<commit_message>
Docs: toll-free 888 A2P verification approved for SMS (TODO + WIP)
Co-Authored-By: Claude Opus 4.8 <noreply@anthropic.com>
</commit_message>
<xml_diff>
--- a/Enyrgy_Master_TODO.docx
+++ b/Enyrgy_Master_TODO.docx
@@ -401,7 +401,7 @@
         <w:t xml:space="preserve"> </w:t>
       </w:r>
       <w:r>
-        <w:t xml:space="preserve">— still failing/pending at the carrier. Blocks SMS from the toll-free number. Resubmit/triage.</w:t>
+        <w:t xml:space="preserve">— VALIDATED and approved for SMS (July 28, 2026). SMS can now send from the toll-free number 888-316-1695. Follow-up: activate any SMS touches that were paused waiting on this.</w:t>
       </w:r>
     </w:p>
     <w:p>
@@ -1497,7 +1497,7 @@
     <w:abstractNumId w:val="993"/>
   </w:num>
   <w:num w:numId="1013">
-    <w:abstractNumId w:val="992"/>
+    <w:abstractNumId w:val="993"/>
   </w:num>
   <w:num w:numId="1014">
     <w:abstractNumId w:val="992"/>

</xml_diff>

<commit_message>
Docs: Reactivation heartbeat enabled (6h)
Co-Authored-By: Claude Opus 4.8 <noreply@anthropic.com>
</commit_message>
<xml_diff>
--- a/Enyrgy_Master_TODO.docx
+++ b/Enyrgy_Master_TODO.docx
@@ -120,7 +120,7 @@
         <w:t xml:space="preserve"> </w:t>
       </w:r>
       <w:r>
-        <w:t xml:space="preserve">(6h) — ready now, lowest risk.</w:t>
+        <w:t xml:space="preserve">(6h) — ENABLED (July 28).</w:t>
       </w:r>
     </w:p>
     <w:p>
@@ -1486,7 +1486,7 @@
     <w:abstractNumId w:val="992"/>
   </w:num>
   <w:num w:numId="1002">
-    <w:abstractNumId w:val="992"/>
+    <w:abstractNumId w:val="993"/>
   </w:num>
   <w:num w:numId="1003">
     <w:abstractNumId w:val="992"/>

</xml_diff>

<commit_message>
Referral and Reviews: trim block (referral paused); hold heartbeat (volume-gated)
Co-Authored-By: Claude Opus 4.8 <noreply@anthropic.com>
</commit_message>
<xml_diff>
--- a/Enyrgy_Master_TODO.docx
+++ b/Enyrgy_Master_TODO.docx
@@ -132,22 +132,16 @@
         </w:numPr>
       </w:pPr>
       <w:r>
-        <w:t xml:space="preserve">Referral and Reviews,</w:t>
-      </w:r>
-      <w:r>
-        <w:t xml:space="preserve"> </w:t>
+        <w:t xml:space="preserve">Referral and Reviews — HELD for now (volume-gated). Instruction block is trimmed (review + testimonial live; referral paused with the deferred loyalty program). At current volume WF-07 sends the review/testimonial asks GHL-native, so the agent adds little. Enable when new-customer volume is steady; daily (</w:t>
       </w:r>
       <w:r>
         <w:rPr>
           <w:rStyle w:val="VerbatimChar"/>
         </w:rPr>
-        <w:t xml:space="preserve">21600</w:t>
-      </w:r>
-      <w:r>
-        <w:t xml:space="preserve"> </w:t>
-      </w:r>
-      <w:r>
-        <w:t xml:space="preserve">(6h) — GATED: enable only after WF-07 review link + referral app are done (see section 3).</w:t>
+        <w:t xml:space="preserve">86400</w:t>
+      </w:r>
+      <w:r>
+        <w:t xml:space="preserve">) is plenty, not 6h.</w:t>
       </w:r>
     </w:p>
     <w:p>

</xml_diff>

<commit_message>
Docs: facility address exception resolved (Shopify policies updated to Phoenix)
Co-Authored-By: Claude Opus 4.8 <noreply@anthropic.com>
</commit_message>
<xml_diff>
--- a/Enyrgy_Master_TODO.docx
+++ b/Enyrgy_Master_TODO.docx
@@ -778,7 +778,7 @@
         <w:t xml:space="preserve"> </w:t>
       </w:r>
       <w:r>
-        <w:t xml:space="preserve">— Shopify Privacy Policy still shows the old Scottsdale address / wrong subdomain. Quick fix.</w:t>
+        <w:t xml:space="preserve">— RESOLVED (July 28). All Shopify policies (Privacy, Terms, Refund) updated to 5115 N 27th Ave, Bld 66, Phoenix, AZ 85017.</w:t>
       </w:r>
     </w:p>
     <w:p>
@@ -1558,7 +1558,7 @@
     <w:abstractNumId w:val="992"/>
   </w:num>
   <w:num w:numId="1028">
-    <w:abstractNumId w:val="992"/>
+    <w:abstractNumId w:val="993"/>
   </w:num>
   <w:num w:numId="1029">
     <w:abstractNumId w:val="992"/>

</xml_diff>

<commit_message>
Docs: commercial ROI PDF drafted; investor voicemail script drafted (content assets partial)
Co-Authored-By: Claude Opus 4.8 <noreply@anthropic.com>
</commit_message>
<xml_diff>
--- a/Enyrgy_Master_TODO.docx
+++ b/Enyrgy_Master_TODO.docx
@@ -587,13 +587,25 @@
           <w:b/>
           <w:bCs/>
         </w:rPr>
-        <w:t xml:space="preserve">Content assets</w:t>
-      </w:r>
-      <w:r>
-        <w:t xml:space="preserve"> </w:t>
-      </w:r>
-      <w:r>
-        <w:t xml:space="preserve">— voicemail recordings and the commercial ROI PDF (PPM itself is attorney-approved).</w:t>
+        <w:t xml:space="preserve">Content assets (PARTIAL)</w:t>
+      </w:r>
+      <w:r>
+        <w:t xml:space="preserve"> </w:t>
+      </w:r>
+      <w:r>
+        <w:t xml:space="preserve">— Commercial ROI PDF DRAFTED (July 28,</w:t>
+      </w:r>
+      <w:r>
+        <w:t xml:space="preserve"> </w:t>
+      </w:r>
+      <w:r>
+        <w:rPr>
+          <w:rStyle w:val="VerbatimChar"/>
+        </w:rPr>
+        <w:t xml:space="preserve">Enyrgy_Commercial_ROI.pdf</w:t>
+      </w:r>
+      <w:r>
+        <w:t xml:space="preserve">, standalone; one placeholder = commercial booking link). Investor voicemail SCRIPT drafted; Scott still to record the audio and upload the recording to GHL. (PPM itself is attorney-approved.)</w:t>
       </w:r>
     </w:p>
     <w:p>

</xml_diff>

<commit_message>
Docs: content assets complete (ROI PDF + inbound voicemail greeting)
Co-Authored-By: Claude Opus 4.8 <noreply@anthropic.com>
</commit_message>
<xml_diff>
--- a/Enyrgy_Master_TODO.docx
+++ b/Enyrgy_Master_TODO.docx
@@ -587,16 +587,13 @@
           <w:b/>
           <w:bCs/>
         </w:rPr>
-        <w:t xml:space="preserve">Content assets (PARTIAL)</w:t>
-      </w:r>
-      <w:r>
-        <w:t xml:space="preserve"> </w:t>
-      </w:r>
-      <w:r>
-        <w:t xml:space="preserve">— Commercial ROI PDF DRAFTED (July 28,</w:t>
-      </w:r>
-      <w:r>
-        <w:t xml:space="preserve"> </w:t>
+        <w:t xml:space="preserve">Content assets</w:t>
+      </w:r>
+      <w:r>
+        <w:t xml:space="preserve"> </w:t>
+      </w:r>
+      <w:r>
+        <w:t xml:space="preserve">— DONE (July 28). Commercial ROI PDF built (</w:t>
       </w:r>
       <w:r>
         <w:rPr>
@@ -605,7 +602,25 @@
         <w:t xml:space="preserve">Enyrgy_Commercial_ROI.pdf</w:t>
       </w:r>
       <w:r>
-        <w:t xml:space="preserve">, standalone; one placeholder = commercial booking link). Investor voicemail SCRIPT drafted; Scott still to record the audio and upload the recording to GHL. (PPM itself is attorney-approved.)</w:t>
+        <w:t xml:space="preserve"> </w:t>
+      </w:r>
+      <w:r>
+        <w:t xml:space="preserve">+ editable</w:t>
+      </w:r>
+      <w:r>
+        <w:t xml:space="preserve"> </w:t>
+      </w:r>
+      <w:r>
+        <w:rPr>
+          <w:rStyle w:val="VerbatimChar"/>
+        </w:rPr>
+        <w:t xml:space="preserve">.html</w:t>
+      </w:r>
+      <w:r>
+        <w:t xml:space="preserve"> </w:t>
+      </w:r>
+      <w:r>
+        <w:t xml:space="preserve">source in repo; one placeholder = commercial booking link). Inbound 888 voicemail greeting recorded in Scott’s voice. Outbound investor-drip voicemail script drafted (record only if/when that touch is activated; optional). PPM attorney-approved.</w:t>
       </w:r>
     </w:p>
     <w:p>
@@ -1549,7 +1564,7 @@
     <w:abstractNumId w:val="993"/>
   </w:num>
   <w:num w:numId="1021">
-    <w:abstractNumId w:val="992"/>
+    <w:abstractNumId w:val="993"/>
   </w:num>
   <w:num w:numId="1022">
     <w:abstractNumId w:val="992"/>

</xml_diff>

<commit_message>
Docs: agency sender-name diagnosed as account/reseller-level (Ledgerix Pro); business category fixed
Co-Authored-By: Claude Opus 4.8 <noreply@anthropic.com>
</commit_message>
<xml_diff>
--- a/Enyrgy_Master_TODO.docx
+++ b/Enyrgy_Master_TODO.docx
@@ -530,25 +530,65 @@
           <w:b/>
           <w:bCs/>
         </w:rPr>
-        <w:t xml:space="preserve">GHL agency email sender name (cosmetic, optional)</w:t>
-      </w:r>
-      <w:r>
-        <w:t xml:space="preserve"> </w:t>
-      </w:r>
-      <w:r>
-        <w:t xml:space="preserve">— the agency mailing address was CORRECTED to Phoenix at the agency level on July 28 (done; that was the CAN-SPAM footer). The agency itself is Enyrgy Inc (Enyrgy-branded). Remaining: agency system emails still send from the name</w:t>
-      </w:r>
-      <w:r>
-        <w:t xml:space="preserve"> </w:t>
-      </w:r>
-      <w:r>
+        <w:t xml:space="preserve">GHL agency email sender name =</w:t>
+      </w:r>
+      <w:r>
+        <w:rPr>
+          <w:b/>
+          <w:bCs/>
+        </w:rPr>
+        <w:t xml:space="preserve"> </w:t>
+      </w:r>
+      <w:r>
+        <w:rPr>
+          <w:b/>
+          <w:bCs/>
+        </w:rPr>
         <w:t xml:space="preserve">“Ledgerix Pro LLC”</w:t>
       </w:r>
       <w:r>
-        <w:t xml:space="preserve"> </w:t>
-      </w:r>
-      <w:r>
-        <w:t xml:space="preserve">(a lingering legal/company-name or SMTP from-name field from before the agency was branded Enyrgy). Optional cosmetic fix: Agency Settings &gt; Company (confirm Company/Legal Name = Enyrgy Inc) and/or Email Services/SMTP from-name.</w:t>
+        <w:rPr>
+          <w:b/>
+          <w:bCs/>
+        </w:rPr>
+        <w:t xml:space="preserve"> </w:t>
+      </w:r>
+      <w:r>
+        <w:rPr>
+          <w:b/>
+          <w:bCs/>
+        </w:rPr>
+        <w:t xml:space="preserve">(HIGH, employee-facing)</w:t>
+      </w:r>
+      <w:r>
+        <w:t xml:space="preserve"> </w:t>
+      </w:r>
+      <w:r>
+        <w:t xml:space="preserve">— DONE July 28: agency mailing address corrected to Phoenix, and Business Category fixed Medical -&gt; Health &amp; Wellness (Self Service Health Station niche; no A2P impact, that’s a separate TCR filing). Confirmed: every field inside the Enyrgy agency reads</w:t>
+      </w:r>
+      <w:r>
+        <w:t xml:space="preserve"> </w:t>
+      </w:r>
+      <w:r>
+        <w:t xml:space="preserve">“Enyrgy Inc”</w:t>
+      </w:r>
+      <w:r>
+        <w:t xml:space="preserve"> </w:t>
+      </w:r>
+      <w:r>
+        <w:t xml:space="preserve">and system-email templates use {{agency.name}} = Enyrgy Inc, so email BODIES are correct. REMAINING: the</w:t>
+      </w:r>
+      <w:r>
+        <w:t xml:space="preserve"> </w:t>
+      </w:r>
+      <w:r>
+        <w:t xml:space="preserve">“Ledgerix Pro LLC”</w:t>
+      </w:r>
+      <w:r>
+        <w:t xml:space="preserve"> </w:t>
+      </w:r>
+      <w:r>
+        <w:t xml:space="preserve">SENDER display name is not in the agency settings; it comes from the account/reseller level above this agency (multi-account switcher + Relationship Number 0-167-470 confirm Scott’s HighLevel login identity is Ledgerix Pro LLC, with Enyrgy Inc as an agency under it). Fix path: check the Ledgerix Pro account’s Company Name via the account switcher, and/or open a HighLevel support ticket to change the account-level system-email sender name to Enyrgy Inc for the Enyrgy agency.</w:t>
       </w:r>
     </w:p>
     <w:bookmarkEnd w:id="11"/>

</xml_diff>

<commit_message>
FlexOffers affiliate attribution built; commit Tired Test quiz to repo
Capture-and-postback chain for affiliate sales that close weeks after the click:
- lead-magnets/tired-test.html: quiz now captures FlexOffers refid from the URL,
  persists it to localStorage, and sends it to the WF-12 webhook.
- GHL: new contact field flexoffers_refid, mapped in WF-12; new WF-30 fires an S2S
  postback on Order fulfilled (Home System only) when the contact carries a refid.
- FlexOffers program 250377, $600 fixed CPA, 365-day attribution window.

Caught during build: flat CPA + no product filter would have paid $600 on a $297
accessory reorder. Fixed via the Fulfilled Products filter.

Open: order merge fields unverified (no-cost Shopify test not possible); publishers
still need migrating from the old untracked program.

Co-Authored-By: Claude Opus 4.8 <noreply@anthropic.com>
</commit_message>
<xml_diff>
--- a/Enyrgy_Master_TODO.docx
+++ b/Enyrgy_Master_TODO.docx
@@ -544,6 +544,366 @@
           <w:b/>
           <w:bCs/>
         </w:rPr>
+        <w:t xml:space="preserve">FlexOffers affiliate attribution — BUILT July 29</w:t>
+      </w:r>
+      <w:r>
+        <w:t xml:space="preserve"> </w:t>
+      </w:r>
+      <w:r>
+        <w:t xml:space="preserve">(full detail in the Handoff). Capture-and-postback design: the Tired Test captures FlexOffers’</w:t>
+      </w:r>
+      <w:r>
+        <w:t xml:space="preserve"> </w:t>
+      </w:r>
+      <w:r>
+        <w:rPr>
+          <w:rStyle w:val="VerbatimChar"/>
+        </w:rPr>
+        <w:t xml:space="preserve">refid</w:t>
+      </w:r>
+      <w:r>
+        <w:t xml:space="preserve"> </w:t>
+      </w:r>
+      <w:r>
+        <w:t xml:space="preserve">click ID, stores it on the GHL contact, and fires a server-to-server postback when a device sale ships. Program</w:t>
+      </w:r>
+      <w:r>
+        <w:t xml:space="preserve"> </w:t>
+      </w:r>
+      <w:r>
+        <w:rPr>
+          <w:b/>
+          <w:bCs/>
+        </w:rPr>
+        <w:t xml:space="preserve">Enyrgy - Tired Test (S2S) #250377</w:t>
+      </w:r>
+      <w:r>
+        <w:t xml:space="preserve">, default campaign #144482449, creative #6673704, workflow</w:t>
+      </w:r>
+      <w:r>
+        <w:t xml:space="preserve"> </w:t>
+      </w:r>
+      <w:r>
+        <w:rPr>
+          <w:b/>
+          <w:bCs/>
+        </w:rPr>
+        <w:t xml:space="preserve">WF-30 FlexOffers Sale Postback</w:t>
+      </w:r>
+      <w:r>
+        <w:t xml:space="preserve">. Payout</w:t>
+      </w:r>
+      <w:r>
+        <w:t xml:space="preserve"> </w:t>
+      </w:r>
+      <w:r>
+        <w:rPr>
+          <w:b/>
+          <w:bCs/>
+        </w:rPr>
+        <w:t xml:space="preserve">$600 fixed CPA</w:t>
+      </w:r>
+      <w:r>
+        <w:t xml:space="preserve">, Return Days 365, Manual Review approval, Deep Linking off. VERIFIED working: refid capture from URL, storage to the</w:t>
+      </w:r>
+      <w:r>
+        <w:t xml:space="preserve"> </w:t>
+      </w:r>
+      <w:r>
+        <w:rPr>
+          <w:rStyle w:val="VerbatimChar"/>
+        </w:rPr>
+        <w:t xml:space="preserve">flexoffers_refid</w:t>
+      </w:r>
+      <w:r>
+        <w:t xml:space="preserve"> </w:t>
+      </w:r>
+      <w:r>
+        <w:t xml:space="preserve">contact field via WF-12, product filter, refid condition.</w:t>
+      </w:r>
+    </w:p>
+    <w:p>
+      <w:pPr>
+        <w:pStyle w:val="Compact"/>
+        <w:numPr>
+          <w:ilvl w:val="0"/>
+          <w:numId w:val="1018"/>
+        </w:numPr>
+      </w:pPr>
+      <w:r>
+        <w:rPr>
+          <w:b/>
+          <w:bCs/>
+        </w:rPr>
+        <w:t xml:space="preserve">FlexOffers remaining (waiting on the FlexOffers rep, emailed July 29)</w:t>
+      </w:r>
+    </w:p>
+    <w:p>
+      <w:pPr>
+        <w:pStyle w:val="Compact"/>
+        <w:numPr>
+          <w:ilvl w:val="1"/>
+          <w:numId w:val="1019"/>
+        </w:numPr>
+      </w:pPr>
+      <w:r>
+        <w:t xml:space="preserve">Get a</w:t>
+      </w:r>
+      <w:r>
+        <w:t xml:space="preserve"> </w:t>
+      </w:r>
+      <w:r>
+        <w:rPr>
+          <w:b/>
+          <w:bCs/>
+        </w:rPr>
+        <w:t xml:space="preserve">test tracking link</w:t>
+      </w:r>
+      <w:r>
+        <w:t xml:space="preserve"> </w:t>
+      </w:r>
+      <w:r>
+        <w:t xml:space="preserve">for 250377, click it, confirm it lands on the quiz with</w:t>
+      </w:r>
+      <w:r>
+        <w:t xml:space="preserve"> </w:t>
+      </w:r>
+      <w:r>
+        <w:rPr>
+          <w:rStyle w:val="VerbatimChar"/>
+        </w:rPr>
+        <w:t xml:space="preserve">?refid=24.…</w:t>
+      </w:r>
+      <w:r>
+        <w:t xml:space="preserve">, complete the quiz, verify the contact’s FlexOffers Refid populates. Free verification of the click-to-capture path.</w:t>
+      </w:r>
+    </w:p>
+    <w:p>
+      <w:pPr>
+        <w:pStyle w:val="Compact"/>
+        <w:numPr>
+          <w:ilvl w:val="1"/>
+          <w:numId w:val="1020"/>
+        </w:numPr>
+      </w:pPr>
+      <w:r>
+        <w:t xml:space="preserve">Ask FlexOffers to</w:t>
+      </w:r>
+      <w:r>
+        <w:t xml:space="preserve"> </w:t>
+      </w:r>
+      <w:r>
+        <w:rPr>
+          <w:b/>
+          <w:bCs/>
+        </w:rPr>
+        <w:t xml:space="preserve">surface program 250377</w:t>
+      </w:r>
+      <w:r>
+        <w:t xml:space="preserve"> </w:t>
+      </w:r>
+      <w:r>
+        <w:t xml:space="preserve">to the network and migrate the</w:t>
+      </w:r>
+      <w:r>
+        <w:t xml:space="preserve"> </w:t>
+      </w:r>
+      <w:r>
+        <w:rPr>
+          <w:b/>
+          <w:bCs/>
+        </w:rPr>
+        <w:t xml:space="preserve">124 publishers</w:t>
+      </w:r>
+      <w:r>
+        <w:t xml:space="preserve"> </w:t>
+      </w:r>
+      <w:r>
+        <w:t xml:space="preserve">approved on the old program (#247334). Approvals are per-program, so 250377 has ZERO publishers today and nobody can promote the tracked link.</w:t>
+      </w:r>
+    </w:p>
+    <w:p>
+      <w:pPr>
+        <w:pStyle w:val="Compact"/>
+        <w:numPr>
+          <w:ilvl w:val="1"/>
+          <w:numId w:val="1021"/>
+        </w:numPr>
+      </w:pPr>
+      <w:r>
+        <w:rPr>
+          <w:b/>
+          <w:bCs/>
+        </w:rPr>
+        <w:t xml:space="preserve">After</w:t>
+      </w:r>
+      <w:r>
+        <w:t xml:space="preserve"> </w:t>
+      </w:r>
+      <w:r>
+        <w:t xml:space="preserve">publishers migrate,</w:t>
+      </w:r>
+      <w:r>
+        <w:t xml:space="preserve"> </w:t>
+      </w:r>
+      <w:r>
+        <w:rPr>
+          <w:b/>
+          <w:bCs/>
+        </w:rPr>
+        <w:t xml:space="preserve">disable old creative #6673701</w:t>
+      </w:r>
+      <w:r>
+        <w:t xml:space="preserve"> </w:t>
+      </w:r>
+      <w:r>
+        <w:t xml:space="preserve">(Tired Test on the old program, no S2S tracking, so anyone promoting it earns nothing and sours the relationship).</w:t>
+      </w:r>
+    </w:p>
+    <w:p>
+      <w:pPr>
+        <w:pStyle w:val="Compact"/>
+        <w:numPr>
+          <w:ilvl w:val="1"/>
+          <w:numId w:val="1022"/>
+        </w:numPr>
+      </w:pPr>
+      <w:r>
+        <w:rPr>
+          <w:b/>
+          <w:bCs/>
+        </w:rPr>
+        <w:t xml:space="preserve">UNVERIFIED merge fields:</w:t>
+      </w:r>
+      <w:r>
+        <w:t xml:space="preserve"> </w:t>
+      </w:r>
+      <w:r>
+        <w:rPr>
+          <w:rStyle w:val="VerbatimChar"/>
+        </w:rPr>
+        <w:t xml:space="preserve">{{order.number}}</w:t>
+      </w:r>
+      <w:r>
+        <w:t xml:space="preserve"> </w:t>
+      </w:r>
+      <w:r>
+        <w:t xml:space="preserve">and</w:t>
+      </w:r>
+      <w:r>
+        <w:t xml:space="preserve"> </w:t>
+      </w:r>
+      <w:r>
+        <w:rPr>
+          <w:rStyle w:val="VerbatimChar"/>
+        </w:rPr>
+        <w:t xml:space="preserve">{{order.subtotal_price}}</w:t>
+      </w:r>
+      <w:r>
+        <w:t xml:space="preserve"> </w:t>
+      </w:r>
+      <w:r>
+        <w:t xml:space="preserve">were chosen while the</w:t>
+      </w:r>
+      <w:r>
+        <w:t xml:space="preserve"> </w:t>
+      </w:r>
+      <w:r>
+        <w:rPr>
+          <w:i/>
+          <w:iCs/>
+        </w:rPr>
+        <w:t xml:space="preserve">Shopify order placed</w:t>
+      </w:r>
+      <w:r>
+        <w:t xml:space="preserve"> </w:t>
+      </w:r>
+      <w:r>
+        <w:t xml:space="preserve">trigger was active; the trigger is now</w:t>
+      </w:r>
+      <w:r>
+        <w:t xml:space="preserve"> </w:t>
+      </w:r>
+      <w:r>
+        <w:rPr>
+          <w:i/>
+          <w:iCs/>
+        </w:rPr>
+        <w:t xml:space="preserve">Order fulfilled</w:t>
+      </w:r>
+      <w:r>
+        <w:t xml:space="preserve"> </w:t>
+      </w:r>
+      <w:r>
+        <w:t xml:space="preserve">(the only trigger exposing a product filter). Could not test without a real Shopify order (payment fees + 7-10 day refund hold made a test order too costly). On the FIRST real affiliate sale, check</w:t>
+      </w:r>
+      <w:r>
+        <w:t xml:space="preserve"> </w:t>
+      </w:r>
+      <w:r>
+        <w:rPr>
+          <w:b/>
+          <w:bCs/>
+        </w:rPr>
+        <w:t xml:space="preserve">WF-30 &gt; Execution Logs</w:t>
+      </w:r>
+      <w:r>
+        <w:t xml:space="preserve"> </w:t>
+      </w:r>
+      <w:r>
+        <w:t xml:space="preserve">to confirm both resolved; if blank, fix and have FlexOffers credit that conversion manually.</w:t>
+      </w:r>
+    </w:p>
+    <w:p>
+      <w:pPr>
+        <w:pStyle w:val="Compact"/>
+        <w:numPr>
+          <w:ilvl w:val="1"/>
+          <w:numId w:val="1023"/>
+        </w:numPr>
+      </w:pPr>
+      <w:r>
+        <w:t xml:space="preserve">Delete test contact</w:t>
+      </w:r>
+      <w:r>
+        <w:t xml:space="preserve"> </w:t>
+      </w:r>
+      <w:r>
+        <w:rPr>
+          <w:b/>
+          <w:bCs/>
+        </w:rPr>
+        <w:t xml:space="preserve">FlexOffers Test2</w:t>
+      </w:r>
+      <w:r>
+        <w:t xml:space="preserve"> </w:t>
+      </w:r>
+      <w:r>
+        <w:t xml:space="preserve">(</w:t>
+      </w:r>
+      <w:r>
+        <w:rPr>
+          <w:rStyle w:val="VerbatimChar"/>
+        </w:rPr>
+        <w:t xml:space="preserve">scott+fotest2@enyrgy.com</w:t>
+      </w:r>
+      <w:r>
+        <w:t xml:space="preserve">) after the postback test. Kept deliberately because it holds a test refid.</w:t>
+      </w:r>
+    </w:p>
+    <w:p>
+      <w:pPr>
+        <w:pStyle w:val="Compact"/>
+        <w:numPr>
+          <w:ilvl w:val="0"/>
+          <w:numId w:val="1024"/>
+        </w:numPr>
+      </w:pPr>
+      <w:r>
+        <w:rPr>
+          <w:b/>
+          <w:bCs/>
+        </w:rPr>
         <w:t xml:space="preserve">Testimonial-form link on enyrgy.com</w:t>
       </w:r>
       <w:r>
@@ -558,7 +918,7 @@
         <w:pStyle w:val="Compact"/>
         <w:numPr>
           <w:ilvl w:val="0"/>
-          <w:numId w:val="1018"/>
+          <w:numId w:val="1025"/>
         </w:numPr>
       </w:pPr>
       <w:r>
@@ -589,7 +949,7 @@
         <w:pStyle w:val="Compact"/>
         <w:numPr>
           <w:ilvl w:val="0"/>
-          <w:numId w:val="1019"/>
+          <w:numId w:val="1026"/>
         </w:numPr>
       </w:pPr>
       <w:r>
@@ -673,7 +1033,7 @@
         <w:pStyle w:val="Compact"/>
         <w:numPr>
           <w:ilvl w:val="0"/>
-          <w:numId w:val="1020"/>
+          <w:numId w:val="1027"/>
         </w:numPr>
       </w:pPr>
       <w:r>
@@ -695,7 +1055,7 @@
         <w:pStyle w:val="Compact"/>
         <w:numPr>
           <w:ilvl w:val="0"/>
-          <w:numId w:val="1021"/>
+          <w:numId w:val="1028"/>
         </w:numPr>
       </w:pPr>
       <w:r>
@@ -717,7 +1077,7 @@
         <w:pStyle w:val="Compact"/>
         <w:numPr>
           <w:ilvl w:val="0"/>
-          <w:numId w:val="1022"/>
+          <w:numId w:val="1029"/>
         </w:numPr>
       </w:pPr>
       <w:r>
@@ -766,7 +1126,7 @@
         <w:pStyle w:val="Compact"/>
         <w:numPr>
           <w:ilvl w:val="0"/>
-          <w:numId w:val="1023"/>
+          <w:numId w:val="1030"/>
         </w:numPr>
       </w:pPr>
       <w:r>
@@ -810,7 +1170,7 @@
         <w:pStyle w:val="Compact"/>
         <w:numPr>
           <w:ilvl w:val="0"/>
-          <w:numId w:val="1024"/>
+          <w:numId w:val="1031"/>
         </w:numPr>
       </w:pPr>
       <w:r>
@@ -832,7 +1192,7 @@
         <w:pStyle w:val="Compact"/>
         <w:numPr>
           <w:ilvl w:val="0"/>
-          <w:numId w:val="1025"/>
+          <w:numId w:val="1032"/>
         </w:numPr>
       </w:pPr>
       <w:r>
@@ -854,7 +1214,7 @@
         <w:pStyle w:val="Compact"/>
         <w:numPr>
           <w:ilvl w:val="0"/>
-          <w:numId w:val="1026"/>
+          <w:numId w:val="1033"/>
         </w:numPr>
       </w:pPr>
       <w:r>
@@ -885,7 +1245,7 @@
         <w:pStyle w:val="Compact"/>
         <w:numPr>
           <w:ilvl w:val="0"/>
-          <w:numId w:val="1027"/>
+          <w:numId w:val="1034"/>
         </w:numPr>
       </w:pPr>
       <w:r>
@@ -907,7 +1267,7 @@
         <w:pStyle w:val="Compact"/>
         <w:numPr>
           <w:ilvl w:val="0"/>
-          <w:numId w:val="1028"/>
+          <w:numId w:val="1035"/>
         </w:numPr>
       </w:pPr>
       <w:r>
@@ -929,7 +1289,7 @@
         <w:pStyle w:val="Compact"/>
         <w:numPr>
           <w:ilvl w:val="0"/>
-          <w:numId w:val="1029"/>
+          <w:numId w:val="1036"/>
         </w:numPr>
       </w:pPr>
       <w:r>
@@ -951,7 +1311,7 @@
         <w:pStyle w:val="Compact"/>
         <w:numPr>
           <w:ilvl w:val="0"/>
-          <w:numId w:val="1030"/>
+          <w:numId w:val="1037"/>
         </w:numPr>
       </w:pPr>
       <w:r>
@@ -1034,7 +1394,7 @@
         <w:pStyle w:val="Compact"/>
         <w:numPr>
           <w:ilvl w:val="0"/>
-          <w:numId w:val="1031"/>
+          <w:numId w:val="1038"/>
         </w:numPr>
       </w:pPr>
       <w:r>
@@ -1056,7 +1416,7 @@
         <w:pStyle w:val="Compact"/>
         <w:numPr>
           <w:ilvl w:val="0"/>
-          <w:numId w:val="1032"/>
+          <w:numId w:val="1039"/>
         </w:numPr>
       </w:pPr>
       <w:r>
@@ -1094,7 +1454,7 @@
         <w:pStyle w:val="Compact"/>
         <w:numPr>
           <w:ilvl w:val="0"/>
-          <w:numId w:val="1033"/>
+          <w:numId w:val="1040"/>
         </w:numPr>
       </w:pPr>
       <w:r>
@@ -1116,7 +1476,7 @@
         <w:pStyle w:val="Compact"/>
         <w:numPr>
           <w:ilvl w:val="0"/>
-          <w:numId w:val="1034"/>
+          <w:numId w:val="1041"/>
         </w:numPr>
       </w:pPr>
       <w:r>
@@ -1138,7 +1498,7 @@
         <w:pStyle w:val="Compact"/>
         <w:numPr>
           <w:ilvl w:val="0"/>
-          <w:numId w:val="1035"/>
+          <w:numId w:val="1042"/>
         </w:numPr>
       </w:pPr>
       <w:r>
@@ -1175,7 +1535,7 @@
         <w:pStyle w:val="Compact"/>
         <w:numPr>
           <w:ilvl w:val="0"/>
-          <w:numId w:val="1036"/>
+          <w:numId w:val="1043"/>
         </w:numPr>
       </w:pPr>
       <w:r>
@@ -1197,7 +1557,7 @@
         <w:pStyle w:val="Compact"/>
         <w:numPr>
           <w:ilvl w:val="0"/>
-          <w:numId w:val="1037"/>
+          <w:numId w:val="1044"/>
         </w:numPr>
       </w:pPr>
       <w:r>
@@ -1229,7 +1589,7 @@
         <w:pStyle w:val="Compact"/>
         <w:numPr>
           <w:ilvl w:val="0"/>
-          <w:numId w:val="1038"/>
+          <w:numId w:val="1045"/>
         </w:numPr>
       </w:pPr>
       <w:r>
@@ -1263,7 +1623,7 @@
         <w:pStyle w:val="Compact"/>
         <w:numPr>
           <w:ilvl w:val="0"/>
-          <w:numId w:val="1039"/>
+          <w:numId w:val="1046"/>
         </w:numPr>
       </w:pPr>
       <w:r>
@@ -1285,7 +1645,7 @@
         <w:pStyle w:val="Compact"/>
         <w:numPr>
           <w:ilvl w:val="0"/>
-          <w:numId w:val="1040"/>
+          <w:numId w:val="1047"/>
         </w:numPr>
       </w:pPr>
       <w:r>
@@ -1335,7 +1695,7 @@
         <w:pStyle w:val="Compact"/>
         <w:numPr>
           <w:ilvl w:val="0"/>
-          <w:numId w:val="1041"/>
+          <w:numId w:val="1048"/>
         </w:numPr>
       </w:pPr>
       <w:r>
@@ -1369,7 +1729,7 @@
         <w:pStyle w:val="Compact"/>
         <w:numPr>
           <w:ilvl w:val="0"/>
-          <w:numId w:val="1042"/>
+          <w:numId w:val="1049"/>
         </w:numPr>
       </w:pPr>
       <w:r>
@@ -1705,7 +2065,7 @@
     <w:abstractNumId w:val="993"/>
   </w:num>
   <w:num w:numId="1018">
-    <w:abstractNumId w:val="993"/>
+    <w:abstractNumId w:val="992"/>
   </w:num>
   <w:num w:numId="1019">
     <w:abstractNumId w:val="992"/>
@@ -1714,19 +2074,19 @@
     <w:abstractNumId w:val="992"/>
   </w:num>
   <w:num w:numId="1021">
-    <w:abstractNumId w:val="993"/>
+    <w:abstractNumId w:val="992"/>
   </w:num>
   <w:num w:numId="1022">
-    <w:abstractNumId w:val="993"/>
+    <w:abstractNumId w:val="992"/>
   </w:num>
   <w:num w:numId="1023">
     <w:abstractNumId w:val="992"/>
   </w:num>
   <w:num w:numId="1024">
-    <w:abstractNumId w:val="992"/>
+    <w:abstractNumId w:val="993"/>
   </w:num>
   <w:num w:numId="1025">
-    <w:abstractNumId w:val="992"/>
+    <w:abstractNumId w:val="993"/>
   </w:num>
   <w:num w:numId="1026">
     <w:abstractNumId w:val="992"/>
@@ -1735,7 +2095,7 @@
     <w:abstractNumId w:val="992"/>
   </w:num>
   <w:num w:numId="1028">
-    <w:abstractNumId w:val="992"/>
+    <w:abstractNumId w:val="993"/>
   </w:num>
   <w:num w:numId="1029">
     <w:abstractNumId w:val="993"/>
@@ -1759,13 +2119,13 @@
     <w:abstractNumId w:val="992"/>
   </w:num>
   <w:num w:numId="1036">
-    <w:abstractNumId w:val="992"/>
+    <w:abstractNumId w:val="993"/>
   </w:num>
   <w:num w:numId="1037">
     <w:abstractNumId w:val="992"/>
   </w:num>
   <w:num w:numId="1038">
-    <w:abstractNumId w:val="993"/>
+    <w:abstractNumId w:val="992"/>
   </w:num>
   <w:num w:numId="1039">
     <w:abstractNumId w:val="992"/>
@@ -1777,6 +2137,27 @@
     <w:abstractNumId w:val="992"/>
   </w:num>
   <w:num w:numId="1042">
+    <w:abstractNumId w:val="992"/>
+  </w:num>
+  <w:num w:numId="1043">
+    <w:abstractNumId w:val="992"/>
+  </w:num>
+  <w:num w:numId="1044">
+    <w:abstractNumId w:val="992"/>
+  </w:num>
+  <w:num w:numId="1045">
+    <w:abstractNumId w:val="993"/>
+  </w:num>
+  <w:num w:numId="1046">
+    <w:abstractNumId w:val="992"/>
+  </w:num>
+  <w:num w:numId="1047">
+    <w:abstractNumId w:val="992"/>
+  </w:num>
+  <w:num w:numId="1048">
+    <w:abstractNumId w:val="992"/>
+  </w:num>
+  <w:num w:numId="1049">
     <w:abstractNumId w:val="992"/>
   </w:num>
 </w:numbering>

</xml_diff>

<commit_message>
FlexOffers: wire Vitamin D Assessment (magnet 2 of 5), commit page to repo
Same 3 additions as the Tired Test, in this page's var/ES5 style. Verified live:
refid captured from URL, sent form-encoded, mapped in WF-21, stored on the contact.
Also records the one-program-many-campaigns structure so publishers apply once and
can promote whichever magnet fits their audience.

Co-Authored-By: Claude Opus 4.8 <noreply@anthropic.com>
</commit_message>
<xml_diff>
--- a/Enyrgy_Master_TODO.docx
+++ b/Enyrgy_Master_TODO.docx
@@ -635,7 +635,41 @@
           <w:b/>
           <w:bCs/>
         </w:rPr>
-        <w:t xml:space="preserve">FlexOffers remaining (waiting on the FlexOffers rep, emailed July 29)</w:t>
+        <w:t xml:space="preserve">FlexOffers: wire the remaining 3 lead magnets (2 of 5 done)</w:t>
+      </w:r>
+      <w:r>
+        <w:t xml:space="preserve"> </w:t>
+      </w:r>
+      <w:r>
+        <w:t xml:space="preserve">— STRUCTURE: one program (250377) with a</w:t>
+      </w:r>
+      <w:r>
+        <w:t xml:space="preserve"> </w:t>
+      </w:r>
+      <w:r>
+        <w:rPr>
+          <w:b/>
+          <w:bCs/>
+        </w:rPr>
+        <w:t xml:space="preserve">campaign per lead magnet</w:t>
+      </w:r>
+      <w:r>
+        <w:t xml:space="preserve">, since the destination URL lives at the campaign level while tracking, payout, and publisher approvals sit at the program level. A publisher applies once and can then promote whichever magnet fits their audience. Per magnet the work is: (1) add the refid capture code to the page, (2) one test submission so GHL learns the field, (3) map</w:t>
+      </w:r>
+      <w:r>
+        <w:t xml:space="preserve"> </w:t>
+      </w:r>
+      <w:r>
+        <w:rPr>
+          <w:rStyle w:val="VerbatimChar"/>
+        </w:rPr>
+        <w:t xml:space="preserve">flexoffers_refid</w:t>
+      </w:r>
+      <w:r>
+        <w:t xml:space="preserve"> </w:t>
+      </w:r>
+      <w:r>
+        <w:t xml:space="preserve">in that magnet’s capture workflow, (4) create its FlexOffers campaign + creative. Only step 4 is blocked on FlexOffers.</w:t>
       </w:r>
     </w:p>
     <w:p>
@@ -647,35 +681,44 @@
         </w:numPr>
       </w:pPr>
       <w:r>
-        <w:t xml:space="preserve">Get a</w:t>
-      </w:r>
-      <w:r>
-        <w:t xml:space="preserve"> </w:t>
-      </w:r>
-      <w:r>
-        <w:rPr>
-          <w:b/>
-          <w:bCs/>
-        </w:rPr>
-        <w:t xml:space="preserve">test tracking link</w:t>
-      </w:r>
-      <w:r>
-        <w:t xml:space="preserve"> </w:t>
-      </w:r>
-      <w:r>
-        <w:t xml:space="preserve">for 250377, click it, confirm it lands on the quiz with</w:t>
-      </w:r>
-      <w:r>
-        <w:t xml:space="preserve"> </w:t>
+        <w:t xml:space="preserve">☒</w:t>
+      </w:r>
+      <w:r>
+        <w:t xml:space="preserve"> </w:t>
+      </w:r>
+      <w:r>
+        <w:rPr>
+          <w:b/>
+          <w:bCs/>
+        </w:rPr>
+        <w:t xml:space="preserve">Tired Test</w:t>
+      </w:r>
+      <w:r>
+        <w:t xml:space="preserve"> </w:t>
+      </w:r>
+      <w:r>
+        <w:t xml:space="preserve">(</w:t>
       </w:r>
       <w:r>
         <w:rPr>
           <w:rStyle w:val="VerbatimChar"/>
         </w:rPr>
-        <w:t xml:space="preserve">?refid=24.…</w:t>
-      </w:r>
-      <w:r>
-        <w:t xml:space="preserve">, complete the quiz, verify the contact’s FlexOffers Refid populates. Free verification of the click-to-capture path.</w:t>
+        <w:t xml:space="preserve">/tired-test</w:t>
+      </w:r>
+      <w:r>
+        <w:t xml:space="preserve">, WF-12) — page + mapping done and verified with a real FlexOffers refid. Page in repo at</w:t>
+      </w:r>
+      <w:r>
+        <w:t xml:space="preserve"> </w:t>
+      </w:r>
+      <w:r>
+        <w:rPr>
+          <w:rStyle w:val="VerbatimChar"/>
+        </w:rPr>
+        <w:t xml:space="preserve">lead-magnets/tired-test.html</w:t>
+      </w:r>
+      <w:r>
+        <w:t xml:space="preserve">.</w:t>
       </w:r>
     </w:p>
     <w:p>
@@ -683,43 +726,280 @@
         <w:pStyle w:val="Compact"/>
         <w:numPr>
           <w:ilvl w:val="1"/>
+          <w:numId w:val="1019"/>
+        </w:numPr>
+      </w:pPr>
+      <w:r>
+        <w:t xml:space="preserve">☒</w:t>
+      </w:r>
+      <w:r>
+        <w:t xml:space="preserve"> </w:t>
+      </w:r>
+      <w:r>
+        <w:rPr>
+          <w:b/>
+          <w:bCs/>
+        </w:rPr>
+        <w:t xml:space="preserve">Vitamin D Assessment</w:t>
+      </w:r>
+      <w:r>
+        <w:t xml:space="preserve"> </w:t>
+      </w:r>
+      <w:r>
+        <w:t xml:space="preserve">(</w:t>
+      </w:r>
+      <w:r>
+        <w:rPr>
+          <w:rStyle w:val="VerbatimChar"/>
+        </w:rPr>
+        <w:t xml:space="preserve">/vitamin-d-assessment</w:t>
+      </w:r>
+      <w:r>
+        <w:t xml:space="preserve">, WF-21, webhook</w:t>
+      </w:r>
+      <w:r>
+        <w:t xml:space="preserve"> </w:t>
+      </w:r>
+      <w:r>
+        <w:rPr>
+          <w:rStyle w:val="VerbatimChar"/>
+        </w:rPr>
+        <w:t xml:space="preserve">d2692dc6-1e9f-466c-8525-58c466c426bd</w:t>
+      </w:r>
+      <w:r>
+        <w:t xml:space="preserve">) — page + mapping done and verified July 30. Page in repo at</w:t>
+      </w:r>
+      <w:r>
+        <w:t xml:space="preserve"> </w:t>
+      </w:r>
+      <w:r>
+        <w:rPr>
+          <w:rStyle w:val="VerbatimChar"/>
+        </w:rPr>
+        <w:t xml:space="preserve">lead-magnets/vitamin-d-assessment.html</w:t>
+      </w:r>
+      <w:r>
+        <w:t xml:space="preserve">.</w:t>
+      </w:r>
+    </w:p>
+    <w:p>
+      <w:pPr>
+        <w:pStyle w:val="Compact"/>
+        <w:numPr>
+          <w:ilvl w:val="1"/>
+          <w:numId w:val="1019"/>
+        </w:numPr>
+      </w:pPr>
+      <w:r>
+        <w:t xml:space="preserve">☐</w:t>
+      </w:r>
+      <w:r>
+        <w:t xml:space="preserve"> </w:t>
+      </w:r>
+      <w:r>
+        <w:rPr>
+          <w:b/>
+          <w:bCs/>
+        </w:rPr>
+        <w:t xml:space="preserve">Synthesis Gap</w:t>
+      </w:r>
+      <w:r>
+        <w:t xml:space="preserve"> </w:t>
+      </w:r>
+      <w:r>
+        <w:t xml:space="preserve">(</w:t>
+      </w:r>
+      <w:r>
+        <w:rPr>
+          <w:rStyle w:val="VerbatimChar"/>
+        </w:rPr>
+        <w:t xml:space="preserve">/synthesis-gap</w:t>
+      </w:r>
+      <w:r>
+        <w:t xml:space="preserve">, WF-15, webhook</w:t>
+      </w:r>
+      <w:r>
+        <w:t xml:space="preserve"> </w:t>
+      </w:r>
+      <w:r>
+        <w:rPr>
+          <w:rStyle w:val="VerbatimChar"/>
+        </w:rPr>
+        <w:t xml:space="preserve">fd32493c-6ec1-4e55-9edb-75399aa53a34</w:t>
+      </w:r>
+      <w:r>
+        <w:t xml:space="preserve">)</w:t>
+      </w:r>
+    </w:p>
+    <w:p>
+      <w:pPr>
+        <w:pStyle w:val="Compact"/>
+        <w:numPr>
+          <w:ilvl w:val="1"/>
+          <w:numId w:val="1019"/>
+        </w:numPr>
+      </w:pPr>
+      <w:r>
+        <w:t xml:space="preserve">☐</w:t>
+      </w:r>
+      <w:r>
+        <w:t xml:space="preserve"> </w:t>
+      </w:r>
+      <w:r>
+        <w:rPr>
+          <w:b/>
+          <w:bCs/>
+        </w:rPr>
+        <w:t xml:space="preserve">Recovery Protocol</w:t>
+      </w:r>
+      <w:r>
+        <w:t xml:space="preserve"> </w:t>
+      </w:r>
+      <w:r>
+        <w:t xml:space="preserve">(</w:t>
+      </w:r>
+      <w:r>
+        <w:rPr>
+          <w:rStyle w:val="VerbatimChar"/>
+        </w:rPr>
+        <w:t xml:space="preserve">/recovery-protocol</w:t>
+      </w:r>
+      <w:r>
+        <w:t xml:space="preserve">, WF-18, webhook</w:t>
+      </w:r>
+      <w:r>
+        <w:t xml:space="preserve"> </w:t>
+      </w:r>
+      <w:r>
+        <w:rPr>
+          <w:rStyle w:val="VerbatimChar"/>
+        </w:rPr>
+        <w:t xml:space="preserve">3ae538d7-81a9-42a7-9e18-5e7c8b19b84a</w:t>
+      </w:r>
+      <w:r>
+        <w:t xml:space="preserve">)</w:t>
+      </w:r>
+    </w:p>
+    <w:p>
+      <w:pPr>
+        <w:pStyle w:val="Compact"/>
+        <w:numPr>
+          <w:ilvl w:val="1"/>
+          <w:numId w:val="1019"/>
+        </w:numPr>
+      </w:pPr>
+      <w:r>
+        <w:t xml:space="preserve">☐</w:t>
+      </w:r>
+      <w:r>
+        <w:t xml:space="preserve"> </w:t>
+      </w:r>
+      <w:r>
+        <w:rPr>
+          <w:b/>
+          <w:bCs/>
+        </w:rPr>
+        <w:t xml:space="preserve">Winter Protocol</w:t>
+      </w:r>
+      <w:r>
+        <w:t xml:space="preserve"> </w:t>
+      </w:r>
+      <w:r>
+        <w:t xml:space="preserve">(</w:t>
+      </w:r>
+      <w:r>
+        <w:rPr>
+          <w:rStyle w:val="VerbatimChar"/>
+        </w:rPr>
+        <w:t xml:space="preserve">/winter-protocol</w:t>
+      </w:r>
+      <w:r>
+        <w:t xml:space="preserve">, WF-19, webhook</w:t>
+      </w:r>
+      <w:r>
+        <w:t xml:space="preserve"> </w:t>
+      </w:r>
+      <w:r>
+        <w:rPr>
+          <w:rStyle w:val="VerbatimChar"/>
+        </w:rPr>
+        <w:t xml:space="preserve">ad11ef02-14c8-4dbc-b1dd-bb5c9f3203bd</w:t>
+      </w:r>
+      <w:r>
+        <w:t xml:space="preserve">)</w:t>
+      </w:r>
+    </w:p>
+    <w:p>
+      <w:pPr>
+        <w:pStyle w:val="Compact"/>
+        <w:numPr>
+          <w:ilvl w:val="1"/>
+          <w:numId w:val="1019"/>
+        </w:numPr>
+      </w:pPr>
+      <w:r>
+        <w:t xml:space="preserve">NOTE: the three remaining are guides rather than quizzes, so their pages will have simpler forms, but the change is the same three additions.</w:t>
+      </w:r>
+    </w:p>
+    <w:p>
+      <w:pPr>
+        <w:pStyle w:val="Compact"/>
+        <w:numPr>
+          <w:ilvl w:val="1"/>
+          <w:numId w:val="1019"/>
+        </w:numPr>
+      </w:pPr>
+      <w:r>
+        <w:t xml:space="preserve">RECOMMENDATION: do not block the affiliate launch on all five. Launch with the Tired Test (fully tested) as soon as publishers are migrated, and add magnets as they are wired.</w:t>
+      </w:r>
+    </w:p>
+    <w:p>
+      <w:pPr>
+        <w:pStyle w:val="Compact"/>
+        <w:numPr>
+          <w:ilvl w:val="1"/>
+          <w:numId w:val="1019"/>
+        </w:numPr>
+      </w:pPr>
+      <w:r>
+        <w:t xml:space="preserve">☐ Rename program 250377 from</w:t>
+      </w:r>
+      <w:r>
+        <w:t xml:space="preserve"> </w:t>
+      </w:r>
+      <w:r>
+        <w:t xml:space="preserve">“Enyrgy - Tired Test (S2S)”</w:t>
+      </w:r>
+      <w:r>
+        <w:t xml:space="preserve"> </w:t>
+      </w:r>
+      <w:r>
+        <w:t xml:space="preserve">to something like</w:t>
+      </w:r>
+      <w:r>
+        <w:t xml:space="preserve"> </w:t>
+      </w:r>
+      <w:r>
+        <w:t xml:space="preserve">“Enyrgy Affiliate Program”</w:t>
+      </w:r>
+      <w:r>
+        <w:t xml:space="preserve">, since it will host all magnets (asked the rep whether renaming is possible).</w:t>
+      </w:r>
+    </w:p>
+    <w:p>
+      <w:pPr>
+        <w:pStyle w:val="Compact"/>
+        <w:numPr>
+          <w:ilvl w:val="0"/>
           <w:numId w:val="1020"/>
         </w:numPr>
       </w:pPr>
       <w:r>
-        <w:t xml:space="preserve">Ask FlexOffers to</w:t>
-      </w:r>
-      <w:r>
-        <w:t xml:space="preserve"> </w:t>
-      </w:r>
-      <w:r>
-        <w:rPr>
-          <w:b/>
-          <w:bCs/>
-        </w:rPr>
-        <w:t xml:space="preserve">surface program 250377</w:t>
-      </w:r>
-      <w:r>
-        <w:t xml:space="preserve"> </w:t>
-      </w:r>
-      <w:r>
-        <w:t xml:space="preserve">to the network and migrate the</w:t>
-      </w:r>
-      <w:r>
-        <w:t xml:space="preserve"> </w:t>
-      </w:r>
-      <w:r>
-        <w:rPr>
-          <w:b/>
-          <w:bCs/>
-        </w:rPr>
-        <w:t xml:space="preserve">124 publishers</w:t>
-      </w:r>
-      <w:r>
-        <w:t xml:space="preserve"> </w:t>
-      </w:r>
-      <w:r>
-        <w:t xml:space="preserve">approved on the old program (#247334). Approvals are per-program, so 250377 has ZERO publishers today and nobody can promote the tracked link.</w:t>
+        <w:rPr>
+          <w:b/>
+          <w:bCs/>
+        </w:rPr>
+        <w:t xml:space="preserve">FlexOffers remaining (waiting on the FlexOffers rep, emailed July 29)</w:t>
       </w:r>
     </w:p>
     <w:p>
@@ -731,33 +1011,35 @@
         </w:numPr>
       </w:pPr>
       <w:r>
-        <w:rPr>
-          <w:b/>
-          <w:bCs/>
-        </w:rPr>
-        <w:t xml:space="preserve">After</w:t>
-      </w:r>
-      <w:r>
-        <w:t xml:space="preserve"> </w:t>
-      </w:r>
-      <w:r>
-        <w:t xml:space="preserve">publishers migrate,</w:t>
-      </w:r>
-      <w:r>
-        <w:t xml:space="preserve"> </w:t>
-      </w:r>
-      <w:r>
-        <w:rPr>
-          <w:b/>
-          <w:bCs/>
-        </w:rPr>
-        <w:t xml:space="preserve">disable old creative #6673701</w:t>
-      </w:r>
-      <w:r>
-        <w:t xml:space="preserve"> </w:t>
-      </w:r>
-      <w:r>
-        <w:t xml:space="preserve">(Tired Test on the old program, no S2S tracking, so anyone promoting it earns nothing and sours the relationship).</w:t>
+        <w:t xml:space="preserve">Get a</w:t>
+      </w:r>
+      <w:r>
+        <w:t xml:space="preserve"> </w:t>
+      </w:r>
+      <w:r>
+        <w:rPr>
+          <w:b/>
+          <w:bCs/>
+        </w:rPr>
+        <w:t xml:space="preserve">test tracking link</w:t>
+      </w:r>
+      <w:r>
+        <w:t xml:space="preserve"> </w:t>
+      </w:r>
+      <w:r>
+        <w:t xml:space="preserve">for 250377, click it, confirm it lands on the quiz with</w:t>
+      </w:r>
+      <w:r>
+        <w:t xml:space="preserve"> </w:t>
+      </w:r>
+      <w:r>
+        <w:rPr>
+          <w:rStyle w:val="VerbatimChar"/>
+        </w:rPr>
+        <w:t xml:space="preserve">?refid=24.…</w:t>
+      </w:r>
+      <w:r>
+        <w:t xml:space="preserve">, complete the quiz, verify the contact’s FlexOffers Refid populates. Free verification of the click-to-capture path.</w:t>
       </w:r>
     </w:p>
     <w:p>
@@ -769,6 +1051,88 @@
         </w:numPr>
       </w:pPr>
       <w:r>
+        <w:t xml:space="preserve">Ask FlexOffers to</w:t>
+      </w:r>
+      <w:r>
+        <w:t xml:space="preserve"> </w:t>
+      </w:r>
+      <w:r>
+        <w:rPr>
+          <w:b/>
+          <w:bCs/>
+        </w:rPr>
+        <w:t xml:space="preserve">surface program 250377</w:t>
+      </w:r>
+      <w:r>
+        <w:t xml:space="preserve"> </w:t>
+      </w:r>
+      <w:r>
+        <w:t xml:space="preserve">to the network and migrate the</w:t>
+      </w:r>
+      <w:r>
+        <w:t xml:space="preserve"> </w:t>
+      </w:r>
+      <w:r>
+        <w:rPr>
+          <w:b/>
+          <w:bCs/>
+        </w:rPr>
+        <w:t xml:space="preserve">124 publishers</w:t>
+      </w:r>
+      <w:r>
+        <w:t xml:space="preserve"> </w:t>
+      </w:r>
+      <w:r>
+        <w:t xml:space="preserve">approved on the old program (#247334). Approvals are per-program, so 250377 has ZERO publishers today and nobody can promote the tracked link.</w:t>
+      </w:r>
+    </w:p>
+    <w:p>
+      <w:pPr>
+        <w:pStyle w:val="Compact"/>
+        <w:numPr>
+          <w:ilvl w:val="1"/>
+          <w:numId w:val="1023"/>
+        </w:numPr>
+      </w:pPr>
+      <w:r>
+        <w:rPr>
+          <w:b/>
+          <w:bCs/>
+        </w:rPr>
+        <w:t xml:space="preserve">After</w:t>
+      </w:r>
+      <w:r>
+        <w:t xml:space="preserve"> </w:t>
+      </w:r>
+      <w:r>
+        <w:t xml:space="preserve">publishers migrate,</w:t>
+      </w:r>
+      <w:r>
+        <w:t xml:space="preserve"> </w:t>
+      </w:r>
+      <w:r>
+        <w:rPr>
+          <w:b/>
+          <w:bCs/>
+        </w:rPr>
+        <w:t xml:space="preserve">disable old creative #6673701</w:t>
+      </w:r>
+      <w:r>
+        <w:t xml:space="preserve"> </w:t>
+      </w:r>
+      <w:r>
+        <w:t xml:space="preserve">(Tired Test on the old program, no S2S tracking, so anyone promoting it earns nothing and sours the relationship).</w:t>
+      </w:r>
+    </w:p>
+    <w:p>
+      <w:pPr>
+        <w:pStyle w:val="Compact"/>
+        <w:numPr>
+          <w:ilvl w:val="1"/>
+          <w:numId w:val="1024"/>
+        </w:numPr>
+      </w:pPr>
+      <w:r>
         <w:rPr>
           <w:b/>
           <w:bCs/>
@@ -859,7 +1223,7 @@
         <w:pStyle w:val="Compact"/>
         <w:numPr>
           <w:ilvl w:val="1"/>
-          <w:numId w:val="1023"/>
+          <w:numId w:val="1025"/>
         </w:numPr>
       </w:pPr>
       <w:r>
@@ -896,7 +1260,7 @@
         <w:pStyle w:val="Compact"/>
         <w:numPr>
           <w:ilvl w:val="0"/>
-          <w:numId w:val="1024"/>
+          <w:numId w:val="1026"/>
         </w:numPr>
       </w:pPr>
       <w:r>
@@ -918,7 +1282,7 @@
         <w:pStyle w:val="Compact"/>
         <w:numPr>
           <w:ilvl w:val="0"/>
-          <w:numId w:val="1025"/>
+          <w:numId w:val="1027"/>
         </w:numPr>
       </w:pPr>
       <w:r>
@@ -949,7 +1313,7 @@
         <w:pStyle w:val="Compact"/>
         <w:numPr>
           <w:ilvl w:val="0"/>
-          <w:numId w:val="1026"/>
+          <w:numId w:val="1028"/>
         </w:numPr>
       </w:pPr>
       <w:r>
@@ -1033,7 +1397,7 @@
         <w:pStyle w:val="Compact"/>
         <w:numPr>
           <w:ilvl w:val="0"/>
-          <w:numId w:val="1027"/>
+          <w:numId w:val="1029"/>
         </w:numPr>
       </w:pPr>
       <w:r>
@@ -1055,7 +1419,7 @@
         <w:pStyle w:val="Compact"/>
         <w:numPr>
           <w:ilvl w:val="0"/>
-          <w:numId w:val="1028"/>
+          <w:numId w:val="1030"/>
         </w:numPr>
       </w:pPr>
       <w:r>
@@ -1077,7 +1441,7 @@
         <w:pStyle w:val="Compact"/>
         <w:numPr>
           <w:ilvl w:val="0"/>
-          <w:numId w:val="1029"/>
+          <w:numId w:val="1031"/>
         </w:numPr>
       </w:pPr>
       <w:r>
@@ -1126,7 +1490,7 @@
         <w:pStyle w:val="Compact"/>
         <w:numPr>
           <w:ilvl w:val="0"/>
-          <w:numId w:val="1030"/>
+          <w:numId w:val="1032"/>
         </w:numPr>
       </w:pPr>
       <w:r>
@@ -1170,7 +1534,7 @@
         <w:pStyle w:val="Compact"/>
         <w:numPr>
           <w:ilvl w:val="0"/>
-          <w:numId w:val="1031"/>
+          <w:numId w:val="1033"/>
         </w:numPr>
       </w:pPr>
       <w:r>
@@ -1192,7 +1556,7 @@
         <w:pStyle w:val="Compact"/>
         <w:numPr>
           <w:ilvl w:val="0"/>
-          <w:numId w:val="1032"/>
+          <w:numId w:val="1034"/>
         </w:numPr>
       </w:pPr>
       <w:r>
@@ -1214,7 +1578,7 @@
         <w:pStyle w:val="Compact"/>
         <w:numPr>
           <w:ilvl w:val="0"/>
-          <w:numId w:val="1033"/>
+          <w:numId w:val="1035"/>
         </w:numPr>
       </w:pPr>
       <w:r>
@@ -1245,7 +1609,7 @@
         <w:pStyle w:val="Compact"/>
         <w:numPr>
           <w:ilvl w:val="0"/>
-          <w:numId w:val="1034"/>
+          <w:numId w:val="1036"/>
         </w:numPr>
       </w:pPr>
       <w:r>
@@ -1267,7 +1631,7 @@
         <w:pStyle w:val="Compact"/>
         <w:numPr>
           <w:ilvl w:val="0"/>
-          <w:numId w:val="1035"/>
+          <w:numId w:val="1037"/>
         </w:numPr>
       </w:pPr>
       <w:r>
@@ -1289,7 +1653,7 @@
         <w:pStyle w:val="Compact"/>
         <w:numPr>
           <w:ilvl w:val="0"/>
-          <w:numId w:val="1036"/>
+          <w:numId w:val="1038"/>
         </w:numPr>
       </w:pPr>
       <w:r>
@@ -1311,7 +1675,7 @@
         <w:pStyle w:val="Compact"/>
         <w:numPr>
           <w:ilvl w:val="0"/>
-          <w:numId w:val="1037"/>
+          <w:numId w:val="1039"/>
         </w:numPr>
       </w:pPr>
       <w:r>
@@ -1394,7 +1758,7 @@
         <w:pStyle w:val="Compact"/>
         <w:numPr>
           <w:ilvl w:val="0"/>
-          <w:numId w:val="1038"/>
+          <w:numId w:val="1040"/>
         </w:numPr>
       </w:pPr>
       <w:r>
@@ -1416,7 +1780,7 @@
         <w:pStyle w:val="Compact"/>
         <w:numPr>
           <w:ilvl w:val="0"/>
-          <w:numId w:val="1039"/>
+          <w:numId w:val="1041"/>
         </w:numPr>
       </w:pPr>
       <w:r>
@@ -1454,7 +1818,7 @@
         <w:pStyle w:val="Compact"/>
         <w:numPr>
           <w:ilvl w:val="0"/>
-          <w:numId w:val="1040"/>
+          <w:numId w:val="1042"/>
         </w:numPr>
       </w:pPr>
       <w:r>
@@ -1476,7 +1840,7 @@
         <w:pStyle w:val="Compact"/>
         <w:numPr>
           <w:ilvl w:val="0"/>
-          <w:numId w:val="1041"/>
+          <w:numId w:val="1043"/>
         </w:numPr>
       </w:pPr>
       <w:r>
@@ -1498,7 +1862,7 @@
         <w:pStyle w:val="Compact"/>
         <w:numPr>
           <w:ilvl w:val="0"/>
-          <w:numId w:val="1042"/>
+          <w:numId w:val="1044"/>
         </w:numPr>
       </w:pPr>
       <w:r>
@@ -1535,7 +1899,7 @@
         <w:pStyle w:val="Compact"/>
         <w:numPr>
           <w:ilvl w:val="0"/>
-          <w:numId w:val="1043"/>
+          <w:numId w:val="1045"/>
         </w:numPr>
       </w:pPr>
       <w:r>
@@ -1557,7 +1921,7 @@
         <w:pStyle w:val="Compact"/>
         <w:numPr>
           <w:ilvl w:val="0"/>
-          <w:numId w:val="1044"/>
+          <w:numId w:val="1046"/>
         </w:numPr>
       </w:pPr>
       <w:r>
@@ -1589,7 +1953,7 @@
         <w:pStyle w:val="Compact"/>
         <w:numPr>
           <w:ilvl w:val="0"/>
-          <w:numId w:val="1045"/>
+          <w:numId w:val="1047"/>
         </w:numPr>
       </w:pPr>
       <w:r>
@@ -1623,7 +1987,7 @@
         <w:pStyle w:val="Compact"/>
         <w:numPr>
           <w:ilvl w:val="0"/>
-          <w:numId w:val="1046"/>
+          <w:numId w:val="1048"/>
         </w:numPr>
       </w:pPr>
       <w:r>
@@ -1645,7 +2009,7 @@
         <w:pStyle w:val="Compact"/>
         <w:numPr>
           <w:ilvl w:val="0"/>
-          <w:numId w:val="1047"/>
+          <w:numId w:val="1049"/>
         </w:numPr>
       </w:pPr>
       <w:r>
@@ -1695,7 +2059,7 @@
         <w:pStyle w:val="Compact"/>
         <w:numPr>
           <w:ilvl w:val="0"/>
-          <w:numId w:val="1048"/>
+          <w:numId w:val="1050"/>
         </w:numPr>
       </w:pPr>
       <w:r>
@@ -1729,7 +2093,7 @@
         <w:pStyle w:val="Compact"/>
         <w:numPr>
           <w:ilvl w:val="0"/>
-          <w:numId w:val="1049"/>
+          <w:numId w:val="1051"/>
         </w:numPr>
       </w:pPr>
       <w:r>
@@ -2010,6 +2374,109 @@
       </w:pPr>
     </w:lvl>
   </w:abstractNum>
+  <w:abstractNum w:abstractNumId="991">
+    <w:nsid w:val="0000A991"/>
+    <w:multiLevelType w:val="multilevel"/>
+    <w:lvl w:ilvl="0">
+      <w:numFmt w:val="bullet"/>
+      <w:lvlText w:val=""/>
+      <w:lvlJc w:val="left"/>
+      <w:pPr>
+        <w:ind w:left="720" w:hanging="360"/>
+      </w:pPr>
+      <w:rPr>
+        <w:rFonts w:ascii="Symbol" w:hAnsi="Symbol" w:cs="Symbol" w:hint="default"/>
+      </w:rPr>
+    </w:lvl>
+    <w:lvl w:ilvl="1">
+      <w:numFmt w:val="bullet"/>
+      <w:lvlText w:val="o"/>
+      <w:lvlJc w:val="left"/>
+      <w:pPr>
+        <w:ind w:left="1440" w:hanging="360"/>
+      </w:pPr>
+      <w:rPr>
+        <w:rFonts w:ascii="Courier New" w:hAnsi="Courier New" w:cs="Courier New" w:hint="default"/>
+      </w:rPr>
+    </w:lvl>
+    <w:lvl w:ilvl="2">
+      <w:numFmt w:val="bullet"/>
+      <w:lvlText w:val=""/>
+      <w:lvlJc w:val="left"/>
+      <w:pPr>
+        <w:ind w:left="2160" w:hanging="360"/>
+      </w:pPr>
+      <w:rPr>
+        <w:rFonts w:ascii="Wingdings" w:hAnsi="Wingdings" w:cs="Wingdings" w:hint="default"/>
+      </w:rPr>
+    </w:lvl>
+    <w:lvl w:ilvl="3">
+      <w:numFmt w:val="bullet"/>
+      <w:lvlText w:val=""/>
+      <w:lvlJc w:val="left"/>
+      <w:pPr>
+        <w:ind w:left="2880" w:hanging="360"/>
+      </w:pPr>
+      <w:rPr>
+        <w:rFonts w:ascii="Symbol" w:hAnsi="Symbol" w:cs="Symbol" w:hint="default"/>
+      </w:rPr>
+    </w:lvl>
+    <w:lvl w:ilvl="4">
+      <w:numFmt w:val="bullet"/>
+      <w:lvlText w:val="o"/>
+      <w:lvlJc w:val="left"/>
+      <w:pPr>
+        <w:ind w:left="3600" w:hanging="360"/>
+      </w:pPr>
+      <w:rPr>
+        <w:rFonts w:ascii="Courier New" w:hAnsi="Courier New" w:cs="Courier New" w:hint="default"/>
+      </w:rPr>
+    </w:lvl>
+    <w:lvl w:ilvl="5">
+      <w:numFmt w:val="bullet"/>
+      <w:lvlText w:val=""/>
+      <w:lvlJc w:val="left"/>
+      <w:pPr>
+        <w:ind w:left="4320" w:hanging="360"/>
+      </w:pPr>
+      <w:rPr>
+        <w:rFonts w:ascii="Wingdings" w:hAnsi="Wingdings" w:cs="Wingdings" w:hint="default"/>
+      </w:rPr>
+    </w:lvl>
+    <w:lvl w:ilvl="6">
+      <w:numFmt w:val="bullet"/>
+      <w:lvlText w:val=""/>
+      <w:lvlJc w:val="left"/>
+      <w:pPr>
+        <w:ind w:left="5040" w:hanging="360"/>
+      </w:pPr>
+      <w:rPr>
+        <w:rFonts w:ascii="Symbol" w:hAnsi="Symbol" w:cs="Symbol" w:hint="default"/>
+      </w:rPr>
+    </w:lvl>
+    <w:lvl w:ilvl="7">
+      <w:numFmt w:val="bullet"/>
+      <w:lvlText w:val="o"/>
+      <w:lvlJc w:val="left"/>
+      <w:pPr>
+        <w:ind w:left="5760" w:hanging="360"/>
+      </w:pPr>
+      <w:rPr>
+        <w:rFonts w:ascii="Courier New" w:hAnsi="Courier New" w:cs="Courier New" w:hint="default"/>
+      </w:rPr>
+    </w:lvl>
+    <w:lvl w:ilvl="8">
+      <w:numFmt w:val="bullet"/>
+      <w:lvlText w:val=""/>
+      <w:lvlJc w:val="left"/>
+      <w:pPr>
+        <w:ind w:left="6480" w:hanging="360"/>
+      </w:pPr>
+      <w:rPr>
+        <w:rFonts w:ascii="Wingdings" w:hAnsi="Wingdings" w:cs="Wingdings" w:hint="default"/>
+      </w:rPr>
+    </w:lvl>
+  </w:abstractNum>
   <w:num w:numId="1000">
     <w:abstractNumId w:val="990"/>
   </w:num>
@@ -2068,7 +2535,7 @@
     <w:abstractNumId w:val="992"/>
   </w:num>
   <w:num w:numId="1019">
-    <w:abstractNumId w:val="992"/>
+    <w:abstractNumId w:val="991"/>
   </w:num>
   <w:num w:numId="1020">
     <w:abstractNumId w:val="992"/>
@@ -2083,28 +2550,28 @@
     <w:abstractNumId w:val="992"/>
   </w:num>
   <w:num w:numId="1024">
+    <w:abstractNumId w:val="992"/>
+  </w:num>
+  <w:num w:numId="1025">
+    <w:abstractNumId w:val="992"/>
+  </w:num>
+  <w:num w:numId="1026">
     <w:abstractNumId w:val="993"/>
   </w:num>
-  <w:num w:numId="1025">
+  <w:num w:numId="1027">
     <w:abstractNumId w:val="993"/>
   </w:num>
-  <w:num w:numId="1026">
+  <w:num w:numId="1028">
     <w:abstractNumId w:val="992"/>
   </w:num>
-  <w:num w:numId="1027">
+  <w:num w:numId="1029">
     <w:abstractNumId w:val="992"/>
   </w:num>
-  <w:num w:numId="1028">
+  <w:num w:numId="1030">
     <w:abstractNumId w:val="993"/>
   </w:num>
-  <w:num w:numId="1029">
+  <w:num w:numId="1031">
     <w:abstractNumId w:val="993"/>
-  </w:num>
-  <w:num w:numId="1030">
-    <w:abstractNumId w:val="992"/>
-  </w:num>
-  <w:num w:numId="1031">
-    <w:abstractNumId w:val="992"/>
   </w:num>
   <w:num w:numId="1032">
     <w:abstractNumId w:val="992"/>
@@ -2119,13 +2586,13 @@
     <w:abstractNumId w:val="992"/>
   </w:num>
   <w:num w:numId="1036">
-    <w:abstractNumId w:val="993"/>
+    <w:abstractNumId w:val="992"/>
   </w:num>
   <w:num w:numId="1037">
     <w:abstractNumId w:val="992"/>
   </w:num>
   <w:num w:numId="1038">
-    <w:abstractNumId w:val="992"/>
+    <w:abstractNumId w:val="993"/>
   </w:num>
   <w:num w:numId="1039">
     <w:abstractNumId w:val="992"/>
@@ -2146,18 +2613,24 @@
     <w:abstractNumId w:val="992"/>
   </w:num>
   <w:num w:numId="1045">
-    <w:abstractNumId w:val="993"/>
+    <w:abstractNumId w:val="992"/>
   </w:num>
   <w:num w:numId="1046">
     <w:abstractNumId w:val="992"/>
   </w:num>
   <w:num w:numId="1047">
-    <w:abstractNumId w:val="992"/>
+    <w:abstractNumId w:val="993"/>
   </w:num>
   <w:num w:numId="1048">
     <w:abstractNumId w:val="992"/>
   </w:num>
   <w:num w:numId="1049">
+    <w:abstractNumId w:val="992"/>
+  </w:num>
+  <w:num w:numId="1050">
+    <w:abstractNumId w:val="992"/>
+  </w:num>
+  <w:num w:numId="1051">
     <w:abstractNumId w:val="992"/>
   </w:num>
 </w:numbering>

</xml_diff>

<commit_message>
FlexOffers: wire Synthesis Gap (magnet 3 of 5), commit page to repo
Co-Authored-By: Claude Opus 4.8 <noreply@anthropic.com>
</commit_message>
<xml_diff>
--- a/Enyrgy_Master_TODO.docx
+++ b/Enyrgy_Master_TODO.docx
@@ -635,7 +635,7 @@
           <w:b/>
           <w:bCs/>
         </w:rPr>
-        <w:t xml:space="preserve">FlexOffers: wire the remaining 3 lead magnets (2 of 5 done)</w:t>
+        <w:t xml:space="preserve">FlexOffers: wire the remaining lead magnets (3 of 5 done)</w:t>
       </w:r>
       <w:r>
         <w:t xml:space="preserve"> </w:t>
@@ -791,7 +791,7 @@
         </w:numPr>
       </w:pPr>
       <w:r>
-        <w:t xml:space="preserve">☐</w:t>
+        <w:t xml:space="preserve">☒</w:t>
       </w:r>
       <w:r>
         <w:t xml:space="preserve"> </w:t>
@@ -828,7 +828,19 @@
         <w:t xml:space="preserve">fd32493c-6ec1-4e55-9edb-75399aa53a34</w:t>
       </w:r>
       <w:r>
-        <w:t xml:space="preserve">)</w:t>
+        <w:t xml:space="preserve">) — page + mapping done and verified July 30. Page in repo at</w:t>
+      </w:r>
+      <w:r>
+        <w:t xml:space="preserve"> </w:t>
+      </w:r>
+      <w:r>
+        <w:rPr>
+          <w:rStyle w:val="VerbatimChar"/>
+        </w:rPr>
+        <w:t xml:space="preserve">lead-magnets/synthesis-gap.html</w:t>
+      </w:r>
+      <w:r>
+        <w:t xml:space="preserve">.</w:t>
       </w:r>
     </w:p>
     <w:p>

</xml_diff>

<commit_message>
FlexOffers: wire Recovery Protocol (magnet 4 of 5), commit page to repo
Co-Authored-By: Claude Opus 4.8 <noreply@anthropic.com>
</commit_message>
<xml_diff>
--- a/Enyrgy_Master_TODO.docx
+++ b/Enyrgy_Master_TODO.docx
@@ -635,7 +635,7 @@
           <w:b/>
           <w:bCs/>
         </w:rPr>
-        <w:t xml:space="preserve">FlexOffers: wire the remaining lead magnets (3 of 5 done)</w:t>
+        <w:t xml:space="preserve">FlexOffers: wire the remaining lead magnets (4 of 5 done)</w:t>
       </w:r>
       <w:r>
         <w:t xml:space="preserve"> </w:t>
@@ -852,7 +852,7 @@
         </w:numPr>
       </w:pPr>
       <w:r>
-        <w:t xml:space="preserve">☐</w:t>
+        <w:t xml:space="preserve">☒</w:t>
       </w:r>
       <w:r>
         <w:t xml:space="preserve"> </w:t>
@@ -889,7 +889,34 @@
         <w:t xml:space="preserve">3ae538d7-81a9-42a7-9e18-5e7c8b19b84a</w:t>
       </w:r>
       <w:r>
-        <w:t xml:space="preserve">)</w:t>
+        <w:t xml:space="preserve">) — page + mapping done and verified July 30. Page in repo at</w:t>
+      </w:r>
+      <w:r>
+        <w:t xml:space="preserve"> </w:t>
+      </w:r>
+      <w:r>
+        <w:rPr>
+          <w:rStyle w:val="VerbatimChar"/>
+        </w:rPr>
+        <w:t xml:space="preserve">lead-magnets/recovery-protocol.html</w:t>
+      </w:r>
+      <w:r>
+        <w:t xml:space="preserve">. Confirmed WF-18 applies</w:t>
+      </w:r>
+      <w:r>
+        <w:t xml:space="preserve"> </w:t>
+      </w:r>
+      <w:r>
+        <w:rPr>
+          <w:rStyle w:val="VerbatimChar"/>
+        </w:rPr>
+        <w:t xml:space="preserve">drip_bypass</w:t>
+      </w:r>
+      <w:r>
+        <w:t xml:space="preserve"> </w:t>
+      </w:r>
+      <w:r>
+        <w:t xml:space="preserve">at the workflow level (the page’s tag list omits it, which is fine).</w:t>
       </w:r>
     </w:p>
     <w:p>

</xml_diff>

<commit_message>
FlexOffers: all 5 lead magnets wired for affiliate attribution
Winter Protocol completes the set. Every magnet page now captures the FlexOffers
refid from the landing URL, persists it to localStorage, and sends it to its
capture webhook; each capture workflow maps it to the contact's FlexOffers Refid
field. All five verified live end to end and committed to lead-magnets/.

WF-30 is magnet-agnostic (fires on the sale), so one postback covers all five.
Documents the one-program-many-campaigns structure and the last-click +
localStorage attribution behavior, including the incognito-session testing gotcha.

Co-Authored-By: Claude Opus 4.8 <noreply@anthropic.com>
</commit_message>
<xml_diff>
--- a/Enyrgy_Master_TODO.docx
+++ b/Enyrgy_Master_TODO.docx
@@ -635,7 +635,7 @@
           <w:b/>
           <w:bCs/>
         </w:rPr>
-        <w:t xml:space="preserve">FlexOffers: wire the remaining lead magnets (4 of 5 done)</w:t>
+        <w:t xml:space="preserve">FlexOffers: ALL 5 LEAD MAGNETS WIRED (July 30)</w:t>
       </w:r>
       <w:r>
         <w:t xml:space="preserve"> </w:t>
@@ -928,7 +928,7 @@
         </w:numPr>
       </w:pPr>
       <w:r>
-        <w:t xml:space="preserve">☐</w:t>
+        <w:t xml:space="preserve">☒</w:t>
       </w:r>
       <w:r>
         <w:t xml:space="preserve"> </w:t>
@@ -965,7 +965,19 @@
         <w:t xml:space="preserve">ad11ef02-14c8-4dbc-b1dd-bb5c9f3203bd</w:t>
       </w:r>
       <w:r>
-        <w:t xml:space="preserve">)</w:t>
+        <w:t xml:space="preserve">) — page + mapping done and verified July 30. Page in repo at</w:t>
+      </w:r>
+      <w:r>
+        <w:t xml:space="preserve"> </w:t>
+      </w:r>
+      <w:r>
+        <w:rPr>
+          <w:rStyle w:val="VerbatimChar"/>
+        </w:rPr>
+        <w:t xml:space="preserve">lead-magnets/winter-protocol.html</w:t>
+      </w:r>
+      <w:r>
+        <w:t xml:space="preserve">.</w:t>
       </w:r>
     </w:p>
     <w:p>
@@ -977,7 +989,34 @@
         </w:numPr>
       </w:pPr>
       <w:r>
-        <w:t xml:space="preserve">NOTE: the three remaining are guides rather than quizzes, so their pages will have simpler forms, but the change is the same three additions.</w:t>
+        <w:t xml:space="preserve">All five pages are version-controlled in</w:t>
+      </w:r>
+      <w:r>
+        <w:t xml:space="preserve"> </w:t>
+      </w:r>
+      <w:r>
+        <w:rPr>
+          <w:rStyle w:val="VerbatimChar"/>
+        </w:rPr>
+        <w:t xml:space="preserve">lead-magnets/</w:t>
+      </w:r>
+      <w:r>
+        <w:t xml:space="preserve">. Each captures</w:t>
+      </w:r>
+      <w:r>
+        <w:t xml:space="preserve"> </w:t>
+      </w:r>
+      <w:r>
+        <w:rPr>
+          <w:rStyle w:val="VerbatimChar"/>
+        </w:rPr>
+        <w:t xml:space="preserve">refid</w:t>
+      </w:r>
+      <w:r>
+        <w:t xml:space="preserve"> </w:t>
+      </w:r>
+      <w:r>
+        <w:t xml:space="preserve">from the URL, persists it to localStorage, sends it to its capture webhook, and the capture workflow maps it to the contact’s FlexOffers Refid field. WF-30 is magnet-agnostic: it fires on the sale, so one postback workflow covers all five.</w:t>
       </w:r>
     </w:p>
     <w:p>
@@ -989,7 +1028,17 @@
         </w:numPr>
       </w:pPr>
       <w:r>
-        <w:t xml:space="preserve">RECOMMENDATION: do not block the affiliate launch on all five. Launch with the Tired Test (fully tested) as soon as publishers are migrated, and add magnets as they are wired.</w:t>
+        <w:rPr>
+          <w:b/>
+          <w:bCs/>
+        </w:rPr>
+        <w:t xml:space="preserve">Attribution behavior (by design):</w:t>
+      </w:r>
+      <w:r>
+        <w:t xml:space="preserve"> </w:t>
+      </w:r>
+      <w:r>
+        <w:t xml:space="preserve">the URL refid always wins; localStorage is the fallback so a visitor who clicks an affiliate link, leaves, and returns later without the link still credits that affiliate. Last-click wins if they later click a different affiliate’s link. NOTE for testing: reusing an incognito session carries localStorage over and can mask a new refid, which produced one confusing test result. Always close all incognito windows before a capture test.</w:t>
       </w:r>
     </w:p>
     <w:p>
@@ -1001,6 +1050,46 @@
         </w:numPr>
       </w:pPr>
       <w:r>
+        <w:t xml:space="preserve">Remaining per magnet: create each one’s FlexOffers</w:t>
+      </w:r>
+      <w:r>
+        <w:t xml:space="preserve"> </w:t>
+      </w:r>
+      <w:r>
+        <w:rPr>
+          <w:b/>
+          <w:bCs/>
+        </w:rPr>
+        <w:t xml:space="preserve">campaign + creative</w:t>
+      </w:r>
+      <w:r>
+        <w:t xml:space="preserve"> </w:t>
+      </w:r>
+      <w:r>
+        <w:t xml:space="preserve">(blocked on the rep confirming the one-program-many-campaigns structure).</w:t>
+      </w:r>
+    </w:p>
+    <w:p>
+      <w:pPr>
+        <w:pStyle w:val="Compact"/>
+        <w:numPr>
+          <w:ilvl w:val="1"/>
+          <w:numId w:val="1019"/>
+        </w:numPr>
+      </w:pPr>
+      <w:r>
+        <w:t xml:space="preserve">RECOMMENDATION: do not block the affiliate launch on all five. Launch with the Tired Test (fully tested) as soon as publishers are migrated, and add magnets as they are wired.</w:t>
+      </w:r>
+    </w:p>
+    <w:p>
+      <w:pPr>
+        <w:pStyle w:val="Compact"/>
+        <w:numPr>
+          <w:ilvl w:val="1"/>
+          <w:numId w:val="1019"/>
+        </w:numPr>
+      </w:pPr>
+      <w:r>
         <w:t xml:space="preserve">☐ Rename program 250377 from</w:t>
       </w:r>
       <w:r>
@@ -1266,32 +1355,142 @@
         </w:numPr>
       </w:pPr>
       <w:r>
-        <w:t xml:space="preserve">Delete test contact</w:t>
-      </w:r>
-      <w:r>
-        <w:t xml:space="preserve"> </w:t>
-      </w:r>
-      <w:r>
-        <w:rPr>
-          <w:b/>
-          <w:bCs/>
-        </w:rPr>
-        <w:t xml:space="preserve">FlexOffers Test2</w:t>
-      </w:r>
-      <w:r>
-        <w:t xml:space="preserve"> </w:t>
-      </w:r>
-      <w:r>
-        <w:t xml:space="preserve">(</w:t>
-      </w:r>
-      <w:r>
-        <w:rPr>
-          <w:rStyle w:val="VerbatimChar"/>
-        </w:rPr>
-        <w:t xml:space="preserve">scott+fotest2@enyrgy.com</w:t>
-      </w:r>
-      <w:r>
-        <w:t xml:space="preserve">) after the postback test. Kept deliberately because it holds a test refid.</w:t>
+        <w:t xml:space="preserve">Delete the FlexOffers test contacts once the postback test is done. Keep ONE (any of them) for that test since it holds a refid; delete the rest:</w:t>
+      </w:r>
+      <w:r>
+        <w:t xml:space="preserve"> </w:t>
+      </w:r>
+      <w:r>
+        <w:rPr>
+          <w:rStyle w:val="VerbatimChar"/>
+        </w:rPr>
+        <w:t xml:space="preserve">scott+fotest2@</w:t>
+      </w:r>
+      <w:r>
+        <w:t xml:space="preserve">,</w:t>
+      </w:r>
+      <w:r>
+        <w:t xml:space="preserve"> </w:t>
+      </w:r>
+      <w:r>
+        <w:rPr>
+          <w:rStyle w:val="VerbatimChar"/>
+        </w:rPr>
+        <w:t xml:space="preserve">scott+vdatest@</w:t>
+      </w:r>
+      <w:r>
+        <w:t xml:space="preserve">,</w:t>
+      </w:r>
+      <w:r>
+        <w:t xml:space="preserve"> </w:t>
+      </w:r>
+      <w:r>
+        <w:rPr>
+          <w:rStyle w:val="VerbatimChar"/>
+        </w:rPr>
+        <w:t xml:space="preserve">scott+vdatest2@</w:t>
+      </w:r>
+      <w:r>
+        <w:t xml:space="preserve">,</w:t>
+      </w:r>
+      <w:r>
+        <w:t xml:space="preserve"> </w:t>
+      </w:r>
+      <w:r>
+        <w:rPr>
+          <w:rStyle w:val="VerbatimChar"/>
+        </w:rPr>
+        <w:t xml:space="preserve">scott+sgtest@</w:t>
+      </w:r>
+      <w:r>
+        <w:t xml:space="preserve">,</w:t>
+      </w:r>
+      <w:r>
+        <w:t xml:space="preserve"> </w:t>
+      </w:r>
+      <w:r>
+        <w:rPr>
+          <w:rStyle w:val="VerbatimChar"/>
+        </w:rPr>
+        <w:t xml:space="preserve">scott+sgtest2@</w:t>
+      </w:r>
+      <w:r>
+        <w:t xml:space="preserve">,</w:t>
+      </w:r>
+      <w:r>
+        <w:t xml:space="preserve"> </w:t>
+      </w:r>
+      <w:r>
+        <w:rPr>
+          <w:rStyle w:val="VerbatimChar"/>
+        </w:rPr>
+        <w:t xml:space="preserve">scott+rptest@</w:t>
+      </w:r>
+      <w:r>
+        <w:t xml:space="preserve">,</w:t>
+      </w:r>
+      <w:r>
+        <w:t xml:space="preserve"> </w:t>
+      </w:r>
+      <w:r>
+        <w:rPr>
+          <w:rStyle w:val="VerbatimChar"/>
+        </w:rPr>
+        <w:t xml:space="preserve">scott+rptest2@</w:t>
+      </w:r>
+      <w:r>
+        <w:t xml:space="preserve">,</w:t>
+      </w:r>
+      <w:r>
+        <w:t xml:space="preserve"> </w:t>
+      </w:r>
+      <w:r>
+        <w:rPr>
+          <w:rStyle w:val="VerbatimChar"/>
+        </w:rPr>
+        <w:t xml:space="preserve">scott+rptest3@</w:t>
+      </w:r>
+      <w:r>
+        <w:t xml:space="preserve">,</w:t>
+      </w:r>
+      <w:r>
+        <w:t xml:space="preserve"> </w:t>
+      </w:r>
+      <w:r>
+        <w:rPr>
+          <w:rStyle w:val="VerbatimChar"/>
+        </w:rPr>
+        <w:t xml:space="preserve">scott+wptest@</w:t>
+      </w:r>
+      <w:r>
+        <w:t xml:space="preserve">,</w:t>
+      </w:r>
+      <w:r>
+        <w:t xml:space="preserve"> </w:t>
+      </w:r>
+      <w:r>
+        <w:rPr>
+          <w:rStyle w:val="VerbatimChar"/>
+        </w:rPr>
+        <w:t xml:space="preserve">scott+wptest2@</w:t>
+      </w:r>
+      <w:r>
+        <w:t xml:space="preserve"> </w:t>
+      </w:r>
+      <w:r>
+        <w:t xml:space="preserve">(all</w:t>
+      </w:r>
+      <w:r>
+        <w:t xml:space="preserve"> </w:t>
+      </w:r>
+      <w:r>
+        <w:rPr>
+          <w:rStyle w:val="VerbatimChar"/>
+        </w:rPr>
+        <w:t xml:space="preserve">@enyrgy.com</w:t>
+      </w:r>
+      <w:r>
+        <w:t xml:space="preserve">). They sit in the live pipeline and are enrolled in nurture sequences.</w:t>
       </w:r>
     </w:p>
     <w:p>
@@ -2571,7 +2770,7 @@
     <w:abstractNumId w:val="993"/>
   </w:num>
   <w:num w:numId="1018">
-    <w:abstractNumId w:val="992"/>
+    <w:abstractNumId w:val="993"/>
   </w:num>
   <w:num w:numId="1019">
     <w:abstractNumId w:val="991"/>

</xml_diff>

<commit_message>
First-in attribution on all 5 capture workflows; fix false SMS consent tagging
Attribution policy set to first-in (first affiliate to introduce the prospect keeps
the $600) via an end-of-workflow guard on WF-12/15/18/19/21. Records the GHL rule
that condition branches never rejoin, so the guard must be last - violating it on
WF-12 briefly swallowed the tagging and would have stopped emails.

Separately, found and fixed a real compliance bug: WF-12's static Add Tag applied
sms_consent_given to EVERY Tired Test lead regardless of whether they consented.
Removed from the static list and added a Dynamic Add Tag reading the payload, which
also restored low_sun_exposure / tired_test_seasonal / source_flexoffers that were
never landing. WF-21 still to verify for the same pattern.

Co-Authored-By: Claude Opus 4.8 <noreply@anthropic.com>
</commit_message>
<xml_diff>
--- a/Enyrgy_Master_TODO.docx
+++ b/Enyrgy_Master_TODO.docx
@@ -1032,13 +1032,13 @@
           <w:b/>
           <w:bCs/>
         </w:rPr>
-        <w:t xml:space="preserve">Attribution behavior (by design):</w:t>
-      </w:r>
-      <w:r>
-        <w:t xml:space="preserve"> </w:t>
-      </w:r>
-      <w:r>
-        <w:t xml:space="preserve">the URL refid always wins; localStorage is the fallback so a visitor who clicks an affiliate link, leaves, and returns later without the link still credits that affiliate. Last-click wins if they later click a different affiliate’s link. NOTE for testing: reusing an incognito session carries localStorage over and can mask a new refid, which produced one confusing test result. Always close all incognito windows before a capture test.</w:t>
+        <w:t xml:space="preserve">Attribution behavior (two layers, do not confuse them):</w:t>
+      </w:r>
+      <w:r>
+        <w:t xml:space="preserve"> </w:t>
+      </w:r>
+      <w:r>
+        <w:t xml:space="preserve">(1) ON THE PAGE, the URL refid always wins and localStorage is the fallback, so a visitor who clicks an affiliate link, leaves, and returns later without the link still carries that refid to the form. (2) IN GHL, the FIRST-IN guard means whichever refid reaches the contact record first is the one that sticks permanently, even if a different affiliate’s refid arrives months later. Net effect: first affiliate to introduce the prospect keeps the $600. NOTE for testing: reusing an incognito session carries localStorage over and can mask a new refid, which produced one confusing test result. Always close all incognito windows before a capture test.</w:t>
       </w:r>
     </w:p>
     <w:p>
@@ -1127,7 +1127,25 @@
           <w:b/>
           <w:bCs/>
         </w:rPr>
-        <w:t xml:space="preserve">FlexOffers remaining (waiting on the FlexOffers rep, emailed July 29)</w:t>
+        <w:t xml:space="preserve">FlexOffers attribution policy: FIRST-IN, implemented on all 5 capture workflows (July 30).</w:t>
+      </w:r>
+      <w:r>
+        <w:t xml:space="preserve"> </w:t>
+      </w:r>
+      <w:r>
+        <w:t xml:space="preserve">Business decision: the FIRST affiliate to introduce a prospect keeps the credit, not the last. Rationale: Enyrgy does the selling, so an affiliate’s real contribution is the introduction. Implementation per workflow: the refid is NO LONGER mapped in Create Contact (that would overwrite unconditionally and make the guard a no-op); instead a guard sits at the END of each workflow:</w:t>
+      </w:r>
+      <w:r>
+        <w:t xml:space="preserve"> </w:t>
+      </w:r>
+      <w:r>
+        <w:rPr>
+          <w:rStyle w:val="VerbatimChar"/>
+        </w:rPr>
+        <w:t xml:space="preserve">If FlexOffers Refid is empty -&gt; Update contact field -&gt; FlexOffers Refid = {{inboundWebhookRequest.flexoffers_refid}}</w:t>
+      </w:r>
+      <w:r>
+        <w:t xml:space="preserve">. Done on WF-12, WF-15, WF-18, WF-19, WF-21.</w:t>
       </w:r>
     </w:p>
     <w:p>
@@ -1139,6 +1157,281 @@
         </w:numPr>
       </w:pPr>
       <w:r>
+        <w:rPr>
+          <w:b/>
+          <w:bCs/>
+        </w:rPr>
+        <w:t xml:space="preserve">CRITICAL PLACEMENT RULE:</w:t>
+      </w:r>
+      <w:r>
+        <w:t xml:space="preserve"> </w:t>
+      </w:r>
+      <w:r>
+        <w:t xml:space="preserve">GHL condition branches never rejoin, so the guard MUST be the last thing in the workflow. Inserting it mid-flow swallows everything downstream into the Yes branch. This actually happened on WF-12 (tags and the seasonal logic ended up inside the branch, so any contact that already had a refid would have received no tags and therefore no emails). Reverted and rebuilt correctly.</w:t>
+      </w:r>
+    </w:p>
+    <w:p>
+      <w:pPr>
+        <w:pStyle w:val="Compact"/>
+        <w:numPr>
+          <w:ilvl w:val="1"/>
+          <w:numId w:val="1021"/>
+        </w:numPr>
+      </w:pPr>
+      <w:r>
+        <w:t xml:space="preserve">Two redundant conditions were removed to make the guard placement clean, both confirmed redundant by inspection first: WF-21’s risk-band Condition and WF-12’s seasonal Condition. Both re-applied tags that the page already sends in its payload and that a Dynamic Add Tag (</w:t>
+      </w:r>
+      <w:r>
+        <w:rPr>
+          <w:rStyle w:val="VerbatimChar"/>
+        </w:rPr>
+        <w:t xml:space="preserve">{{inboundWebhookRequest.tags}}</w:t>
+      </w:r>
+      <w:r>
+        <w:t xml:space="preserve">) applies.</w:t>
+      </w:r>
+    </w:p>
+    <w:p>
+      <w:pPr>
+        <w:pStyle w:val="Compact"/>
+        <w:numPr>
+          <w:ilvl w:val="1"/>
+          <w:numId w:val="1021"/>
+        </w:numPr>
+      </w:pPr>
+      <w:r>
+        <w:rPr>
+          <w:b/>
+          <w:bCs/>
+        </w:rPr>
+        <w:t xml:space="preserve">TELL PUBLISHERS.</w:t>
+      </w:r>
+      <w:r>
+        <w:t xml:space="preserve"> </w:t>
+      </w:r>
+      <w:r>
+        <w:t xml:space="preserve">Last-click is the industry default, so first-in must be stated explicitly in the program terms and the Message Center newsletter, or it becomes a dispute pointed at Enyrgy.</w:t>
+      </w:r>
+    </w:p>
+    <w:p>
+      <w:pPr>
+        <w:pStyle w:val="Compact"/>
+        <w:numPr>
+          <w:ilvl w:val="1"/>
+          <w:numId w:val="1021"/>
+        </w:numPr>
+      </w:pPr>
+      <w:r>
+        <w:t xml:space="preserve">OPEN DECISION: an existing customer or long-time organic lead who clicks an affiliate link would have an empty refid and so would credit that affiliate $600 for someone already in the database. A known affiliate leak. Not addressed; decide whether to exclude.</w:t>
+      </w:r>
+    </w:p>
+    <w:p>
+      <w:pPr>
+        <w:pStyle w:val="Compact"/>
+        <w:numPr>
+          <w:ilvl w:val="0"/>
+          <w:numId w:val="1022"/>
+        </w:numPr>
+      </w:pPr>
+      <w:r>
+        <w:rPr>
+          <w:b/>
+          <w:bCs/>
+        </w:rPr>
+        <w:t xml:space="preserve">COMPLIANCE FIX:</w:t>
+      </w:r>
+      <w:r>
+        <w:rPr>
+          <w:b/>
+          <w:bCs/>
+        </w:rPr>
+        <w:t xml:space="preserve"> </w:t>
+      </w:r>
+      <w:r>
+        <w:rPr>
+          <w:rStyle w:val="VerbatimChar"/>
+          <w:b/>
+          <w:bCs/>
+        </w:rPr>
+        <w:t xml:space="preserve">sms_consent_given</w:t>
+      </w:r>
+      <w:r>
+        <w:rPr>
+          <w:b/>
+          <w:bCs/>
+        </w:rPr>
+        <w:t xml:space="preserve"> </w:t>
+      </w:r>
+      <w:r>
+        <w:rPr>
+          <w:b/>
+          <w:bCs/>
+        </w:rPr>
+        <w:t xml:space="preserve">was being applied to EVERY Tired Test lead (July 30).</w:t>
+      </w:r>
+      <w:r>
+        <w:t xml:space="preserve"> </w:t>
+      </w:r>
+      <w:r>
+        <w:t xml:space="preserve">WF-12’s static Add Tag included</w:t>
+      </w:r>
+      <w:r>
+        <w:t xml:space="preserve"> </w:t>
+      </w:r>
+      <w:r>
+        <w:rPr>
+          <w:rStyle w:val="VerbatimChar"/>
+        </w:rPr>
+        <w:t xml:space="preserve">sms_consent_given</w:t>
+      </w:r>
+      <w:r>
+        <w:t xml:space="preserve"> </w:t>
+      </w:r>
+      <w:r>
+        <w:t xml:space="preserve">in its always-on list, so every lead was tagged as an SMS opt-in regardless of whether they checked the consent box or supplied a phone number. Real TCPA/A2P exposure, especially with the toll-free now live. FIX: removed it from the static list and added a Dynamic Add Tag reading</w:t>
+      </w:r>
+      <w:r>
+        <w:t xml:space="preserve"> </w:t>
+      </w:r>
+      <w:r>
+        <w:rPr>
+          <w:rStyle w:val="VerbatimChar"/>
+        </w:rPr>
+        <w:t xml:space="preserve">{{inboundWebhookRequest.tags}}</w:t>
+      </w:r>
+      <w:r>
+        <w:t xml:space="preserve">, so consent lands only when the page actually sends it. This also closed a second gap: WF-12 had NO dynamic tag action at all, so the page’s other conditional tags (</w:t>
+      </w:r>
+      <w:r>
+        <w:rPr>
+          <w:rStyle w:val="VerbatimChar"/>
+        </w:rPr>
+        <w:t xml:space="preserve">low_sun_exposure</w:t>
+      </w:r>
+      <w:r>
+        <w:t xml:space="preserve">,</w:t>
+      </w:r>
+      <w:r>
+        <w:t xml:space="preserve"> </w:t>
+      </w:r>
+      <w:r>
+        <w:rPr>
+          <w:rStyle w:val="VerbatimChar"/>
+        </w:rPr>
+        <w:t xml:space="preserve">tired_test_seasonal</w:t>
+      </w:r>
+      <w:r>
+        <w:t xml:space="preserve">,</w:t>
+      </w:r>
+      <w:r>
+        <w:t xml:space="preserve"> </w:t>
+      </w:r>
+      <w:r>
+        <w:rPr>
+          <w:rStyle w:val="VerbatimChar"/>
+        </w:rPr>
+        <w:t xml:space="preserve">source_flexoffers</w:t>
+      </w:r>
+      <w:r>
+        <w:t xml:space="preserve">) were never landing either.</w:t>
+      </w:r>
+    </w:p>
+    <w:p>
+      <w:pPr>
+        <w:pStyle w:val="Compact"/>
+        <w:numPr>
+          <w:ilvl w:val="0"/>
+          <w:numId w:val="1023"/>
+        </w:numPr>
+      </w:pPr>
+      <w:r>
+        <w:rPr>
+          <w:b/>
+          <w:bCs/>
+        </w:rPr>
+        <w:t xml:space="preserve">VERIFY WF-21 for the same false-consent bug</w:t>
+      </w:r>
+      <w:r>
+        <w:t xml:space="preserve"> </w:t>
+      </w:r>
+      <w:r>
+        <w:t xml:space="preserve">— expand its static Add Tag list (showed</w:t>
+      </w:r>
+      <w:r>
+        <w:t xml:space="preserve"> </w:t>
+      </w:r>
+      <w:r>
+        <w:rPr>
+          <w:rStyle w:val="VerbatimChar"/>
+        </w:rPr>
+        <w:t xml:space="preserve">type_consumer, source_lead_magnet, status_new, +3</w:t>
+      </w:r>
+      <w:r>
+        <w:t xml:space="preserve">). The Vitamin D Assessment page also collects phone and SMS consent conditionally. If</w:t>
+      </w:r>
+      <w:r>
+        <w:t xml:space="preserve"> </w:t>
+      </w:r>
+      <w:r>
+        <w:rPr>
+          <w:rStyle w:val="VerbatimChar"/>
+        </w:rPr>
+        <w:t xml:space="preserve">sms_consent_given</w:t>
+      </w:r>
+      <w:r>
+        <w:t xml:space="preserve"> </w:t>
+      </w:r>
+      <w:r>
+        <w:t xml:space="preserve">is in that static list, remove it (WF-21 already has a Dynamic Add Tag, so consent will then land correctly on its own).</w:t>
+      </w:r>
+    </w:p>
+    <w:p>
+      <w:pPr>
+        <w:pStyle w:val="Compact"/>
+        <w:numPr>
+          <w:ilvl w:val="0"/>
+          <w:numId w:val="1024"/>
+        </w:numPr>
+      </w:pPr>
+      <w:r>
+        <w:rPr>
+          <w:b/>
+          <w:bCs/>
+        </w:rPr>
+        <w:t xml:space="preserve">Audit the other capture workflows for the same pattern</w:t>
+      </w:r>
+      <w:r>
+        <w:t xml:space="preserve"> </w:t>
+      </w:r>
+      <w:r>
+        <w:t xml:space="preserve">— WF-15/18/19 pages do not collect phone or SMS consent, so they are not exposed, but confirm no other conditional tag is being applied unconditionally anywhere.</w:t>
+      </w:r>
+    </w:p>
+    <w:p>
+      <w:pPr>
+        <w:pStyle w:val="Compact"/>
+        <w:numPr>
+          <w:ilvl w:val="0"/>
+          <w:numId w:val="1025"/>
+        </w:numPr>
+      </w:pPr>
+      <w:r>
+        <w:rPr>
+          <w:b/>
+          <w:bCs/>
+        </w:rPr>
+        <w:t xml:space="preserve">FlexOffers remaining (waiting on the FlexOffers rep, emailed July 29)</w:t>
+      </w:r>
+    </w:p>
+    <w:p>
+      <w:pPr>
+        <w:pStyle w:val="Compact"/>
+        <w:numPr>
+          <w:ilvl w:val="1"/>
+          <w:numId w:val="1026"/>
+        </w:numPr>
+      </w:pPr>
+      <w:r>
         <w:t xml:space="preserve">Get a</w:t>
       </w:r>
       <w:r>
@@ -1175,7 +1468,7 @@
         <w:pStyle w:val="Compact"/>
         <w:numPr>
           <w:ilvl w:val="1"/>
-          <w:numId w:val="1022"/>
+          <w:numId w:val="1027"/>
         </w:numPr>
       </w:pPr>
       <w:r>
@@ -1219,7 +1512,7 @@
         <w:pStyle w:val="Compact"/>
         <w:numPr>
           <w:ilvl w:val="1"/>
-          <w:numId w:val="1023"/>
+          <w:numId w:val="1028"/>
         </w:numPr>
       </w:pPr>
       <w:r>
@@ -1257,7 +1550,7 @@
         <w:pStyle w:val="Compact"/>
         <w:numPr>
           <w:ilvl w:val="1"/>
-          <w:numId w:val="1024"/>
+          <w:numId w:val="1029"/>
         </w:numPr>
       </w:pPr>
       <w:r>
@@ -1351,7 +1644,7 @@
         <w:pStyle w:val="Compact"/>
         <w:numPr>
           <w:ilvl w:val="1"/>
-          <w:numId w:val="1025"/>
+          <w:numId w:val="1030"/>
         </w:numPr>
       </w:pPr>
       <w:r>
@@ -1498,7 +1791,7 @@
         <w:pStyle w:val="Compact"/>
         <w:numPr>
           <w:ilvl w:val="0"/>
-          <w:numId w:val="1026"/>
+          <w:numId w:val="1031"/>
         </w:numPr>
       </w:pPr>
       <w:r>
@@ -1520,7 +1813,7 @@
         <w:pStyle w:val="Compact"/>
         <w:numPr>
           <w:ilvl w:val="0"/>
-          <w:numId w:val="1027"/>
+          <w:numId w:val="1032"/>
         </w:numPr>
       </w:pPr>
       <w:r>
@@ -1551,7 +1844,7 @@
         <w:pStyle w:val="Compact"/>
         <w:numPr>
           <w:ilvl w:val="0"/>
-          <w:numId w:val="1028"/>
+          <w:numId w:val="1033"/>
         </w:numPr>
       </w:pPr>
       <w:r>
@@ -1635,7 +1928,7 @@
         <w:pStyle w:val="Compact"/>
         <w:numPr>
           <w:ilvl w:val="0"/>
-          <w:numId w:val="1029"/>
+          <w:numId w:val="1034"/>
         </w:numPr>
       </w:pPr>
       <w:r>
@@ -1657,7 +1950,7 @@
         <w:pStyle w:val="Compact"/>
         <w:numPr>
           <w:ilvl w:val="0"/>
-          <w:numId w:val="1030"/>
+          <w:numId w:val="1035"/>
         </w:numPr>
       </w:pPr>
       <w:r>
@@ -1679,7 +1972,7 @@
         <w:pStyle w:val="Compact"/>
         <w:numPr>
           <w:ilvl w:val="0"/>
-          <w:numId w:val="1031"/>
+          <w:numId w:val="1036"/>
         </w:numPr>
       </w:pPr>
       <w:r>
@@ -1728,7 +2021,7 @@
         <w:pStyle w:val="Compact"/>
         <w:numPr>
           <w:ilvl w:val="0"/>
-          <w:numId w:val="1032"/>
+          <w:numId w:val="1037"/>
         </w:numPr>
       </w:pPr>
       <w:r>
@@ -1772,7 +2065,7 @@
         <w:pStyle w:val="Compact"/>
         <w:numPr>
           <w:ilvl w:val="0"/>
-          <w:numId w:val="1033"/>
+          <w:numId w:val="1038"/>
         </w:numPr>
       </w:pPr>
       <w:r>
@@ -1794,7 +2087,7 @@
         <w:pStyle w:val="Compact"/>
         <w:numPr>
           <w:ilvl w:val="0"/>
-          <w:numId w:val="1034"/>
+          <w:numId w:val="1039"/>
         </w:numPr>
       </w:pPr>
       <w:r>
@@ -1816,7 +2109,7 @@
         <w:pStyle w:val="Compact"/>
         <w:numPr>
           <w:ilvl w:val="0"/>
-          <w:numId w:val="1035"/>
+          <w:numId w:val="1040"/>
         </w:numPr>
       </w:pPr>
       <w:r>
@@ -1847,7 +2140,7 @@
         <w:pStyle w:val="Compact"/>
         <w:numPr>
           <w:ilvl w:val="0"/>
-          <w:numId w:val="1036"/>
+          <w:numId w:val="1041"/>
         </w:numPr>
       </w:pPr>
       <w:r>
@@ -1869,7 +2162,7 @@
         <w:pStyle w:val="Compact"/>
         <w:numPr>
           <w:ilvl w:val="0"/>
-          <w:numId w:val="1037"/>
+          <w:numId w:val="1042"/>
         </w:numPr>
       </w:pPr>
       <w:r>
@@ -1891,7 +2184,7 @@
         <w:pStyle w:val="Compact"/>
         <w:numPr>
           <w:ilvl w:val="0"/>
-          <w:numId w:val="1038"/>
+          <w:numId w:val="1043"/>
         </w:numPr>
       </w:pPr>
       <w:r>
@@ -1913,7 +2206,7 @@
         <w:pStyle w:val="Compact"/>
         <w:numPr>
           <w:ilvl w:val="0"/>
-          <w:numId w:val="1039"/>
+          <w:numId w:val="1044"/>
         </w:numPr>
       </w:pPr>
       <w:r>
@@ -1996,7 +2289,7 @@
         <w:pStyle w:val="Compact"/>
         <w:numPr>
           <w:ilvl w:val="0"/>
-          <w:numId w:val="1040"/>
+          <w:numId w:val="1045"/>
         </w:numPr>
       </w:pPr>
       <w:r>
@@ -2018,7 +2311,7 @@
         <w:pStyle w:val="Compact"/>
         <w:numPr>
           <w:ilvl w:val="0"/>
-          <w:numId w:val="1041"/>
+          <w:numId w:val="1046"/>
         </w:numPr>
       </w:pPr>
       <w:r>
@@ -2056,7 +2349,7 @@
         <w:pStyle w:val="Compact"/>
         <w:numPr>
           <w:ilvl w:val="0"/>
-          <w:numId w:val="1042"/>
+          <w:numId w:val="1047"/>
         </w:numPr>
       </w:pPr>
       <w:r>
@@ -2078,7 +2371,7 @@
         <w:pStyle w:val="Compact"/>
         <w:numPr>
           <w:ilvl w:val="0"/>
-          <w:numId w:val="1043"/>
+          <w:numId w:val="1048"/>
         </w:numPr>
       </w:pPr>
       <w:r>
@@ -2100,7 +2393,7 @@
         <w:pStyle w:val="Compact"/>
         <w:numPr>
           <w:ilvl w:val="0"/>
-          <w:numId w:val="1044"/>
+          <w:numId w:val="1049"/>
         </w:numPr>
       </w:pPr>
       <w:r>
@@ -2137,7 +2430,7 @@
         <w:pStyle w:val="Compact"/>
         <w:numPr>
           <w:ilvl w:val="0"/>
-          <w:numId w:val="1045"/>
+          <w:numId w:val="1050"/>
         </w:numPr>
       </w:pPr>
       <w:r>
@@ -2159,7 +2452,7 @@
         <w:pStyle w:val="Compact"/>
         <w:numPr>
           <w:ilvl w:val="0"/>
-          <w:numId w:val="1046"/>
+          <w:numId w:val="1051"/>
         </w:numPr>
       </w:pPr>
       <w:r>
@@ -2191,7 +2484,7 @@
         <w:pStyle w:val="Compact"/>
         <w:numPr>
           <w:ilvl w:val="0"/>
-          <w:numId w:val="1047"/>
+          <w:numId w:val="1052"/>
         </w:numPr>
       </w:pPr>
       <w:r>
@@ -2225,7 +2518,7 @@
         <w:pStyle w:val="Compact"/>
         <w:numPr>
           <w:ilvl w:val="0"/>
-          <w:numId w:val="1048"/>
+          <w:numId w:val="1053"/>
         </w:numPr>
       </w:pPr>
       <w:r>
@@ -2247,7 +2540,7 @@
         <w:pStyle w:val="Compact"/>
         <w:numPr>
           <w:ilvl w:val="0"/>
-          <w:numId w:val="1049"/>
+          <w:numId w:val="1054"/>
         </w:numPr>
       </w:pPr>
       <w:r>
@@ -2297,7 +2590,7 @@
         <w:pStyle w:val="Compact"/>
         <w:numPr>
           <w:ilvl w:val="0"/>
-          <w:numId w:val="1050"/>
+          <w:numId w:val="1055"/>
         </w:numPr>
       </w:pPr>
       <w:r>
@@ -2331,7 +2624,7 @@
         <w:pStyle w:val="Compact"/>
         <w:numPr>
           <w:ilvl w:val="0"/>
-          <w:numId w:val="1051"/>
+          <w:numId w:val="1056"/>
         </w:numPr>
       </w:pPr>
       <w:r>
@@ -2776,13 +3069,13 @@
     <w:abstractNumId w:val="991"/>
   </w:num>
   <w:num w:numId="1020">
-    <w:abstractNumId w:val="992"/>
+    <w:abstractNumId w:val="993"/>
   </w:num>
   <w:num w:numId="1021">
-    <w:abstractNumId w:val="992"/>
+    <w:abstractNumId w:val="991"/>
   </w:num>
   <w:num w:numId="1022">
-    <w:abstractNumId w:val="992"/>
+    <w:abstractNumId w:val="993"/>
   </w:num>
   <w:num w:numId="1023">
     <w:abstractNumId w:val="992"/>
@@ -2794,10 +3087,10 @@
     <w:abstractNumId w:val="992"/>
   </w:num>
   <w:num w:numId="1026">
-    <w:abstractNumId w:val="993"/>
+    <w:abstractNumId w:val="992"/>
   </w:num>
   <w:num w:numId="1027">
-    <w:abstractNumId w:val="993"/>
+    <w:abstractNumId w:val="992"/>
   </w:num>
   <w:num w:numId="1028">
     <w:abstractNumId w:val="992"/>
@@ -2806,13 +3099,13 @@
     <w:abstractNumId w:val="992"/>
   </w:num>
   <w:num w:numId="1030">
-    <w:abstractNumId w:val="993"/>
+    <w:abstractNumId w:val="992"/>
   </w:num>
   <w:num w:numId="1031">
     <w:abstractNumId w:val="993"/>
   </w:num>
   <w:num w:numId="1032">
-    <w:abstractNumId w:val="992"/>
+    <w:abstractNumId w:val="993"/>
   </w:num>
   <w:num w:numId="1033">
     <w:abstractNumId w:val="992"/>
@@ -2821,16 +3114,16 @@
     <w:abstractNumId w:val="992"/>
   </w:num>
   <w:num w:numId="1035">
-    <w:abstractNumId w:val="992"/>
+    <w:abstractNumId w:val="993"/>
   </w:num>
   <w:num w:numId="1036">
-    <w:abstractNumId w:val="992"/>
+    <w:abstractNumId w:val="993"/>
   </w:num>
   <w:num w:numId="1037">
     <w:abstractNumId w:val="992"/>
   </w:num>
   <w:num w:numId="1038">
-    <w:abstractNumId w:val="993"/>
+    <w:abstractNumId w:val="992"/>
   </w:num>
   <w:num w:numId="1039">
     <w:abstractNumId w:val="992"/>
@@ -2845,7 +3138,7 @@
     <w:abstractNumId w:val="992"/>
   </w:num>
   <w:num w:numId="1043">
-    <w:abstractNumId w:val="992"/>
+    <w:abstractNumId w:val="993"/>
   </w:num>
   <w:num w:numId="1044">
     <w:abstractNumId w:val="992"/>
@@ -2857,7 +3150,7 @@
     <w:abstractNumId w:val="992"/>
   </w:num>
   <w:num w:numId="1047">
-    <w:abstractNumId w:val="993"/>
+    <w:abstractNumId w:val="992"/>
   </w:num>
   <w:num w:numId="1048">
     <w:abstractNumId w:val="992"/>
@@ -2869,6 +3162,21 @@
     <w:abstractNumId w:val="992"/>
   </w:num>
   <w:num w:numId="1051">
+    <w:abstractNumId w:val="992"/>
+  </w:num>
+  <w:num w:numId="1052">
+    <w:abstractNumId w:val="993"/>
+  </w:num>
+  <w:num w:numId="1053">
+    <w:abstractNumId w:val="992"/>
+  </w:num>
+  <w:num w:numId="1054">
+    <w:abstractNumId w:val="992"/>
+  </w:num>
+  <w:num w:numId="1055">
+    <w:abstractNumId w:val="992"/>
+  </w:num>
+  <w:num w:numId="1056">
     <w:abstractNumId w:val="992"/>
   </w:num>
 </w:numbering>

</xml_diff>

<commit_message>
WF-21 verified clean: no false sms_consent_given (bug was WF-12 only)
Co-Authored-By: Claude Opus 4.8 <noreply@anthropic.com>
</commit_message>
<xml_diff>
--- a/Enyrgy_Master_TODO.docx
+++ b/Enyrgy_Master_TODO.docx
@@ -1349,13 +1349,94 @@
           <w:b/>
           <w:bCs/>
         </w:rPr>
-        <w:t xml:space="preserve">VERIFY WF-21 for the same false-consent bug</w:t>
-      </w:r>
-      <w:r>
-        <w:t xml:space="preserve"> </w:t>
-      </w:r>
-      <w:r>
-        <w:t xml:space="preserve">— expand its static Add Tag list (showed</w:t>
+        <w:t xml:space="preserve">WF-21 VERIFIED CLEAN (July 30)</w:t>
+      </w:r>
+      <w:r>
+        <w:t xml:space="preserve"> </w:t>
+      </w:r>
+      <w:r>
+        <w:t xml:space="preserve">— its static Add Tag holds only legitimately always-on tags (</w:t>
+      </w:r>
+      <w:r>
+        <w:rPr>
+          <w:rStyle w:val="VerbatimChar"/>
+        </w:rPr>
+        <w:t xml:space="preserve">type_consumer</w:t>
+      </w:r>
+      <w:r>
+        <w:t xml:space="preserve">,</w:t>
+      </w:r>
+      <w:r>
+        <w:t xml:space="preserve"> </w:t>
+      </w:r>
+      <w:r>
+        <w:rPr>
+          <w:rStyle w:val="VerbatimChar"/>
+        </w:rPr>
+        <w:t xml:space="preserve">source_lead_magnet</w:t>
+      </w:r>
+      <w:r>
+        <w:t xml:space="preserve">,</w:t>
+      </w:r>
+      <w:r>
+        <w:t xml:space="preserve"> </w:t>
+      </w:r>
+      <w:r>
+        <w:rPr>
+          <w:rStyle w:val="VerbatimChar"/>
+        </w:rPr>
+        <w:t xml:space="preserve">status_new</w:t>
+      </w:r>
+      <w:r>
+        <w:t xml:space="preserve">,</w:t>
+      </w:r>
+      <w:r>
+        <w:t xml:space="preserve"> </w:t>
+      </w:r>
+      <w:r>
+        <w:rPr>
+          <w:rStyle w:val="VerbatimChar"/>
+        </w:rPr>
+        <w:t xml:space="preserve">magnet_lead</w:t>
+      </w:r>
+      <w:r>
+        <w:t xml:space="preserve">,</w:t>
+      </w:r>
+      <w:r>
+        <w:t xml:space="preserve"> </w:t>
+      </w:r>
+      <w:r>
+        <w:rPr>
+          <w:rStyle w:val="VerbatimChar"/>
+        </w:rPr>
+        <w:t xml:space="preserve">drip_bypass</w:t>
+      </w:r>
+      <w:r>
+        <w:t xml:space="preserve">,</w:t>
+      </w:r>
+      <w:r>
+        <w:t xml:space="preserve"> </w:t>
+      </w:r>
+      <w:r>
+        <w:rPr>
+          <w:rStyle w:val="VerbatimChar"/>
+        </w:rPr>
+        <w:t xml:space="preserve">magnet_vitamin_d_assessment</w:t>
+      </w:r>
+      <w:r>
+        <w:t xml:space="preserve">); no</w:t>
+      </w:r>
+      <w:r>
+        <w:t xml:space="preserve"> </w:t>
+      </w:r>
+      <w:r>
+        <w:rPr>
+          <w:rStyle w:val="VerbatimChar"/>
+        </w:rPr>
+        <w:t xml:space="preserve">sms_consent_given</w:t>
+      </w:r>
+      <w:r>
+        <w:t xml:space="preserve">. WF-21 already had a Dynamic Add Tag, so conditional consent lands correctly from the payload. The false-consent bug was WF-12 only. ORIGINAL ITEM: — expand its static Add Tag list (showed</w:t>
       </w:r>
       <w:r>
         <w:t xml:space="preserve"> </w:t>
@@ -3078,7 +3159,7 @@
     <w:abstractNumId w:val="993"/>
   </w:num>
   <w:num w:numId="1023">
-    <w:abstractNumId w:val="992"/>
+    <w:abstractNumId w:val="993"/>
   </w:num>
   <w:num w:numId="1024">
     <w:abstractNumId w:val="992"/>

</xml_diff>

<commit_message>
Attribution: first-in + new-contacts-only via WF-31 Contact Created trigger
Scott's rule: an affiliate earns the $600 only for introducing someone new to the
database. A pre-existing contact (organic or prior affiliate) never gets attributed
to a later affiliate.

GHL exposes no contact-creation date in conditions, and tags cannot substitute since
capture-workflow Add Tag actions run before any guard. Solution uses the Contact
Created trigger, which only fires on genuine creation.

Capture workflows now just map the click ID to a staging field (flexoffers_refid_incoming)
with no branching. WF-31 waits 2 minutes, then copies it to FlexOffers Refid only when
the contact is new and has no refid. One rule, one workflow, five magnets inherit it.

Co-Authored-By: Claude Opus 4.8 <noreply@anthropic.com>
</commit_message>
<xml_diff>
--- a/Enyrgy_Master_TODO.docx
+++ b/Enyrgy_Master_TODO.docx
@@ -1127,25 +1127,26 @@
           <w:b/>
           <w:bCs/>
         </w:rPr>
-        <w:t xml:space="preserve">FlexOffers attribution policy: FIRST-IN, implemented on all 5 capture workflows (July 30).</w:t>
-      </w:r>
-      <w:r>
-        <w:t xml:space="preserve"> </w:t>
-      </w:r>
-      <w:r>
-        <w:t xml:space="preserve">Business decision: the FIRST affiliate to introduce a prospect keeps the credit, not the last. Rationale: Enyrgy does the selling, so an affiliate’s real contribution is the introduction. Implementation per workflow: the refid is NO LONGER mapped in Create Contact (that would overwrite unconditionally and make the guard a no-op); instead a guard sits at the END of each workflow:</w:t>
-      </w:r>
-      <w:r>
-        <w:t xml:space="preserve"> </w:t>
-      </w:r>
-      <w:r>
-        <w:rPr>
-          <w:rStyle w:val="VerbatimChar"/>
-        </w:rPr>
-        <w:t xml:space="preserve">If FlexOffers Refid is empty -&gt; Update contact field -&gt; FlexOffers Refid = {{inboundWebhookRequest.flexoffers_refid}}</w:t>
-      </w:r>
-      <w:r>
-        <w:t xml:space="preserve">. Done on WF-12, WF-15, WF-18, WF-19, WF-21.</w:t>
+        <w:t xml:space="preserve">FlexOffers attribution policy: FIRST-IN + NEW-CONTACTS-ONLY (July 30, final architecture).</w:t>
+      </w:r>
+      <w:r>
+        <w:t xml:space="preserve"> </w:t>
+      </w:r>
+      <w:r>
+        <w:t xml:space="preserve">Business rule Scott set: an affiliate earns the $600 only for introducing someone</w:t>
+      </w:r>
+      <w:r>
+        <w:t xml:space="preserve"> </w:t>
+      </w:r>
+      <w:r>
+        <w:rPr>
+          <w:b/>
+          <w:bCs/>
+        </w:rPr>
+        <w:t xml:space="preserve">new to the database</w:t>
+      </w:r>
+      <w:r>
+        <w:t xml:space="preserve">. If a contact record already exists, Enyrgy had the relationship first (organic or a prior affiliate), so a later affiliate does not collect. Combined with first-in, whichever refid lands on a brand-new contact sticks permanently.</w:t>
       </w:r>
     </w:p>
     <w:p>
@@ -1161,13 +1162,81 @@
           <w:b/>
           <w:bCs/>
         </w:rPr>
-        <w:t xml:space="preserve">CRITICAL PLACEMENT RULE:</w:t>
-      </w:r>
-      <w:r>
-        <w:t xml:space="preserve"> </w:t>
-      </w:r>
-      <w:r>
-        <w:t xml:space="preserve">GHL condition branches never rejoin, so the guard MUST be the last thing in the workflow. Inserting it mid-flow swallows everything downstream into the Yes branch. This actually happened on WF-12 (tags and the seasonal logic ended up inside the branch, so any contact that already had a refid would have received no tags and therefore no emails). Reverted and rebuilt correctly.</w:t>
+        <w:t xml:space="preserve">ARCHITECTURE (do not re-litigate this, two earlier approaches failed):</w:t>
+      </w:r>
+      <w:r>
+        <w:t xml:space="preserve"> </w:t>
+      </w:r>
+      <w:r>
+        <w:t xml:space="preserve">GHL’s condition builder exposes</w:t>
+      </w:r>
+      <w:r>
+        <w:t xml:space="preserve"> </w:t>
+      </w:r>
+      <w:r>
+        <w:rPr>
+          <w:b/>
+          <w:bCs/>
+        </w:rPr>
+        <w:t xml:space="preserve">no contact-creation date</w:t>
+      </w:r>
+      <w:r>
+        <w:t xml:space="preserve"> </w:t>
+      </w:r>
+      <w:r>
+        <w:t xml:space="preserve">(searched</w:t>
+      </w:r>
+      <w:r>
+        <w:t xml:space="preserve"> </w:t>
+      </w:r>
+      <w:r>
+        <w:t xml:space="preserve">“created”</w:t>
+      </w:r>
+      <w:r>
+        <w:t xml:space="preserve"> </w:t>
+      </w:r>
+      <w:r>
+        <w:t xml:space="preserve">and</w:t>
+      </w:r>
+      <w:r>
+        <w:t xml:space="preserve"> </w:t>
+      </w:r>
+      <w:r>
+        <w:t xml:space="preserve">“date”</w:t>
+      </w:r>
+      <w:r>
+        <w:t xml:space="preserve"> </w:t>
+      </w:r>
+      <w:r>
+        <w:t xml:space="preserve">— only DOB and custom date fields), so</w:t>
+      </w:r>
+      <w:r>
+        <w:t xml:space="preserve"> </w:t>
+      </w:r>
+      <w:r>
+        <w:t xml:space="preserve">“is this contact new?”</w:t>
+      </w:r>
+      <w:r>
+        <w:t xml:space="preserve"> </w:t>
+      </w:r>
+      <w:r>
+        <w:t xml:space="preserve">cannot be tested inside the capture workflows. And tags cannot substitute, because the capture workflow’s own Add Tag actions run before any guard, so by then every contact carries this magnet’s tags. SOLUTION: use GHL’s</w:t>
+      </w:r>
+      <w:r>
+        <w:t xml:space="preserve"> </w:t>
+      </w:r>
+      <w:r>
+        <w:rPr>
+          <w:b/>
+          <w:bCs/>
+        </w:rPr>
+        <w:t xml:space="preserve">Contact Created</w:t>
+      </w:r>
+      <w:r>
+        <w:t xml:space="preserve"> </w:t>
+      </w:r>
+      <w:r>
+        <w:t xml:space="preserve">trigger, which fires only on genuine creation.</w:t>
       </w:r>
     </w:p>
     <w:p>
@@ -1179,16 +1248,168 @@
         </w:numPr>
       </w:pPr>
       <w:r>
-        <w:t xml:space="preserve">Two redundant conditions were removed to make the guard placement clean, both confirmed redundant by inspection first: WF-21’s risk-band Condition and WF-12’s seasonal Condition. Both re-applied tags that the page already sends in its payload and that a Dynamic Add Tag (</w:t>
-      </w:r>
-      <w:r>
-        <w:rPr>
-          <w:rStyle w:val="VerbatimChar"/>
-        </w:rPr>
-        <w:t xml:space="preserve">{{inboundWebhookRequest.tags}}</w:t>
-      </w:r>
-      <w:r>
-        <w:t xml:space="preserve">) applies.</w:t>
+        <w:rPr>
+          <w:b/>
+          <w:bCs/>
+        </w:rPr>
+        <w:t xml:space="preserve">How it works now:</w:t>
+      </w:r>
+      <w:r>
+        <w:t xml:space="preserve"> </w:t>
+      </w:r>
+      <w:r>
+        <w:t xml:space="preserve">each of the 5 capture workflows (WF-12/15/18/19/21) simply maps the incoming click ID to a staging field in Create Contact:</w:t>
+      </w:r>
+      <w:r>
+        <w:t xml:space="preserve"> </w:t>
+      </w:r>
+      <w:r>
+        <w:rPr>
+          <w:b/>
+          <w:bCs/>
+        </w:rPr>
+        <w:t xml:space="preserve">FlexOffers Refid Incoming</w:t>
+      </w:r>
+      <w:r>
+        <w:t xml:space="preserve"> </w:t>
+      </w:r>
+      <w:r>
+        <w:t xml:space="preserve">(</w:t>
+      </w:r>
+      <w:r>
+        <w:rPr>
+          <w:rStyle w:val="VerbatimChar"/>
+        </w:rPr>
+        <w:t xml:space="preserve">flexoffers_refid_incoming</w:t>
+      </w:r>
+      <w:r>
+        <w:t xml:space="preserve">) =</w:t>
+      </w:r>
+      <w:r>
+        <w:t xml:space="preserve"> </w:t>
+      </w:r>
+      <w:r>
+        <w:rPr>
+          <w:rStyle w:val="VerbatimChar"/>
+        </w:rPr>
+        <w:t xml:space="preserve">{{inboundWebhookRequest.flexoffers_refid}}</w:t>
+      </w:r>
+      <w:r>
+        <w:t xml:space="preserve">. No conditions, no branching, nothing to break. Then</w:t>
+      </w:r>
+      <w:r>
+        <w:t xml:space="preserve"> </w:t>
+      </w:r>
+      <w:r>
+        <w:rPr>
+          <w:b/>
+          <w:bCs/>
+        </w:rPr>
+        <w:t xml:space="preserve">WF-31 FlexOffers First Touch</w:t>
+      </w:r>
+      <w:r>
+        <w:t xml:space="preserve"> </w:t>
+      </w:r>
+      <w:r>
+        <w:t xml:space="preserve">does the attribution: trigger</w:t>
+      </w:r>
+      <w:r>
+        <w:t xml:space="preserve"> </w:t>
+      </w:r>
+      <w:r>
+        <w:rPr>
+          <w:b/>
+          <w:bCs/>
+        </w:rPr>
+        <w:t xml:space="preserve">Contact Created</w:t>
+      </w:r>
+      <w:r>
+        <w:t xml:space="preserve"> </w:t>
+      </w:r>
+      <w:r>
+        <w:t xml:space="preserve">(unfiltered) -&gt;</w:t>
+      </w:r>
+      <w:r>
+        <w:t xml:space="preserve"> </w:t>
+      </w:r>
+      <w:r>
+        <w:rPr>
+          <w:b/>
+          <w:bCs/>
+        </w:rPr>
+        <w:t xml:space="preserve">Wait 2 minutes</w:t>
+      </w:r>
+      <w:r>
+        <w:t xml:space="preserve"> </w:t>
+      </w:r>
+      <w:r>
+        <w:t xml:space="preserve">(lets custom fields finish writing; a trigger-level filter would silently drop refids that had not landed yet) -&gt; Condition</w:t>
+      </w:r>
+      <w:r>
+        <w:t xml:space="preserve"> </w:t>
+      </w:r>
+      <w:r>
+        <w:rPr>
+          <w:rStyle w:val="VerbatimChar"/>
+        </w:rPr>
+        <w:t xml:space="preserve">FlexOffers Refid Incoming is not empty AND FlexOffers Refid is empty</w:t>
+      </w:r>
+      <w:r>
+        <w:t xml:space="preserve"> </w:t>
+      </w:r>
+      <w:r>
+        <w:t xml:space="preserve">-&gt; Update Contact Field</w:t>
+      </w:r>
+      <w:r>
+        <w:t xml:space="preserve"> </w:t>
+      </w:r>
+      <w:r>
+        <w:rPr>
+          <w:rStyle w:val="VerbatimChar"/>
+        </w:rPr>
+        <w:t xml:space="preserve">FlexOffers Refid</w:t>
+      </w:r>
+      <w:r>
+        <w:t xml:space="preserve"> </w:t>
+      </w:r>
+      <w:r>
+        <w:t xml:space="preserve">=</w:t>
+      </w:r>
+      <w:r>
+        <w:t xml:space="preserve"> </w:t>
+      </w:r>
+      <w:r>
+        <w:rPr>
+          <w:rStyle w:val="VerbatimChar"/>
+        </w:rPr>
+        <w:t xml:space="preserve">{{contact.flexoffers_refid_incoming}}</w:t>
+      </w:r>
+      <w:r>
+        <w:t xml:space="preserve">. Note WF-31 reads from</w:t>
+      </w:r>
+      <w:r>
+        <w:t xml:space="preserve"> </w:t>
+      </w:r>
+      <w:r>
+        <w:rPr>
+          <w:rStyle w:val="VerbatimChar"/>
+        </w:rPr>
+        <w:t xml:space="preserve">contact.</w:t>
+      </w:r>
+      <w:r>
+        <w:t xml:space="preserve"> </w:t>
+      </w:r>
+      <w:r>
+        <w:t xml:space="preserve">while the capture workflows read from</w:t>
+      </w:r>
+      <w:r>
+        <w:t xml:space="preserve"> </w:t>
+      </w:r>
+      <w:r>
+        <w:rPr>
+          <w:rStyle w:val="VerbatimChar"/>
+        </w:rPr>
+        <w:t xml:space="preserve">inboundWebhookRequest.</w:t>
       </w:r>
     </w:p>
     <w:p>
@@ -1200,17 +1421,7 @@
         </w:numPr>
       </w:pPr>
       <w:r>
-        <w:rPr>
-          <w:b/>
-          <w:bCs/>
-        </w:rPr>
-        <w:t xml:space="preserve">TELL PUBLISHERS.</w:t>
-      </w:r>
-      <w:r>
-        <w:t xml:space="preserve"> </w:t>
-      </w:r>
-      <w:r>
-        <w:t xml:space="preserve">Last-click is the industry default, so first-in must be stated explicitly in the program terms and the Message Center newsletter, or it becomes a dispute pointed at Enyrgy.</w:t>
+        <w:t xml:space="preserve">The earlier per-workflow guards were removed. One rule, one workflow, five magnets inherit it.</w:t>
       </w:r>
     </w:p>
     <w:p>
@@ -1222,7 +1433,39 @@
         </w:numPr>
       </w:pPr>
       <w:r>
-        <w:t xml:space="preserve">OPEN DECISION: an existing customer or long-time organic lead who clicks an affiliate link would have an empty refid and so would credit that affiliate $600 for someone already in the database. A known affiliate leak. Not addressed; decide whether to exclude.</w:t>
+        <w:rPr>
+          <w:b/>
+          <w:bCs/>
+        </w:rPr>
+        <w:t xml:space="preserve">CRITICAL GHL RULE learned along the way:</w:t>
+      </w:r>
+      <w:r>
+        <w:t xml:space="preserve"> </w:t>
+      </w:r>
+      <w:r>
+        <w:t xml:space="preserve">condition branches never rejoin, so any guard placed mid-flow swallows everything below it into the Yes branch. This happened on WF-12 (tags and seasonal logic ended up inside the branch, so a contact who already had a refid would have gotten no tags and therefore no emails). Caught, reverted, rebuilt. Two redundant conditions were also removed after verifying redundancy by inspection: WF-21’s risk-band Condition and WF-12’s seasonal Condition, both re-applying tags the page already sends and a Dynamic Add Tag already applies.</w:t>
+      </w:r>
+    </w:p>
+    <w:p>
+      <w:pPr>
+        <w:pStyle w:val="Compact"/>
+        <w:numPr>
+          <w:ilvl w:val="1"/>
+          <w:numId w:val="1021"/>
+        </w:numPr>
+      </w:pPr>
+      <w:r>
+        <w:rPr>
+          <w:b/>
+          <w:bCs/>
+        </w:rPr>
+        <w:t xml:space="preserve">MUST TELL PUBLISHERS.</w:t>
+      </w:r>
+      <w:r>
+        <w:t xml:space="preserve"> </w:t>
+      </w:r>
+      <w:r>
+        <w:t xml:space="preserve">Last-click is the industry default and new-contacts-only is stricter still, so both rules must be stated explicitly in the program terms and the Message Center newsletter, or the dispute lands on Enyrgy.</w:t>
       </w:r>
     </w:p>
     <w:p>

</xml_diff>

<commit_message>
Docs: note sms_consent regression + add end-to-end test for new attribution mechanism
Co-Authored-By: Claude Opus 4.8 <noreply@anthropic.com>
</commit_message>
<xml_diff>
--- a/Enyrgy_Master_TODO.docx
+++ b/Enyrgy_Master_TODO.docx
@@ -1510,7 +1510,58 @@
           <w:b/>
           <w:bCs/>
         </w:rPr>
-        <w:t xml:space="preserve">was being applied to EVERY Tired Test lead (July 30).</w:t>
+        <w:t xml:space="preserve">was being applied to EVERY Tired Test lead (July 30). NOTE: this fix REGRESSED once during the attribution rebuild and had to be re-applied. If WF-12 is ever reverted or rebuilt again, RE-CHECK that its static Add Tag holds six tags, not seven. The list should be</w:t>
+      </w:r>
+      <w:r>
+        <w:rPr>
+          <w:b/>
+          <w:bCs/>
+        </w:rPr>
+        <w:t xml:space="preserve"> </w:t>
+      </w:r>
+      <w:r>
+        <w:rPr>
+          <w:rStyle w:val="VerbatimChar"/>
+          <w:b/>
+          <w:bCs/>
+        </w:rPr>
+        <w:t xml:space="preserve">type_consumer, magnet_tired_test, source_lead_magnet, status_new, drip_bypass, magnet_lead</w:t>
+      </w:r>
+      <w:r>
+        <w:rPr>
+          <w:b/>
+          <w:bCs/>
+        </w:rPr>
+        <w:t xml:space="preserve"> </w:t>
+      </w:r>
+      <w:r>
+        <w:rPr>
+          <w:b/>
+          <w:bCs/>
+        </w:rPr>
+        <w:t xml:space="preserve">with NO</w:t>
+      </w:r>
+      <w:r>
+        <w:rPr>
+          <w:b/>
+          <w:bCs/>
+        </w:rPr>
+        <w:t xml:space="preserve"> </w:t>
+      </w:r>
+      <w:r>
+        <w:rPr>
+          <w:rStyle w:val="VerbatimChar"/>
+          <w:b/>
+          <w:bCs/>
+        </w:rPr>
+        <w:t xml:space="preserve">sms_consent_given</w:t>
+      </w:r>
+      <w:r>
+        <w:rPr>
+          <w:b/>
+          <w:bCs/>
+        </w:rPr>
+        <w:t xml:space="preserve">.</w:t>
       </w:r>
       <w:r>
         <w:t xml:space="preserve"> </w:t>
@@ -1744,7 +1795,13 @@
           <w:b/>
           <w:bCs/>
         </w:rPr>
-        <w:t xml:space="preserve">FlexOffers remaining (waiting on the FlexOffers rep, emailed July 29)</w:t>
+        <w:t xml:space="preserve">TEST THE NEW ATTRIBUTION MECHANISM END TO END (not yet verified).</w:t>
+      </w:r>
+      <w:r>
+        <w:t xml:space="preserve"> </w:t>
+      </w:r>
+      <w:r>
+        <w:t xml:space="preserve">The capture chain was re-architected on July 30 (staging field + WF-31 Contact Created trigger) and has NOT been tested since. Two tests needed:</w:t>
       </w:r>
     </w:p>
     <w:p>
@@ -1756,35 +1813,62 @@
         </w:numPr>
       </w:pPr>
       <w:r>
-        <w:t xml:space="preserve">Get a</w:t>
-      </w:r>
-      <w:r>
-        <w:t xml:space="preserve"> </w:t>
-      </w:r>
-      <w:r>
-        <w:rPr>
-          <w:b/>
-          <w:bCs/>
-        </w:rPr>
-        <w:t xml:space="preserve">test tracking link</w:t>
-      </w:r>
-      <w:r>
-        <w:t xml:space="preserve"> </w:t>
-      </w:r>
-      <w:r>
-        <w:t xml:space="preserve">for 250377, click it, confirm it lands on the quiz with</w:t>
-      </w:r>
-      <w:r>
-        <w:t xml:space="preserve"> </w:t>
-      </w:r>
-      <w:r>
-        <w:rPr>
-          <w:rStyle w:val="VerbatimChar"/>
-        </w:rPr>
-        <w:t xml:space="preserve">?refid=24.…</w:t>
-      </w:r>
-      <w:r>
-        <w:t xml:space="preserve">, complete the quiz, verify the contact’s FlexOffers Refid populates. Free verification of the click-to-capture path.</w:t>
+        <w:rPr>
+          <w:b/>
+          <w:bCs/>
+        </w:rPr>
+        <w:t xml:space="preserve">New contact path:</w:t>
+      </w:r>
+      <w:r>
+        <w:t xml:space="preserve"> </w:t>
+      </w:r>
+      <w:r>
+        <w:t xml:space="preserve">fresh incognito, submit any magnet with</w:t>
+      </w:r>
+      <w:r>
+        <w:t xml:space="preserve"> </w:t>
+      </w:r>
+      <w:r>
+        <w:rPr>
+          <w:rStyle w:val="VerbatimChar"/>
+        </w:rPr>
+        <w:t xml:space="preserve">?refid=24.TESTWF31001</w:t>
+      </w:r>
+      <w:r>
+        <w:t xml:space="preserve"> </w:t>
+      </w:r>
+      <w:r>
+        <w:t xml:space="preserve">using a brand-new email. Wait 3+ minutes (WF-31 waits 2). Confirm the contact has BOTH</w:t>
+      </w:r>
+      <w:r>
+        <w:t xml:space="preserve"> </w:t>
+      </w:r>
+      <w:r>
+        <w:rPr>
+          <w:rStyle w:val="VerbatimChar"/>
+        </w:rPr>
+        <w:t xml:space="preserve">FlexOffers Refid Incoming</w:t>
+      </w:r>
+      <w:r>
+        <w:t xml:space="preserve"> </w:t>
+      </w:r>
+      <w:r>
+        <w:t xml:space="preserve">AND</w:t>
+      </w:r>
+      <w:r>
+        <w:t xml:space="preserve"> </w:t>
+      </w:r>
+      <w:r>
+        <w:rPr>
+          <w:rStyle w:val="VerbatimChar"/>
+        </w:rPr>
+        <w:t xml:space="preserve">FlexOffers Refid</w:t>
+      </w:r>
+      <w:r>
+        <w:t xml:space="preserve"> </w:t>
+      </w:r>
+      <w:r>
+        <w:t xml:space="preserve">populated.</w:t>
       </w:r>
     </w:p>
     <w:p>
@@ -1792,43 +1876,73 @@
         <w:pStyle w:val="Compact"/>
         <w:numPr>
           <w:ilvl w:val="1"/>
+          <w:numId w:val="1026"/>
+        </w:numPr>
+      </w:pPr>
+      <w:r>
+        <w:rPr>
+          <w:b/>
+          <w:bCs/>
+        </w:rPr>
+        <w:t xml:space="preserve">Exclusion path (the important one):</w:t>
+      </w:r>
+      <w:r>
+        <w:t xml:space="preserve"> </w:t>
+      </w:r>
+      <w:r>
+        <w:t xml:space="preserve">submit again using an EXISTING contact’s email with a DIFFERENT refid. Confirm</w:t>
+      </w:r>
+      <w:r>
+        <w:t xml:space="preserve"> </w:t>
+      </w:r>
+      <w:r>
+        <w:rPr>
+          <w:rStyle w:val="VerbatimChar"/>
+        </w:rPr>
+        <w:t xml:space="preserve">FlexOffers Refid Incoming</w:t>
+      </w:r>
+      <w:r>
+        <w:t xml:space="preserve"> </w:t>
+      </w:r>
+      <w:r>
+        <w:t xml:space="preserve">updates but</w:t>
+      </w:r>
+      <w:r>
+        <w:t xml:space="preserve"> </w:t>
+      </w:r>
+      <w:r>
+        <w:rPr>
+          <w:rStyle w:val="VerbatimChar"/>
+        </w:rPr>
+        <w:t xml:space="preserve">FlexOffers Refid</w:t>
+      </w:r>
+      <w:r>
+        <w:t xml:space="preserve"> </w:t>
+      </w:r>
+      <w:r>
+        <w:t xml:space="preserve">does NOT change. That proves new-contacts-only is actually enforced.</w:t>
+      </w:r>
+      <w:r>
+        <w:t xml:space="preserve"> </w:t>
+      </w:r>
+      <w:r>
+        <w:t xml:space="preserve">If test 2 fails, WF-31’s Contact Created trigger is firing on updates as well as creations, and the rule is not being enforced.</w:t>
+      </w:r>
+    </w:p>
+    <w:p>
+      <w:pPr>
+        <w:pStyle w:val="Compact"/>
+        <w:numPr>
+          <w:ilvl w:val="0"/>
           <w:numId w:val="1027"/>
         </w:numPr>
       </w:pPr>
       <w:r>
-        <w:t xml:space="preserve">Ask FlexOffers to</w:t>
-      </w:r>
-      <w:r>
-        <w:t xml:space="preserve"> </w:t>
-      </w:r>
-      <w:r>
-        <w:rPr>
-          <w:b/>
-          <w:bCs/>
-        </w:rPr>
-        <w:t xml:space="preserve">surface program 250377</w:t>
-      </w:r>
-      <w:r>
-        <w:t xml:space="preserve"> </w:t>
-      </w:r>
-      <w:r>
-        <w:t xml:space="preserve">to the network and migrate the</w:t>
-      </w:r>
-      <w:r>
-        <w:t xml:space="preserve"> </w:t>
-      </w:r>
-      <w:r>
-        <w:rPr>
-          <w:b/>
-          <w:bCs/>
-        </w:rPr>
-        <w:t xml:space="preserve">124 publishers</w:t>
-      </w:r>
-      <w:r>
-        <w:t xml:space="preserve"> </w:t>
-      </w:r>
-      <w:r>
-        <w:t xml:space="preserve">approved on the old program (#247334). Approvals are per-program, so 250377 has ZERO publishers today and nobody can promote the tracked link.</w:t>
+        <w:rPr>
+          <w:b/>
+          <w:bCs/>
+        </w:rPr>
+        <w:t xml:space="preserve">FlexOffers remaining (waiting on the FlexOffers rep, emailed July 29)</w:t>
       </w:r>
     </w:p>
     <w:p>
@@ -1840,33 +1954,35 @@
         </w:numPr>
       </w:pPr>
       <w:r>
-        <w:rPr>
-          <w:b/>
-          <w:bCs/>
-        </w:rPr>
-        <w:t xml:space="preserve">After</w:t>
-      </w:r>
-      <w:r>
-        <w:t xml:space="preserve"> </w:t>
-      </w:r>
-      <w:r>
-        <w:t xml:space="preserve">publishers migrate,</w:t>
-      </w:r>
-      <w:r>
-        <w:t xml:space="preserve"> </w:t>
-      </w:r>
-      <w:r>
-        <w:rPr>
-          <w:b/>
-          <w:bCs/>
-        </w:rPr>
-        <w:t xml:space="preserve">disable old creative #6673701</w:t>
-      </w:r>
-      <w:r>
-        <w:t xml:space="preserve"> </w:t>
-      </w:r>
-      <w:r>
-        <w:t xml:space="preserve">(Tired Test on the old program, no S2S tracking, so anyone promoting it earns nothing and sours the relationship).</w:t>
+        <w:t xml:space="preserve">Get a</w:t>
+      </w:r>
+      <w:r>
+        <w:t xml:space="preserve"> </w:t>
+      </w:r>
+      <w:r>
+        <w:rPr>
+          <w:b/>
+          <w:bCs/>
+        </w:rPr>
+        <w:t xml:space="preserve">test tracking link</w:t>
+      </w:r>
+      <w:r>
+        <w:t xml:space="preserve"> </w:t>
+      </w:r>
+      <w:r>
+        <w:t xml:space="preserve">for 250377, click it, confirm it lands on the quiz with</w:t>
+      </w:r>
+      <w:r>
+        <w:t xml:space="preserve"> </w:t>
+      </w:r>
+      <w:r>
+        <w:rPr>
+          <w:rStyle w:val="VerbatimChar"/>
+        </w:rPr>
+        <w:t xml:space="preserve">?refid=24.…</w:t>
+      </w:r>
+      <w:r>
+        <w:t xml:space="preserve">, complete the quiz, verify the contact’s FlexOffers Refid populates. Free verification of the click-to-capture path.</w:t>
       </w:r>
     </w:p>
     <w:p>
@@ -1878,6 +1994,88 @@
         </w:numPr>
       </w:pPr>
       <w:r>
+        <w:t xml:space="preserve">Ask FlexOffers to</w:t>
+      </w:r>
+      <w:r>
+        <w:t xml:space="preserve"> </w:t>
+      </w:r>
+      <w:r>
+        <w:rPr>
+          <w:b/>
+          <w:bCs/>
+        </w:rPr>
+        <w:t xml:space="preserve">surface program 250377</w:t>
+      </w:r>
+      <w:r>
+        <w:t xml:space="preserve"> </w:t>
+      </w:r>
+      <w:r>
+        <w:t xml:space="preserve">to the network and migrate the</w:t>
+      </w:r>
+      <w:r>
+        <w:t xml:space="preserve"> </w:t>
+      </w:r>
+      <w:r>
+        <w:rPr>
+          <w:b/>
+          <w:bCs/>
+        </w:rPr>
+        <w:t xml:space="preserve">124 publishers</w:t>
+      </w:r>
+      <w:r>
+        <w:t xml:space="preserve"> </w:t>
+      </w:r>
+      <w:r>
+        <w:t xml:space="preserve">approved on the old program (#247334). Approvals are per-program, so 250377 has ZERO publishers today and nobody can promote the tracked link.</w:t>
+      </w:r>
+    </w:p>
+    <w:p>
+      <w:pPr>
+        <w:pStyle w:val="Compact"/>
+        <w:numPr>
+          <w:ilvl w:val="1"/>
+          <w:numId w:val="1030"/>
+        </w:numPr>
+      </w:pPr>
+      <w:r>
+        <w:rPr>
+          <w:b/>
+          <w:bCs/>
+        </w:rPr>
+        <w:t xml:space="preserve">After</w:t>
+      </w:r>
+      <w:r>
+        <w:t xml:space="preserve"> </w:t>
+      </w:r>
+      <w:r>
+        <w:t xml:space="preserve">publishers migrate,</w:t>
+      </w:r>
+      <w:r>
+        <w:t xml:space="preserve"> </w:t>
+      </w:r>
+      <w:r>
+        <w:rPr>
+          <w:b/>
+          <w:bCs/>
+        </w:rPr>
+        <w:t xml:space="preserve">disable old creative #6673701</w:t>
+      </w:r>
+      <w:r>
+        <w:t xml:space="preserve"> </w:t>
+      </w:r>
+      <w:r>
+        <w:t xml:space="preserve">(Tired Test on the old program, no S2S tracking, so anyone promoting it earns nothing and sours the relationship).</w:t>
+      </w:r>
+    </w:p>
+    <w:p>
+      <w:pPr>
+        <w:pStyle w:val="Compact"/>
+        <w:numPr>
+          <w:ilvl w:val="1"/>
+          <w:numId w:val="1031"/>
+        </w:numPr>
+      </w:pPr>
+      <w:r>
         <w:rPr>
           <w:b/>
           <w:bCs/>
@@ -1968,7 +2166,7 @@
         <w:pStyle w:val="Compact"/>
         <w:numPr>
           <w:ilvl w:val="1"/>
-          <w:numId w:val="1030"/>
+          <w:numId w:val="1032"/>
         </w:numPr>
       </w:pPr>
       <w:r>
@@ -2108,59 +2306,6 @@
       </w:r>
       <w:r>
         <w:t xml:space="preserve">). They sit in the live pipeline and are enrolled in nurture sequences.</w:t>
-      </w:r>
-    </w:p>
-    <w:p>
-      <w:pPr>
-        <w:pStyle w:val="Compact"/>
-        <w:numPr>
-          <w:ilvl w:val="0"/>
-          <w:numId w:val="1031"/>
-        </w:numPr>
-      </w:pPr>
-      <w:r>
-        <w:rPr>
-          <w:b/>
-          <w:bCs/>
-        </w:rPr>
-        <w:t xml:space="preserve">Testimonial-form link on enyrgy.com</w:t>
-      </w:r>
-      <w:r>
-        <w:t xml:space="preserve"> </w:t>
-      </w:r>
-      <w:r>
-        <w:t xml:space="preserve">— DONE (July 28). Link added to the website.</w:t>
-      </w:r>
-    </w:p>
-    <w:p>
-      <w:pPr>
-        <w:pStyle w:val="Compact"/>
-        <w:numPr>
-          <w:ilvl w:val="0"/>
-          <w:numId w:val="1032"/>
-        </w:numPr>
-      </w:pPr>
-      <w:r>
-        <w:rPr>
-          <w:b/>
-          <w:bCs/>
-        </w:rPr>
-        <w:t xml:space="preserve">CNAM caller-ID registration</w:t>
-      </w:r>
-      <w:r>
-        <w:t xml:space="preserve"> </w:t>
-      </w:r>
-      <w:r>
-        <w:t xml:space="preserve">— DONE. Already Approved in LC Phone with Friendly Name</w:t>
-      </w:r>
-      <w:r>
-        <w:t xml:space="preserve"> </w:t>
-      </w:r>
-      <w:r>
-        <w:t xml:space="preserve">“Enyrgy Inc”</w:t>
-      </w:r>
-      <w:r>
-        <w:t xml:space="preserve">; outbound calls display the business name.</w:t>
       </w:r>
     </w:p>
     <w:p>
@@ -2176,6 +2321,59 @@
           <w:b/>
           <w:bCs/>
         </w:rPr>
+        <w:t xml:space="preserve">Testimonial-form link on enyrgy.com</w:t>
+      </w:r>
+      <w:r>
+        <w:t xml:space="preserve"> </w:t>
+      </w:r>
+      <w:r>
+        <w:t xml:space="preserve">— DONE (July 28). Link added to the website.</w:t>
+      </w:r>
+    </w:p>
+    <w:p>
+      <w:pPr>
+        <w:pStyle w:val="Compact"/>
+        <w:numPr>
+          <w:ilvl w:val="0"/>
+          <w:numId w:val="1034"/>
+        </w:numPr>
+      </w:pPr>
+      <w:r>
+        <w:rPr>
+          <w:b/>
+          <w:bCs/>
+        </w:rPr>
+        <w:t xml:space="preserve">CNAM caller-ID registration</w:t>
+      </w:r>
+      <w:r>
+        <w:t xml:space="preserve"> </w:t>
+      </w:r>
+      <w:r>
+        <w:t xml:space="preserve">— DONE. Already Approved in LC Phone with Friendly Name</w:t>
+      </w:r>
+      <w:r>
+        <w:t xml:space="preserve"> </w:t>
+      </w:r>
+      <w:r>
+        <w:t xml:space="preserve">“Enyrgy Inc”</w:t>
+      </w:r>
+      <w:r>
+        <w:t xml:space="preserve">; outbound calls display the business name.</w:t>
+      </w:r>
+    </w:p>
+    <w:p>
+      <w:pPr>
+        <w:pStyle w:val="Compact"/>
+        <w:numPr>
+          <w:ilvl w:val="0"/>
+          <w:numId w:val="1035"/>
+        </w:numPr>
+      </w:pPr>
+      <w:r>
+        <w:rPr>
+          <w:b/>
+          <w:bCs/>
+        </w:rPr>
         <w:t xml:space="preserve">GHL agency email sender name =</w:t>
       </w:r>
       <w:r>
@@ -2252,7 +2450,7 @@
         <w:pStyle w:val="Compact"/>
         <w:numPr>
           <w:ilvl w:val="0"/>
-          <w:numId w:val="1034"/>
+          <w:numId w:val="1036"/>
         </w:numPr>
       </w:pPr>
       <w:r>
@@ -2267,77 +2465,6 @@
       </w:r>
       <w:r>
         <w:t xml:space="preserve">(100+ contacts), then import.</w:t>
-      </w:r>
-    </w:p>
-    <w:p>
-      <w:pPr>
-        <w:pStyle w:val="Compact"/>
-        <w:numPr>
-          <w:ilvl w:val="0"/>
-          <w:numId w:val="1035"/>
-        </w:numPr>
-      </w:pPr>
-      <w:r>
-        <w:rPr>
-          <w:b/>
-          <w:bCs/>
-        </w:rPr>
-        <w:t xml:space="preserve">Investor Presentation calendar</w:t>
-      </w:r>
-      <w:r>
-        <w:t xml:space="preserve"> </w:t>
-      </w:r>
-      <w:r>
-        <w:t xml:space="preserve">— conflict detection verified/fixed (July 28).</w:t>
-      </w:r>
-    </w:p>
-    <w:p>
-      <w:pPr>
-        <w:pStyle w:val="Compact"/>
-        <w:numPr>
-          <w:ilvl w:val="0"/>
-          <w:numId w:val="1036"/>
-        </w:numPr>
-      </w:pPr>
-      <w:r>
-        <w:rPr>
-          <w:b/>
-          <w:bCs/>
-        </w:rPr>
-        <w:t xml:space="preserve">Content assets</w:t>
-      </w:r>
-      <w:r>
-        <w:t xml:space="preserve"> </w:t>
-      </w:r>
-      <w:r>
-        <w:t xml:space="preserve">— DONE (July 28). Commercial ROI PDF built (</w:t>
-      </w:r>
-      <w:r>
-        <w:rPr>
-          <w:rStyle w:val="VerbatimChar"/>
-        </w:rPr>
-        <w:t xml:space="preserve">Enyrgy_Commercial_ROI.pdf</w:t>
-      </w:r>
-      <w:r>
-        <w:t xml:space="preserve"> </w:t>
-      </w:r>
-      <w:r>
-        <w:t xml:space="preserve">+ editable</w:t>
-      </w:r>
-      <w:r>
-        <w:t xml:space="preserve"> </w:t>
-      </w:r>
-      <w:r>
-        <w:rPr>
-          <w:rStyle w:val="VerbatimChar"/>
-        </w:rPr>
-        <w:t xml:space="preserve">.html</w:t>
-      </w:r>
-      <w:r>
-        <w:t xml:space="preserve"> </w:t>
-      </w:r>
-      <w:r>
-        <w:t xml:space="preserve">source in repo; one placeholder = commercial booking link). Inbound 888 voicemail greeting recorded in Scott’s voice. Outbound investor-drip voicemail script drafted (record only if/when that touch is activated; optional). PPM attorney-approved.</w:t>
       </w:r>
     </w:p>
     <w:p>
@@ -2353,6 +2480,77 @@
           <w:b/>
           <w:bCs/>
         </w:rPr>
+        <w:t xml:space="preserve">Investor Presentation calendar</w:t>
+      </w:r>
+      <w:r>
+        <w:t xml:space="preserve"> </w:t>
+      </w:r>
+      <w:r>
+        <w:t xml:space="preserve">— conflict detection verified/fixed (July 28).</w:t>
+      </w:r>
+    </w:p>
+    <w:p>
+      <w:pPr>
+        <w:pStyle w:val="Compact"/>
+        <w:numPr>
+          <w:ilvl w:val="0"/>
+          <w:numId w:val="1038"/>
+        </w:numPr>
+      </w:pPr>
+      <w:r>
+        <w:rPr>
+          <w:b/>
+          <w:bCs/>
+        </w:rPr>
+        <w:t xml:space="preserve">Content assets</w:t>
+      </w:r>
+      <w:r>
+        <w:t xml:space="preserve"> </w:t>
+      </w:r>
+      <w:r>
+        <w:t xml:space="preserve">— DONE (July 28). Commercial ROI PDF built (</w:t>
+      </w:r>
+      <w:r>
+        <w:rPr>
+          <w:rStyle w:val="VerbatimChar"/>
+        </w:rPr>
+        <w:t xml:space="preserve">Enyrgy_Commercial_ROI.pdf</w:t>
+      </w:r>
+      <w:r>
+        <w:t xml:space="preserve"> </w:t>
+      </w:r>
+      <w:r>
+        <w:t xml:space="preserve">+ editable</w:t>
+      </w:r>
+      <w:r>
+        <w:t xml:space="preserve"> </w:t>
+      </w:r>
+      <w:r>
+        <w:rPr>
+          <w:rStyle w:val="VerbatimChar"/>
+        </w:rPr>
+        <w:t xml:space="preserve">.html</w:t>
+      </w:r>
+      <w:r>
+        <w:t xml:space="preserve"> </w:t>
+      </w:r>
+      <w:r>
+        <w:t xml:space="preserve">source in repo; one placeholder = commercial booking link). Inbound 888 voicemail greeting recorded in Scott’s voice. Outbound investor-drip voicemail script drafted (record only if/when that touch is activated; optional). PPM attorney-approved.</w:t>
+      </w:r>
+    </w:p>
+    <w:p>
+      <w:pPr>
+        <w:pStyle w:val="Compact"/>
+        <w:numPr>
+          <w:ilvl w:val="0"/>
+          <w:numId w:val="1039"/>
+        </w:numPr>
+      </w:pPr>
+      <w:r>
+        <w:rPr>
+          <w:b/>
+          <w:bCs/>
+        </w:rPr>
         <w:t xml:space="preserve">Q2 2026 investor update</w:t>
       </w:r>
       <w:r>
@@ -2389,7 +2587,7 @@
         <w:pStyle w:val="Compact"/>
         <w:numPr>
           <w:ilvl w:val="0"/>
-          <w:numId w:val="1038"/>
+          <w:numId w:val="1040"/>
         </w:numPr>
       </w:pPr>
       <w:r>
@@ -2404,59 +2602,6 @@
       </w:r>
       <w:r>
         <w:t xml:space="preserve">— the EA flags this as the top gap, but it predates the Session 11 native integration + WF-27/28/29, which largely built it. Reconcile the EA and ratify rather than rebuild.</w:t>
-      </w:r>
-    </w:p>
-    <w:p>
-      <w:pPr>
-        <w:pStyle w:val="Compact"/>
-        <w:numPr>
-          <w:ilvl w:val="0"/>
-          <w:numId w:val="1039"/>
-        </w:numPr>
-      </w:pPr>
-      <w:r>
-        <w:rPr>
-          <w:b/>
-          <w:bCs/>
-        </w:rPr>
-        <w:t xml:space="preserve">System-of-record ownership map</w:t>
-      </w:r>
-      <w:r>
-        <w:t xml:space="preserve"> </w:t>
-      </w:r>
-      <w:r>
-        <w:t xml:space="preserve">— ratify the documented SoR (decision/doc task).</w:t>
-      </w:r>
-    </w:p>
-    <w:p>
-      <w:pPr>
-        <w:pStyle w:val="Compact"/>
-        <w:numPr>
-          <w:ilvl w:val="0"/>
-          <w:numId w:val="1040"/>
-        </w:numPr>
-      </w:pPr>
-      <w:r>
-        <w:rPr>
-          <w:b/>
-          <w:bCs/>
-        </w:rPr>
-        <w:t xml:space="preserve">Device App to GHL usage-data flow</w:t>
-      </w:r>
-      <w:r>
-        <w:t xml:space="preserve"> </w:t>
-      </w:r>
-      <w:r>
-        <w:t xml:space="preserve">— deferred</w:t>
-      </w:r>
-      <w:r>
-        <w:t xml:space="preserve"> </w:t>
-      </w:r>
-      <w:r>
-        <w:t xml:space="preserve">“Phase 2-plus”</w:t>
-      </w:r>
-      <w:r>
-        <w:t xml:space="preserve">; decide whether/how usage data flows, with privacy treatment.</w:t>
       </w:r>
     </w:p>
     <w:p>
@@ -2472,13 +2617,13 @@
           <w:b/>
           <w:bCs/>
         </w:rPr>
-        <w:t xml:space="preserve">OEM / Lumanova data boundary</w:t>
-      </w:r>
-      <w:r>
-        <w:t xml:space="preserve"> </w:t>
-      </w:r>
-      <w:r>
-        <w:t xml:space="preserve">— formalize an auditable path as the partner program grows.</w:t>
+        <w:t xml:space="preserve">System-of-record ownership map</w:t>
+      </w:r>
+      <w:r>
+        <w:t xml:space="preserve"> </w:t>
+      </w:r>
+      <w:r>
+        <w:t xml:space="preserve">— ratify the documented SoR (decision/doc task).</w:t>
       </w:r>
     </w:p>
     <w:p>
@@ -2494,13 +2639,22 @@
           <w:b/>
           <w:bCs/>
         </w:rPr>
-        <w:t xml:space="preserve">Metric governance owner</w:t>
-      </w:r>
-      <w:r>
-        <w:t xml:space="preserve"> </w:t>
-      </w:r>
-      <w:r>
-        <w:t xml:space="preserve">— figures reconciled; assign a single owner.</w:t>
+        <w:t xml:space="preserve">Device App to GHL usage-data flow</w:t>
+      </w:r>
+      <w:r>
+        <w:t xml:space="preserve"> </w:t>
+      </w:r>
+      <w:r>
+        <w:t xml:space="preserve">— deferred</w:t>
+      </w:r>
+      <w:r>
+        <w:t xml:space="preserve"> </w:t>
+      </w:r>
+      <w:r>
+        <w:t xml:space="preserve">“Phase 2-plus”</w:t>
+      </w:r>
+      <w:r>
+        <w:t xml:space="preserve">; decide whether/how usage data flows, with privacy treatment.</w:t>
       </w:r>
     </w:p>
     <w:p>
@@ -2516,13 +2670,13 @@
           <w:b/>
           <w:bCs/>
         </w:rPr>
-        <w:t xml:space="preserve">Facility address exception</w:t>
-      </w:r>
-      <w:r>
-        <w:t xml:space="preserve"> </w:t>
-      </w:r>
-      <w:r>
-        <w:t xml:space="preserve">— RESOLVED (July 28). All Shopify policies (Privacy, Terms, Refund) updated to 5115 N 27th Ave, Bld 66, Phoenix, AZ 85017.</w:t>
+        <w:t xml:space="preserve">OEM / Lumanova data boundary</w:t>
+      </w:r>
+      <w:r>
+        <w:t xml:space="preserve"> </w:t>
+      </w:r>
+      <w:r>
+        <w:t xml:space="preserve">— formalize an auditable path as the partner program grows.</w:t>
       </w:r>
     </w:p>
     <w:p>
@@ -2538,6 +2692,50 @@
           <w:b/>
           <w:bCs/>
         </w:rPr>
+        <w:t xml:space="preserve">Metric governance owner</w:t>
+      </w:r>
+      <w:r>
+        <w:t xml:space="preserve"> </w:t>
+      </w:r>
+      <w:r>
+        <w:t xml:space="preserve">— figures reconciled; assign a single owner.</w:t>
+      </w:r>
+    </w:p>
+    <w:p>
+      <w:pPr>
+        <w:pStyle w:val="Compact"/>
+        <w:numPr>
+          <w:ilvl w:val="0"/>
+          <w:numId w:val="1045"/>
+        </w:numPr>
+      </w:pPr>
+      <w:r>
+        <w:rPr>
+          <w:b/>
+          <w:bCs/>
+        </w:rPr>
+        <w:t xml:space="preserve">Facility address exception</w:t>
+      </w:r>
+      <w:r>
+        <w:t xml:space="preserve"> </w:t>
+      </w:r>
+      <w:r>
+        <w:t xml:space="preserve">— RESOLVED (July 28). All Shopify policies (Privacy, Terms, Refund) updated to 5115 N 27th Ave, Bld 66, Phoenix, AZ 85017.</w:t>
+      </w:r>
+    </w:p>
+    <w:p>
+      <w:pPr>
+        <w:pStyle w:val="Compact"/>
+        <w:numPr>
+          <w:ilvl w:val="0"/>
+          <w:numId w:val="1046"/>
+        </w:numPr>
+      </w:pPr>
+      <w:r>
+        <w:rPr>
+          <w:b/>
+          <w:bCs/>
+        </w:rPr>
         <w:t xml:space="preserve">Status-lifecycle representation</w:t>
       </w:r>
       <w:r>
@@ -2613,7 +2811,7 @@
         <w:pStyle w:val="Compact"/>
         <w:numPr>
           <w:ilvl w:val="0"/>
-          <w:numId w:val="1045"/>
+          <w:numId w:val="1047"/>
         </w:numPr>
       </w:pPr>
       <w:r>
@@ -2628,66 +2826,6 @@
       </w:r>
       <w:r>
         <w:t xml:space="preserve">— planned for the next version of Enyrgy, replacing the need for a third-party Shopify referral app. This will supply the referral link/mechanic that WF-07 and the Referral and Reviews agent are waiting on ($150 off referee / $100 store credit referrer are the intended terms).</w:t>
-      </w:r>
-    </w:p>
-    <w:p>
-      <w:pPr>
-        <w:pStyle w:val="Compact"/>
-        <w:numPr>
-          <w:ilvl w:val="0"/>
-          <w:numId w:val="1046"/>
-        </w:numPr>
-      </w:pPr>
-      <w:r>
-        <w:rPr>
-          <w:b/>
-          <w:bCs/>
-        </w:rPr>
-        <w:t xml:space="preserve">Reporting dashboards</w:t>
-      </w:r>
-      <w:r>
-        <w:t xml:space="preserve"> </w:t>
-      </w:r>
-      <w:r>
-        <w:t xml:space="preserve">(GHL KPI views) and the</w:t>
-      </w:r>
-      <w:r>
-        <w:t xml:space="preserve"> </w:t>
-      </w:r>
-      <w:r>
-        <w:rPr>
-          <w:b/>
-          <w:bCs/>
-        </w:rPr>
-        <w:t xml:space="preserve">Reporting Agent</w:t>
-      </w:r>
-      <w:r>
-        <w:t xml:space="preserve"> </w:t>
-      </w:r>
-      <w:r>
-        <w:t xml:space="preserve">(Phase-2 addition).</w:t>
-      </w:r>
-    </w:p>
-    <w:p>
-      <w:pPr>
-        <w:pStyle w:val="Compact"/>
-        <w:numPr>
-          <w:ilvl w:val="0"/>
-          <w:numId w:val="1047"/>
-        </w:numPr>
-      </w:pPr>
-      <w:r>
-        <w:rPr>
-          <w:b/>
-          <w:bCs/>
-        </w:rPr>
-        <w:t xml:space="preserve">The other five Phase-2 agents</w:t>
-      </w:r>
-      <w:r>
-        <w:t xml:space="preserve"> </w:t>
-      </w:r>
-      <w:r>
-        <w:t xml:space="preserve">— Proposal Writer, OEM Pipeline, Podcast Attribution, Clinical Concierge, Billing. Add only after the core is stable.</w:t>
       </w:r>
     </w:p>
     <w:p>
@@ -2703,13 +2841,29 @@
           <w:b/>
           <w:bCs/>
         </w:rPr>
-        <w:t xml:space="preserve">Paid acquisition</w:t>
-      </w:r>
-      <w:r>
-        <w:t xml:space="preserve"> </w:t>
-      </w:r>
-      <w:r>
-        <w:t xml:space="preserve">(Meta/Google) — after domain warmup finishes.</w:t>
+        <w:t xml:space="preserve">Reporting dashboards</w:t>
+      </w:r>
+      <w:r>
+        <w:t xml:space="preserve"> </w:t>
+      </w:r>
+      <w:r>
+        <w:t xml:space="preserve">(GHL KPI views) and the</w:t>
+      </w:r>
+      <w:r>
+        <w:t xml:space="preserve"> </w:t>
+      </w:r>
+      <w:r>
+        <w:rPr>
+          <w:b/>
+          <w:bCs/>
+        </w:rPr>
+        <w:t xml:space="preserve">Reporting Agent</w:t>
+      </w:r>
+      <w:r>
+        <w:t xml:space="preserve"> </w:t>
+      </w:r>
+      <w:r>
+        <w:t xml:space="preserve">(Phase-2 addition).</w:t>
       </w:r>
     </w:p>
     <w:p>
@@ -2725,28 +2879,13 @@
           <w:b/>
           <w:bCs/>
         </w:rPr>
-        <w:t xml:space="preserve">Domain warmup ramp</w:t>
-      </w:r>
-      <w:r>
-        <w:t xml:space="preserve"> </w:t>
-      </w:r>
-      <w:r>
-        <w:t xml:space="preserve">— mg.enyrgy.com still Stage 1; do NOT bulk-send the 600+ list. Send the first testimonial batch warmup-safe; run weekly gift-card fulfillment from the</w:t>
-      </w:r>
-      <w:r>
-        <w:t xml:space="preserve"> </w:t>
-      </w:r>
-      <w:r>
-        <w:rPr>
-          <w:rStyle w:val="VerbatimChar"/>
-        </w:rPr>
-        <w:t xml:space="preserve">gift_card_pending</w:t>
-      </w:r>
-      <w:r>
-        <w:t xml:space="preserve"> </w:t>
-      </w:r>
-      <w:r>
-        <w:t xml:space="preserve">queue.</w:t>
+        <w:t xml:space="preserve">The other five Phase-2 agents</w:t>
+      </w:r>
+      <w:r>
+        <w:t xml:space="preserve"> </w:t>
+      </w:r>
+      <w:r>
+        <w:t xml:space="preserve">— Proposal Writer, OEM Pipeline, Podcast Attribution, Clinical Concierge, Billing. Add only after the core is stable.</w:t>
       </w:r>
     </w:p>
     <w:p>
@@ -2762,13 +2901,13 @@
           <w:b/>
           <w:bCs/>
         </w:rPr>
-        <w:t xml:space="preserve">Form embeds</w:t>
-      </w:r>
-      <w:r>
-        <w:t xml:space="preserve"> </w:t>
-      </w:r>
-      <w:r>
-        <w:t xml:space="preserve">— Commercial Inquiry + Partner Application forms onto go.enyrgy.com (developer).</w:t>
+        <w:t xml:space="preserve">Paid acquisition</w:t>
+      </w:r>
+      <w:r>
+        <w:t xml:space="preserve"> </w:t>
+      </w:r>
+      <w:r>
+        <w:t xml:space="preserve">(Meta/Google) — after domain warmup finishes.</w:t>
       </w:r>
     </w:p>
     <w:p>
@@ -2784,6 +2923,65 @@
           <w:b/>
           <w:bCs/>
         </w:rPr>
+        <w:t xml:space="preserve">Domain warmup ramp</w:t>
+      </w:r>
+      <w:r>
+        <w:t xml:space="preserve"> </w:t>
+      </w:r>
+      <w:r>
+        <w:t xml:space="preserve">— mg.enyrgy.com still Stage 1; do NOT bulk-send the 600+ list. Send the first testimonial batch warmup-safe; run weekly gift-card fulfillment from the</w:t>
+      </w:r>
+      <w:r>
+        <w:t xml:space="preserve"> </w:t>
+      </w:r>
+      <w:r>
+        <w:rPr>
+          <w:rStyle w:val="VerbatimChar"/>
+        </w:rPr>
+        <w:t xml:space="preserve">gift_card_pending</w:t>
+      </w:r>
+      <w:r>
+        <w:t xml:space="preserve"> </w:t>
+      </w:r>
+      <w:r>
+        <w:t xml:space="preserve">queue.</w:t>
+      </w:r>
+    </w:p>
+    <w:p>
+      <w:pPr>
+        <w:pStyle w:val="Compact"/>
+        <w:numPr>
+          <w:ilvl w:val="0"/>
+          <w:numId w:val="1052"/>
+        </w:numPr>
+      </w:pPr>
+      <w:r>
+        <w:rPr>
+          <w:b/>
+          <w:bCs/>
+        </w:rPr>
+        <w:t xml:space="preserve">Form embeds</w:t>
+      </w:r>
+      <w:r>
+        <w:t xml:space="preserve"> </w:t>
+      </w:r>
+      <w:r>
+        <w:t xml:space="preserve">— Commercial Inquiry + Partner Application forms onto go.enyrgy.com (developer).</w:t>
+      </w:r>
+    </w:p>
+    <w:p>
+      <w:pPr>
+        <w:pStyle w:val="Compact"/>
+        <w:numPr>
+          <w:ilvl w:val="0"/>
+          <w:numId w:val="1053"/>
+        </w:numPr>
+      </w:pPr>
+      <w:r>
+        <w:rPr>
+          <w:b/>
+          <w:bCs/>
+        </w:rPr>
         <w:t xml:space="preserve">Upgrade the abandoned-checkout Railway service off trial</w:t>
       </w:r>
       <w:r>
@@ -2808,7 +3006,7 @@
         <w:pStyle w:val="Compact"/>
         <w:numPr>
           <w:ilvl w:val="0"/>
-          <w:numId w:val="1052"/>
+          <w:numId w:val="1054"/>
         </w:numPr>
       </w:pPr>
       <w:r>
@@ -2842,7 +3040,7 @@
         <w:pStyle w:val="Compact"/>
         <w:numPr>
           <w:ilvl w:val="0"/>
-          <w:numId w:val="1053"/>
+          <w:numId w:val="1055"/>
         </w:numPr>
       </w:pPr>
       <w:r>
@@ -2864,7 +3062,7 @@
         <w:pStyle w:val="Compact"/>
         <w:numPr>
           <w:ilvl w:val="0"/>
-          <w:numId w:val="1054"/>
+          <w:numId w:val="1056"/>
         </w:numPr>
       </w:pPr>
       <w:r>
@@ -2914,7 +3112,7 @@
         <w:pStyle w:val="Compact"/>
         <w:numPr>
           <w:ilvl w:val="0"/>
-          <w:numId w:val="1055"/>
+          <w:numId w:val="1057"/>
         </w:numPr>
       </w:pPr>
       <w:r>
@@ -2948,7 +3146,7 @@
         <w:pStyle w:val="Compact"/>
         <w:numPr>
           <w:ilvl w:val="0"/>
-          <w:numId w:val="1056"/>
+          <w:numId w:val="1058"/>
         </w:numPr>
       </w:pPr>
       <w:r>
@@ -3332,6 +3530,91 @@
       </w:rPr>
     </w:lvl>
   </w:abstractNum>
+  <w:abstractNum w:abstractNumId="99411">
+    <w:nsid w:val="00A99411"/>
+    <w:multiLevelType w:val="multilevel"/>
+    <w:lvl w:ilvl="0">
+      <w:start w:val="1"/>
+      <w:numFmt w:val="decimal"/>
+      <w:lvlText w:val="%1."/>
+      <w:lvlJc w:val="left"/>
+      <w:pPr>
+        <w:ind w:left="720" w:hanging="360"/>
+      </w:pPr>
+    </w:lvl>
+    <w:lvl w:ilvl="1">
+      <w:start w:val="1"/>
+      <w:numFmt w:val="decimal"/>
+      <w:lvlText w:val="%2."/>
+      <w:lvlJc w:val="left"/>
+      <w:pPr>
+        <w:ind w:left="1440" w:hanging="360"/>
+      </w:pPr>
+    </w:lvl>
+    <w:lvl w:ilvl="2">
+      <w:start w:val="1"/>
+      <w:numFmt w:val="decimal"/>
+      <w:lvlText w:val="%3."/>
+      <w:lvlJc w:val="left"/>
+      <w:pPr>
+        <w:ind w:left="2160" w:hanging="360"/>
+      </w:pPr>
+    </w:lvl>
+    <w:lvl w:ilvl="3">
+      <w:start w:val="1"/>
+      <w:numFmt w:val="decimal"/>
+      <w:lvlText w:val="%4."/>
+      <w:lvlJc w:val="left"/>
+      <w:pPr>
+        <w:ind w:left="2880" w:hanging="360"/>
+      </w:pPr>
+    </w:lvl>
+    <w:lvl w:ilvl="4">
+      <w:start w:val="1"/>
+      <w:numFmt w:val="decimal"/>
+      <w:lvlText w:val="%5."/>
+      <w:lvlJc w:val="left"/>
+      <w:pPr>
+        <w:ind w:left="3600" w:hanging="360"/>
+      </w:pPr>
+    </w:lvl>
+    <w:lvl w:ilvl="5">
+      <w:start w:val="1"/>
+      <w:numFmt w:val="decimal"/>
+      <w:lvlText w:val="%6."/>
+      <w:lvlJc w:val="left"/>
+      <w:pPr>
+        <w:ind w:left="4320" w:hanging="360"/>
+      </w:pPr>
+    </w:lvl>
+    <w:lvl w:ilvl="6">
+      <w:start w:val="1"/>
+      <w:numFmt w:val="decimal"/>
+      <w:lvlText w:val="%7."/>
+      <w:lvlJc w:val="left"/>
+      <w:pPr>
+        <w:ind w:left="5040" w:hanging="360"/>
+      </w:pPr>
+    </w:lvl>
+    <w:lvl w:ilvl="7">
+      <w:start w:val="1"/>
+      <w:numFmt w:val="decimal"/>
+      <w:lvlText w:val="%8."/>
+      <w:lvlJc w:val="left"/>
+      <w:pPr>
+        <w:ind w:left="5760" w:hanging="360"/>
+      </w:pPr>
+    </w:lvl>
+    <w:lvl w:ilvl="8">
+      <w:start w:val="1"/>
+      <w:numFmt w:val="decimal"/>
+      <w:lvlText w:val="%9."/>
+      <w:lvlJc w:val="left"/>
+      <w:pPr>
+        <w:ind w:left="6480" w:hanging="360"/>
+      </w:pPr>
+    </w:lvl>
+  </w:abstractNum>
   <w:num w:numId="1000">
     <w:abstractNumId w:val="990"/>
   </w:num>
@@ -3411,7 +3694,34 @@
     <w:abstractNumId w:val="992"/>
   </w:num>
   <w:num w:numId="1026">
-    <w:abstractNumId w:val="992"/>
+    <w:abstractNumId w:val="99411"/>
+    <w:lvlOverride w:ilvl="0">
+      <w:startOverride w:val="1"/>
+    </w:lvlOverride>
+    <w:lvlOverride w:ilvl="1">
+      <w:startOverride w:val="1"/>
+    </w:lvlOverride>
+    <w:lvlOverride w:ilvl="2">
+      <w:startOverride w:val="1"/>
+    </w:lvlOverride>
+    <w:lvlOverride w:ilvl="3">
+      <w:startOverride w:val="1"/>
+    </w:lvlOverride>
+    <w:lvlOverride w:ilvl="4">
+      <w:startOverride w:val="1"/>
+    </w:lvlOverride>
+    <w:lvlOverride w:ilvl="5">
+      <w:startOverride w:val="1"/>
+    </w:lvlOverride>
+    <w:lvlOverride w:ilvl="6">
+      <w:startOverride w:val="1"/>
+    </w:lvlOverride>
+    <w:lvlOverride w:ilvl="7">
+      <w:startOverride w:val="1"/>
+    </w:lvlOverride>
+    <w:lvlOverride w:ilvl="8">
+      <w:startOverride w:val="1"/>
+    </w:lvlOverride>
   </w:num>
   <w:num w:numId="1027">
     <w:abstractNumId w:val="992"/>
@@ -3426,28 +3736,28 @@
     <w:abstractNumId w:val="992"/>
   </w:num>
   <w:num w:numId="1031">
+    <w:abstractNumId w:val="992"/>
+  </w:num>
+  <w:num w:numId="1032">
+    <w:abstractNumId w:val="992"/>
+  </w:num>
+  <w:num w:numId="1033">
     <w:abstractNumId w:val="993"/>
   </w:num>
-  <w:num w:numId="1032">
+  <w:num w:numId="1034">
     <w:abstractNumId w:val="993"/>
   </w:num>
-  <w:num w:numId="1033">
+  <w:num w:numId="1035">
     <w:abstractNumId w:val="992"/>
   </w:num>
-  <w:num w:numId="1034">
+  <w:num w:numId="1036">
     <w:abstractNumId w:val="992"/>
   </w:num>
-  <w:num w:numId="1035">
+  <w:num w:numId="1037">
     <w:abstractNumId w:val="993"/>
   </w:num>
-  <w:num w:numId="1036">
+  <w:num w:numId="1038">
     <w:abstractNumId w:val="993"/>
-  </w:num>
-  <w:num w:numId="1037">
-    <w:abstractNumId w:val="992"/>
-  </w:num>
-  <w:num w:numId="1038">
-    <w:abstractNumId w:val="992"/>
   </w:num>
   <w:num w:numId="1039">
     <w:abstractNumId w:val="992"/>
@@ -3462,13 +3772,13 @@
     <w:abstractNumId w:val="992"/>
   </w:num>
   <w:num w:numId="1043">
-    <w:abstractNumId w:val="993"/>
+    <w:abstractNumId w:val="992"/>
   </w:num>
   <w:num w:numId="1044">
     <w:abstractNumId w:val="992"/>
   </w:num>
   <w:num w:numId="1045">
-    <w:abstractNumId w:val="992"/>
+    <w:abstractNumId w:val="993"/>
   </w:num>
   <w:num w:numId="1046">
     <w:abstractNumId w:val="992"/>
@@ -3489,18 +3799,24 @@
     <w:abstractNumId w:val="992"/>
   </w:num>
   <w:num w:numId="1052">
-    <w:abstractNumId w:val="993"/>
+    <w:abstractNumId w:val="992"/>
   </w:num>
   <w:num w:numId="1053">
     <w:abstractNumId w:val="992"/>
   </w:num>
   <w:num w:numId="1054">
-    <w:abstractNumId w:val="992"/>
+    <w:abstractNumId w:val="993"/>
   </w:num>
   <w:num w:numId="1055">
     <w:abstractNumId w:val="992"/>
   </w:num>
   <w:num w:numId="1056">
+    <w:abstractNumId w:val="992"/>
+  </w:num>
+  <w:num w:numId="1057">
+    <w:abstractNumId w:val="992"/>
+  </w:num>
+  <w:num w:numId="1058">
     <w:abstractNumId w:val="992"/>
   </w:num>
 </w:numbering>

</xml_diff>

<commit_message>
Attribution mechanism verified end to end: first-in + new-contacts-only both enforced
Co-Authored-By: Claude Opus 4.8 <noreply@anthropic.com>
</commit_message>
<xml_diff>
--- a/Enyrgy_Master_TODO.docx
+++ b/Enyrgy_Master_TODO.docx
@@ -1795,13 +1795,88 @@
           <w:b/>
           <w:bCs/>
         </w:rPr>
-        <w:t xml:space="preserve">TEST THE NEW ATTRIBUTION MECHANISM END TO END (not yet verified).</w:t>
-      </w:r>
-      <w:r>
-        <w:t xml:space="preserve"> </w:t>
-      </w:r>
-      <w:r>
-        <w:t xml:space="preserve">The capture chain was re-architected on July 30 (staging field + WF-31 Contact Created trigger) and has NOT been tested since. Two tests needed:</w:t>
+        <w:t xml:space="preserve">ATTRIBUTION MECHANISM VERIFIED END TO END (July 30). Both tests passed.</w:t>
+      </w:r>
+      <w:r>
+        <w:t xml:space="preserve"> </w:t>
+      </w:r>
+      <w:r>
+        <w:t xml:space="preserve">Test 1: new contact submitted via Synthesis Gap with</w:t>
+      </w:r>
+      <w:r>
+        <w:t xml:space="preserve"> </w:t>
+      </w:r>
+      <w:r>
+        <w:rPr>
+          <w:rStyle w:val="VerbatimChar"/>
+        </w:rPr>
+        <w:t xml:space="preserve">refid=24.TESTWF31001</w:t>
+      </w:r>
+      <w:r>
+        <w:t xml:space="preserve"> </w:t>
+      </w:r>
+      <w:r>
+        <w:t xml:space="preserve">-&gt; WF-31 fired -&gt;</w:t>
+      </w:r>
+      <w:r>
+        <w:t xml:space="preserve"> </w:t>
+      </w:r>
+      <w:r>
+        <w:rPr>
+          <w:rStyle w:val="VerbatimChar"/>
+        </w:rPr>
+        <w:t xml:space="preserve">FlexOffers Refid</w:t>
+      </w:r>
+      <w:r>
+        <w:t xml:space="preserve"> </w:t>
+      </w:r>
+      <w:r>
+        <w:t xml:space="preserve">= 24.TESTWF31001. Test 2: the SAME contact submitted again via Recovery Protocol with</w:t>
+      </w:r>
+      <w:r>
+        <w:t xml:space="preserve"> </w:t>
+      </w:r>
+      <w:r>
+        <w:rPr>
+          <w:rStyle w:val="VerbatimChar"/>
+        </w:rPr>
+        <w:t xml:space="preserve">refid=24.TESTWF31002</w:t>
+      </w:r>
+      <w:r>
+        <w:t xml:space="preserve"> </w:t>
+      </w:r>
+      <w:r>
+        <w:t xml:space="preserve">-&gt;</w:t>
+      </w:r>
+      <w:r>
+        <w:t xml:space="preserve"> </w:t>
+      </w:r>
+      <w:r>
+        <w:rPr>
+          <w:rStyle w:val="VerbatimChar"/>
+        </w:rPr>
+        <w:t xml:space="preserve">FlexOffers Refid Incoming</w:t>
+      </w:r>
+      <w:r>
+        <w:t xml:space="preserve"> </w:t>
+      </w:r>
+      <w:r>
+        <w:t xml:space="preserve">updated to 24.TESTWF31002 but</w:t>
+      </w:r>
+      <w:r>
+        <w:t xml:space="preserve"> </w:t>
+      </w:r>
+      <w:r>
+        <w:rPr>
+          <w:rStyle w:val="VerbatimChar"/>
+        </w:rPr>
+        <w:t xml:space="preserve">FlexOffers Refid</w:t>
+      </w:r>
+      <w:r>
+        <w:t xml:space="preserve"> </w:t>
+      </w:r>
+      <w:r>
+        <w:t xml:space="preserve">stayed 24.TESTWF31001. That confirms the Contact Created trigger does NOT fire on updates, so a later affiliate cannot take attribution from an existing contact. First-in and new-contacts-only both enforced. ORIGINAL TEST PLAN: The capture chain was re-architected on July 30 (staging field + WF-31 Contact Created trigger) and has NOT been tested since. Two tests needed:</w:t>
       </w:r>
     </w:p>
     <w:p>
@@ -3691,7 +3766,7 @@
     <w:abstractNumId w:val="992"/>
   </w:num>
   <w:num w:numId="1025">
-    <w:abstractNumId w:val="992"/>
+    <w:abstractNumId w:val="993"/>
   </w:num>
   <w:num w:numId="1026">
     <w:abstractNumId w:val="99411"/>

</xml_diff>

<commit_message>
FlexOffers: program renamed and all 5 magnet campaigns built with creatives
Rep confirmed one-program-many-campaigns. Program 250377 renamed to Enyrgy Affiliate
Program, description rewritten to cover all five magnets and state both attribution
rules to publishers. Five campaigns built, each with its own destination URL,
auto-renew on, and a magnet-specific description plus text link.

Tired Test moved off the DEFAULT campaign before YourTango goes live. Records why the
program default URL must keep pointing at a magnet page: capture code exists only on
those five pages, so any creative pointing elsewhere earns the publisher nothing.

Co-Authored-By: Claude Opus 4.8 <noreply@anthropic.com>
</commit_message>
<xml_diff>
--- a/Enyrgy_Master_TODO.docx
+++ b/Enyrgy_Master_TODO.docx
@@ -2017,7 +2017,13 @@
           <w:b/>
           <w:bCs/>
         </w:rPr>
-        <w:t xml:space="preserve">FlexOffers remaining (waiting on the FlexOffers rep, emailed July 29)</w:t>
+        <w:t xml:space="preserve">FlexOffers program structure BUILT OUT (July 30).</w:t>
+      </w:r>
+      <w:r>
+        <w:t xml:space="preserve"> </w:t>
+      </w:r>
+      <w:r>
+        <w:t xml:space="preserve">The rep confirmed one-program-many-campaigns is exactly how he would set it up, and that the program can be renamed anytime.</w:t>
       </w:r>
     </w:p>
     <w:p>
@@ -2029,6 +2035,327 @@
         </w:numPr>
       </w:pPr>
       <w:r>
+        <w:rPr>
+          <w:b/>
+          <w:bCs/>
+        </w:rPr>
+        <w:t xml:space="preserve">Program renamed</w:t>
+      </w:r>
+      <w:r>
+        <w:t xml:space="preserve"> </w:t>
+      </w:r>
+      <w:r>
+        <w:t xml:space="preserve">to</w:t>
+      </w:r>
+      <w:r>
+        <w:t xml:space="preserve"> </w:t>
+      </w:r>
+      <w:r>
+        <w:rPr>
+          <w:b/>
+          <w:bCs/>
+        </w:rPr>
+        <w:t xml:space="preserve">Enyrgy Affiliate Program</w:t>
+      </w:r>
+      <w:r>
+        <w:t xml:space="preserve"> </w:t>
+      </w:r>
+      <w:r>
+        <w:t xml:space="preserve">(#250377). Description rewritten to cover all five magnets and, importantly, to state both attribution rules in publisher-facing language. Field caps at 1500 characters (count line breaks as 2 for CRLF; the final copy is ~1291 plain / ~1307 worst case).</w:t>
+      </w:r>
+    </w:p>
+    <w:p>
+      <w:pPr>
+        <w:pStyle w:val="Compact"/>
+        <w:numPr>
+          <w:ilvl w:val="1"/>
+          <w:numId w:val="1028"/>
+        </w:numPr>
+      </w:pPr>
+      <w:r>
+        <w:rPr>
+          <w:b/>
+          <w:bCs/>
+        </w:rPr>
+        <w:t xml:space="preserve">Five campaigns built</w:t>
+      </w:r>
+      <w:r>
+        <w:t xml:space="preserve">, each with its own Destination URL on the LINK tab, Auto-Renew</w:t>
+      </w:r>
+      <w:r>
+        <w:t xml:space="preserve"> </w:t>
+      </w:r>
+      <w:r>
+        <w:rPr>
+          <w:b/>
+          <w:bCs/>
+        </w:rPr>
+        <w:t xml:space="preserve">Yes</w:t>
+      </w:r>
+      <w:r>
+        <w:t xml:space="preserve">, and an expiry of 12/31/2028:</w:t>
+      </w:r>
+      <w:r>
+        <w:t xml:space="preserve"> </w:t>
+      </w:r>
+      <w:r>
+        <w:rPr>
+          <w:rStyle w:val="VerbatimChar"/>
+        </w:rPr>
+        <w:t xml:space="preserve">Tired Test</w:t>
+      </w:r>
+      <w:r>
+        <w:t xml:space="preserve"> </w:t>
+      </w:r>
+      <w:r>
+        <w:t xml:space="preserve">-&gt; /tired-test,</w:t>
+      </w:r>
+      <w:r>
+        <w:t xml:space="preserve"> </w:t>
+      </w:r>
+      <w:r>
+        <w:rPr>
+          <w:rStyle w:val="VerbatimChar"/>
+        </w:rPr>
+        <w:t xml:space="preserve">Vitamin D Assessment</w:t>
+      </w:r>
+      <w:r>
+        <w:t xml:space="preserve"> </w:t>
+      </w:r>
+      <w:r>
+        <w:t xml:space="preserve">-&gt; /vitamin-d-assessment,</w:t>
+      </w:r>
+      <w:r>
+        <w:t xml:space="preserve"> </w:t>
+      </w:r>
+      <w:r>
+        <w:rPr>
+          <w:rStyle w:val="VerbatimChar"/>
+        </w:rPr>
+        <w:t xml:space="preserve">Synthesis Gap</w:t>
+      </w:r>
+      <w:r>
+        <w:t xml:space="preserve"> </w:t>
+      </w:r>
+      <w:r>
+        <w:t xml:space="preserve">-&gt; /synthesis-gap,</w:t>
+      </w:r>
+      <w:r>
+        <w:t xml:space="preserve"> </w:t>
+      </w:r>
+      <w:r>
+        <w:rPr>
+          <w:rStyle w:val="VerbatimChar"/>
+        </w:rPr>
+        <w:t xml:space="preserve">Recovery Protocol</w:t>
+      </w:r>
+      <w:r>
+        <w:t xml:space="preserve"> </w:t>
+      </w:r>
+      <w:r>
+        <w:t xml:space="preserve">-&gt; /recovery-protocol,</w:t>
+      </w:r>
+      <w:r>
+        <w:t xml:space="preserve"> </w:t>
+      </w:r>
+      <w:r>
+        <w:rPr>
+          <w:rStyle w:val="VerbatimChar"/>
+        </w:rPr>
+        <w:t xml:space="preserve">Winter Protocol</w:t>
+      </w:r>
+      <w:r>
+        <w:t xml:space="preserve"> </w:t>
+      </w:r>
+      <w:r>
+        <w:t xml:space="preserve">-&gt; /winter-protocol. Each has a magnet-specific description telling publishers who the audience is and why it converts, plus one hand-written text link on top of the auto-generated default link.</w:t>
+      </w:r>
+    </w:p>
+    <w:p>
+      <w:pPr>
+        <w:pStyle w:val="Compact"/>
+        <w:numPr>
+          <w:ilvl w:val="1"/>
+          <w:numId w:val="1028"/>
+        </w:numPr>
+      </w:pPr>
+      <w:r>
+        <w:rPr>
+          <w:b/>
+          <w:bCs/>
+        </w:rPr>
+        <w:t xml:space="preserve">Auto-Renew matters:</w:t>
+      </w:r>
+      <w:r>
+        <w:t xml:space="preserve"> </w:t>
+      </w:r>
+      <w:r>
+        <w:t xml:space="preserve">the ORIGINAL Tired Test campaign on the old program has auto-renew OFF with a 09/30/2027 expiry, which would silently kill every publisher link under it on that date. All new campaigns are set to renew.</w:t>
+      </w:r>
+    </w:p>
+    <w:p>
+      <w:pPr>
+        <w:pStyle w:val="Compact"/>
+        <w:numPr>
+          <w:ilvl w:val="1"/>
+          <w:numId w:val="1028"/>
+        </w:numPr>
+      </w:pPr>
+      <w:r>
+        <w:rPr>
+          <w:b/>
+          <w:bCs/>
+        </w:rPr>
+        <w:t xml:space="preserve">Tired Test moved off the DEFAULT campaign</w:t>
+      </w:r>
+      <w:r>
+        <w:t xml:space="preserve"> </w:t>
+      </w:r>
+      <w:r>
+        <w:t xml:space="preserve">onto its own proper campaign, deliberately done BEFORE YourTango goes live rather than restructuring under a live partner. Old duplicate creative #6673704 disabled.</w:t>
+      </w:r>
+    </w:p>
+    <w:p>
+      <w:pPr>
+        <w:pStyle w:val="Compact"/>
+        <w:numPr>
+          <w:ilvl w:val="1"/>
+          <w:numId w:val="1028"/>
+        </w:numPr>
+      </w:pPr>
+      <w:r>
+        <w:rPr>
+          <w:b/>
+          <w:bCs/>
+        </w:rPr>
+        <w:t xml:space="preserve">DELIBERATE: leave the program default URL pointing at</w:t>
+      </w:r>
+      <w:r>
+        <w:rPr>
+          <w:b/>
+          <w:bCs/>
+        </w:rPr>
+        <w:t xml:space="preserve"> </w:t>
+      </w:r>
+      <w:r>
+        <w:rPr>
+          <w:rStyle w:val="VerbatimChar"/>
+          <w:b/>
+          <w:bCs/>
+        </w:rPr>
+        <w:t xml:space="preserve">go.enyrgy.com/tired-test</w:t>
+      </w:r>
+      <w:r>
+        <w:rPr>
+          <w:b/>
+          <w:bCs/>
+        </w:rPr>
+        <w:t xml:space="preserve">.</w:t>
+      </w:r>
+      <w:r>
+        <w:t xml:space="preserve"> </w:t>
+      </w:r>
+      <w:r>
+        <w:t xml:space="preserve">Do NOT</w:t>
+      </w:r>
+      <w:r>
+        <w:t xml:space="preserve"> </w:t>
+      </w:r>
+      <w:r>
+        <w:t xml:space="preserve">“tidy”</w:t>
+      </w:r>
+      <w:r>
+        <w:t xml:space="preserve"> </w:t>
+      </w:r>
+      <w:r>
+        <w:t xml:space="preserve">it back to enyrgy.com. The DEFAULT campaign’s creative is visible to publishers, and the refid capture code exists ONLY on the five magnet pages, so pointing the default anywhere else means a publisher using that creative drives traffic that captures nothing and earns nothing.</w:t>
+      </w:r>
+    </w:p>
+    <w:p>
+      <w:pPr>
+        <w:pStyle w:val="Compact"/>
+        <w:numPr>
+          <w:ilvl w:val="0"/>
+          <w:numId w:val="1029"/>
+        </w:numPr>
+      </w:pPr>
+      <w:r>
+        <w:rPr>
+          <w:b/>
+          <w:bCs/>
+        </w:rPr>
+        <w:t xml:space="preserve">Set up a publisher account and apply to your own program</w:t>
+      </w:r>
+      <w:r>
+        <w:t xml:space="preserve"> </w:t>
+      </w:r>
+      <w:r>
+        <w:t xml:space="preserve">(the rep’s best tip; he and Brittany will approve it). It is the only way to see exactly what publishers see: campaign descriptions, creatives, and how the five magnets read side by side. QA the program from the buyer’s side before recruiting.</w:t>
+      </w:r>
+    </w:p>
+    <w:p>
+      <w:pPr>
+        <w:pStyle w:val="Compact"/>
+        <w:numPr>
+          <w:ilvl w:val="0"/>
+          <w:numId w:val="1030"/>
+        </w:numPr>
+      </w:pPr>
+      <w:r>
+        <w:rPr>
+          <w:b/>
+          <w:bCs/>
+        </w:rPr>
+        <w:t xml:space="preserve">Decide what to do with the 3 brand creatives on the OLD program</w:t>
+      </w:r>
+      <w:r>
+        <w:t xml:space="preserve"> </w:t>
+      </w:r>
+      <w:r>
+        <w:t xml:space="preserve">(#6671366/67/68, the UVB and red-light product copy). They are not magnet creatives, so check where their campaign points.</w:t>
+      </w:r>
+      <w:r>
+        <w:t xml:space="preserve"> </w:t>
+      </w:r>
+      <w:r>
+        <w:rPr>
+          <w:b/>
+          <w:bCs/>
+        </w:rPr>
+        <w:t xml:space="preserve">If a creative sends traffic anywhere other than one of the five magnet pages, no refid is captured and the publisher earns nothing.</w:t>
+      </w:r>
+      <w:r>
+        <w:t xml:space="preserve"> </w:t>
+      </w:r>
+      <w:r>
+        <w:t xml:space="preserve">Either repoint them at magnets, or add the capture snippet to whatever other landing pages you want affiliates using.</w:t>
+      </w:r>
+    </w:p>
+    <w:p>
+      <w:pPr>
+        <w:pStyle w:val="Compact"/>
+        <w:numPr>
+          <w:ilvl w:val="0"/>
+          <w:numId w:val="1031"/>
+        </w:numPr>
+      </w:pPr>
+      <w:r>
+        <w:rPr>
+          <w:b/>
+          <w:bCs/>
+        </w:rPr>
+        <w:t xml:space="preserve">FlexOffers remaining (waiting on the FlexOffers rep, emailed July 29)</w:t>
+      </w:r>
+    </w:p>
+    <w:p>
+      <w:pPr>
+        <w:pStyle w:val="Compact"/>
+        <w:numPr>
+          <w:ilvl w:val="1"/>
+          <w:numId w:val="1032"/>
+        </w:numPr>
+      </w:pPr>
+      <w:r>
         <w:t xml:space="preserve">Get a</w:t>
       </w:r>
       <w:r>
@@ -2065,7 +2392,7 @@
         <w:pStyle w:val="Compact"/>
         <w:numPr>
           <w:ilvl w:val="1"/>
-          <w:numId w:val="1029"/>
+          <w:numId w:val="1033"/>
         </w:numPr>
       </w:pPr>
       <w:r>
@@ -2109,7 +2436,7 @@
         <w:pStyle w:val="Compact"/>
         <w:numPr>
           <w:ilvl w:val="1"/>
-          <w:numId w:val="1030"/>
+          <w:numId w:val="1034"/>
         </w:numPr>
       </w:pPr>
       <w:r>
@@ -2147,7 +2474,7 @@
         <w:pStyle w:val="Compact"/>
         <w:numPr>
           <w:ilvl w:val="1"/>
-          <w:numId w:val="1031"/>
+          <w:numId w:val="1035"/>
         </w:numPr>
       </w:pPr>
       <w:r>
@@ -2241,7 +2568,7 @@
         <w:pStyle w:val="Compact"/>
         <w:numPr>
           <w:ilvl w:val="1"/>
-          <w:numId w:val="1032"/>
+          <w:numId w:val="1036"/>
         </w:numPr>
       </w:pPr>
       <w:r>
@@ -2388,7 +2715,7 @@
         <w:pStyle w:val="Compact"/>
         <w:numPr>
           <w:ilvl w:val="0"/>
-          <w:numId w:val="1033"/>
+          <w:numId w:val="1037"/>
         </w:numPr>
       </w:pPr>
       <w:r>
@@ -2410,7 +2737,7 @@
         <w:pStyle w:val="Compact"/>
         <w:numPr>
           <w:ilvl w:val="0"/>
-          <w:numId w:val="1034"/>
+          <w:numId w:val="1038"/>
         </w:numPr>
       </w:pPr>
       <w:r>
@@ -2441,7 +2768,7 @@
         <w:pStyle w:val="Compact"/>
         <w:numPr>
           <w:ilvl w:val="0"/>
-          <w:numId w:val="1035"/>
+          <w:numId w:val="1039"/>
         </w:numPr>
       </w:pPr>
       <w:r>
@@ -2525,7 +2852,7 @@
         <w:pStyle w:val="Compact"/>
         <w:numPr>
           <w:ilvl w:val="0"/>
-          <w:numId w:val="1036"/>
+          <w:numId w:val="1040"/>
         </w:numPr>
       </w:pPr>
       <w:r>
@@ -2547,7 +2874,7 @@
         <w:pStyle w:val="Compact"/>
         <w:numPr>
           <w:ilvl w:val="0"/>
-          <w:numId w:val="1037"/>
+          <w:numId w:val="1041"/>
         </w:numPr>
       </w:pPr>
       <w:r>
@@ -2569,7 +2896,7 @@
         <w:pStyle w:val="Compact"/>
         <w:numPr>
           <w:ilvl w:val="0"/>
-          <w:numId w:val="1038"/>
+          <w:numId w:val="1042"/>
         </w:numPr>
       </w:pPr>
       <w:r>
@@ -2618,7 +2945,7 @@
         <w:pStyle w:val="Compact"/>
         <w:numPr>
           <w:ilvl w:val="0"/>
-          <w:numId w:val="1039"/>
+          <w:numId w:val="1043"/>
         </w:numPr>
       </w:pPr>
       <w:r>
@@ -2662,7 +2989,7 @@
         <w:pStyle w:val="Compact"/>
         <w:numPr>
           <w:ilvl w:val="0"/>
-          <w:numId w:val="1040"/>
+          <w:numId w:val="1044"/>
         </w:numPr>
       </w:pPr>
       <w:r>
@@ -2677,103 +3004,6 @@
       </w:r>
       <w:r>
         <w:t xml:space="preserve">— the EA flags this as the top gap, but it predates the Session 11 native integration + WF-27/28/29, which largely built it. Reconcile the EA and ratify rather than rebuild.</w:t>
-      </w:r>
-    </w:p>
-    <w:p>
-      <w:pPr>
-        <w:pStyle w:val="Compact"/>
-        <w:numPr>
-          <w:ilvl w:val="0"/>
-          <w:numId w:val="1041"/>
-        </w:numPr>
-      </w:pPr>
-      <w:r>
-        <w:rPr>
-          <w:b/>
-          <w:bCs/>
-        </w:rPr>
-        <w:t xml:space="preserve">System-of-record ownership map</w:t>
-      </w:r>
-      <w:r>
-        <w:t xml:space="preserve"> </w:t>
-      </w:r>
-      <w:r>
-        <w:t xml:space="preserve">— ratify the documented SoR (decision/doc task).</w:t>
-      </w:r>
-    </w:p>
-    <w:p>
-      <w:pPr>
-        <w:pStyle w:val="Compact"/>
-        <w:numPr>
-          <w:ilvl w:val="0"/>
-          <w:numId w:val="1042"/>
-        </w:numPr>
-      </w:pPr>
-      <w:r>
-        <w:rPr>
-          <w:b/>
-          <w:bCs/>
-        </w:rPr>
-        <w:t xml:space="preserve">Device App to GHL usage-data flow</w:t>
-      </w:r>
-      <w:r>
-        <w:t xml:space="preserve"> </w:t>
-      </w:r>
-      <w:r>
-        <w:t xml:space="preserve">— deferred</w:t>
-      </w:r>
-      <w:r>
-        <w:t xml:space="preserve"> </w:t>
-      </w:r>
-      <w:r>
-        <w:t xml:space="preserve">“Phase 2-plus”</w:t>
-      </w:r>
-      <w:r>
-        <w:t xml:space="preserve">; decide whether/how usage data flows, with privacy treatment.</w:t>
-      </w:r>
-    </w:p>
-    <w:p>
-      <w:pPr>
-        <w:pStyle w:val="Compact"/>
-        <w:numPr>
-          <w:ilvl w:val="0"/>
-          <w:numId w:val="1043"/>
-        </w:numPr>
-      </w:pPr>
-      <w:r>
-        <w:rPr>
-          <w:b/>
-          <w:bCs/>
-        </w:rPr>
-        <w:t xml:space="preserve">OEM / Lumanova data boundary</w:t>
-      </w:r>
-      <w:r>
-        <w:t xml:space="preserve"> </w:t>
-      </w:r>
-      <w:r>
-        <w:t xml:space="preserve">— formalize an auditable path as the partner program grows.</w:t>
-      </w:r>
-    </w:p>
-    <w:p>
-      <w:pPr>
-        <w:pStyle w:val="Compact"/>
-        <w:numPr>
-          <w:ilvl w:val="0"/>
-          <w:numId w:val="1044"/>
-        </w:numPr>
-      </w:pPr>
-      <w:r>
-        <w:rPr>
-          <w:b/>
-          <w:bCs/>
-        </w:rPr>
-        <w:t xml:space="preserve">Metric governance owner</w:t>
-      </w:r>
-      <w:r>
-        <w:t xml:space="preserve"> </w:t>
-      </w:r>
-      <w:r>
-        <w:t xml:space="preserve">— figures reconciled; assign a single owner.</w:t>
       </w:r>
     </w:p>
     <w:p>
@@ -2789,13 +3019,13 @@
           <w:b/>
           <w:bCs/>
         </w:rPr>
-        <w:t xml:space="preserve">Facility address exception</w:t>
-      </w:r>
-      <w:r>
-        <w:t xml:space="preserve"> </w:t>
-      </w:r>
-      <w:r>
-        <w:t xml:space="preserve">— RESOLVED (July 28). All Shopify policies (Privacy, Terms, Refund) updated to 5115 N 27th Ave, Bld 66, Phoenix, AZ 85017.</w:t>
+        <w:t xml:space="preserve">System-of-record ownership map</w:t>
+      </w:r>
+      <w:r>
+        <w:t xml:space="preserve"> </w:t>
+      </w:r>
+      <w:r>
+        <w:t xml:space="preserve">— ratify the documented SoR (decision/doc task).</w:t>
       </w:r>
     </w:p>
     <w:p>
@@ -2811,6 +3041,103 @@
           <w:b/>
           <w:bCs/>
         </w:rPr>
+        <w:t xml:space="preserve">Device App to GHL usage-data flow</w:t>
+      </w:r>
+      <w:r>
+        <w:t xml:space="preserve"> </w:t>
+      </w:r>
+      <w:r>
+        <w:t xml:space="preserve">— deferred</w:t>
+      </w:r>
+      <w:r>
+        <w:t xml:space="preserve"> </w:t>
+      </w:r>
+      <w:r>
+        <w:t xml:space="preserve">“Phase 2-plus”</w:t>
+      </w:r>
+      <w:r>
+        <w:t xml:space="preserve">; decide whether/how usage data flows, with privacy treatment.</w:t>
+      </w:r>
+    </w:p>
+    <w:p>
+      <w:pPr>
+        <w:pStyle w:val="Compact"/>
+        <w:numPr>
+          <w:ilvl w:val="0"/>
+          <w:numId w:val="1047"/>
+        </w:numPr>
+      </w:pPr>
+      <w:r>
+        <w:rPr>
+          <w:b/>
+          <w:bCs/>
+        </w:rPr>
+        <w:t xml:space="preserve">OEM / Lumanova data boundary</w:t>
+      </w:r>
+      <w:r>
+        <w:t xml:space="preserve"> </w:t>
+      </w:r>
+      <w:r>
+        <w:t xml:space="preserve">— formalize an auditable path as the partner program grows.</w:t>
+      </w:r>
+    </w:p>
+    <w:p>
+      <w:pPr>
+        <w:pStyle w:val="Compact"/>
+        <w:numPr>
+          <w:ilvl w:val="0"/>
+          <w:numId w:val="1048"/>
+        </w:numPr>
+      </w:pPr>
+      <w:r>
+        <w:rPr>
+          <w:b/>
+          <w:bCs/>
+        </w:rPr>
+        <w:t xml:space="preserve">Metric governance owner</w:t>
+      </w:r>
+      <w:r>
+        <w:t xml:space="preserve"> </w:t>
+      </w:r>
+      <w:r>
+        <w:t xml:space="preserve">— figures reconciled; assign a single owner.</w:t>
+      </w:r>
+    </w:p>
+    <w:p>
+      <w:pPr>
+        <w:pStyle w:val="Compact"/>
+        <w:numPr>
+          <w:ilvl w:val="0"/>
+          <w:numId w:val="1049"/>
+        </w:numPr>
+      </w:pPr>
+      <w:r>
+        <w:rPr>
+          <w:b/>
+          <w:bCs/>
+        </w:rPr>
+        <w:t xml:space="preserve">Facility address exception</w:t>
+      </w:r>
+      <w:r>
+        <w:t xml:space="preserve"> </w:t>
+      </w:r>
+      <w:r>
+        <w:t xml:space="preserve">— RESOLVED (July 28). All Shopify policies (Privacy, Terms, Refund) updated to 5115 N 27th Ave, Bld 66, Phoenix, AZ 85017.</w:t>
+      </w:r>
+    </w:p>
+    <w:p>
+      <w:pPr>
+        <w:pStyle w:val="Compact"/>
+        <w:numPr>
+          <w:ilvl w:val="0"/>
+          <w:numId w:val="1050"/>
+        </w:numPr>
+      </w:pPr>
+      <w:r>
+        <w:rPr>
+          <w:b/>
+          <w:bCs/>
+        </w:rPr>
         <w:t xml:space="preserve">Status-lifecycle representation</w:t>
       </w:r>
       <w:r>
@@ -2886,7 +3213,7 @@
         <w:pStyle w:val="Compact"/>
         <w:numPr>
           <w:ilvl w:val="0"/>
-          <w:numId w:val="1047"/>
+          <w:numId w:val="1051"/>
         </w:numPr>
       </w:pPr>
       <w:r>
@@ -2901,125 +3228,6 @@
       </w:r>
       <w:r>
         <w:t xml:space="preserve">— planned for the next version of Enyrgy, replacing the need for a third-party Shopify referral app. This will supply the referral link/mechanic that WF-07 and the Referral and Reviews agent are waiting on ($150 off referee / $100 store credit referrer are the intended terms).</w:t>
-      </w:r>
-    </w:p>
-    <w:p>
-      <w:pPr>
-        <w:pStyle w:val="Compact"/>
-        <w:numPr>
-          <w:ilvl w:val="0"/>
-          <w:numId w:val="1048"/>
-        </w:numPr>
-      </w:pPr>
-      <w:r>
-        <w:rPr>
-          <w:b/>
-          <w:bCs/>
-        </w:rPr>
-        <w:t xml:space="preserve">Reporting dashboards</w:t>
-      </w:r>
-      <w:r>
-        <w:t xml:space="preserve"> </w:t>
-      </w:r>
-      <w:r>
-        <w:t xml:space="preserve">(GHL KPI views) and the</w:t>
-      </w:r>
-      <w:r>
-        <w:t xml:space="preserve"> </w:t>
-      </w:r>
-      <w:r>
-        <w:rPr>
-          <w:b/>
-          <w:bCs/>
-        </w:rPr>
-        <w:t xml:space="preserve">Reporting Agent</w:t>
-      </w:r>
-      <w:r>
-        <w:t xml:space="preserve"> </w:t>
-      </w:r>
-      <w:r>
-        <w:t xml:space="preserve">(Phase-2 addition).</w:t>
-      </w:r>
-    </w:p>
-    <w:p>
-      <w:pPr>
-        <w:pStyle w:val="Compact"/>
-        <w:numPr>
-          <w:ilvl w:val="0"/>
-          <w:numId w:val="1049"/>
-        </w:numPr>
-      </w:pPr>
-      <w:r>
-        <w:rPr>
-          <w:b/>
-          <w:bCs/>
-        </w:rPr>
-        <w:t xml:space="preserve">The other five Phase-2 agents</w:t>
-      </w:r>
-      <w:r>
-        <w:t xml:space="preserve"> </w:t>
-      </w:r>
-      <w:r>
-        <w:t xml:space="preserve">— Proposal Writer, OEM Pipeline, Podcast Attribution, Clinical Concierge, Billing. Add only after the core is stable.</w:t>
-      </w:r>
-    </w:p>
-    <w:p>
-      <w:pPr>
-        <w:pStyle w:val="Compact"/>
-        <w:numPr>
-          <w:ilvl w:val="0"/>
-          <w:numId w:val="1050"/>
-        </w:numPr>
-      </w:pPr>
-      <w:r>
-        <w:rPr>
-          <w:b/>
-          <w:bCs/>
-        </w:rPr>
-        <w:t xml:space="preserve">Paid acquisition</w:t>
-      </w:r>
-      <w:r>
-        <w:t xml:space="preserve"> </w:t>
-      </w:r>
-      <w:r>
-        <w:t xml:space="preserve">(Meta/Google) — after domain warmup finishes.</w:t>
-      </w:r>
-    </w:p>
-    <w:p>
-      <w:pPr>
-        <w:pStyle w:val="Compact"/>
-        <w:numPr>
-          <w:ilvl w:val="0"/>
-          <w:numId w:val="1051"/>
-        </w:numPr>
-      </w:pPr>
-      <w:r>
-        <w:rPr>
-          <w:b/>
-          <w:bCs/>
-        </w:rPr>
-        <w:t xml:space="preserve">Domain warmup ramp</w:t>
-      </w:r>
-      <w:r>
-        <w:t xml:space="preserve"> </w:t>
-      </w:r>
-      <w:r>
-        <w:t xml:space="preserve">— mg.enyrgy.com still Stage 1; do NOT bulk-send the 600+ list. Send the first testimonial batch warmup-safe; run weekly gift-card fulfillment from the</w:t>
-      </w:r>
-      <w:r>
-        <w:t xml:space="preserve"> </w:t>
-      </w:r>
-      <w:r>
-        <w:rPr>
-          <w:rStyle w:val="VerbatimChar"/>
-        </w:rPr>
-        <w:t xml:space="preserve">gift_card_pending</w:t>
-      </w:r>
-      <w:r>
-        <w:t xml:space="preserve"> </w:t>
-      </w:r>
-      <w:r>
-        <w:t xml:space="preserve">queue.</w:t>
       </w:r>
     </w:p>
     <w:p>
@@ -3035,13 +3243,29 @@
           <w:b/>
           <w:bCs/>
         </w:rPr>
-        <w:t xml:space="preserve">Form embeds</w:t>
-      </w:r>
-      <w:r>
-        <w:t xml:space="preserve"> </w:t>
-      </w:r>
-      <w:r>
-        <w:t xml:space="preserve">— Commercial Inquiry + Partner Application forms onto go.enyrgy.com (developer).</w:t>
+        <w:t xml:space="preserve">Reporting dashboards</w:t>
+      </w:r>
+      <w:r>
+        <w:t xml:space="preserve"> </w:t>
+      </w:r>
+      <w:r>
+        <w:t xml:space="preserve">(GHL KPI views) and the</w:t>
+      </w:r>
+      <w:r>
+        <w:t xml:space="preserve"> </w:t>
+      </w:r>
+      <w:r>
+        <w:rPr>
+          <w:b/>
+          <w:bCs/>
+        </w:rPr>
+        <w:t xml:space="preserve">Reporting Agent</w:t>
+      </w:r>
+      <w:r>
+        <w:t xml:space="preserve"> </w:t>
+      </w:r>
+      <w:r>
+        <w:t xml:space="preserve">(Phase-2 addition).</w:t>
       </w:r>
     </w:p>
     <w:p>
@@ -3057,6 +3281,109 @@
           <w:b/>
           <w:bCs/>
         </w:rPr>
+        <w:t xml:space="preserve">The other five Phase-2 agents</w:t>
+      </w:r>
+      <w:r>
+        <w:t xml:space="preserve"> </w:t>
+      </w:r>
+      <w:r>
+        <w:t xml:space="preserve">— Proposal Writer, OEM Pipeline, Podcast Attribution, Clinical Concierge, Billing. Add only after the core is stable.</w:t>
+      </w:r>
+    </w:p>
+    <w:p>
+      <w:pPr>
+        <w:pStyle w:val="Compact"/>
+        <w:numPr>
+          <w:ilvl w:val="0"/>
+          <w:numId w:val="1054"/>
+        </w:numPr>
+      </w:pPr>
+      <w:r>
+        <w:rPr>
+          <w:b/>
+          <w:bCs/>
+        </w:rPr>
+        <w:t xml:space="preserve">Paid acquisition</w:t>
+      </w:r>
+      <w:r>
+        <w:t xml:space="preserve"> </w:t>
+      </w:r>
+      <w:r>
+        <w:t xml:space="preserve">(Meta/Google) — after domain warmup finishes.</w:t>
+      </w:r>
+    </w:p>
+    <w:p>
+      <w:pPr>
+        <w:pStyle w:val="Compact"/>
+        <w:numPr>
+          <w:ilvl w:val="0"/>
+          <w:numId w:val="1055"/>
+        </w:numPr>
+      </w:pPr>
+      <w:r>
+        <w:rPr>
+          <w:b/>
+          <w:bCs/>
+        </w:rPr>
+        <w:t xml:space="preserve">Domain warmup ramp</w:t>
+      </w:r>
+      <w:r>
+        <w:t xml:space="preserve"> </w:t>
+      </w:r>
+      <w:r>
+        <w:t xml:space="preserve">— mg.enyrgy.com still Stage 1; do NOT bulk-send the 600+ list. Send the first testimonial batch warmup-safe; run weekly gift-card fulfillment from the</w:t>
+      </w:r>
+      <w:r>
+        <w:t xml:space="preserve"> </w:t>
+      </w:r>
+      <w:r>
+        <w:rPr>
+          <w:rStyle w:val="VerbatimChar"/>
+        </w:rPr>
+        <w:t xml:space="preserve">gift_card_pending</w:t>
+      </w:r>
+      <w:r>
+        <w:t xml:space="preserve"> </w:t>
+      </w:r>
+      <w:r>
+        <w:t xml:space="preserve">queue.</w:t>
+      </w:r>
+    </w:p>
+    <w:p>
+      <w:pPr>
+        <w:pStyle w:val="Compact"/>
+        <w:numPr>
+          <w:ilvl w:val="0"/>
+          <w:numId w:val="1056"/>
+        </w:numPr>
+      </w:pPr>
+      <w:r>
+        <w:rPr>
+          <w:b/>
+          <w:bCs/>
+        </w:rPr>
+        <w:t xml:space="preserve">Form embeds</w:t>
+      </w:r>
+      <w:r>
+        <w:t xml:space="preserve"> </w:t>
+      </w:r>
+      <w:r>
+        <w:t xml:space="preserve">— Commercial Inquiry + Partner Application forms onto go.enyrgy.com (developer).</w:t>
+      </w:r>
+    </w:p>
+    <w:p>
+      <w:pPr>
+        <w:pStyle w:val="Compact"/>
+        <w:numPr>
+          <w:ilvl w:val="0"/>
+          <w:numId w:val="1057"/>
+        </w:numPr>
+      </w:pPr>
+      <w:r>
+        <w:rPr>
+          <w:b/>
+          <w:bCs/>
+        </w:rPr>
         <w:t xml:space="preserve">Upgrade the abandoned-checkout Railway service off trial</w:t>
       </w:r>
       <w:r>
@@ -3081,7 +3408,7 @@
         <w:pStyle w:val="Compact"/>
         <w:numPr>
           <w:ilvl w:val="0"/>
-          <w:numId w:val="1054"/>
+          <w:numId w:val="1058"/>
         </w:numPr>
       </w:pPr>
       <w:r>
@@ -3115,7 +3442,7 @@
         <w:pStyle w:val="Compact"/>
         <w:numPr>
           <w:ilvl w:val="0"/>
-          <w:numId w:val="1055"/>
+          <w:numId w:val="1059"/>
         </w:numPr>
       </w:pPr>
       <w:r>
@@ -3137,7 +3464,7 @@
         <w:pStyle w:val="Compact"/>
         <w:numPr>
           <w:ilvl w:val="0"/>
-          <w:numId w:val="1056"/>
+          <w:numId w:val="1060"/>
         </w:numPr>
       </w:pPr>
       <w:r>
@@ -3187,7 +3514,7 @@
         <w:pStyle w:val="Compact"/>
         <w:numPr>
           <w:ilvl w:val="0"/>
-          <w:numId w:val="1057"/>
+          <w:numId w:val="1061"/>
         </w:numPr>
       </w:pPr>
       <w:r>
@@ -3221,7 +3548,7 @@
         <w:pStyle w:val="Compact"/>
         <w:numPr>
           <w:ilvl w:val="0"/>
-          <w:numId w:val="1058"/>
+          <w:numId w:val="1062"/>
         </w:numPr>
       </w:pPr>
       <w:r>
@@ -3799,10 +4126,10 @@
     </w:lvlOverride>
   </w:num>
   <w:num w:numId="1027">
-    <w:abstractNumId w:val="992"/>
+    <w:abstractNumId w:val="993"/>
   </w:num>
   <w:num w:numId="1028">
-    <w:abstractNumId w:val="992"/>
+    <w:abstractNumId w:val="991"/>
   </w:num>
   <w:num w:numId="1029">
     <w:abstractNumId w:val="992"/>
@@ -3817,10 +4144,10 @@
     <w:abstractNumId w:val="992"/>
   </w:num>
   <w:num w:numId="1033">
-    <w:abstractNumId w:val="993"/>
+    <w:abstractNumId w:val="992"/>
   </w:num>
   <w:num w:numId="1034">
-    <w:abstractNumId w:val="993"/>
+    <w:abstractNumId w:val="992"/>
   </w:num>
   <w:num w:numId="1035">
     <w:abstractNumId w:val="992"/>
@@ -3841,10 +4168,10 @@
     <w:abstractNumId w:val="992"/>
   </w:num>
   <w:num w:numId="1041">
-    <w:abstractNumId w:val="992"/>
+    <w:abstractNumId w:val="993"/>
   </w:num>
   <w:num w:numId="1042">
-    <w:abstractNumId w:val="992"/>
+    <w:abstractNumId w:val="993"/>
   </w:num>
   <w:num w:numId="1043">
     <w:abstractNumId w:val="992"/>
@@ -3853,7 +4180,7 @@
     <w:abstractNumId w:val="992"/>
   </w:num>
   <w:num w:numId="1045">
-    <w:abstractNumId w:val="993"/>
+    <w:abstractNumId w:val="992"/>
   </w:num>
   <w:num w:numId="1046">
     <w:abstractNumId w:val="992"/>
@@ -3865,7 +4192,7 @@
     <w:abstractNumId w:val="992"/>
   </w:num>
   <w:num w:numId="1049">
-    <w:abstractNumId w:val="992"/>
+    <w:abstractNumId w:val="993"/>
   </w:num>
   <w:num w:numId="1050">
     <w:abstractNumId w:val="992"/>
@@ -3880,7 +4207,7 @@
     <w:abstractNumId w:val="992"/>
   </w:num>
   <w:num w:numId="1054">
-    <w:abstractNumId w:val="993"/>
+    <w:abstractNumId w:val="992"/>
   </w:num>
   <w:num w:numId="1055">
     <w:abstractNumId w:val="992"/>
@@ -3892,6 +4219,18 @@
     <w:abstractNumId w:val="992"/>
   </w:num>
   <w:num w:numId="1058">
+    <w:abstractNumId w:val="993"/>
+  </w:num>
+  <w:num w:numId="1059">
+    <w:abstractNumId w:val="992"/>
+  </w:num>
+  <w:num w:numId="1060">
+    <w:abstractNumId w:val="992"/>
+  </w:num>
+  <w:num w:numId="1061">
+    <w:abstractNumId w:val="992"/>
+  </w:num>
+  <w:num w:numId="1062">
     <w:abstractNumId w:val="992"/>
   </w:num>
 </w:numbering>

</xml_diff>

<commit_message>
FlexOffers: retarget red-light creative to Synthesis Gap, retire other 2 brand creatives
Also corrects the record: 4,233 clicks / 0 sales on the old program is normal for a
$2,995 considered purchase from cold traffic, not a tracking failure. The real issue
was creatives pointing at the website, which captures no email and permits no nurture.

Flags the open decision: 250377 is Private while the old program is Public, which is
why one has 124 publishers and the other has zero.

Co-Authored-By: Claude Opus 4.8 <noreply@anthropic.com>
</commit_message>
<xml_diff>
--- a/Enyrgy_Master_TODO.docx
+++ b/Enyrgy_Master_TODO.docx
@@ -2306,29 +2306,51 @@
           <w:b/>
           <w:bCs/>
         </w:rPr>
-        <w:t xml:space="preserve">Decide what to do with the 3 brand creatives on the OLD program</w:t>
-      </w:r>
-      <w:r>
-        <w:t xml:space="preserve"> </w:t>
-      </w:r>
-      <w:r>
-        <w:t xml:space="preserve">(#6671366/67/68, the UVB and red-light product copy). They are not magnet creatives, so check where their campaign points.</w:t>
-      </w:r>
-      <w:r>
-        <w:t xml:space="preserve"> </w:t>
-      </w:r>
-      <w:r>
-        <w:rPr>
-          <w:b/>
-          <w:bCs/>
-        </w:rPr>
-        <w:t xml:space="preserve">If a creative sends traffic anywhere other than one of the five magnet pages, no refid is captured and the publisher earns nothing.</w:t>
-      </w:r>
-      <w:r>
-        <w:t xml:space="preserve"> </w:t>
-      </w:r>
-      <w:r>
-        <w:t xml:space="preserve">Either repoint them at magnets, or add the capture snippet to whatever other landing pages you want affiliates using.</w:t>
+        <w:t xml:space="preserve">3 brand creatives on the OLD program handled (July 30).</w:t>
+      </w:r>
+      <w:r>
+        <w:t xml:space="preserve"> </w:t>
+      </w:r>
+      <w:r>
+        <w:t xml:space="preserve">The red-light angle (</w:t>
+      </w:r>
+      <w:r>
+        <w:t xml:space="preserve">“Already doing red light therapy?”</w:t>
+      </w:r>
+      <w:r>
+        <w:t xml:space="preserve">) was RECREATED under the new program’s</w:t>
+      </w:r>
+      <w:r>
+        <w:t xml:space="preserve"> </w:t>
+      </w:r>
+      <w:r>
+        <w:rPr>
+          <w:b/>
+          <w:bCs/>
+        </w:rPr>
+        <w:t xml:space="preserve">Synthesis Gap</w:t>
+      </w:r>
+      <w:r>
+        <w:t xml:space="preserve"> </w:t>
+      </w:r>
+      <w:r>
+        <w:t xml:space="preserve">campaign, repointed at a magnet so it now captures an email instead of dropping traffic on the website. The other two (#6671367 immunity/hormones/mood, #6671368 UVB safety) were disabled.</w:t>
+      </w:r>
+      <w:r>
+        <w:t xml:space="preserve"> </w:t>
+      </w:r>
+      <w:r>
+        <w:rPr>
+          <w:b/>
+          <w:bCs/>
+        </w:rPr>
+        <w:t xml:space="preserve">Framing correction worth keeping:</w:t>
+      </w:r>
+      <w:r>
+        <w:t xml:space="preserve"> </w:t>
+      </w:r>
+      <w:r>
+        <w:t xml:space="preserve">the old program’s 4,233 clicks / 0 sales is NOT evidence of broken tracking. It is the expected result for a $2,995 considered purchase from cold traffic. The real problem with those creatives was that they sent traffic to the website, which captures no email and allows no nurture. That is precisely why the lead-magnet program exists.</w:t>
       </w:r>
     </w:p>
     <w:p>
@@ -2344,91 +2366,108 @@
           <w:b/>
           <w:bCs/>
         </w:rPr>
+        <w:t xml:space="preserve">DECIDE: make program 250377 Public?</w:t>
+      </w:r>
+      <w:r>
+        <w:t xml:space="preserve"> </w:t>
+      </w:r>
+      <w:r>
+        <w:t xml:space="preserve">The old program (247334) is</w:t>
+      </w:r>
+      <w:r>
+        <w:t xml:space="preserve"> </w:t>
+      </w:r>
+      <w:r>
+        <w:rPr>
+          <w:b/>
+          <w:bCs/>
+        </w:rPr>
+        <w:t xml:space="preserve">Public</w:t>
+      </w:r>
+      <w:r>
+        <w:t xml:space="preserve">, which is why publishers found and joined it on their own and it has 124 of them. The new program (250377) is</w:t>
+      </w:r>
+      <w:r>
+        <w:t xml:space="preserve"> </w:t>
+      </w:r>
+      <w:r>
+        <w:rPr>
+          <w:b/>
+          <w:bCs/>
+        </w:rPr>
+        <w:t xml:space="preserve">Private</w:t>
+      </w:r>
+      <w:r>
+        <w:t xml:space="preserve">, so nobody can discover it and it will not grow organically even after Brittany adds people manually. Going Public would not cost control, because Publisher Approval is already set to</w:t>
+      </w:r>
+      <w:r>
+        <w:t xml:space="preserve"> </w:t>
+      </w:r>
+      <w:r>
+        <w:rPr>
+          <w:b/>
+          <w:bCs/>
+        </w:rPr>
+        <w:t xml:space="preserve">Manual Review</w:t>
+      </w:r>
+      <w:r>
+        <w:t xml:space="preserve"> </w:t>
+      </w:r>
+      <w:r>
+        <w:t xml:space="preserve">— publishers could find and apply, but each still needs approval. This is the more consequential open decision.</w:t>
+      </w:r>
+    </w:p>
+    <w:p>
+      <w:pPr>
+        <w:pStyle w:val="Compact"/>
+        <w:numPr>
+          <w:ilvl w:val="0"/>
+          <w:numId w:val="1032"/>
+        </w:numPr>
+      </w:pPr>
+      <w:r>
+        <w:rPr>
+          <w:strike/>
+        </w:rPr>
+        <w:t xml:space="preserve">Decide what to do with the 3 brand creatives on the OLD program</w:t>
+      </w:r>
+      <w:r>
+        <w:t xml:space="preserve"> </w:t>
+      </w:r>
+      <w:r>
+        <w:t xml:space="preserve">(#6671366/67/68, the UVB and red-light product copy). They are not magnet creatives, so check where their campaign points.</w:t>
+      </w:r>
+      <w:r>
+        <w:t xml:space="preserve"> </w:t>
+      </w:r>
+      <w:r>
+        <w:rPr>
+          <w:b/>
+          <w:bCs/>
+        </w:rPr>
+        <w:t xml:space="preserve">If a creative sends traffic anywhere other than one of the five magnet pages, no refid is captured and the publisher earns nothing.</w:t>
+      </w:r>
+      <w:r>
+        <w:t xml:space="preserve"> </w:t>
+      </w:r>
+      <w:r>
+        <w:t xml:space="preserve">Either repoint them at magnets, or add the capture snippet to whatever other landing pages you want affiliates using.</w:t>
+      </w:r>
+    </w:p>
+    <w:p>
+      <w:pPr>
+        <w:pStyle w:val="Compact"/>
+        <w:numPr>
+          <w:ilvl w:val="0"/>
+          <w:numId w:val="1033"/>
+        </w:numPr>
+      </w:pPr>
+      <w:r>
+        <w:rPr>
+          <w:b/>
+          <w:bCs/>
+        </w:rPr>
         <w:t xml:space="preserve">FlexOffers remaining (waiting on the FlexOffers rep, emailed July 29)</w:t>
-      </w:r>
-    </w:p>
-    <w:p>
-      <w:pPr>
-        <w:pStyle w:val="Compact"/>
-        <w:numPr>
-          <w:ilvl w:val="1"/>
-          <w:numId w:val="1032"/>
-        </w:numPr>
-      </w:pPr>
-      <w:r>
-        <w:t xml:space="preserve">Get a</w:t>
-      </w:r>
-      <w:r>
-        <w:t xml:space="preserve"> </w:t>
-      </w:r>
-      <w:r>
-        <w:rPr>
-          <w:b/>
-          <w:bCs/>
-        </w:rPr>
-        <w:t xml:space="preserve">test tracking link</w:t>
-      </w:r>
-      <w:r>
-        <w:t xml:space="preserve"> </w:t>
-      </w:r>
-      <w:r>
-        <w:t xml:space="preserve">for 250377, click it, confirm it lands on the quiz with</w:t>
-      </w:r>
-      <w:r>
-        <w:t xml:space="preserve"> </w:t>
-      </w:r>
-      <w:r>
-        <w:rPr>
-          <w:rStyle w:val="VerbatimChar"/>
-        </w:rPr>
-        <w:t xml:space="preserve">?refid=24.…</w:t>
-      </w:r>
-      <w:r>
-        <w:t xml:space="preserve">, complete the quiz, verify the contact’s FlexOffers Refid populates. Free verification of the click-to-capture path.</w:t>
-      </w:r>
-    </w:p>
-    <w:p>
-      <w:pPr>
-        <w:pStyle w:val="Compact"/>
-        <w:numPr>
-          <w:ilvl w:val="1"/>
-          <w:numId w:val="1033"/>
-        </w:numPr>
-      </w:pPr>
-      <w:r>
-        <w:t xml:space="preserve">Ask FlexOffers to</w:t>
-      </w:r>
-      <w:r>
-        <w:t xml:space="preserve"> </w:t>
-      </w:r>
-      <w:r>
-        <w:rPr>
-          <w:b/>
-          <w:bCs/>
-        </w:rPr>
-        <w:t xml:space="preserve">surface program 250377</w:t>
-      </w:r>
-      <w:r>
-        <w:t xml:space="preserve"> </w:t>
-      </w:r>
-      <w:r>
-        <w:t xml:space="preserve">to the network and migrate the</w:t>
-      </w:r>
-      <w:r>
-        <w:t xml:space="preserve"> </w:t>
-      </w:r>
-      <w:r>
-        <w:rPr>
-          <w:b/>
-          <w:bCs/>
-        </w:rPr>
-        <w:t xml:space="preserve">124 publishers</w:t>
-      </w:r>
-      <w:r>
-        <w:t xml:space="preserve"> </w:t>
-      </w:r>
-      <w:r>
-        <w:t xml:space="preserve">approved on the old program (#247334). Approvals are per-program, so 250377 has ZERO publishers today and nobody can promote the tracked link.</w:t>
       </w:r>
     </w:p>
     <w:p>
@@ -2440,33 +2479,35 @@
         </w:numPr>
       </w:pPr>
       <w:r>
-        <w:rPr>
-          <w:b/>
-          <w:bCs/>
-        </w:rPr>
-        <w:t xml:space="preserve">After</w:t>
-      </w:r>
-      <w:r>
-        <w:t xml:space="preserve"> </w:t>
-      </w:r>
-      <w:r>
-        <w:t xml:space="preserve">publishers migrate,</w:t>
-      </w:r>
-      <w:r>
-        <w:t xml:space="preserve"> </w:t>
-      </w:r>
-      <w:r>
-        <w:rPr>
-          <w:b/>
-          <w:bCs/>
-        </w:rPr>
-        <w:t xml:space="preserve">disable old creative #6673701</w:t>
-      </w:r>
-      <w:r>
-        <w:t xml:space="preserve"> </w:t>
-      </w:r>
-      <w:r>
-        <w:t xml:space="preserve">(Tired Test on the old program, no S2S tracking, so anyone promoting it earns nothing and sours the relationship).</w:t>
+        <w:t xml:space="preserve">Get a</w:t>
+      </w:r>
+      <w:r>
+        <w:t xml:space="preserve"> </w:t>
+      </w:r>
+      <w:r>
+        <w:rPr>
+          <w:b/>
+          <w:bCs/>
+        </w:rPr>
+        <w:t xml:space="preserve">test tracking link</w:t>
+      </w:r>
+      <w:r>
+        <w:t xml:space="preserve"> </w:t>
+      </w:r>
+      <w:r>
+        <w:t xml:space="preserve">for 250377, click it, confirm it lands on the quiz with</w:t>
+      </w:r>
+      <w:r>
+        <w:t xml:space="preserve"> </w:t>
+      </w:r>
+      <w:r>
+        <w:rPr>
+          <w:rStyle w:val="VerbatimChar"/>
+        </w:rPr>
+        <w:t xml:space="preserve">?refid=24.…</w:t>
+      </w:r>
+      <w:r>
+        <w:t xml:space="preserve">, complete the quiz, verify the contact’s FlexOffers Refid populates. Free verification of the click-to-capture path.</w:t>
       </w:r>
     </w:p>
     <w:p>
@@ -2478,6 +2519,88 @@
         </w:numPr>
       </w:pPr>
       <w:r>
+        <w:t xml:space="preserve">Ask FlexOffers to</w:t>
+      </w:r>
+      <w:r>
+        <w:t xml:space="preserve"> </w:t>
+      </w:r>
+      <w:r>
+        <w:rPr>
+          <w:b/>
+          <w:bCs/>
+        </w:rPr>
+        <w:t xml:space="preserve">surface program 250377</w:t>
+      </w:r>
+      <w:r>
+        <w:t xml:space="preserve"> </w:t>
+      </w:r>
+      <w:r>
+        <w:t xml:space="preserve">to the network and migrate the</w:t>
+      </w:r>
+      <w:r>
+        <w:t xml:space="preserve"> </w:t>
+      </w:r>
+      <w:r>
+        <w:rPr>
+          <w:b/>
+          <w:bCs/>
+        </w:rPr>
+        <w:t xml:space="preserve">124 publishers</w:t>
+      </w:r>
+      <w:r>
+        <w:t xml:space="preserve"> </w:t>
+      </w:r>
+      <w:r>
+        <w:t xml:space="preserve">approved on the old program (#247334). Approvals are per-program, so 250377 has ZERO publishers today and nobody can promote the tracked link.</w:t>
+      </w:r>
+    </w:p>
+    <w:p>
+      <w:pPr>
+        <w:pStyle w:val="Compact"/>
+        <w:numPr>
+          <w:ilvl w:val="1"/>
+          <w:numId w:val="1036"/>
+        </w:numPr>
+      </w:pPr>
+      <w:r>
+        <w:rPr>
+          <w:b/>
+          <w:bCs/>
+        </w:rPr>
+        <w:t xml:space="preserve">After</w:t>
+      </w:r>
+      <w:r>
+        <w:t xml:space="preserve"> </w:t>
+      </w:r>
+      <w:r>
+        <w:t xml:space="preserve">publishers migrate,</w:t>
+      </w:r>
+      <w:r>
+        <w:t xml:space="preserve"> </w:t>
+      </w:r>
+      <w:r>
+        <w:rPr>
+          <w:b/>
+          <w:bCs/>
+        </w:rPr>
+        <w:t xml:space="preserve">disable old creative #6673701</w:t>
+      </w:r>
+      <w:r>
+        <w:t xml:space="preserve"> </w:t>
+      </w:r>
+      <w:r>
+        <w:t xml:space="preserve">(Tired Test on the old program, no S2S tracking, so anyone promoting it earns nothing and sours the relationship).</w:t>
+      </w:r>
+    </w:p>
+    <w:p>
+      <w:pPr>
+        <w:pStyle w:val="Compact"/>
+        <w:numPr>
+          <w:ilvl w:val="1"/>
+          <w:numId w:val="1037"/>
+        </w:numPr>
+      </w:pPr>
+      <w:r>
         <w:rPr>
           <w:b/>
           <w:bCs/>
@@ -2568,7 +2691,7 @@
         <w:pStyle w:val="Compact"/>
         <w:numPr>
           <w:ilvl w:val="1"/>
-          <w:numId w:val="1036"/>
+          <w:numId w:val="1038"/>
         </w:numPr>
       </w:pPr>
       <w:r>
@@ -2708,59 +2831,6 @@
       </w:r>
       <w:r>
         <w:t xml:space="preserve">). They sit in the live pipeline and are enrolled in nurture sequences.</w:t>
-      </w:r>
-    </w:p>
-    <w:p>
-      <w:pPr>
-        <w:pStyle w:val="Compact"/>
-        <w:numPr>
-          <w:ilvl w:val="0"/>
-          <w:numId w:val="1037"/>
-        </w:numPr>
-      </w:pPr>
-      <w:r>
-        <w:rPr>
-          <w:b/>
-          <w:bCs/>
-        </w:rPr>
-        <w:t xml:space="preserve">Testimonial-form link on enyrgy.com</w:t>
-      </w:r>
-      <w:r>
-        <w:t xml:space="preserve"> </w:t>
-      </w:r>
-      <w:r>
-        <w:t xml:space="preserve">— DONE (July 28). Link added to the website.</w:t>
-      </w:r>
-    </w:p>
-    <w:p>
-      <w:pPr>
-        <w:pStyle w:val="Compact"/>
-        <w:numPr>
-          <w:ilvl w:val="0"/>
-          <w:numId w:val="1038"/>
-        </w:numPr>
-      </w:pPr>
-      <w:r>
-        <w:rPr>
-          <w:b/>
-          <w:bCs/>
-        </w:rPr>
-        <w:t xml:space="preserve">CNAM caller-ID registration</w:t>
-      </w:r>
-      <w:r>
-        <w:t xml:space="preserve"> </w:t>
-      </w:r>
-      <w:r>
-        <w:t xml:space="preserve">— DONE. Already Approved in LC Phone with Friendly Name</w:t>
-      </w:r>
-      <w:r>
-        <w:t xml:space="preserve"> </w:t>
-      </w:r>
-      <w:r>
-        <w:t xml:space="preserve">“Enyrgy Inc”</w:t>
-      </w:r>
-      <w:r>
-        <w:t xml:space="preserve">; outbound calls display the business name.</w:t>
       </w:r>
     </w:p>
     <w:p>
@@ -2776,6 +2846,59 @@
           <w:b/>
           <w:bCs/>
         </w:rPr>
+        <w:t xml:space="preserve">Testimonial-form link on enyrgy.com</w:t>
+      </w:r>
+      <w:r>
+        <w:t xml:space="preserve"> </w:t>
+      </w:r>
+      <w:r>
+        <w:t xml:space="preserve">— DONE (July 28). Link added to the website.</w:t>
+      </w:r>
+    </w:p>
+    <w:p>
+      <w:pPr>
+        <w:pStyle w:val="Compact"/>
+        <w:numPr>
+          <w:ilvl w:val="0"/>
+          <w:numId w:val="1040"/>
+        </w:numPr>
+      </w:pPr>
+      <w:r>
+        <w:rPr>
+          <w:b/>
+          <w:bCs/>
+        </w:rPr>
+        <w:t xml:space="preserve">CNAM caller-ID registration</w:t>
+      </w:r>
+      <w:r>
+        <w:t xml:space="preserve"> </w:t>
+      </w:r>
+      <w:r>
+        <w:t xml:space="preserve">— DONE. Already Approved in LC Phone with Friendly Name</w:t>
+      </w:r>
+      <w:r>
+        <w:t xml:space="preserve"> </w:t>
+      </w:r>
+      <w:r>
+        <w:t xml:space="preserve">“Enyrgy Inc”</w:t>
+      </w:r>
+      <w:r>
+        <w:t xml:space="preserve">; outbound calls display the business name.</w:t>
+      </w:r>
+    </w:p>
+    <w:p>
+      <w:pPr>
+        <w:pStyle w:val="Compact"/>
+        <w:numPr>
+          <w:ilvl w:val="0"/>
+          <w:numId w:val="1041"/>
+        </w:numPr>
+      </w:pPr>
+      <w:r>
+        <w:rPr>
+          <w:b/>
+          <w:bCs/>
+        </w:rPr>
         <w:t xml:space="preserve">GHL agency email sender name =</w:t>
       </w:r>
       <w:r>
@@ -2852,7 +2975,7 @@
         <w:pStyle w:val="Compact"/>
         <w:numPr>
           <w:ilvl w:val="0"/>
-          <w:numId w:val="1040"/>
+          <w:numId w:val="1042"/>
         </w:numPr>
       </w:pPr>
       <w:r>
@@ -2867,77 +2990,6 @@
       </w:r>
       <w:r>
         <w:t xml:space="preserve">(100+ contacts), then import.</w:t>
-      </w:r>
-    </w:p>
-    <w:p>
-      <w:pPr>
-        <w:pStyle w:val="Compact"/>
-        <w:numPr>
-          <w:ilvl w:val="0"/>
-          <w:numId w:val="1041"/>
-        </w:numPr>
-      </w:pPr>
-      <w:r>
-        <w:rPr>
-          <w:b/>
-          <w:bCs/>
-        </w:rPr>
-        <w:t xml:space="preserve">Investor Presentation calendar</w:t>
-      </w:r>
-      <w:r>
-        <w:t xml:space="preserve"> </w:t>
-      </w:r>
-      <w:r>
-        <w:t xml:space="preserve">— conflict detection verified/fixed (July 28).</w:t>
-      </w:r>
-    </w:p>
-    <w:p>
-      <w:pPr>
-        <w:pStyle w:val="Compact"/>
-        <w:numPr>
-          <w:ilvl w:val="0"/>
-          <w:numId w:val="1042"/>
-        </w:numPr>
-      </w:pPr>
-      <w:r>
-        <w:rPr>
-          <w:b/>
-          <w:bCs/>
-        </w:rPr>
-        <w:t xml:space="preserve">Content assets</w:t>
-      </w:r>
-      <w:r>
-        <w:t xml:space="preserve"> </w:t>
-      </w:r>
-      <w:r>
-        <w:t xml:space="preserve">— DONE (July 28). Commercial ROI PDF built (</w:t>
-      </w:r>
-      <w:r>
-        <w:rPr>
-          <w:rStyle w:val="VerbatimChar"/>
-        </w:rPr>
-        <w:t xml:space="preserve">Enyrgy_Commercial_ROI.pdf</w:t>
-      </w:r>
-      <w:r>
-        <w:t xml:space="preserve"> </w:t>
-      </w:r>
-      <w:r>
-        <w:t xml:space="preserve">+ editable</w:t>
-      </w:r>
-      <w:r>
-        <w:t xml:space="preserve"> </w:t>
-      </w:r>
-      <w:r>
-        <w:rPr>
-          <w:rStyle w:val="VerbatimChar"/>
-        </w:rPr>
-        <w:t xml:space="preserve">.html</w:t>
-      </w:r>
-      <w:r>
-        <w:t xml:space="preserve"> </w:t>
-      </w:r>
-      <w:r>
-        <w:t xml:space="preserve">source in repo; one placeholder = commercial booking link). Inbound 888 voicemail greeting recorded in Scott’s voice. Outbound investor-drip voicemail script drafted (record only if/when that touch is activated; optional). PPM attorney-approved.</w:t>
       </w:r>
     </w:p>
     <w:p>
@@ -2953,6 +3005,77 @@
           <w:b/>
           <w:bCs/>
         </w:rPr>
+        <w:t xml:space="preserve">Investor Presentation calendar</w:t>
+      </w:r>
+      <w:r>
+        <w:t xml:space="preserve"> </w:t>
+      </w:r>
+      <w:r>
+        <w:t xml:space="preserve">— conflict detection verified/fixed (July 28).</w:t>
+      </w:r>
+    </w:p>
+    <w:p>
+      <w:pPr>
+        <w:pStyle w:val="Compact"/>
+        <w:numPr>
+          <w:ilvl w:val="0"/>
+          <w:numId w:val="1044"/>
+        </w:numPr>
+      </w:pPr>
+      <w:r>
+        <w:rPr>
+          <w:b/>
+          <w:bCs/>
+        </w:rPr>
+        <w:t xml:space="preserve">Content assets</w:t>
+      </w:r>
+      <w:r>
+        <w:t xml:space="preserve"> </w:t>
+      </w:r>
+      <w:r>
+        <w:t xml:space="preserve">— DONE (July 28). Commercial ROI PDF built (</w:t>
+      </w:r>
+      <w:r>
+        <w:rPr>
+          <w:rStyle w:val="VerbatimChar"/>
+        </w:rPr>
+        <w:t xml:space="preserve">Enyrgy_Commercial_ROI.pdf</w:t>
+      </w:r>
+      <w:r>
+        <w:t xml:space="preserve"> </w:t>
+      </w:r>
+      <w:r>
+        <w:t xml:space="preserve">+ editable</w:t>
+      </w:r>
+      <w:r>
+        <w:t xml:space="preserve"> </w:t>
+      </w:r>
+      <w:r>
+        <w:rPr>
+          <w:rStyle w:val="VerbatimChar"/>
+        </w:rPr>
+        <w:t xml:space="preserve">.html</w:t>
+      </w:r>
+      <w:r>
+        <w:t xml:space="preserve"> </w:t>
+      </w:r>
+      <w:r>
+        <w:t xml:space="preserve">source in repo; one placeholder = commercial booking link). Inbound 888 voicemail greeting recorded in Scott’s voice. Outbound investor-drip voicemail script drafted (record only if/when that touch is activated; optional). PPM attorney-approved.</w:t>
+      </w:r>
+    </w:p>
+    <w:p>
+      <w:pPr>
+        <w:pStyle w:val="Compact"/>
+        <w:numPr>
+          <w:ilvl w:val="0"/>
+          <w:numId w:val="1045"/>
+        </w:numPr>
+      </w:pPr>
+      <w:r>
+        <w:rPr>
+          <w:b/>
+          <w:bCs/>
+        </w:rPr>
         <w:t xml:space="preserve">Q2 2026 investor update</w:t>
       </w:r>
       <w:r>
@@ -2989,7 +3112,7 @@
         <w:pStyle w:val="Compact"/>
         <w:numPr>
           <w:ilvl w:val="0"/>
-          <w:numId w:val="1044"/>
+          <w:numId w:val="1046"/>
         </w:numPr>
       </w:pPr>
       <w:r>
@@ -3004,59 +3127,6 @@
       </w:r>
       <w:r>
         <w:t xml:space="preserve">— the EA flags this as the top gap, but it predates the Session 11 native integration + WF-27/28/29, which largely built it. Reconcile the EA and ratify rather than rebuild.</w:t>
-      </w:r>
-    </w:p>
-    <w:p>
-      <w:pPr>
-        <w:pStyle w:val="Compact"/>
-        <w:numPr>
-          <w:ilvl w:val="0"/>
-          <w:numId w:val="1045"/>
-        </w:numPr>
-      </w:pPr>
-      <w:r>
-        <w:rPr>
-          <w:b/>
-          <w:bCs/>
-        </w:rPr>
-        <w:t xml:space="preserve">System-of-record ownership map</w:t>
-      </w:r>
-      <w:r>
-        <w:t xml:space="preserve"> </w:t>
-      </w:r>
-      <w:r>
-        <w:t xml:space="preserve">— ratify the documented SoR (decision/doc task).</w:t>
-      </w:r>
-    </w:p>
-    <w:p>
-      <w:pPr>
-        <w:pStyle w:val="Compact"/>
-        <w:numPr>
-          <w:ilvl w:val="0"/>
-          <w:numId w:val="1046"/>
-        </w:numPr>
-      </w:pPr>
-      <w:r>
-        <w:rPr>
-          <w:b/>
-          <w:bCs/>
-        </w:rPr>
-        <w:t xml:space="preserve">Device App to GHL usage-data flow</w:t>
-      </w:r>
-      <w:r>
-        <w:t xml:space="preserve"> </w:t>
-      </w:r>
-      <w:r>
-        <w:t xml:space="preserve">— deferred</w:t>
-      </w:r>
-      <w:r>
-        <w:t xml:space="preserve"> </w:t>
-      </w:r>
-      <w:r>
-        <w:t xml:space="preserve">“Phase 2-plus”</w:t>
-      </w:r>
-      <w:r>
-        <w:t xml:space="preserve">; decide whether/how usage data flows, with privacy treatment.</w:t>
       </w:r>
     </w:p>
     <w:p>
@@ -3072,13 +3142,13 @@
           <w:b/>
           <w:bCs/>
         </w:rPr>
-        <w:t xml:space="preserve">OEM / Lumanova data boundary</w:t>
-      </w:r>
-      <w:r>
-        <w:t xml:space="preserve"> </w:t>
-      </w:r>
-      <w:r>
-        <w:t xml:space="preserve">— formalize an auditable path as the partner program grows.</w:t>
+        <w:t xml:space="preserve">System-of-record ownership map</w:t>
+      </w:r>
+      <w:r>
+        <w:t xml:space="preserve"> </w:t>
+      </w:r>
+      <w:r>
+        <w:t xml:space="preserve">— ratify the documented SoR (decision/doc task).</w:t>
       </w:r>
     </w:p>
     <w:p>
@@ -3094,13 +3164,22 @@
           <w:b/>
           <w:bCs/>
         </w:rPr>
-        <w:t xml:space="preserve">Metric governance owner</w:t>
-      </w:r>
-      <w:r>
-        <w:t xml:space="preserve"> </w:t>
-      </w:r>
-      <w:r>
-        <w:t xml:space="preserve">— figures reconciled; assign a single owner.</w:t>
+        <w:t xml:space="preserve">Device App to GHL usage-data flow</w:t>
+      </w:r>
+      <w:r>
+        <w:t xml:space="preserve"> </w:t>
+      </w:r>
+      <w:r>
+        <w:t xml:space="preserve">— deferred</w:t>
+      </w:r>
+      <w:r>
+        <w:t xml:space="preserve"> </w:t>
+      </w:r>
+      <w:r>
+        <w:t xml:space="preserve">“Phase 2-plus”</w:t>
+      </w:r>
+      <w:r>
+        <w:t xml:space="preserve">; decide whether/how usage data flows, with privacy treatment.</w:t>
       </w:r>
     </w:p>
     <w:p>
@@ -3116,13 +3195,13 @@
           <w:b/>
           <w:bCs/>
         </w:rPr>
-        <w:t xml:space="preserve">Facility address exception</w:t>
-      </w:r>
-      <w:r>
-        <w:t xml:space="preserve"> </w:t>
-      </w:r>
-      <w:r>
-        <w:t xml:space="preserve">— RESOLVED (July 28). All Shopify policies (Privacy, Terms, Refund) updated to 5115 N 27th Ave, Bld 66, Phoenix, AZ 85017.</w:t>
+        <w:t xml:space="preserve">OEM / Lumanova data boundary</w:t>
+      </w:r>
+      <w:r>
+        <w:t xml:space="preserve"> </w:t>
+      </w:r>
+      <w:r>
+        <w:t xml:space="preserve">— formalize an auditable path as the partner program grows.</w:t>
       </w:r>
     </w:p>
     <w:p>
@@ -3138,6 +3217,50 @@
           <w:b/>
           <w:bCs/>
         </w:rPr>
+        <w:t xml:space="preserve">Metric governance owner</w:t>
+      </w:r>
+      <w:r>
+        <w:t xml:space="preserve"> </w:t>
+      </w:r>
+      <w:r>
+        <w:t xml:space="preserve">— figures reconciled; assign a single owner.</w:t>
+      </w:r>
+    </w:p>
+    <w:p>
+      <w:pPr>
+        <w:pStyle w:val="Compact"/>
+        <w:numPr>
+          <w:ilvl w:val="0"/>
+          <w:numId w:val="1051"/>
+        </w:numPr>
+      </w:pPr>
+      <w:r>
+        <w:rPr>
+          <w:b/>
+          <w:bCs/>
+        </w:rPr>
+        <w:t xml:space="preserve">Facility address exception</w:t>
+      </w:r>
+      <w:r>
+        <w:t xml:space="preserve"> </w:t>
+      </w:r>
+      <w:r>
+        <w:t xml:space="preserve">— RESOLVED (July 28). All Shopify policies (Privacy, Terms, Refund) updated to 5115 N 27th Ave, Bld 66, Phoenix, AZ 85017.</w:t>
+      </w:r>
+    </w:p>
+    <w:p>
+      <w:pPr>
+        <w:pStyle w:val="Compact"/>
+        <w:numPr>
+          <w:ilvl w:val="0"/>
+          <w:numId w:val="1052"/>
+        </w:numPr>
+      </w:pPr>
+      <w:r>
+        <w:rPr>
+          <w:b/>
+          <w:bCs/>
+        </w:rPr>
         <w:t xml:space="preserve">Status-lifecycle representation</w:t>
       </w:r>
       <w:r>
@@ -3213,7 +3336,7 @@
         <w:pStyle w:val="Compact"/>
         <w:numPr>
           <w:ilvl w:val="0"/>
-          <w:numId w:val="1051"/>
+          <w:numId w:val="1053"/>
         </w:numPr>
       </w:pPr>
       <w:r>
@@ -3228,66 +3351,6 @@
       </w:r>
       <w:r>
         <w:t xml:space="preserve">— planned for the next version of Enyrgy, replacing the need for a third-party Shopify referral app. This will supply the referral link/mechanic that WF-07 and the Referral and Reviews agent are waiting on ($150 off referee / $100 store credit referrer are the intended terms).</w:t>
-      </w:r>
-    </w:p>
-    <w:p>
-      <w:pPr>
-        <w:pStyle w:val="Compact"/>
-        <w:numPr>
-          <w:ilvl w:val="0"/>
-          <w:numId w:val="1052"/>
-        </w:numPr>
-      </w:pPr>
-      <w:r>
-        <w:rPr>
-          <w:b/>
-          <w:bCs/>
-        </w:rPr>
-        <w:t xml:space="preserve">Reporting dashboards</w:t>
-      </w:r>
-      <w:r>
-        <w:t xml:space="preserve"> </w:t>
-      </w:r>
-      <w:r>
-        <w:t xml:space="preserve">(GHL KPI views) and the</w:t>
-      </w:r>
-      <w:r>
-        <w:t xml:space="preserve"> </w:t>
-      </w:r>
-      <w:r>
-        <w:rPr>
-          <w:b/>
-          <w:bCs/>
-        </w:rPr>
-        <w:t xml:space="preserve">Reporting Agent</w:t>
-      </w:r>
-      <w:r>
-        <w:t xml:space="preserve"> </w:t>
-      </w:r>
-      <w:r>
-        <w:t xml:space="preserve">(Phase-2 addition).</w:t>
-      </w:r>
-    </w:p>
-    <w:p>
-      <w:pPr>
-        <w:pStyle w:val="Compact"/>
-        <w:numPr>
-          <w:ilvl w:val="0"/>
-          <w:numId w:val="1053"/>
-        </w:numPr>
-      </w:pPr>
-      <w:r>
-        <w:rPr>
-          <w:b/>
-          <w:bCs/>
-        </w:rPr>
-        <w:t xml:space="preserve">The other five Phase-2 agents</w:t>
-      </w:r>
-      <w:r>
-        <w:t xml:space="preserve"> </w:t>
-      </w:r>
-      <w:r>
-        <w:t xml:space="preserve">— Proposal Writer, OEM Pipeline, Podcast Attribution, Clinical Concierge, Billing. Add only after the core is stable.</w:t>
       </w:r>
     </w:p>
     <w:p>
@@ -3303,13 +3366,29 @@
           <w:b/>
           <w:bCs/>
         </w:rPr>
-        <w:t xml:space="preserve">Paid acquisition</w:t>
-      </w:r>
-      <w:r>
-        <w:t xml:space="preserve"> </w:t>
-      </w:r>
-      <w:r>
-        <w:t xml:space="preserve">(Meta/Google) — after domain warmup finishes.</w:t>
+        <w:t xml:space="preserve">Reporting dashboards</w:t>
+      </w:r>
+      <w:r>
+        <w:t xml:space="preserve"> </w:t>
+      </w:r>
+      <w:r>
+        <w:t xml:space="preserve">(GHL KPI views) and the</w:t>
+      </w:r>
+      <w:r>
+        <w:t xml:space="preserve"> </w:t>
+      </w:r>
+      <w:r>
+        <w:rPr>
+          <w:b/>
+          <w:bCs/>
+        </w:rPr>
+        <w:t xml:space="preserve">Reporting Agent</w:t>
+      </w:r>
+      <w:r>
+        <w:t xml:space="preserve"> </w:t>
+      </w:r>
+      <w:r>
+        <w:t xml:space="preserve">(Phase-2 addition).</w:t>
       </w:r>
     </w:p>
     <w:p>
@@ -3325,28 +3404,13 @@
           <w:b/>
           <w:bCs/>
         </w:rPr>
-        <w:t xml:space="preserve">Domain warmup ramp</w:t>
-      </w:r>
-      <w:r>
-        <w:t xml:space="preserve"> </w:t>
-      </w:r>
-      <w:r>
-        <w:t xml:space="preserve">— mg.enyrgy.com still Stage 1; do NOT bulk-send the 600+ list. Send the first testimonial batch warmup-safe; run weekly gift-card fulfillment from the</w:t>
-      </w:r>
-      <w:r>
-        <w:t xml:space="preserve"> </w:t>
-      </w:r>
-      <w:r>
-        <w:rPr>
-          <w:rStyle w:val="VerbatimChar"/>
-        </w:rPr>
-        <w:t xml:space="preserve">gift_card_pending</w:t>
-      </w:r>
-      <w:r>
-        <w:t xml:space="preserve"> </w:t>
-      </w:r>
-      <w:r>
-        <w:t xml:space="preserve">queue.</w:t>
+        <w:t xml:space="preserve">The other five Phase-2 agents</w:t>
+      </w:r>
+      <w:r>
+        <w:t xml:space="preserve"> </w:t>
+      </w:r>
+      <w:r>
+        <w:t xml:space="preserve">— Proposal Writer, OEM Pipeline, Podcast Attribution, Clinical Concierge, Billing. Add only after the core is stable.</w:t>
       </w:r>
     </w:p>
     <w:p>
@@ -3362,13 +3426,13 @@
           <w:b/>
           <w:bCs/>
         </w:rPr>
-        <w:t xml:space="preserve">Form embeds</w:t>
-      </w:r>
-      <w:r>
-        <w:t xml:space="preserve"> </w:t>
-      </w:r>
-      <w:r>
-        <w:t xml:space="preserve">— Commercial Inquiry + Partner Application forms onto go.enyrgy.com (developer).</w:t>
+        <w:t xml:space="preserve">Paid acquisition</w:t>
+      </w:r>
+      <w:r>
+        <w:t xml:space="preserve"> </w:t>
+      </w:r>
+      <w:r>
+        <w:t xml:space="preserve">(Meta/Google) — after domain warmup finishes.</w:t>
       </w:r>
     </w:p>
     <w:p>
@@ -3384,6 +3448,65 @@
           <w:b/>
           <w:bCs/>
         </w:rPr>
+        <w:t xml:space="preserve">Domain warmup ramp</w:t>
+      </w:r>
+      <w:r>
+        <w:t xml:space="preserve"> </w:t>
+      </w:r>
+      <w:r>
+        <w:t xml:space="preserve">— mg.enyrgy.com still Stage 1; do NOT bulk-send the 600+ list. Send the first testimonial batch warmup-safe; run weekly gift-card fulfillment from the</w:t>
+      </w:r>
+      <w:r>
+        <w:t xml:space="preserve"> </w:t>
+      </w:r>
+      <w:r>
+        <w:rPr>
+          <w:rStyle w:val="VerbatimChar"/>
+        </w:rPr>
+        <w:t xml:space="preserve">gift_card_pending</w:t>
+      </w:r>
+      <w:r>
+        <w:t xml:space="preserve"> </w:t>
+      </w:r>
+      <w:r>
+        <w:t xml:space="preserve">queue.</w:t>
+      </w:r>
+    </w:p>
+    <w:p>
+      <w:pPr>
+        <w:pStyle w:val="Compact"/>
+        <w:numPr>
+          <w:ilvl w:val="0"/>
+          <w:numId w:val="1058"/>
+        </w:numPr>
+      </w:pPr>
+      <w:r>
+        <w:rPr>
+          <w:b/>
+          <w:bCs/>
+        </w:rPr>
+        <w:t xml:space="preserve">Form embeds</w:t>
+      </w:r>
+      <w:r>
+        <w:t xml:space="preserve"> </w:t>
+      </w:r>
+      <w:r>
+        <w:t xml:space="preserve">— Commercial Inquiry + Partner Application forms onto go.enyrgy.com (developer).</w:t>
+      </w:r>
+    </w:p>
+    <w:p>
+      <w:pPr>
+        <w:pStyle w:val="Compact"/>
+        <w:numPr>
+          <w:ilvl w:val="0"/>
+          <w:numId w:val="1059"/>
+        </w:numPr>
+      </w:pPr>
+      <w:r>
+        <w:rPr>
+          <w:b/>
+          <w:bCs/>
+        </w:rPr>
         <w:t xml:space="preserve">Upgrade the abandoned-checkout Railway service off trial</w:t>
       </w:r>
       <w:r>
@@ -3408,7 +3531,7 @@
         <w:pStyle w:val="Compact"/>
         <w:numPr>
           <w:ilvl w:val="0"/>
-          <w:numId w:val="1058"/>
+          <w:numId w:val="1060"/>
         </w:numPr>
       </w:pPr>
       <w:r>
@@ -3442,7 +3565,7 @@
         <w:pStyle w:val="Compact"/>
         <w:numPr>
           <w:ilvl w:val="0"/>
-          <w:numId w:val="1059"/>
+          <w:numId w:val="1061"/>
         </w:numPr>
       </w:pPr>
       <w:r>
@@ -3464,7 +3587,7 @@
         <w:pStyle w:val="Compact"/>
         <w:numPr>
           <w:ilvl w:val="0"/>
-          <w:numId w:val="1060"/>
+          <w:numId w:val="1062"/>
         </w:numPr>
       </w:pPr>
       <w:r>
@@ -3514,7 +3637,7 @@
         <w:pStyle w:val="Compact"/>
         <w:numPr>
           <w:ilvl w:val="0"/>
-          <w:numId w:val="1061"/>
+          <w:numId w:val="1063"/>
         </w:numPr>
       </w:pPr>
       <w:r>
@@ -3548,7 +3671,7 @@
         <w:pStyle w:val="Compact"/>
         <w:numPr>
           <w:ilvl w:val="0"/>
-          <w:numId w:val="1062"/>
+          <w:numId w:val="1064"/>
         </w:numPr>
       </w:pPr>
       <w:r>
@@ -4135,7 +4258,7 @@
     <w:abstractNumId w:val="992"/>
   </w:num>
   <w:num w:numId="1030">
-    <w:abstractNumId w:val="992"/>
+    <w:abstractNumId w:val="993"/>
   </w:num>
   <w:num w:numId="1031">
     <w:abstractNumId w:val="992"/>
@@ -4156,28 +4279,28 @@
     <w:abstractNumId w:val="992"/>
   </w:num>
   <w:num w:numId="1037">
+    <w:abstractNumId w:val="992"/>
+  </w:num>
+  <w:num w:numId="1038">
+    <w:abstractNumId w:val="992"/>
+  </w:num>
+  <w:num w:numId="1039">
     <w:abstractNumId w:val="993"/>
   </w:num>
-  <w:num w:numId="1038">
+  <w:num w:numId="1040">
     <w:abstractNumId w:val="993"/>
   </w:num>
-  <w:num w:numId="1039">
+  <w:num w:numId="1041">
     <w:abstractNumId w:val="992"/>
   </w:num>
-  <w:num w:numId="1040">
+  <w:num w:numId="1042">
     <w:abstractNumId w:val="992"/>
   </w:num>
-  <w:num w:numId="1041">
+  <w:num w:numId="1043">
     <w:abstractNumId w:val="993"/>
   </w:num>
-  <w:num w:numId="1042">
+  <w:num w:numId="1044">
     <w:abstractNumId w:val="993"/>
-  </w:num>
-  <w:num w:numId="1043">
-    <w:abstractNumId w:val="992"/>
-  </w:num>
-  <w:num w:numId="1044">
-    <w:abstractNumId w:val="992"/>
   </w:num>
   <w:num w:numId="1045">
     <w:abstractNumId w:val="992"/>
@@ -4192,13 +4315,13 @@
     <w:abstractNumId w:val="992"/>
   </w:num>
   <w:num w:numId="1049">
-    <w:abstractNumId w:val="993"/>
+    <w:abstractNumId w:val="992"/>
   </w:num>
   <w:num w:numId="1050">
     <w:abstractNumId w:val="992"/>
   </w:num>
   <w:num w:numId="1051">
-    <w:abstractNumId w:val="992"/>
+    <w:abstractNumId w:val="993"/>
   </w:num>
   <w:num w:numId="1052">
     <w:abstractNumId w:val="992"/>
@@ -4219,18 +4342,24 @@
     <w:abstractNumId w:val="992"/>
   </w:num>
   <w:num w:numId="1058">
-    <w:abstractNumId w:val="993"/>
+    <w:abstractNumId w:val="992"/>
   </w:num>
   <w:num w:numId="1059">
     <w:abstractNumId w:val="992"/>
   </w:num>
   <w:num w:numId="1060">
-    <w:abstractNumId w:val="992"/>
+    <w:abstractNumId w:val="993"/>
   </w:num>
   <w:num w:numId="1061">
     <w:abstractNumId w:val="992"/>
   </w:num>
   <w:num w:numId="1062">
+    <w:abstractNumId w:val="992"/>
+  </w:num>
+  <w:num w:numId="1063">
+    <w:abstractNumId w:val="992"/>
+  </w:num>
+  <w:num w:numId="1064">
     <w:abstractNumId w:val="992"/>
   </w:num>
 </w:numbering>

</xml_diff>

<commit_message>
FlexOffers: build complete on Enyrgy side; 6 items awaiting the network
Co-Authored-By: Claude Opus 4.8 <noreply@anthropic.com>
</commit_message>
<xml_diff>
--- a/Enyrgy_Master_TODO.docx
+++ b/Enyrgy_Master_TODO.docx
@@ -2366,92 +2366,190 @@
           <w:b/>
           <w:bCs/>
         </w:rPr>
-        <w:t xml:space="preserve">DECIDE: make program 250377 Public?</w:t>
-      </w:r>
-      <w:r>
-        <w:t xml:space="preserve"> </w:t>
-      </w:r>
-      <w:r>
-        <w:t xml:space="preserve">The old program (247334) is</w:t>
-      </w:r>
-      <w:r>
-        <w:t xml:space="preserve"> </w:t>
-      </w:r>
-      <w:r>
-        <w:rPr>
-          <w:b/>
-          <w:bCs/>
-        </w:rPr>
-        <w:t xml:space="preserve">Public</w:t>
-      </w:r>
-      <w:r>
-        <w:t xml:space="preserve">, which is why publishers found and joined it on their own and it has 124 of them. The new program (250377) is</w:t>
-      </w:r>
-      <w:r>
-        <w:t xml:space="preserve"> </w:t>
-      </w:r>
-      <w:r>
-        <w:rPr>
-          <w:b/>
-          <w:bCs/>
-        </w:rPr>
-        <w:t xml:space="preserve">Private</w:t>
-      </w:r>
-      <w:r>
-        <w:t xml:space="preserve">, so nobody can discover it and it will not grow organically even after Brittany adds people manually. Going Public would not cost control, because Publisher Approval is already set to</w:t>
-      </w:r>
-      <w:r>
-        <w:t xml:space="preserve"> </w:t>
-      </w:r>
-      <w:r>
-        <w:rPr>
-          <w:b/>
-          <w:bCs/>
-        </w:rPr>
-        <w:t xml:space="preserve">Manual Review</w:t>
-      </w:r>
-      <w:r>
-        <w:t xml:space="preserve"> </w:t>
-      </w:r>
-      <w:r>
-        <w:t xml:space="preserve">— publishers could find and apply, but each still needs approval. This is the more consequential open decision.</w:t>
-      </w:r>
-    </w:p>
-    <w:p>
-      <w:pPr>
-        <w:pStyle w:val="Compact"/>
-        <w:numPr>
-          <w:ilvl w:val="0"/>
+        <w:t xml:space="preserve">AWAITING FlexOffers (emailed John + Brittany July 30, end of session).</w:t>
+      </w:r>
+      <w:r>
+        <w:t xml:space="preserve"> </w:t>
+      </w:r>
+      <w:r>
+        <w:t xml:space="preserve">Everything on Enyrgy’s side is built; these six are with the network:</w:t>
+      </w:r>
+    </w:p>
+    <w:p>
+      <w:pPr>
+        <w:pStyle w:val="Compact"/>
+        <w:numPr>
+          <w:ilvl w:val="1"/>
           <w:numId w:val="1032"/>
         </w:numPr>
       </w:pPr>
       <w:r>
         <w:rPr>
-          <w:strike/>
-        </w:rPr>
-        <w:t xml:space="preserve">Decide what to do with the 3 brand creatives on the OLD program</w:t>
-      </w:r>
-      <w:r>
-        <w:t xml:space="preserve"> </w:t>
-      </w:r>
-      <w:r>
-        <w:t xml:space="preserve">(#6671366/67/68, the UVB and red-light product copy). They are not magnet creatives, so check where their campaign points.</w:t>
-      </w:r>
-      <w:r>
-        <w:t xml:space="preserve"> </w:t>
-      </w:r>
-      <w:r>
-        <w:rPr>
-          <w:b/>
-          <w:bCs/>
-        </w:rPr>
-        <w:t xml:space="preserve">If a creative sends traffic anywhere other than one of the five magnet pages, no refid is captured and the publisher earns nothing.</w:t>
-      </w:r>
-      <w:r>
-        <w:t xml:space="preserve"> </w:t>
-      </w:r>
-      <w:r>
-        <w:t xml:space="preserve">Either repoint them at magnets, or add the capture snippet to whatever other landing pages you want affiliates using.</w:t>
+          <w:b/>
+          <w:bCs/>
+        </w:rPr>
+        <w:t xml:space="preserve">Make 250377 Public.</w:t>
+      </w:r>
+      <w:r>
+        <w:t xml:space="preserve"> </w:t>
+      </w:r>
+      <w:r>
+        <w:t xml:space="preserve">No Private/Public control exists on the advertiser side, so it appears to be a network-side setting. Likely the same action as</w:t>
+      </w:r>
+      <w:r>
+        <w:t xml:space="preserve"> </w:t>
+      </w:r>
+      <w:r>
+        <w:t xml:space="preserve">“surface the program to the network.”</w:t>
+      </w:r>
+      <w:r>
+        <w:t xml:space="preserve"> </w:t>
+      </w:r>
+      <w:r>
+        <w:t xml:space="preserve">Manual Review stays on, so Public does not cost control.</w:t>
+      </w:r>
+    </w:p>
+    <w:p>
+      <w:pPr>
+        <w:pStyle w:val="Compact"/>
+        <w:numPr>
+          <w:ilvl w:val="1"/>
+          <w:numId w:val="1032"/>
+        </w:numPr>
+      </w:pPr>
+      <w:r>
+        <w:rPr>
+          <w:b/>
+          <w:bCs/>
+        </w:rPr>
+        <w:t xml:space="preserve">Publisher account for Scott</w:t>
+      </w:r>
+      <w:r>
+        <w:t xml:space="preserve">, so he can see exactly what publishers see (John’s own suggestion). John and Brittany to approve it.</w:t>
+      </w:r>
+    </w:p>
+    <w:p>
+      <w:pPr>
+        <w:pStyle w:val="Compact"/>
+        <w:numPr>
+          <w:ilvl w:val="1"/>
+          <w:numId w:val="1032"/>
+        </w:numPr>
+      </w:pPr>
+      <w:r>
+        <w:rPr>
+          <w:b/>
+          <w:bCs/>
+        </w:rPr>
+        <w:t xml:space="preserve">Prioritize YourTango approval on 250377</w:t>
+      </w:r>
+      <w:r>
+        <w:t xml:space="preserve"> </w:t>
+      </w:r>
+      <w:r>
+        <w:t xml:space="preserve">— executed MSA and the joint press release already went out two weeks ago, so they are the first partner who needs a live link.</w:t>
+      </w:r>
+    </w:p>
+    <w:p>
+      <w:pPr>
+        <w:pStyle w:val="Compact"/>
+        <w:numPr>
+          <w:ilvl w:val="1"/>
+          <w:numId w:val="1032"/>
+        </w:numPr>
+      </w:pPr>
+      <w:r>
+        <w:rPr>
+          <w:b/>
+          <w:bCs/>
+        </w:rPr>
+        <w:t xml:space="preserve">Reporting question:</w:t>
+      </w:r>
+      <w:r>
+        <w:t xml:space="preserve"> </w:t>
+      </w:r>
+      <w:r>
+        <w:t xml:space="preserve">does it break out by campaign and creative, so Enyrgy can see which magnet converts affiliate traffic?</w:t>
+      </w:r>
+    </w:p>
+    <w:p>
+      <w:pPr>
+        <w:pStyle w:val="Compact"/>
+        <w:numPr>
+          <w:ilvl w:val="1"/>
+          <w:numId w:val="1032"/>
+        </w:numPr>
+      </w:pPr>
+      <w:r>
+        <w:rPr>
+          <w:b/>
+          <w:bCs/>
+        </w:rPr>
+        <w:t xml:space="preserve">Old program 247334:</w:t>
+      </w:r>
+      <w:r>
+        <w:t xml:space="preserve"> </w:t>
+      </w:r>
+      <w:r>
+        <w:t xml:space="preserve">deactivate or leave running once publishers migrate?</w:t>
+      </w:r>
+    </w:p>
+    <w:p>
+      <w:pPr>
+        <w:pStyle w:val="Compact"/>
+        <w:numPr>
+          <w:ilvl w:val="1"/>
+          <w:numId w:val="1032"/>
+        </w:numPr>
+      </w:pPr>
+      <w:r>
+        <w:rPr>
+          <w:b/>
+          <w:bCs/>
+        </w:rPr>
+        <w:t xml:space="preserve">Postback validation:</w:t>
+      </w:r>
+      <w:r>
+        <w:t xml:space="preserve"> </w:t>
+      </w:r>
+      <w:r>
+        <w:t xml:space="preserve">ask FlexOffers to help watch the FIRST real affiliate sale, since</w:t>
+      </w:r>
+      <w:r>
+        <w:t xml:space="preserve"> </w:t>
+      </w:r>
+      <w:r>
+        <w:rPr>
+          <w:rStyle w:val="VerbatimChar"/>
+        </w:rPr>
+        <w:t xml:space="preserve">{{order.number}}</w:t>
+      </w:r>
+      <w:r>
+        <w:t xml:space="preserve"> </w:t>
+      </w:r>
+      <w:r>
+        <w:t xml:space="preserve">and</w:t>
+      </w:r>
+      <w:r>
+        <w:t xml:space="preserve"> </w:t>
+      </w:r>
+      <w:r>
+        <w:rPr>
+          <w:rStyle w:val="VerbatimChar"/>
+        </w:rPr>
+        <w:t xml:space="preserve">{{order.subtotal_price}}</w:t>
+      </w:r>
+      <w:r>
+        <w:t xml:space="preserve"> </w:t>
+      </w:r>
+      <w:r>
+        <w:t xml:space="preserve">remain untested.</w:t>
+      </w:r>
+      <w:r>
+        <w:t xml:space="preserve"> </w:t>
+      </w:r>
+      <w:r>
+        <w:t xml:space="preserve">Brittany was also given the program benefits to lead with, plus both attribution rules to set publisher expectations up front.</w:t>
       </w:r>
     </w:p>
     <w:p>
@@ -2464,94 +2562,110 @@
       </w:pPr>
       <w:r>
         <w:rPr>
+          <w:strike/>
+        </w:rPr>
+        <w:t xml:space="preserve">DECIDE: make program 250377 Public?</w:t>
+      </w:r>
+      <w:r>
+        <w:t xml:space="preserve"> </w:t>
+      </w:r>
+      <w:r>
+        <w:t xml:space="preserve">DECIDED YES (July 30); requested from the network since it is not advertiser-editable. The old program (247334) is</w:t>
+      </w:r>
+      <w:r>
+        <w:t xml:space="preserve"> </w:t>
+      </w:r>
+      <w:r>
+        <w:rPr>
+          <w:b/>
+          <w:bCs/>
+        </w:rPr>
+        <w:t xml:space="preserve">Public</w:t>
+      </w:r>
+      <w:r>
+        <w:t xml:space="preserve">, which is why publishers found and joined it on their own and it has 124 of them. The new program (250377) is</w:t>
+      </w:r>
+      <w:r>
+        <w:t xml:space="preserve"> </w:t>
+      </w:r>
+      <w:r>
+        <w:rPr>
+          <w:b/>
+          <w:bCs/>
+        </w:rPr>
+        <w:t xml:space="preserve">Private</w:t>
+      </w:r>
+      <w:r>
+        <w:t xml:space="preserve">, so nobody can discover it and it will not grow organically even after Brittany adds people manually. Going Public would not cost control, because Publisher Approval is already set to</w:t>
+      </w:r>
+      <w:r>
+        <w:t xml:space="preserve"> </w:t>
+      </w:r>
+      <w:r>
+        <w:rPr>
+          <w:b/>
+          <w:bCs/>
+        </w:rPr>
+        <w:t xml:space="preserve">Manual Review</w:t>
+      </w:r>
+      <w:r>
+        <w:t xml:space="preserve"> </w:t>
+      </w:r>
+      <w:r>
+        <w:t xml:space="preserve">— publishers could find and apply, but each still needs approval. This is the more consequential open decision.</w:t>
+      </w:r>
+    </w:p>
+    <w:p>
+      <w:pPr>
+        <w:pStyle w:val="Compact"/>
+        <w:numPr>
+          <w:ilvl w:val="0"/>
+          <w:numId w:val="1034"/>
+        </w:numPr>
+      </w:pPr>
+      <w:r>
+        <w:rPr>
+          <w:strike/>
+        </w:rPr>
+        <w:t xml:space="preserve">Decide what to do with the 3 brand creatives on the OLD program</w:t>
+      </w:r>
+      <w:r>
+        <w:t xml:space="preserve"> </w:t>
+      </w:r>
+      <w:r>
+        <w:t xml:space="preserve">(#6671366/67/68, the UVB and red-light product copy). They are not magnet creatives, so check where their campaign points.</w:t>
+      </w:r>
+      <w:r>
+        <w:t xml:space="preserve"> </w:t>
+      </w:r>
+      <w:r>
+        <w:rPr>
+          <w:b/>
+          <w:bCs/>
+        </w:rPr>
+        <w:t xml:space="preserve">If a creative sends traffic anywhere other than one of the five magnet pages, no refid is captured and the publisher earns nothing.</w:t>
+      </w:r>
+      <w:r>
+        <w:t xml:space="preserve"> </w:t>
+      </w:r>
+      <w:r>
+        <w:t xml:space="preserve">Either repoint them at magnets, or add the capture snippet to whatever other landing pages you want affiliates using.</w:t>
+      </w:r>
+    </w:p>
+    <w:p>
+      <w:pPr>
+        <w:pStyle w:val="Compact"/>
+        <w:numPr>
+          <w:ilvl w:val="0"/>
+          <w:numId w:val="1035"/>
+        </w:numPr>
+      </w:pPr>
+      <w:r>
+        <w:rPr>
           <w:b/>
           <w:bCs/>
         </w:rPr>
         <w:t xml:space="preserve">FlexOffers remaining (waiting on the FlexOffers rep, emailed July 29)</w:t>
-      </w:r>
-    </w:p>
-    <w:p>
-      <w:pPr>
-        <w:pStyle w:val="Compact"/>
-        <w:numPr>
-          <w:ilvl w:val="1"/>
-          <w:numId w:val="1034"/>
-        </w:numPr>
-      </w:pPr>
-      <w:r>
-        <w:t xml:space="preserve">Get a</w:t>
-      </w:r>
-      <w:r>
-        <w:t xml:space="preserve"> </w:t>
-      </w:r>
-      <w:r>
-        <w:rPr>
-          <w:b/>
-          <w:bCs/>
-        </w:rPr>
-        <w:t xml:space="preserve">test tracking link</w:t>
-      </w:r>
-      <w:r>
-        <w:t xml:space="preserve"> </w:t>
-      </w:r>
-      <w:r>
-        <w:t xml:space="preserve">for 250377, click it, confirm it lands on the quiz with</w:t>
-      </w:r>
-      <w:r>
-        <w:t xml:space="preserve"> </w:t>
-      </w:r>
-      <w:r>
-        <w:rPr>
-          <w:rStyle w:val="VerbatimChar"/>
-        </w:rPr>
-        <w:t xml:space="preserve">?refid=24.…</w:t>
-      </w:r>
-      <w:r>
-        <w:t xml:space="preserve">, complete the quiz, verify the contact’s FlexOffers Refid populates. Free verification of the click-to-capture path.</w:t>
-      </w:r>
-    </w:p>
-    <w:p>
-      <w:pPr>
-        <w:pStyle w:val="Compact"/>
-        <w:numPr>
-          <w:ilvl w:val="1"/>
-          <w:numId w:val="1035"/>
-        </w:numPr>
-      </w:pPr>
-      <w:r>
-        <w:t xml:space="preserve">Ask FlexOffers to</w:t>
-      </w:r>
-      <w:r>
-        <w:t xml:space="preserve"> </w:t>
-      </w:r>
-      <w:r>
-        <w:rPr>
-          <w:b/>
-          <w:bCs/>
-        </w:rPr>
-        <w:t xml:space="preserve">surface program 250377</w:t>
-      </w:r>
-      <w:r>
-        <w:t xml:space="preserve"> </w:t>
-      </w:r>
-      <w:r>
-        <w:t xml:space="preserve">to the network and migrate the</w:t>
-      </w:r>
-      <w:r>
-        <w:t xml:space="preserve"> </w:t>
-      </w:r>
-      <w:r>
-        <w:rPr>
-          <w:b/>
-          <w:bCs/>
-        </w:rPr>
-        <w:t xml:space="preserve">124 publishers</w:t>
-      </w:r>
-      <w:r>
-        <w:t xml:space="preserve"> </w:t>
-      </w:r>
-      <w:r>
-        <w:t xml:space="preserve">approved on the old program (#247334). Approvals are per-program, so 250377 has ZERO publishers today and nobody can promote the tracked link.</w:t>
       </w:r>
     </w:p>
     <w:p>
@@ -2563,33 +2677,35 @@
         </w:numPr>
       </w:pPr>
       <w:r>
-        <w:rPr>
-          <w:b/>
-          <w:bCs/>
-        </w:rPr>
-        <w:t xml:space="preserve">After</w:t>
-      </w:r>
-      <w:r>
-        <w:t xml:space="preserve"> </w:t>
-      </w:r>
-      <w:r>
-        <w:t xml:space="preserve">publishers migrate,</w:t>
-      </w:r>
-      <w:r>
-        <w:t xml:space="preserve"> </w:t>
-      </w:r>
-      <w:r>
-        <w:rPr>
-          <w:b/>
-          <w:bCs/>
-        </w:rPr>
-        <w:t xml:space="preserve">disable old creative #6673701</w:t>
-      </w:r>
-      <w:r>
-        <w:t xml:space="preserve"> </w:t>
-      </w:r>
-      <w:r>
-        <w:t xml:space="preserve">(Tired Test on the old program, no S2S tracking, so anyone promoting it earns nothing and sours the relationship).</w:t>
+        <w:t xml:space="preserve">Get a</w:t>
+      </w:r>
+      <w:r>
+        <w:t xml:space="preserve"> </w:t>
+      </w:r>
+      <w:r>
+        <w:rPr>
+          <w:b/>
+          <w:bCs/>
+        </w:rPr>
+        <w:t xml:space="preserve">test tracking link</w:t>
+      </w:r>
+      <w:r>
+        <w:t xml:space="preserve"> </w:t>
+      </w:r>
+      <w:r>
+        <w:t xml:space="preserve">for 250377, click it, confirm it lands on the quiz with</w:t>
+      </w:r>
+      <w:r>
+        <w:t xml:space="preserve"> </w:t>
+      </w:r>
+      <w:r>
+        <w:rPr>
+          <w:rStyle w:val="VerbatimChar"/>
+        </w:rPr>
+        <w:t xml:space="preserve">?refid=24.…</w:t>
+      </w:r>
+      <w:r>
+        <w:t xml:space="preserve">, complete the quiz, verify the contact’s FlexOffers Refid populates. Free verification of the click-to-capture path.</w:t>
       </w:r>
     </w:p>
     <w:p>
@@ -2601,6 +2717,88 @@
         </w:numPr>
       </w:pPr>
       <w:r>
+        <w:t xml:space="preserve">Ask FlexOffers to</w:t>
+      </w:r>
+      <w:r>
+        <w:t xml:space="preserve"> </w:t>
+      </w:r>
+      <w:r>
+        <w:rPr>
+          <w:b/>
+          <w:bCs/>
+        </w:rPr>
+        <w:t xml:space="preserve">surface program 250377</w:t>
+      </w:r>
+      <w:r>
+        <w:t xml:space="preserve"> </w:t>
+      </w:r>
+      <w:r>
+        <w:t xml:space="preserve">to the network and migrate the</w:t>
+      </w:r>
+      <w:r>
+        <w:t xml:space="preserve"> </w:t>
+      </w:r>
+      <w:r>
+        <w:rPr>
+          <w:b/>
+          <w:bCs/>
+        </w:rPr>
+        <w:t xml:space="preserve">124 publishers</w:t>
+      </w:r>
+      <w:r>
+        <w:t xml:space="preserve"> </w:t>
+      </w:r>
+      <w:r>
+        <w:t xml:space="preserve">approved on the old program (#247334). Approvals are per-program, so 250377 has ZERO publishers today and nobody can promote the tracked link.</w:t>
+      </w:r>
+    </w:p>
+    <w:p>
+      <w:pPr>
+        <w:pStyle w:val="Compact"/>
+        <w:numPr>
+          <w:ilvl w:val="1"/>
+          <w:numId w:val="1038"/>
+        </w:numPr>
+      </w:pPr>
+      <w:r>
+        <w:rPr>
+          <w:b/>
+          <w:bCs/>
+        </w:rPr>
+        <w:t xml:space="preserve">After</w:t>
+      </w:r>
+      <w:r>
+        <w:t xml:space="preserve"> </w:t>
+      </w:r>
+      <w:r>
+        <w:t xml:space="preserve">publishers migrate,</w:t>
+      </w:r>
+      <w:r>
+        <w:t xml:space="preserve"> </w:t>
+      </w:r>
+      <w:r>
+        <w:rPr>
+          <w:b/>
+          <w:bCs/>
+        </w:rPr>
+        <w:t xml:space="preserve">disable old creative #6673701</w:t>
+      </w:r>
+      <w:r>
+        <w:t xml:space="preserve"> </w:t>
+      </w:r>
+      <w:r>
+        <w:t xml:space="preserve">(Tired Test on the old program, no S2S tracking, so anyone promoting it earns nothing and sours the relationship).</w:t>
+      </w:r>
+    </w:p>
+    <w:p>
+      <w:pPr>
+        <w:pStyle w:val="Compact"/>
+        <w:numPr>
+          <w:ilvl w:val="1"/>
+          <w:numId w:val="1039"/>
+        </w:numPr>
+      </w:pPr>
+      <w:r>
         <w:rPr>
           <w:b/>
           <w:bCs/>
@@ -2691,7 +2889,7 @@
         <w:pStyle w:val="Compact"/>
         <w:numPr>
           <w:ilvl w:val="1"/>
-          <w:numId w:val="1038"/>
+          <w:numId w:val="1040"/>
         </w:numPr>
       </w:pPr>
       <w:r>
@@ -2831,59 +3029,6 @@
       </w:r>
       <w:r>
         <w:t xml:space="preserve">). They sit in the live pipeline and are enrolled in nurture sequences.</w:t>
-      </w:r>
-    </w:p>
-    <w:p>
-      <w:pPr>
-        <w:pStyle w:val="Compact"/>
-        <w:numPr>
-          <w:ilvl w:val="0"/>
-          <w:numId w:val="1039"/>
-        </w:numPr>
-      </w:pPr>
-      <w:r>
-        <w:rPr>
-          <w:b/>
-          <w:bCs/>
-        </w:rPr>
-        <w:t xml:space="preserve">Testimonial-form link on enyrgy.com</w:t>
-      </w:r>
-      <w:r>
-        <w:t xml:space="preserve"> </w:t>
-      </w:r>
-      <w:r>
-        <w:t xml:space="preserve">— DONE (July 28). Link added to the website.</w:t>
-      </w:r>
-    </w:p>
-    <w:p>
-      <w:pPr>
-        <w:pStyle w:val="Compact"/>
-        <w:numPr>
-          <w:ilvl w:val="0"/>
-          <w:numId w:val="1040"/>
-        </w:numPr>
-      </w:pPr>
-      <w:r>
-        <w:rPr>
-          <w:b/>
-          <w:bCs/>
-        </w:rPr>
-        <w:t xml:space="preserve">CNAM caller-ID registration</w:t>
-      </w:r>
-      <w:r>
-        <w:t xml:space="preserve"> </w:t>
-      </w:r>
-      <w:r>
-        <w:t xml:space="preserve">— DONE. Already Approved in LC Phone with Friendly Name</w:t>
-      </w:r>
-      <w:r>
-        <w:t xml:space="preserve"> </w:t>
-      </w:r>
-      <w:r>
-        <w:t xml:space="preserve">“Enyrgy Inc”</w:t>
-      </w:r>
-      <w:r>
-        <w:t xml:space="preserve">; outbound calls display the business name.</w:t>
       </w:r>
     </w:p>
     <w:p>
@@ -2899,6 +3044,59 @@
           <w:b/>
           <w:bCs/>
         </w:rPr>
+        <w:t xml:space="preserve">Testimonial-form link on enyrgy.com</w:t>
+      </w:r>
+      <w:r>
+        <w:t xml:space="preserve"> </w:t>
+      </w:r>
+      <w:r>
+        <w:t xml:space="preserve">— DONE (July 28). Link added to the website.</w:t>
+      </w:r>
+    </w:p>
+    <w:p>
+      <w:pPr>
+        <w:pStyle w:val="Compact"/>
+        <w:numPr>
+          <w:ilvl w:val="0"/>
+          <w:numId w:val="1042"/>
+        </w:numPr>
+      </w:pPr>
+      <w:r>
+        <w:rPr>
+          <w:b/>
+          <w:bCs/>
+        </w:rPr>
+        <w:t xml:space="preserve">CNAM caller-ID registration</w:t>
+      </w:r>
+      <w:r>
+        <w:t xml:space="preserve"> </w:t>
+      </w:r>
+      <w:r>
+        <w:t xml:space="preserve">— DONE. Already Approved in LC Phone with Friendly Name</w:t>
+      </w:r>
+      <w:r>
+        <w:t xml:space="preserve"> </w:t>
+      </w:r>
+      <w:r>
+        <w:t xml:space="preserve">“Enyrgy Inc”</w:t>
+      </w:r>
+      <w:r>
+        <w:t xml:space="preserve">; outbound calls display the business name.</w:t>
+      </w:r>
+    </w:p>
+    <w:p>
+      <w:pPr>
+        <w:pStyle w:val="Compact"/>
+        <w:numPr>
+          <w:ilvl w:val="0"/>
+          <w:numId w:val="1043"/>
+        </w:numPr>
+      </w:pPr>
+      <w:r>
+        <w:rPr>
+          <w:b/>
+          <w:bCs/>
+        </w:rPr>
         <w:t xml:space="preserve">GHL agency email sender name =</w:t>
       </w:r>
       <w:r>
@@ -2975,7 +3173,7 @@
         <w:pStyle w:val="Compact"/>
         <w:numPr>
           <w:ilvl w:val="0"/>
-          <w:numId w:val="1042"/>
+          <w:numId w:val="1044"/>
         </w:numPr>
       </w:pPr>
       <w:r>
@@ -2990,77 +3188,6 @@
       </w:r>
       <w:r>
         <w:t xml:space="preserve">(100+ contacts), then import.</w:t>
-      </w:r>
-    </w:p>
-    <w:p>
-      <w:pPr>
-        <w:pStyle w:val="Compact"/>
-        <w:numPr>
-          <w:ilvl w:val="0"/>
-          <w:numId w:val="1043"/>
-        </w:numPr>
-      </w:pPr>
-      <w:r>
-        <w:rPr>
-          <w:b/>
-          <w:bCs/>
-        </w:rPr>
-        <w:t xml:space="preserve">Investor Presentation calendar</w:t>
-      </w:r>
-      <w:r>
-        <w:t xml:space="preserve"> </w:t>
-      </w:r>
-      <w:r>
-        <w:t xml:space="preserve">— conflict detection verified/fixed (July 28).</w:t>
-      </w:r>
-    </w:p>
-    <w:p>
-      <w:pPr>
-        <w:pStyle w:val="Compact"/>
-        <w:numPr>
-          <w:ilvl w:val="0"/>
-          <w:numId w:val="1044"/>
-        </w:numPr>
-      </w:pPr>
-      <w:r>
-        <w:rPr>
-          <w:b/>
-          <w:bCs/>
-        </w:rPr>
-        <w:t xml:space="preserve">Content assets</w:t>
-      </w:r>
-      <w:r>
-        <w:t xml:space="preserve"> </w:t>
-      </w:r>
-      <w:r>
-        <w:t xml:space="preserve">— DONE (July 28). Commercial ROI PDF built (</w:t>
-      </w:r>
-      <w:r>
-        <w:rPr>
-          <w:rStyle w:val="VerbatimChar"/>
-        </w:rPr>
-        <w:t xml:space="preserve">Enyrgy_Commercial_ROI.pdf</w:t>
-      </w:r>
-      <w:r>
-        <w:t xml:space="preserve"> </w:t>
-      </w:r>
-      <w:r>
-        <w:t xml:space="preserve">+ editable</w:t>
-      </w:r>
-      <w:r>
-        <w:t xml:space="preserve"> </w:t>
-      </w:r>
-      <w:r>
-        <w:rPr>
-          <w:rStyle w:val="VerbatimChar"/>
-        </w:rPr>
-        <w:t xml:space="preserve">.html</w:t>
-      </w:r>
-      <w:r>
-        <w:t xml:space="preserve"> </w:t>
-      </w:r>
-      <w:r>
-        <w:t xml:space="preserve">source in repo; one placeholder = commercial booking link). Inbound 888 voicemail greeting recorded in Scott’s voice. Outbound investor-drip voicemail script drafted (record only if/when that touch is activated; optional). PPM attorney-approved.</w:t>
       </w:r>
     </w:p>
     <w:p>
@@ -3076,6 +3203,77 @@
           <w:b/>
           <w:bCs/>
         </w:rPr>
+        <w:t xml:space="preserve">Investor Presentation calendar</w:t>
+      </w:r>
+      <w:r>
+        <w:t xml:space="preserve"> </w:t>
+      </w:r>
+      <w:r>
+        <w:t xml:space="preserve">— conflict detection verified/fixed (July 28).</w:t>
+      </w:r>
+    </w:p>
+    <w:p>
+      <w:pPr>
+        <w:pStyle w:val="Compact"/>
+        <w:numPr>
+          <w:ilvl w:val="0"/>
+          <w:numId w:val="1046"/>
+        </w:numPr>
+      </w:pPr>
+      <w:r>
+        <w:rPr>
+          <w:b/>
+          <w:bCs/>
+        </w:rPr>
+        <w:t xml:space="preserve">Content assets</w:t>
+      </w:r>
+      <w:r>
+        <w:t xml:space="preserve"> </w:t>
+      </w:r>
+      <w:r>
+        <w:t xml:space="preserve">— DONE (July 28). Commercial ROI PDF built (</w:t>
+      </w:r>
+      <w:r>
+        <w:rPr>
+          <w:rStyle w:val="VerbatimChar"/>
+        </w:rPr>
+        <w:t xml:space="preserve">Enyrgy_Commercial_ROI.pdf</w:t>
+      </w:r>
+      <w:r>
+        <w:t xml:space="preserve"> </w:t>
+      </w:r>
+      <w:r>
+        <w:t xml:space="preserve">+ editable</w:t>
+      </w:r>
+      <w:r>
+        <w:t xml:space="preserve"> </w:t>
+      </w:r>
+      <w:r>
+        <w:rPr>
+          <w:rStyle w:val="VerbatimChar"/>
+        </w:rPr>
+        <w:t xml:space="preserve">.html</w:t>
+      </w:r>
+      <w:r>
+        <w:t xml:space="preserve"> </w:t>
+      </w:r>
+      <w:r>
+        <w:t xml:space="preserve">source in repo; one placeholder = commercial booking link). Inbound 888 voicemail greeting recorded in Scott’s voice. Outbound investor-drip voicemail script drafted (record only if/when that touch is activated; optional). PPM attorney-approved.</w:t>
+      </w:r>
+    </w:p>
+    <w:p>
+      <w:pPr>
+        <w:pStyle w:val="Compact"/>
+        <w:numPr>
+          <w:ilvl w:val="0"/>
+          <w:numId w:val="1047"/>
+        </w:numPr>
+      </w:pPr>
+      <w:r>
+        <w:rPr>
+          <w:b/>
+          <w:bCs/>
+        </w:rPr>
         <w:t xml:space="preserve">Q2 2026 investor update</w:t>
       </w:r>
       <w:r>
@@ -3112,7 +3310,7 @@
         <w:pStyle w:val="Compact"/>
         <w:numPr>
           <w:ilvl w:val="0"/>
-          <w:numId w:val="1046"/>
+          <w:numId w:val="1048"/>
         </w:numPr>
       </w:pPr>
       <w:r>
@@ -3127,59 +3325,6 @@
       </w:r>
       <w:r>
         <w:t xml:space="preserve">— the EA flags this as the top gap, but it predates the Session 11 native integration + WF-27/28/29, which largely built it. Reconcile the EA and ratify rather than rebuild.</w:t>
-      </w:r>
-    </w:p>
-    <w:p>
-      <w:pPr>
-        <w:pStyle w:val="Compact"/>
-        <w:numPr>
-          <w:ilvl w:val="0"/>
-          <w:numId w:val="1047"/>
-        </w:numPr>
-      </w:pPr>
-      <w:r>
-        <w:rPr>
-          <w:b/>
-          <w:bCs/>
-        </w:rPr>
-        <w:t xml:space="preserve">System-of-record ownership map</w:t>
-      </w:r>
-      <w:r>
-        <w:t xml:space="preserve"> </w:t>
-      </w:r>
-      <w:r>
-        <w:t xml:space="preserve">— ratify the documented SoR (decision/doc task).</w:t>
-      </w:r>
-    </w:p>
-    <w:p>
-      <w:pPr>
-        <w:pStyle w:val="Compact"/>
-        <w:numPr>
-          <w:ilvl w:val="0"/>
-          <w:numId w:val="1048"/>
-        </w:numPr>
-      </w:pPr>
-      <w:r>
-        <w:rPr>
-          <w:b/>
-          <w:bCs/>
-        </w:rPr>
-        <w:t xml:space="preserve">Device App to GHL usage-data flow</w:t>
-      </w:r>
-      <w:r>
-        <w:t xml:space="preserve"> </w:t>
-      </w:r>
-      <w:r>
-        <w:t xml:space="preserve">— deferred</w:t>
-      </w:r>
-      <w:r>
-        <w:t xml:space="preserve"> </w:t>
-      </w:r>
-      <w:r>
-        <w:t xml:space="preserve">“Phase 2-plus”</w:t>
-      </w:r>
-      <w:r>
-        <w:t xml:space="preserve">; decide whether/how usage data flows, with privacy treatment.</w:t>
       </w:r>
     </w:p>
     <w:p>
@@ -3195,13 +3340,13 @@
           <w:b/>
           <w:bCs/>
         </w:rPr>
-        <w:t xml:space="preserve">OEM / Lumanova data boundary</w:t>
-      </w:r>
-      <w:r>
-        <w:t xml:space="preserve"> </w:t>
-      </w:r>
-      <w:r>
-        <w:t xml:space="preserve">— formalize an auditable path as the partner program grows.</w:t>
+        <w:t xml:space="preserve">System-of-record ownership map</w:t>
+      </w:r>
+      <w:r>
+        <w:t xml:space="preserve"> </w:t>
+      </w:r>
+      <w:r>
+        <w:t xml:space="preserve">— ratify the documented SoR (decision/doc task).</w:t>
       </w:r>
     </w:p>
     <w:p>
@@ -3217,13 +3362,22 @@
           <w:b/>
           <w:bCs/>
         </w:rPr>
-        <w:t xml:space="preserve">Metric governance owner</w:t>
-      </w:r>
-      <w:r>
-        <w:t xml:space="preserve"> </w:t>
-      </w:r>
-      <w:r>
-        <w:t xml:space="preserve">— figures reconciled; assign a single owner.</w:t>
+        <w:t xml:space="preserve">Device App to GHL usage-data flow</w:t>
+      </w:r>
+      <w:r>
+        <w:t xml:space="preserve"> </w:t>
+      </w:r>
+      <w:r>
+        <w:t xml:space="preserve">— deferred</w:t>
+      </w:r>
+      <w:r>
+        <w:t xml:space="preserve"> </w:t>
+      </w:r>
+      <w:r>
+        <w:t xml:space="preserve">“Phase 2-plus”</w:t>
+      </w:r>
+      <w:r>
+        <w:t xml:space="preserve">; decide whether/how usage data flows, with privacy treatment.</w:t>
       </w:r>
     </w:p>
     <w:p>
@@ -3239,13 +3393,13 @@
           <w:b/>
           <w:bCs/>
         </w:rPr>
-        <w:t xml:space="preserve">Facility address exception</w:t>
-      </w:r>
-      <w:r>
-        <w:t xml:space="preserve"> </w:t>
-      </w:r>
-      <w:r>
-        <w:t xml:space="preserve">— RESOLVED (July 28). All Shopify policies (Privacy, Terms, Refund) updated to 5115 N 27th Ave, Bld 66, Phoenix, AZ 85017.</w:t>
+        <w:t xml:space="preserve">OEM / Lumanova data boundary</w:t>
+      </w:r>
+      <w:r>
+        <w:t xml:space="preserve"> </w:t>
+      </w:r>
+      <w:r>
+        <w:t xml:space="preserve">— formalize an auditable path as the partner program grows.</w:t>
       </w:r>
     </w:p>
     <w:p>
@@ -3261,6 +3415,50 @@
           <w:b/>
           <w:bCs/>
         </w:rPr>
+        <w:t xml:space="preserve">Metric governance owner</w:t>
+      </w:r>
+      <w:r>
+        <w:t xml:space="preserve"> </w:t>
+      </w:r>
+      <w:r>
+        <w:t xml:space="preserve">— figures reconciled; assign a single owner.</w:t>
+      </w:r>
+    </w:p>
+    <w:p>
+      <w:pPr>
+        <w:pStyle w:val="Compact"/>
+        <w:numPr>
+          <w:ilvl w:val="0"/>
+          <w:numId w:val="1053"/>
+        </w:numPr>
+      </w:pPr>
+      <w:r>
+        <w:rPr>
+          <w:b/>
+          <w:bCs/>
+        </w:rPr>
+        <w:t xml:space="preserve">Facility address exception</w:t>
+      </w:r>
+      <w:r>
+        <w:t xml:space="preserve"> </w:t>
+      </w:r>
+      <w:r>
+        <w:t xml:space="preserve">— RESOLVED (July 28). All Shopify policies (Privacy, Terms, Refund) updated to 5115 N 27th Ave, Bld 66, Phoenix, AZ 85017.</w:t>
+      </w:r>
+    </w:p>
+    <w:p>
+      <w:pPr>
+        <w:pStyle w:val="Compact"/>
+        <w:numPr>
+          <w:ilvl w:val="0"/>
+          <w:numId w:val="1054"/>
+        </w:numPr>
+      </w:pPr>
+      <w:r>
+        <w:rPr>
+          <w:b/>
+          <w:bCs/>
+        </w:rPr>
         <w:t xml:space="preserve">Status-lifecycle representation</w:t>
       </w:r>
       <w:r>
@@ -3336,7 +3534,7 @@
         <w:pStyle w:val="Compact"/>
         <w:numPr>
           <w:ilvl w:val="0"/>
-          <w:numId w:val="1053"/>
+          <w:numId w:val="1055"/>
         </w:numPr>
       </w:pPr>
       <w:r>
@@ -3351,66 +3549,6 @@
       </w:r>
       <w:r>
         <w:t xml:space="preserve">— planned for the next version of Enyrgy, replacing the need for a third-party Shopify referral app. This will supply the referral link/mechanic that WF-07 and the Referral and Reviews agent are waiting on ($150 off referee / $100 store credit referrer are the intended terms).</w:t>
-      </w:r>
-    </w:p>
-    <w:p>
-      <w:pPr>
-        <w:pStyle w:val="Compact"/>
-        <w:numPr>
-          <w:ilvl w:val="0"/>
-          <w:numId w:val="1054"/>
-        </w:numPr>
-      </w:pPr>
-      <w:r>
-        <w:rPr>
-          <w:b/>
-          <w:bCs/>
-        </w:rPr>
-        <w:t xml:space="preserve">Reporting dashboards</w:t>
-      </w:r>
-      <w:r>
-        <w:t xml:space="preserve"> </w:t>
-      </w:r>
-      <w:r>
-        <w:t xml:space="preserve">(GHL KPI views) and the</w:t>
-      </w:r>
-      <w:r>
-        <w:t xml:space="preserve"> </w:t>
-      </w:r>
-      <w:r>
-        <w:rPr>
-          <w:b/>
-          <w:bCs/>
-        </w:rPr>
-        <w:t xml:space="preserve">Reporting Agent</w:t>
-      </w:r>
-      <w:r>
-        <w:t xml:space="preserve"> </w:t>
-      </w:r>
-      <w:r>
-        <w:t xml:space="preserve">(Phase-2 addition).</w:t>
-      </w:r>
-    </w:p>
-    <w:p>
-      <w:pPr>
-        <w:pStyle w:val="Compact"/>
-        <w:numPr>
-          <w:ilvl w:val="0"/>
-          <w:numId w:val="1055"/>
-        </w:numPr>
-      </w:pPr>
-      <w:r>
-        <w:rPr>
-          <w:b/>
-          <w:bCs/>
-        </w:rPr>
-        <w:t xml:space="preserve">The other five Phase-2 agents</w:t>
-      </w:r>
-      <w:r>
-        <w:t xml:space="preserve"> </w:t>
-      </w:r>
-      <w:r>
-        <w:t xml:space="preserve">— Proposal Writer, OEM Pipeline, Podcast Attribution, Clinical Concierge, Billing. Add only after the core is stable.</w:t>
       </w:r>
     </w:p>
     <w:p>
@@ -3426,13 +3564,29 @@
           <w:b/>
           <w:bCs/>
         </w:rPr>
-        <w:t xml:space="preserve">Paid acquisition</w:t>
-      </w:r>
-      <w:r>
-        <w:t xml:space="preserve"> </w:t>
-      </w:r>
-      <w:r>
-        <w:t xml:space="preserve">(Meta/Google) — after domain warmup finishes.</w:t>
+        <w:t xml:space="preserve">Reporting dashboards</w:t>
+      </w:r>
+      <w:r>
+        <w:t xml:space="preserve"> </w:t>
+      </w:r>
+      <w:r>
+        <w:t xml:space="preserve">(GHL KPI views) and the</w:t>
+      </w:r>
+      <w:r>
+        <w:t xml:space="preserve"> </w:t>
+      </w:r>
+      <w:r>
+        <w:rPr>
+          <w:b/>
+          <w:bCs/>
+        </w:rPr>
+        <w:t xml:space="preserve">Reporting Agent</w:t>
+      </w:r>
+      <w:r>
+        <w:t xml:space="preserve"> </w:t>
+      </w:r>
+      <w:r>
+        <w:t xml:space="preserve">(Phase-2 addition).</w:t>
       </w:r>
     </w:p>
     <w:p>
@@ -3448,28 +3602,13 @@
           <w:b/>
           <w:bCs/>
         </w:rPr>
-        <w:t xml:space="preserve">Domain warmup ramp</w:t>
-      </w:r>
-      <w:r>
-        <w:t xml:space="preserve"> </w:t>
-      </w:r>
-      <w:r>
-        <w:t xml:space="preserve">— mg.enyrgy.com still Stage 1; do NOT bulk-send the 600+ list. Send the first testimonial batch warmup-safe; run weekly gift-card fulfillment from the</w:t>
-      </w:r>
-      <w:r>
-        <w:t xml:space="preserve"> </w:t>
-      </w:r>
-      <w:r>
-        <w:rPr>
-          <w:rStyle w:val="VerbatimChar"/>
-        </w:rPr>
-        <w:t xml:space="preserve">gift_card_pending</w:t>
-      </w:r>
-      <w:r>
-        <w:t xml:space="preserve"> </w:t>
-      </w:r>
-      <w:r>
-        <w:t xml:space="preserve">queue.</w:t>
+        <w:t xml:space="preserve">The other five Phase-2 agents</w:t>
+      </w:r>
+      <w:r>
+        <w:t xml:space="preserve"> </w:t>
+      </w:r>
+      <w:r>
+        <w:t xml:space="preserve">— Proposal Writer, OEM Pipeline, Podcast Attribution, Clinical Concierge, Billing. Add only after the core is stable.</w:t>
       </w:r>
     </w:p>
     <w:p>
@@ -3485,13 +3624,13 @@
           <w:b/>
           <w:bCs/>
         </w:rPr>
-        <w:t xml:space="preserve">Form embeds</w:t>
-      </w:r>
-      <w:r>
-        <w:t xml:space="preserve"> </w:t>
-      </w:r>
-      <w:r>
-        <w:t xml:space="preserve">— Commercial Inquiry + Partner Application forms onto go.enyrgy.com (developer).</w:t>
+        <w:t xml:space="preserve">Paid acquisition</w:t>
+      </w:r>
+      <w:r>
+        <w:t xml:space="preserve"> </w:t>
+      </w:r>
+      <w:r>
+        <w:t xml:space="preserve">(Meta/Google) — after domain warmup finishes.</w:t>
       </w:r>
     </w:p>
     <w:p>
@@ -3507,6 +3646,65 @@
           <w:b/>
           <w:bCs/>
         </w:rPr>
+        <w:t xml:space="preserve">Domain warmup ramp</w:t>
+      </w:r>
+      <w:r>
+        <w:t xml:space="preserve"> </w:t>
+      </w:r>
+      <w:r>
+        <w:t xml:space="preserve">— mg.enyrgy.com still Stage 1; do NOT bulk-send the 600+ list. Send the first testimonial batch warmup-safe; run weekly gift-card fulfillment from the</w:t>
+      </w:r>
+      <w:r>
+        <w:t xml:space="preserve"> </w:t>
+      </w:r>
+      <w:r>
+        <w:rPr>
+          <w:rStyle w:val="VerbatimChar"/>
+        </w:rPr>
+        <w:t xml:space="preserve">gift_card_pending</w:t>
+      </w:r>
+      <w:r>
+        <w:t xml:space="preserve"> </w:t>
+      </w:r>
+      <w:r>
+        <w:t xml:space="preserve">queue.</w:t>
+      </w:r>
+    </w:p>
+    <w:p>
+      <w:pPr>
+        <w:pStyle w:val="Compact"/>
+        <w:numPr>
+          <w:ilvl w:val="0"/>
+          <w:numId w:val="1060"/>
+        </w:numPr>
+      </w:pPr>
+      <w:r>
+        <w:rPr>
+          <w:b/>
+          <w:bCs/>
+        </w:rPr>
+        <w:t xml:space="preserve">Form embeds</w:t>
+      </w:r>
+      <w:r>
+        <w:t xml:space="preserve"> </w:t>
+      </w:r>
+      <w:r>
+        <w:t xml:space="preserve">— Commercial Inquiry + Partner Application forms onto go.enyrgy.com (developer).</w:t>
+      </w:r>
+    </w:p>
+    <w:p>
+      <w:pPr>
+        <w:pStyle w:val="Compact"/>
+        <w:numPr>
+          <w:ilvl w:val="0"/>
+          <w:numId w:val="1061"/>
+        </w:numPr>
+      </w:pPr>
+      <w:r>
+        <w:rPr>
+          <w:b/>
+          <w:bCs/>
+        </w:rPr>
         <w:t xml:space="preserve">Upgrade the abandoned-checkout Railway service off trial</w:t>
       </w:r>
       <w:r>
@@ -3531,7 +3729,7 @@
         <w:pStyle w:val="Compact"/>
         <w:numPr>
           <w:ilvl w:val="0"/>
-          <w:numId w:val="1060"/>
+          <w:numId w:val="1062"/>
         </w:numPr>
       </w:pPr>
       <w:r>
@@ -3565,7 +3763,7 @@
         <w:pStyle w:val="Compact"/>
         <w:numPr>
           <w:ilvl w:val="0"/>
-          <w:numId w:val="1061"/>
+          <w:numId w:val="1063"/>
         </w:numPr>
       </w:pPr>
       <w:r>
@@ -3587,7 +3785,7 @@
         <w:pStyle w:val="Compact"/>
         <w:numPr>
           <w:ilvl w:val="0"/>
-          <w:numId w:val="1062"/>
+          <w:numId w:val="1064"/>
         </w:numPr>
       </w:pPr>
       <w:r>
@@ -3637,7 +3835,7 @@
         <w:pStyle w:val="Compact"/>
         <w:numPr>
           <w:ilvl w:val="0"/>
-          <w:numId w:val="1063"/>
+          <w:numId w:val="1065"/>
         </w:numPr>
       </w:pPr>
       <w:r>
@@ -3671,7 +3869,7 @@
         <w:pStyle w:val="Compact"/>
         <w:numPr>
           <w:ilvl w:val="0"/>
-          <w:numId w:val="1064"/>
+          <w:numId w:val="1066"/>
         </w:numPr>
       </w:pPr>
       <w:r>
@@ -4264,10 +4462,37 @@
     <w:abstractNumId w:val="992"/>
   </w:num>
   <w:num w:numId="1032">
-    <w:abstractNumId w:val="992"/>
+    <w:abstractNumId w:val="99411"/>
+    <w:lvlOverride w:ilvl="0">
+      <w:startOverride w:val="1"/>
+    </w:lvlOverride>
+    <w:lvlOverride w:ilvl="1">
+      <w:startOverride w:val="1"/>
+    </w:lvlOverride>
+    <w:lvlOverride w:ilvl="2">
+      <w:startOverride w:val="1"/>
+    </w:lvlOverride>
+    <w:lvlOverride w:ilvl="3">
+      <w:startOverride w:val="1"/>
+    </w:lvlOverride>
+    <w:lvlOverride w:ilvl="4">
+      <w:startOverride w:val="1"/>
+    </w:lvlOverride>
+    <w:lvlOverride w:ilvl="5">
+      <w:startOverride w:val="1"/>
+    </w:lvlOverride>
+    <w:lvlOverride w:ilvl="6">
+      <w:startOverride w:val="1"/>
+    </w:lvlOverride>
+    <w:lvlOverride w:ilvl="7">
+      <w:startOverride w:val="1"/>
+    </w:lvlOverride>
+    <w:lvlOverride w:ilvl="8">
+      <w:startOverride w:val="1"/>
+    </w:lvlOverride>
   </w:num>
   <w:num w:numId="1033">
-    <w:abstractNumId w:val="992"/>
+    <w:abstractNumId w:val="993"/>
   </w:num>
   <w:num w:numId="1034">
     <w:abstractNumId w:val="992"/>
@@ -4285,28 +4510,28 @@
     <w:abstractNumId w:val="992"/>
   </w:num>
   <w:num w:numId="1039">
+    <w:abstractNumId w:val="992"/>
+  </w:num>
+  <w:num w:numId="1040">
+    <w:abstractNumId w:val="992"/>
+  </w:num>
+  <w:num w:numId="1041">
     <w:abstractNumId w:val="993"/>
   </w:num>
-  <w:num w:numId="1040">
+  <w:num w:numId="1042">
     <w:abstractNumId w:val="993"/>
   </w:num>
-  <w:num w:numId="1041">
+  <w:num w:numId="1043">
     <w:abstractNumId w:val="992"/>
   </w:num>
-  <w:num w:numId="1042">
+  <w:num w:numId="1044">
     <w:abstractNumId w:val="992"/>
   </w:num>
-  <w:num w:numId="1043">
+  <w:num w:numId="1045">
     <w:abstractNumId w:val="993"/>
   </w:num>
-  <w:num w:numId="1044">
+  <w:num w:numId="1046">
     <w:abstractNumId w:val="993"/>
-  </w:num>
-  <w:num w:numId="1045">
-    <w:abstractNumId w:val="992"/>
-  </w:num>
-  <w:num w:numId="1046">
-    <w:abstractNumId w:val="992"/>
   </w:num>
   <w:num w:numId="1047">
     <w:abstractNumId w:val="992"/>
@@ -4321,13 +4546,13 @@
     <w:abstractNumId w:val="992"/>
   </w:num>
   <w:num w:numId="1051">
-    <w:abstractNumId w:val="993"/>
+    <w:abstractNumId w:val="992"/>
   </w:num>
   <w:num w:numId="1052">
     <w:abstractNumId w:val="992"/>
   </w:num>
   <w:num w:numId="1053">
-    <w:abstractNumId w:val="992"/>
+    <w:abstractNumId w:val="993"/>
   </w:num>
   <w:num w:numId="1054">
     <w:abstractNumId w:val="992"/>
@@ -4348,18 +4573,24 @@
     <w:abstractNumId w:val="992"/>
   </w:num>
   <w:num w:numId="1060">
-    <w:abstractNumId w:val="993"/>
+    <w:abstractNumId w:val="992"/>
   </w:num>
   <w:num w:numId="1061">
     <w:abstractNumId w:val="992"/>
   </w:num>
   <w:num w:numId="1062">
-    <w:abstractNumId w:val="992"/>
+    <w:abstractNumId w:val="993"/>
   </w:num>
   <w:num w:numId="1063">
     <w:abstractNumId w:val="992"/>
   </w:num>
   <w:num w:numId="1064">
+    <w:abstractNumId w:val="992"/>
+  </w:num>
+  <w:num w:numId="1065">
+    <w:abstractNumId w:val="992"/>
+  </w:num>
+  <w:num w:numId="1066">
     <w:abstractNumId w:val="992"/>
   </w:num>
 </w:numbering>

</xml_diff>

<commit_message>
Docs: all FlexOffers test contacts deleted; pipeline clean
Co-Authored-By: Claude Opus 4.8 <noreply@anthropic.com>
</commit_message>
<xml_diff>
--- a/Enyrgy_Master_TODO.docx
+++ b/Enyrgy_Master_TODO.docx
@@ -2893,142 +2893,17 @@
         </w:numPr>
       </w:pPr>
       <w:r>
-        <w:t xml:space="preserve">Delete the FlexOffers test contacts once the postback test is done. Keep ONE (any of them) for that test since it holds a refid; delete the rest:</w:t>
-      </w:r>
-      <w:r>
-        <w:t xml:space="preserve"> </w:t>
-      </w:r>
-      <w:r>
-        <w:rPr>
-          <w:rStyle w:val="VerbatimChar"/>
-        </w:rPr>
-        <w:t xml:space="preserve">scott+fotest2@</w:t>
-      </w:r>
-      <w:r>
-        <w:t xml:space="preserve">,</w:t>
-      </w:r>
-      <w:r>
-        <w:t xml:space="preserve"> </w:t>
-      </w:r>
-      <w:r>
-        <w:rPr>
-          <w:rStyle w:val="VerbatimChar"/>
-        </w:rPr>
-        <w:t xml:space="preserve">scott+vdatest@</w:t>
-      </w:r>
-      <w:r>
-        <w:t xml:space="preserve">,</w:t>
-      </w:r>
-      <w:r>
-        <w:t xml:space="preserve"> </w:t>
-      </w:r>
-      <w:r>
-        <w:rPr>
-          <w:rStyle w:val="VerbatimChar"/>
-        </w:rPr>
-        <w:t xml:space="preserve">scott+vdatest2@</w:t>
-      </w:r>
-      <w:r>
-        <w:t xml:space="preserve">,</w:t>
-      </w:r>
-      <w:r>
-        <w:t xml:space="preserve"> </w:t>
-      </w:r>
-      <w:r>
-        <w:rPr>
-          <w:rStyle w:val="VerbatimChar"/>
-        </w:rPr>
-        <w:t xml:space="preserve">scott+sgtest@</w:t>
-      </w:r>
-      <w:r>
-        <w:t xml:space="preserve">,</w:t>
-      </w:r>
-      <w:r>
-        <w:t xml:space="preserve"> </w:t>
-      </w:r>
-      <w:r>
-        <w:rPr>
-          <w:rStyle w:val="VerbatimChar"/>
-        </w:rPr>
-        <w:t xml:space="preserve">scott+sgtest2@</w:t>
-      </w:r>
-      <w:r>
-        <w:t xml:space="preserve">,</w:t>
-      </w:r>
-      <w:r>
-        <w:t xml:space="preserve"> </w:t>
-      </w:r>
-      <w:r>
-        <w:rPr>
-          <w:rStyle w:val="VerbatimChar"/>
-        </w:rPr>
-        <w:t xml:space="preserve">scott+rptest@</w:t>
-      </w:r>
-      <w:r>
-        <w:t xml:space="preserve">,</w:t>
-      </w:r>
-      <w:r>
-        <w:t xml:space="preserve"> </w:t>
-      </w:r>
-      <w:r>
-        <w:rPr>
-          <w:rStyle w:val="VerbatimChar"/>
-        </w:rPr>
-        <w:t xml:space="preserve">scott+rptest2@</w:t>
-      </w:r>
-      <w:r>
-        <w:t xml:space="preserve">,</w:t>
-      </w:r>
-      <w:r>
-        <w:t xml:space="preserve"> </w:t>
-      </w:r>
-      <w:r>
-        <w:rPr>
-          <w:rStyle w:val="VerbatimChar"/>
-        </w:rPr>
-        <w:t xml:space="preserve">scott+rptest3@</w:t>
-      </w:r>
-      <w:r>
-        <w:t xml:space="preserve">,</w:t>
-      </w:r>
-      <w:r>
-        <w:t xml:space="preserve"> </w:t>
-      </w:r>
-      <w:r>
-        <w:rPr>
-          <w:rStyle w:val="VerbatimChar"/>
-        </w:rPr>
-        <w:t xml:space="preserve">scott+wptest@</w:t>
-      </w:r>
-      <w:r>
-        <w:t xml:space="preserve">,</w:t>
-      </w:r>
-      <w:r>
-        <w:t xml:space="preserve"> </w:t>
-      </w:r>
-      <w:r>
-        <w:rPr>
-          <w:rStyle w:val="VerbatimChar"/>
-        </w:rPr>
-        <w:t xml:space="preserve">scott+wptest2@</w:t>
-      </w:r>
-      <w:r>
-        <w:t xml:space="preserve"> </w:t>
-      </w:r>
-      <w:r>
-        <w:t xml:space="preserve">(all</w:t>
-      </w:r>
-      <w:r>
-        <w:t xml:space="preserve"> </w:t>
-      </w:r>
-      <w:r>
-        <w:rPr>
-          <w:rStyle w:val="VerbatimChar"/>
-        </w:rPr>
-        <w:t xml:space="preserve">@enyrgy.com</w:t>
-      </w:r>
-      <w:r>
-        <w:t xml:space="preserve">). They sit in the live pipeline and are enrolled in nurture sequences.</w:t>
+        <w:rPr>
+          <w:b/>
+          <w:bCs/>
+        </w:rPr>
+        <w:t xml:space="preserve">All FlexOffers test contacts deleted (July 30).</w:t>
+      </w:r>
+      <w:r>
+        <w:t xml:space="preserve"> </w:t>
+      </w:r>
+      <w:r>
+        <w:t xml:space="preserve">The live pipeline is clean. Note: no test contact was retained, so the WF-30 postback will be exercised for the first time on a real affiliate sale. Check WF-30 &gt; Execution Logs the moment one lands.</w:t>
       </w:r>
     </w:p>
     <w:p>
@@ -4513,7 +4388,7 @@
     <w:abstractNumId w:val="992"/>
   </w:num>
   <w:num w:numId="1040">
-    <w:abstractNumId w:val="992"/>
+    <w:abstractNumId w:val="993"/>
   </w:num>
   <w:num w:numId="1041">
     <w:abstractNumId w:val="993"/>

</xml_diff>

<commit_message>
TODO: add drip email copy backup gap (WF-11 to WF-29 exist only in GHL)
Co-Authored-By: Claude Opus 4.8 <noreply@anthropic.com>
</commit_message>
<xml_diff>
--- a/Enyrgy_Master_TODO.docx
+++ b/Enyrgy_Master_TODO.docx
@@ -2,7 +2,7 @@
 <file path=word/document.xml><?xml version="1.0" encoding="utf-8"?>
 <w:document xmlns:w="http://schemas.openxmlformats.org/wordprocessingml/2006/main" xmlns:m="http://schemas.openxmlformats.org/officeDocument/2006/math" xmlns:r="http://schemas.openxmlformats.org/officeDocument/2006/relationships" xmlns:o="urn:schemas-microsoft-com:office:office" xmlns:v="urn:schemas-microsoft-com:vml" xmlns:w10="urn:schemas-microsoft-com:office:word" xmlns:a="http://schemas.openxmlformats.org/drawingml/2006/main" xmlns:pic="http://schemas.openxmlformats.org/drawingml/2006/picture" xmlns:wp="http://schemas.openxmlformats.org/drawingml/2006/wordprocessingDrawing">
   <w:body>
-    <w:bookmarkStart w:id="17" w:name="enyrgy-master-todo"/>
+    <w:bookmarkStart w:id="18" w:name="enyrgy-master-todo"/>
     <w:p>
       <w:pPr>
         <w:pStyle w:val="Heading1"/>
@@ -3590,13 +3590,13 @@
       </w:r>
     </w:p>
     <w:bookmarkEnd w:id="14"/>
-    <w:bookmarkStart w:id="15" w:name="documentation-hygiene"/>
+    <w:bookmarkStart w:id="15" w:name="b.-content-backup-gap-identified-july-31"/>
     <w:p>
       <w:pPr>
         <w:pStyle w:val="Heading2"/>
       </w:pPr>
       <w:r>
-        <w:t xml:space="preserve">7. Documentation hygiene</w:t>
+        <w:t xml:space="preserve">6b. Content backup gap (identified July 31)</w:t>
       </w:r>
     </w:p>
     <w:p>
@@ -3612,32 +3612,60 @@
           <w:b/>
           <w:bCs/>
         </w:rPr>
-        <w:t xml:space="preserve">Refresh the EA to v1.1 (July 28)</w:t>
-      </w:r>
-      <w:r>
-        <w:t xml:space="preserve"> </w:t>
-      </w:r>
-      <w:r>
-        <w:t xml:space="preserve">— bumped to Version 1.1 with an authoritative</w:t>
-      </w:r>
-      <w:r>
-        <w:t xml:space="preserve"> </w:t>
-      </w:r>
-      <w:r>
-        <w:t xml:space="preserve">“v1.1 Current-State Update”</w:t>
-      </w:r>
-      <w:r>
-        <w:t xml:space="preserve"> </w:t>
-      </w:r>
-      <w:r>
-        <w:t xml:space="preserve">section that overrides the stale June-29 body (Shopify integration + WF-27/28/29, GBP live + WF-07 wiring, full Paperclip org + tuned heartbeats, toll-free SMS/CNAM/no-10DLC, content assets, addresses/business-category fixes, the reliability findings incl. the debunked phantom-completion, and the open agency-email item). A future pass can fold these line-by-line into each layer.</w:t>
-      </w:r>
-    </w:p>
-    <w:p>
-      <w:pPr>
-        <w:pStyle w:val="Compact"/>
-        <w:numPr>
-          <w:ilvl w:val="0"/>
+        <w:t xml:space="preserve">Export the drip email copy into the repo.</w:t>
+      </w:r>
+      <w:r>
+        <w:t xml:space="preserve"> </w:t>
+      </w:r>
+      <w:r>
+        <w:t xml:space="preserve">All the campaign email copy for WF-11 through WF-29 (consumer drip, the five magnet nurtures, Winter, Recovery, Synthesis Gap, Vitamin D Assessment, testimonial, abandoned cart, investor drip) exists</w:t>
+      </w:r>
+      <w:r>
+        <w:t xml:space="preserve"> </w:t>
+      </w:r>
+      <w:r>
+        <w:rPr>
+          <w:b/>
+          <w:bCs/>
+        </w:rPr>
+        <w:t xml:space="preserve">only inside GHL</w:t>
+      </w:r>
+      <w:r>
+        <w:t xml:space="preserve">. It is not version-controlled, not searchable, and not reliably recoverable: Account Snapshots capture workflow structure but not email bodies in a diffable form. Only two content sets are currently backed up: the five agent templates in</w:t>
+      </w:r>
+      <w:r>
+        <w:t xml:space="preserve"> </w:t>
+      </w:r>
+      <w:r>
+        <w:rPr>
+          <w:rStyle w:val="VerbatimChar"/>
+        </w:rPr>
+        <w:t xml:space="preserve">Enyrgy_Agent_Email_Templates_v1.md</w:t>
+      </w:r>
+      <w:r>
+        <w:t xml:space="preserve"> </w:t>
+      </w:r>
+      <w:r>
+        <w:t xml:space="preserve">and the five landing pages in</w:t>
+      </w:r>
+      <w:r>
+        <w:t xml:space="preserve"> </w:t>
+      </w:r>
+      <w:r>
+        <w:rPr>
+          <w:rStyle w:val="VerbatimChar"/>
+        </w:rPr>
+        <w:t xml:space="preserve">lead-magnets/</w:t>
+      </w:r>
+      <w:r>
+        <w:t xml:space="preserve">.</w:t>
+      </w:r>
+    </w:p>
+    <w:p>
+      <w:pPr>
+        <w:pStyle w:val="Compact"/>
+        <w:numPr>
+          <w:ilvl w:val="1"/>
           <w:numId w:val="1063"/>
         </w:numPr>
       </w:pPr>
@@ -3646,13 +3674,125 @@
           <w:b/>
           <w:bCs/>
         </w:rPr>
-        <w:t xml:space="preserve">IG loose ends</w:t>
-      </w:r>
-      <w:r>
-        <w:t xml:space="preserve"> </w:t>
-      </w:r>
-      <w:r>
-        <w:t xml:space="preserve">— WF-23/WF-24 numbering gap (confirm not unbuilt), Winter/Tired-Test URLs missing from the Key URLs table, blank team contact fields (Dennis Lan, Dario Pompeii, Millie Carrillo, Thea Cartier).</w:t>
+        <w:t xml:space="preserve">Why it matters:</w:t>
+      </w:r>
+      <w:r>
+        <w:t xml:space="preserve"> </w:t>
+      </w:r>
+      <w:r>
+        <w:t xml:space="preserve">an entire session was spent compliance-auditing this copy (prohibited words, em-dashes, the guarantee-vs-lab-timeline decoupling, the light-does-five framing, FTC testimonial rules). That work lives in one place with no backup. A bad edit or an accidental workflow deletion loses it.</w:t>
+      </w:r>
+    </w:p>
+    <w:p>
+      <w:pPr>
+        <w:pStyle w:val="Compact"/>
+        <w:numPr>
+          <w:ilvl w:val="1"/>
+          <w:numId w:val="1063"/>
+        </w:numPr>
+      </w:pPr>
+      <w:r>
+        <w:rPr>
+          <w:b/>
+          <w:bCs/>
+        </w:rPr>
+        <w:t xml:space="preserve">Trigger that surfaced it:</w:t>
+      </w:r>
+      <w:r>
+        <w:t xml:space="preserve"> </w:t>
+      </w:r>
+      <w:r>
+        <w:t xml:space="preserve">could not answer</w:t>
+      </w:r>
+      <w:r>
+        <w:t xml:space="preserve"> </w:t>
+      </w:r>
+      <w:r>
+        <w:t xml:space="preserve">“which workflow has the email with subject</w:t>
+      </w:r>
+      <w:r>
+        <w:t xml:space="preserve"> </w:t>
+      </w:r>
+      <w:r>
+        <w:t xml:space="preserve">‘One trigger, three outputs’</w:t>
+      </w:r>
+      <w:r>
+        <w:t xml:space="preserve">?”</w:t>
+      </w:r>
+      <w:r>
+        <w:t xml:space="preserve"> </w:t>
+      </w:r>
+      <w:r>
+        <w:t xml:space="preserve">because there is nothing to search.</w:t>
+      </w:r>
+    </w:p>
+    <w:p>
+      <w:pPr>
+        <w:pStyle w:val="Compact"/>
+        <w:numPr>
+          <w:ilvl w:val="1"/>
+          <w:numId w:val="1063"/>
+        </w:numPr>
+      </w:pPr>
+      <w:r>
+        <w:rPr>
+          <w:b/>
+          <w:bCs/>
+        </w:rPr>
+        <w:t xml:space="preserve">Suggested shape:</w:t>
+      </w:r>
+      <w:r>
+        <w:t xml:space="preserve"> </w:t>
+      </w:r>
+      <w:r>
+        <w:t xml:space="preserve">one markdown file per workflow under a</w:t>
+      </w:r>
+      <w:r>
+        <w:t xml:space="preserve"> </w:t>
+      </w:r>
+      <w:r>
+        <w:rPr>
+          <w:rStyle w:val="VerbatimChar"/>
+        </w:rPr>
+        <w:t xml:space="preserve">campaigns/</w:t>
+      </w:r>
+      <w:r>
+        <w:t xml:space="preserve"> </w:t>
+      </w:r>
+      <w:r>
+        <w:t xml:space="preserve">directory, each email with its subject, body, and the WF number plus touch order. Roughly a session of work.</w:t>
+      </w:r>
+    </w:p>
+    <w:p>
+      <w:pPr>
+        <w:pStyle w:val="Compact"/>
+        <w:numPr>
+          <w:ilvl w:val="1"/>
+          <w:numId w:val="1063"/>
+        </w:numPr>
+      </w:pPr>
+      <w:r>
+        <w:rPr>
+          <w:b/>
+          <w:bCs/>
+        </w:rPr>
+        <w:t xml:space="preserve">Secondary benefit:</w:t>
+      </w:r>
+      <w:r>
+        <w:t xml:space="preserve"> </w:t>
+      </w:r>
+      <w:r>
+        <w:t xml:space="preserve">makes the copy greppable, so subject lines and claims can be located and audited without clicking through GHL.</w:t>
+      </w:r>
+    </w:p>
+    <w:bookmarkEnd w:id="15"/>
+    <w:bookmarkStart w:id="16" w:name="documentation-hygiene"/>
+    <w:p>
+      <w:pPr>
+        <w:pStyle w:val="Heading2"/>
+      </w:pPr>
+      <w:r>
+        <w:t xml:space="preserve">7. Documentation hygiene</w:t>
       </w:r>
     </w:p>
     <w:p>
@@ -3668,41 +3808,25 @@
           <w:b/>
           <w:bCs/>
         </w:rPr>
-        <w:t xml:space="preserve">WIP</w:t>
-      </w:r>
-      <w:r>
-        <w:t xml:space="preserve"> </w:t>
-      </w:r>
-      <w:r>
-        <w:t xml:space="preserve">— correct the</w:t>
-      </w:r>
-      <w:r>
-        <w:t xml:space="preserve"> </w:t>
-      </w:r>
-      <w:r>
-        <w:t xml:space="preserve">“24-agent”</w:t>
-      </w:r>
-      <w:r>
-        <w:t xml:space="preserve"> </w:t>
-      </w:r>
-      <w:r>
-        <w:t xml:space="preserve">count to</w:t>
-      </w:r>
-      <w:r>
-        <w:t xml:space="preserve"> </w:t>
-      </w:r>
-      <w:r>
-        <w:t xml:space="preserve">“16-agent core (22 with additions).”</w:t>
-      </w:r>
-    </w:p>
-    <w:bookmarkEnd w:id="15"/>
-    <w:bookmarkStart w:id="16" w:name="X4ef6576507d0fd69ab3954b626c150ac8397a60"/>
-    <w:p>
-      <w:pPr>
-        <w:pStyle w:val="Heading2"/>
-      </w:pPr>
-      <w:r>
-        <w:t xml:space="preserve">8. Standing operating discipline (adopted Session 15)</w:t>
+        <w:t xml:space="preserve">Refresh the EA to v1.1 (July 28)</w:t>
+      </w:r>
+      <w:r>
+        <w:t xml:space="preserve"> </w:t>
+      </w:r>
+      <w:r>
+        <w:t xml:space="preserve">— bumped to Version 1.1 with an authoritative</w:t>
+      </w:r>
+      <w:r>
+        <w:t xml:space="preserve"> </w:t>
+      </w:r>
+      <w:r>
+        <w:t xml:space="preserve">“v1.1 Current-State Update”</w:t>
+      </w:r>
+      <w:r>
+        <w:t xml:space="preserve"> </w:t>
+      </w:r>
+      <w:r>
+        <w:t xml:space="preserve">section that overrides the stale June-29 body (Shopify integration + WF-27/28/29, GBP live + WF-07 wiring, full Paperclip org + tuned heartbeats, toll-free SMS/CNAM/no-10DLC, content assets, addresses/business-category fixes, the reliability findings incl. the debunked phantom-completion, and the open agency-email item). A future pass can fold these line-by-line into each layer.</w:t>
       </w:r>
     </w:p>
     <w:p>
@@ -3718,25 +3842,13 @@
           <w:b/>
           <w:bCs/>
         </w:rPr>
-        <w:t xml:space="preserve">Verify agent audits/verifications against the live GHL account before acting.</w:t>
-      </w:r>
-      <w:r>
-        <w:t xml:space="preserve"> </w:t>
-      </w:r>
-      <w:r>
-        <w:t xml:space="preserve">Agents confabulate under credit starvation — they produced specific, plausible, false claims (invented tag states, a workflow last-edit date misread as a last-run date, a</w:t>
-      </w:r>
-      <w:r>
-        <w:t xml:space="preserve"> </w:t>
-      </w:r>
-      <w:r>
-        <w:t xml:space="preserve">“confirmed”</w:t>
-      </w:r>
-      <w:r>
-        <w:t xml:space="preserve"> </w:t>
-      </w:r>
-      <w:r>
-        <w:t xml:space="preserve">systemic issue that did not exist). Treat agent escalations as leads to verify, never as facts.</w:t>
+        <w:t xml:space="preserve">IG loose ends</w:t>
+      </w:r>
+      <w:r>
+        <w:t xml:space="preserve"> </w:t>
+      </w:r>
+      <w:r>
+        <w:t xml:space="preserve">— WF-23/WF-24 numbering gap (confirm not unbuilt), Winter/Tired-Test URLs missing from the Key URLs table, blank team contact fields (Dennis Lan, Dario Pompeii, Millie Carrillo, Thea Cartier).</w:t>
       </w:r>
     </w:p>
     <w:p>
@@ -3752,6 +3864,90 @@
           <w:b/>
           <w:bCs/>
         </w:rPr>
+        <w:t xml:space="preserve">WIP</w:t>
+      </w:r>
+      <w:r>
+        <w:t xml:space="preserve"> </w:t>
+      </w:r>
+      <w:r>
+        <w:t xml:space="preserve">— correct the</w:t>
+      </w:r>
+      <w:r>
+        <w:t xml:space="preserve"> </w:t>
+      </w:r>
+      <w:r>
+        <w:t xml:space="preserve">“24-agent”</w:t>
+      </w:r>
+      <w:r>
+        <w:t xml:space="preserve"> </w:t>
+      </w:r>
+      <w:r>
+        <w:t xml:space="preserve">count to</w:t>
+      </w:r>
+      <w:r>
+        <w:t xml:space="preserve"> </w:t>
+      </w:r>
+      <w:r>
+        <w:t xml:space="preserve">“16-agent core (22 with additions).”</w:t>
+      </w:r>
+    </w:p>
+    <w:bookmarkEnd w:id="16"/>
+    <w:bookmarkStart w:id="17" w:name="X4ef6576507d0fd69ab3954b626c150ac8397a60"/>
+    <w:p>
+      <w:pPr>
+        <w:pStyle w:val="Heading2"/>
+      </w:pPr>
+      <w:r>
+        <w:t xml:space="preserve">8. Standing operating discipline (adopted Session 15)</w:t>
+      </w:r>
+    </w:p>
+    <w:p>
+      <w:pPr>
+        <w:pStyle w:val="Compact"/>
+        <w:numPr>
+          <w:ilvl w:val="0"/>
+          <w:numId w:val="1067"/>
+        </w:numPr>
+      </w:pPr>
+      <w:r>
+        <w:rPr>
+          <w:b/>
+          <w:bCs/>
+        </w:rPr>
+        <w:t xml:space="preserve">Verify agent audits/verifications against the live GHL account before acting.</w:t>
+      </w:r>
+      <w:r>
+        <w:t xml:space="preserve"> </w:t>
+      </w:r>
+      <w:r>
+        <w:t xml:space="preserve">Agents confabulate under credit starvation — they produced specific, plausible, false claims (invented tag states, a workflow last-edit date misread as a last-run date, a</w:t>
+      </w:r>
+      <w:r>
+        <w:t xml:space="preserve"> </w:t>
+      </w:r>
+      <w:r>
+        <w:t xml:space="preserve">“confirmed”</w:t>
+      </w:r>
+      <w:r>
+        <w:t xml:space="preserve"> </w:t>
+      </w:r>
+      <w:r>
+        <w:t xml:space="preserve">systemic issue that did not exist). Treat agent escalations as leads to verify, never as facts.</w:t>
+      </w:r>
+    </w:p>
+    <w:p>
+      <w:pPr>
+        <w:pStyle w:val="Compact"/>
+        <w:numPr>
+          <w:ilvl w:val="0"/>
+          <w:numId w:val="1068"/>
+        </w:numPr>
+      </w:pPr>
+      <w:r>
+        <w:rPr>
+          <w:b/>
+          <w:bCs/>
+        </w:rPr>
         <w:t xml:space="preserve">Keep credit buffered and watch the Costs page.</w:t>
       </w:r>
       <w:r>
@@ -3761,8 +3957,8 @@
         <w:t xml:space="preserve">Starvation is more expensive than headroom, not cheaper.</w:t>
       </w:r>
     </w:p>
-    <w:bookmarkEnd w:id="16"/>
     <w:bookmarkEnd w:id="17"/>
+    <w:bookmarkEnd w:id="18"/>
     <w:sectPr>
       <w:footnotePr>
         <w:numRestart w:val="eachSect"/>
@@ -4454,18 +4650,24 @@
     <w:abstractNumId w:val="992"/>
   </w:num>
   <w:num w:numId="1062">
+    <w:abstractNumId w:val="992"/>
+  </w:num>
+  <w:num w:numId="1063">
+    <w:abstractNumId w:val="991"/>
+  </w:num>
+  <w:num w:numId="1064">
     <w:abstractNumId w:val="993"/>
-  </w:num>
-  <w:num w:numId="1063">
-    <w:abstractNumId w:val="992"/>
-  </w:num>
-  <w:num w:numId="1064">
-    <w:abstractNumId w:val="992"/>
   </w:num>
   <w:num w:numId="1065">
     <w:abstractNumId w:val="992"/>
   </w:num>
   <w:num w:numId="1066">
+    <w:abstractNumId w:val="992"/>
+  </w:num>
+  <w:num w:numId="1067">
+    <w:abstractNumId w:val="992"/>
+  </w:num>
+  <w:num w:numId="1068">
     <w:abstractNumId w:val="992"/>
   </w:num>
 </w:numbering>

</xml_diff>

<commit_message>
Remove the content engine work; keep the KB compliance gap it surfaced
Scott is restarting this from a clean slate without the imported spec, so the
spec document, agent instruction block 17, and the TODO section built on them are
all gone. Nothing referencing the Weekly Content Engine or Maria remains.

Kept, decoupled and flagged to Scott: the KB requires every client-facing string
to be reviewed against the January 2026 FDA Guidelines for Wellness Products and
does not contain them. That is not a content-engine finding. It predates this
work, applies to every agent that composes copy, and has been latent since the KB
was written. An agent cannot execute a review against a document it does not
have; it will either pass the check silently or invent the criteria.

The interim rule stays in KB Section 11: an agent that cannot perform the check
must say so and must never report it as passed.

Co-Authored-By: Claude Opus 5 <noreply@anthropic.com>
</commit_message>
<xml_diff>
--- a/Enyrgy_Master_TODO.docx
+++ b/Enyrgy_Master_TODO.docx
@@ -5708,13 +5708,13 @@
       </w:r>
     </w:p>
     <w:bookmarkEnd w:id="16"/>
-    <w:bookmarkStart w:id="17" w:name="Xd990285ed89636a7d9164f06365c6599008122f"/>
+    <w:bookmarkStart w:id="17" w:name="X386c59d54a54d038daa00cccbf35a0e2bb0fc7b"/>
     <w:p>
       <w:pPr>
         <w:pStyle w:val="Heading2"/>
       </w:pPr>
       <w:r>
-        <w:t xml:space="preserve">4f. Weekly Content Engine (spec received August 4, 2026)</w:t>
+        <w:t xml:space="preserve">4f. KB compliance gap: the FDA wellness guidelines are cited but not contained</w:t>
       </w:r>
     </w:p>
     <w:p>
@@ -5722,41 +5722,11 @@
         <w:pStyle w:val="FirstParagraph"/>
       </w:pPr>
       <w:r>
-        <w:t xml:space="preserve">Scott supplied</w:t>
-      </w:r>
-      <w:r>
-        <w:t xml:space="preserve"> </w:t>
-      </w:r>
-      <w:r>
-        <w:rPr>
-          <w:rStyle w:val="VerbatimChar"/>
-        </w:rPr>
-        <w:t xml:space="preserve">Enyrgy_Weekly_Content_Engine_Spec.md</w:t>
-      </w:r>
-      <w:r>
-        <w:t xml:space="preserve">, the outbound marketing agent he built for another company, to be rebuilt on Enyrgy’s Paperclip / Railway / GHL stack. Verified against the live corpus; agent block 17 drafted in</w:t>
-      </w:r>
-      <w:r>
-        <w:t xml:space="preserve"> </w:t>
-      </w:r>
-      <w:r>
-        <w:rPr>
-          <w:rStyle w:val="VerbatimChar"/>
-        </w:rPr>
-        <w:t xml:space="preserve">Enyrgy_Paperclip_Agent_Instruction_Blocks.md</w:t>
-      </w:r>
-      <w:r>
-        <w:t xml:space="preserve">,</w:t>
-      </w:r>
-      <w:r>
-        <w:t xml:space="preserve"> </w:t>
-      </w:r>
-      <w:r>
-        <w:rPr>
-          <w:b/>
-          <w:bCs/>
-        </w:rPr>
-        <w:t xml:space="preserve">not hired.</w:t>
+        <w:rPr>
+          <w:b/>
+          <w:bCs/>
+        </w:rPr>
+        <w:t xml:space="preserve">Found August 4, 2026. Affects every agent that composes client-facing copy, not any one feature.</w:t>
       </w:r>
     </w:p>
     <w:p>
@@ -5768,30 +5738,95 @@
         </w:numPr>
       </w:pPr>
       <w:r>
-        <w:rPr>
-          <w:b/>
-          <w:bCs/>
-        </w:rPr>
-        <w:t xml:space="preserve">BLOCKING, and now higher-stakes: load the January 2026 FDA Guidelines for Wellness Products into KB Section 11.</w:t>
-      </w:r>
-      <w:r>
-        <w:t xml:space="preserve"> </w:t>
-      </w:r>
-      <w:r>
-        <w:t xml:space="preserve">With blog auto-publishing on approval, an unperformable compliance check sits directly upstream of a public, indexed page rather than upstream of a draft somebody reads. The KB has required this review since it was written but has never contained the document. The rule is binding and the substance is absent, so</w:t>
-      </w:r>
-      <w:r>
-        <w:t xml:space="preserve"> </w:t>
-      </w:r>
-      <w:r>
-        <w:rPr>
-          <w:b/>
-          <w:bCs/>
-        </w:rPr>
-        <w:t xml:space="preserve">no agent can actually perform the check</w:t>
-      </w:r>
-      <w:r>
-        <w:t xml:space="preserve">, and an agent asked to will either pass it silently or invent the criteria. This is not specific to the content engine; it applies to every agent that composes client-facing copy, and it has been latent the whole time.</w:t>
+        <w:t xml:space="preserve">☐</w:t>
+      </w:r>
+      <w:r>
+        <w:t xml:space="preserve"> </w:t>
+      </w:r>
+      <w:r>
+        <w:rPr>
+          <w:b/>
+          <w:bCs/>
+        </w:rPr>
+        <w:t xml:space="preserve">Load the January 2026 FDA Guidelines for Wellness Products into KB Section 11.</w:t>
+      </w:r>
+      <w:r>
+        <w:t xml:space="preserve"> </w:t>
+      </w:r>
+      <w:r>
+        <w:t xml:space="preserve">The KB has required this review since it was written:</w:t>
+      </w:r>
+      <w:r>
+        <w:t xml:space="preserve"> </w:t>
+      </w:r>
+      <w:r>
+        <w:t xml:space="preserve">“Review all client-facing content against the January 2026 FDA Guidelines for Wellness Products before use.”</w:t>
+      </w:r>
+      <w:r>
+        <w:t xml:space="preserve"> </w:t>
+      </w:r>
+      <w:r>
+        <w:t xml:space="preserve">The rule is binding and correct.</w:t>
+      </w:r>
+      <w:r>
+        <w:t xml:space="preserve"> </w:t>
+      </w:r>
+      <w:r>
+        <w:rPr>
+          <w:b/>
+          <w:bCs/>
+        </w:rPr>
+        <w:t xml:space="preserve">What is missing is the document.</w:t>
+      </w:r>
+      <w:r>
+        <w:t xml:space="preserve"> </w:t>
+      </w:r>
+      <w:r>
+        <w:t xml:space="preserve">There is no summary, no clause list, no link and no copy anywhere in the repo.</w:t>
+      </w:r>
+    </w:p>
+    <w:p>
+      <w:pPr>
+        <w:pStyle w:val="Compact"/>
+        <w:numPr>
+          <w:ilvl w:val="0"/>
+          <w:numId w:val="1073"/>
+        </w:numPr>
+      </w:pPr>
+      <w:r>
+        <w:rPr>
+          <w:b/>
+          <w:bCs/>
+        </w:rPr>
+        <w:t xml:space="preserve">Why it matters more than a missing citation.</w:t>
+      </w:r>
+      <w:r>
+        <w:t xml:space="preserve"> </w:t>
+      </w:r>
+      <w:r>
+        <w:t xml:space="preserve">An agent cannot execute a review against a document it does not have. Faced with that instruction it will either treat the check as passed or reconstruct what it imagines the guidance says. Either way the result is a confident compliance claim resting on nothing, which is the confabulation failure already documented on this account, sitting on the most regulated thing Enyrgy writes.</w:t>
+      </w:r>
+    </w:p>
+    <w:p>
+      <w:pPr>
+        <w:pStyle w:val="Compact"/>
+        <w:numPr>
+          <w:ilvl w:val="0"/>
+          <w:numId w:val="1073"/>
+        </w:numPr>
+      </w:pPr>
+      <w:r>
+        <w:rPr>
+          <w:b/>
+          <w:bCs/>
+        </w:rPr>
+        <w:t xml:space="preserve">What is needed:</w:t>
+      </w:r>
+      <w:r>
+        <w:t xml:space="preserve"> </w:t>
+      </w:r>
+      <w:r>
+        <w:t xml:space="preserve">the operative content in KB Section 11, in the same usable form as the prohibited-words list beside it. A link is not sufficient for agents that cannot browse.</w:t>
       </w:r>
       <w:r>
         <w:t xml:space="preserve"> </w:t>
@@ -5803,298 +5838,27 @@
         </w:rPr>
         <w:t xml:space="preserve">Scott to supply the document or an authoritative summary.</w:t>
       </w:r>
-      <w:r>
-        <w:t xml:space="preserve"> </w:t>
-      </w:r>
-      <w:r>
-        <w:t xml:space="preserve">A link is not sufficient for agents that cannot browse; the operative content has to be in the KB the way the prohibited-words list is.</w:t>
-      </w:r>
-    </w:p>
-    <w:p>
-      <w:pPr>
-        <w:pStyle w:val="Compact"/>
-        <w:numPr>
-          <w:ilvl w:val="0"/>
-          <w:numId w:val="1074"/>
-        </w:numPr>
-      </w:pPr>
-      <w:r>
-        <w:rPr>
-          <w:b/>
-          <w:bCs/>
-        </w:rPr>
-        <w:t xml:space="preserve">Retire</w:t>
-      </w:r>
-      <w:r>
-        <w:rPr>
-          <w:b/>
-          <w:bCs/>
-        </w:rPr>
-        <w:t xml:space="preserve"> </w:t>
-      </w:r>
-      <w:r>
-        <w:rPr>
-          <w:b/>
-          <w:bCs/>
-        </w:rPr>
-        <w:t xml:space="preserve">“zero paid advertising to date”</w:t>
-      </w:r>
-      <w:r>
-        <w:rPr>
-          <w:b/>
-          <w:bCs/>
-        </w:rPr>
-        <w:t xml:space="preserve"> </w:t>
-      </w:r>
-      <w:r>
-        <w:rPr>
-          <w:b/>
-          <w:bCs/>
-        </w:rPr>
-        <w:t xml:space="preserve">the day the first ad runs.</w:t>
-      </w:r>
-      <w:r>
-        <w:t xml:space="preserve"> </w:t>
-      </w:r>
-      <w:r>
-        <w:t xml:space="preserve">Ads are deliberately in scope, since the raise is explicitly for advertising. The claim appears in</w:t>
-      </w:r>
-      <w:r>
-        <w:t xml:space="preserve"> </w:t>
-      </w:r>
-      <w:r>
-        <w:rPr>
-          <w:b/>
-          <w:bCs/>
-        </w:rPr>
-        <w:t xml:space="preserve">KB Sections 1 and 6</w:t>
-      </w:r>
-      <w:r>
-        <w:t xml:space="preserve">, in live drip copy, and in the</w:t>
-      </w:r>
-      <w:r>
-        <w:t xml:space="preserve"> </w:t>
-      </w:r>
-      <w:r>
-        <w:rPr>
-          <w:b/>
-          <w:bCs/>
-        </w:rPr>
-        <w:t xml:space="preserve">Q2 2026 investor update</w:t>
-      </w:r>
-      <w:r>
-        <w:t xml:space="preserve">, which describes Thea Cartier’s role as</w:t>
-      </w:r>
-      <w:r>
-        <w:t xml:space="preserve"> </w:t>
-      </w:r>
-      <w:r>
-        <w:t xml:space="preserve">“extending the zero-paid-ads engine.”</w:t>
-      </w:r>
-      <w:r>
-        <w:t xml:space="preserve"> </w:t>
-      </w:r>
-      <w:r>
-        <w:t xml:space="preserve">It was true and is a real credibility asset while it lasts, but it cannot outlive the first ad.</w:t>
-      </w:r>
-      <w:r>
-        <w:t xml:space="preserve"> </w:t>
-      </w:r>
-      <w:r>
-        <w:rPr>
-          <w:b/>
-          <w:bCs/>
-        </w:rPr>
-        <w:t xml:space="preserve">Retiring it late is the failure mode:</w:t>
-      </w:r>
-      <w:r>
-        <w:t xml:space="preserve"> </w:t>
-      </w:r>
-      <w:r>
-        <w:t xml:space="preserve">a true differentiator becomes a false claim in copy already in the field. Grep</w:t>
-      </w:r>
-      <w:r>
-        <w:t xml:space="preserve"> </w:t>
-      </w:r>
-      <w:r>
-        <w:rPr>
-          <w:rStyle w:val="VerbatimChar"/>
-        </w:rPr>
-        <w:t xml:space="preserve">campaigns/</w:t>
-      </w:r>
-      <w:r>
-        <w:t xml:space="preserve"> </w:t>
-      </w:r>
-      <w:r>
-        <w:t xml:space="preserve">and the KB before the first campaign goes live.</w:t>
-      </w:r>
-    </w:p>
-    <w:p>
-      <w:pPr>
-        <w:pStyle w:val="Compact"/>
-        <w:numPr>
-          <w:ilvl w:val="0"/>
-          <w:numId w:val="1075"/>
-        </w:numPr>
-      </w:pPr>
-      <w:r>
-        <w:rPr>
-          <w:b/>
-          <w:bCs/>
-        </w:rPr>
-        <w:t xml:space="preserve">Thea Cartier’s remit settled (Aug 4).</w:t>
-      </w:r>
-      <w:r>
-        <w:t xml:space="preserve"> </w:t>
-      </w:r>
-      <w:r>
-        <w:t xml:space="preserve">She is the social poster. The agent drafts, the dashboard presents copy for review and edit, Thea takes approved copy to each channel by hand. No channel connects to GHL.</w:t>
-      </w:r>
-    </w:p>
-    <w:p>
-      <w:pPr>
-        <w:pStyle w:val="Compact"/>
-        <w:numPr>
-          <w:ilvl w:val="0"/>
-          <w:numId w:val="1076"/>
-        </w:numPr>
-      </w:pPr>
-      <w:r>
-        <w:rPr>
-          <w:b/>
-          <w:bCs/>
-        </w:rPr>
-        <w:t xml:space="preserve">Blog settled (Aug 4): GHL Blogs, auto-publish on approval.</w:t>
-      </w:r>
-      <w:r>
-        <w:t xml:space="preserve"> </w:t>
-      </w:r>
-      <w:r>
-        <w:t xml:space="preserve">Scott is enabling Blogs on the sub-account. This makes blog the one content type on gated agent-publish rather than human-publish, so</w:t>
-      </w:r>
-      <w:r>
-        <w:t xml:space="preserve"> </w:t>
-      </w:r>
-      <w:r>
-        <w:rPr>
-          <w:b/>
-          <w:bCs/>
-        </w:rPr>
-        <w:t xml:space="preserve">the approval click is a publish click</w:t>
-      </w:r>
-      <w:r>
-        <w:t xml:space="preserve"> </w:t>
-      </w:r>
-      <w:r>
-        <w:t xml:space="preserve">and the dashboard control must say so.</w:t>
-      </w:r>
-    </w:p>
-    <w:p>
-      <w:pPr>
-        <w:pStyle w:val="Compact"/>
-        <w:numPr>
-          <w:ilvl w:val="0"/>
-          <w:numId w:val="1077"/>
-        </w:numPr>
-      </w:pPr>
-      <w:r>
-        <w:rPr>
-          <w:b/>
-          <w:bCs/>
-        </w:rPr>
-        <w:t xml:space="preserve">VERIFY the GHL blog API before building the routine.</w:t>
-      </w:r>
-      <w:r>
-        <w:t xml:space="preserve"> </w:t>
-      </w:r>
-      <w:r>
-        <w:t xml:space="preserve">Blog auto-publish is now a requirement, and nothing in the repo confirms the GHL API exposes blog post creation and publishing, or that the agent’s GHL tool surfaces it. If it does not, blog falls back to staged draft plus a human publish click. Small loss, but find out before the dry run rather than during it.</w:t>
-      </w:r>
-    </w:p>
-    <w:p>
-      <w:pPr>
-        <w:pStyle w:val="Compact"/>
-        <w:numPr>
-          <w:ilvl w:val="0"/>
-          <w:numId w:val="1078"/>
-        </w:numPr>
-      </w:pPr>
-      <w:r>
-        <w:rPr>
-          <w:b/>
-          <w:bCs/>
-        </w:rPr>
-        <w:t xml:space="preserve">Decide who holds the approval click per content type.</w:t>
-      </w:r>
-      <w:r>
-        <w:t xml:space="preserve"> </w:t>
-      </w:r>
-      <w:r>
-        <w:t xml:space="preserve">Scott approves and Thea edits, or Thea approves her own channels and Scott approves blog. This matters more now that approval publishes on blog.</w:t>
-      </w:r>
-    </w:p>
-    <w:p>
-      <w:pPr>
-        <w:pStyle w:val="Compact"/>
-        <w:numPr>
-          <w:ilvl w:val="0"/>
-          <w:numId w:val="1079"/>
-        </w:numPr>
-      </w:pPr>
-      <w:r>
-        <w:rPr>
-          <w:b/>
-          <w:bCs/>
-        </w:rPr>
-        <w:t xml:space="preserve">Decide email:</w:t>
-      </w:r>
-      <w:r>
-        <w:t xml:space="preserve"> </w:t>
-      </w:r>
-      <w:r>
-        <w:t xml:space="preserve">GHL draft, or handed off like social.</w:t>
-      </w:r>
-    </w:p>
-    <w:p>
-      <w:pPr>
-        <w:pStyle w:val="Compact"/>
-        <w:numPr>
-          <w:ilvl w:val="0"/>
-          <w:numId w:val="1080"/>
-        </w:numPr>
-      </w:pPr>
-      <w:r>
-        <w:t xml:space="preserve">Pick the Monday hour, then build: marketing project, hire from block 17, routine with</w:t>
-      </w:r>
-      <w:r>
-        <w:t xml:space="preserve"> </w:t>
-      </w:r>
-      <w:r>
-        <w:rPr>
-          <w:rStyle w:val="VerbatimChar"/>
-        </w:rPr>
-        <w:t xml:space="preserve">schedule</w:t>
-      </w:r>
-      <w:r>
-        <w:t xml:space="preserve"> </w:t>
-      </w:r>
-      <w:r>
-        <w:t xml:space="preserve">+ manual</w:t>
-      </w:r>
-      <w:r>
-        <w:t xml:space="preserve"> </w:t>
-      </w:r>
-      <w:r>
-        <w:rPr>
-          <w:rStyle w:val="VerbatimChar"/>
-        </w:rPr>
-        <w:t xml:space="preserve">api</w:t>
-      </w:r>
-      <w:r>
-        <w:t xml:space="preserve"> </w:t>
-      </w:r>
-      <w:r>
-        <w:t xml:space="preserve">triggers, dry run, go live.</w:t>
+    </w:p>
+    <w:p>
+      <w:pPr>
+        <w:pStyle w:val="Compact"/>
+        <w:numPr>
+          <w:ilvl w:val="0"/>
+          <w:numId w:val="1073"/>
+        </w:numPr>
+      </w:pPr>
+      <w:r>
+        <w:rPr>
+          <w:b/>
+          <w:bCs/>
+        </w:rPr>
+        <w:t xml:space="preserve">Interim rule, already written into KB Section 11:</w:t>
+      </w:r>
+      <w:r>
+        <w:t xml:space="preserve"> </w:t>
+      </w:r>
+      <w:r>
+        <w:t xml:space="preserve">any agent instructed to perform this check must report that it could not, and must never report it as passed. A human reviews the affected copy instead.</w:t>
       </w:r>
     </w:p>
     <w:bookmarkEnd w:id="17"/>
@@ -6112,7 +5876,7 @@
         <w:pStyle w:val="Compact"/>
         <w:numPr>
           <w:ilvl w:val="0"/>
-          <w:numId w:val="1081"/>
+          <w:numId w:val="1074"/>
         </w:numPr>
       </w:pPr>
       <w:r>
@@ -6134,7 +5898,7 @@
         <w:pStyle w:val="Compact"/>
         <w:numPr>
           <w:ilvl w:val="0"/>
-          <w:numId w:val="1082"/>
+          <w:numId w:val="1075"/>
         </w:numPr>
       </w:pPr>
       <w:r>
@@ -6156,7 +5920,7 @@
         <w:pStyle w:val="Compact"/>
         <w:numPr>
           <w:ilvl w:val="0"/>
-          <w:numId w:val="1083"/>
+          <w:numId w:val="1076"/>
         </w:numPr>
       </w:pPr>
       <w:r>
@@ -6187,7 +5951,7 @@
         <w:pStyle w:val="Compact"/>
         <w:numPr>
           <w:ilvl w:val="0"/>
-          <w:numId w:val="1084"/>
+          <w:numId w:val="1077"/>
         </w:numPr>
       </w:pPr>
       <w:r>
@@ -6209,7 +5973,7 @@
         <w:pStyle w:val="Compact"/>
         <w:numPr>
           <w:ilvl w:val="0"/>
-          <w:numId w:val="1085"/>
+          <w:numId w:val="1078"/>
         </w:numPr>
       </w:pPr>
       <w:r>
@@ -6231,7 +5995,7 @@
         <w:pStyle w:val="Compact"/>
         <w:numPr>
           <w:ilvl w:val="0"/>
-          <w:numId w:val="1086"/>
+          <w:numId w:val="1079"/>
         </w:numPr>
       </w:pPr>
       <w:r>
@@ -6253,7 +6017,7 @@
         <w:pStyle w:val="Compact"/>
         <w:numPr>
           <w:ilvl w:val="0"/>
-          <w:numId w:val="1087"/>
+          <w:numId w:val="1080"/>
         </w:numPr>
       </w:pPr>
       <w:r>
@@ -6336,7 +6100,7 @@
         <w:pStyle w:val="Compact"/>
         <w:numPr>
           <w:ilvl w:val="0"/>
-          <w:numId w:val="1088"/>
+          <w:numId w:val="1081"/>
         </w:numPr>
       </w:pPr>
       <w:r>
@@ -6358,7 +6122,7 @@
         <w:pStyle w:val="Compact"/>
         <w:numPr>
           <w:ilvl w:val="0"/>
-          <w:numId w:val="1089"/>
+          <w:numId w:val="1082"/>
         </w:numPr>
       </w:pPr>
       <w:r>
@@ -6396,7 +6160,7 @@
         <w:pStyle w:val="Compact"/>
         <w:numPr>
           <w:ilvl w:val="0"/>
-          <w:numId w:val="1090"/>
+          <w:numId w:val="1083"/>
         </w:numPr>
       </w:pPr>
       <w:r>
@@ -6418,7 +6182,7 @@
         <w:pStyle w:val="Compact"/>
         <w:numPr>
           <w:ilvl w:val="0"/>
-          <w:numId w:val="1091"/>
+          <w:numId w:val="1084"/>
         </w:numPr>
       </w:pPr>
       <w:r>
@@ -6440,7 +6204,7 @@
         <w:pStyle w:val="Compact"/>
         <w:numPr>
           <w:ilvl w:val="0"/>
-          <w:numId w:val="1092"/>
+          <w:numId w:val="1085"/>
         </w:numPr>
       </w:pPr>
       <w:r>
@@ -6541,7 +6305,7 @@
         <w:pStyle w:val="Compact"/>
         <w:numPr>
           <w:ilvl w:val="0"/>
-          <w:numId w:val="1093"/>
+          <w:numId w:val="1086"/>
         </w:numPr>
       </w:pPr>
       <w:r>
@@ -6563,7 +6327,7 @@
         <w:pStyle w:val="Compact"/>
         <w:numPr>
           <w:ilvl w:val="0"/>
-          <w:numId w:val="1094"/>
+          <w:numId w:val="1087"/>
         </w:numPr>
       </w:pPr>
       <w:r>
@@ -6595,7 +6359,7 @@
         <w:pStyle w:val="Compact"/>
         <w:numPr>
           <w:ilvl w:val="0"/>
-          <w:numId w:val="1095"/>
+          <w:numId w:val="1088"/>
         </w:numPr>
       </w:pPr>
       <w:r>
@@ -6669,7 +6433,7 @@
         <w:pStyle w:val="Compact"/>
         <w:numPr>
           <w:ilvl w:val="0"/>
-          <w:numId w:val="1096"/>
+          <w:numId w:val="1089"/>
         </w:numPr>
       </w:pPr>
       <w:r>
@@ -6732,7 +6496,7 @@
         <w:pStyle w:val="Compact"/>
         <w:numPr>
           <w:ilvl w:val="1"/>
-          <w:numId w:val="1097"/>
+          <w:numId w:val="1090"/>
         </w:numPr>
       </w:pPr>
       <w:r>
@@ -6754,7 +6518,7 @@
         <w:pStyle w:val="Compact"/>
         <w:numPr>
           <w:ilvl w:val="1"/>
-          <w:numId w:val="1097"/>
+          <w:numId w:val="1090"/>
         </w:numPr>
       </w:pPr>
       <w:r>
@@ -6797,7 +6561,7 @@
         <w:pStyle w:val="Compact"/>
         <w:numPr>
           <w:ilvl w:val="1"/>
-          <w:numId w:val="1097"/>
+          <w:numId w:val="1090"/>
         </w:numPr>
       </w:pPr>
       <w:r>
@@ -6834,7 +6598,7 @@
         <w:pStyle w:val="Compact"/>
         <w:numPr>
           <w:ilvl w:val="1"/>
-          <w:numId w:val="1097"/>
+          <w:numId w:val="1090"/>
         </w:numPr>
       </w:pPr>
       <w:r>
@@ -6865,6 +6629,424 @@
       <w:pPr>
         <w:numPr>
           <w:ilvl w:val="0"/>
+          <w:numId w:val="1091"/>
+        </w:numPr>
+      </w:pPr>
+      <w:r>
+        <w:rPr>
+          <w:b/>
+          <w:bCs/>
+        </w:rPr>
+        <w:t xml:space="preserve">Sync the live</w:t>
+      </w:r>
+      <w:r>
+        <w:rPr>
+          <w:b/>
+          <w:bCs/>
+        </w:rPr>
+        <w:t xml:space="preserve"> </w:t>
+      </w:r>
+      <w:r>
+        <w:rPr>
+          <w:rStyle w:val="VerbatimChar"/>
+          <w:b/>
+          <w:bCs/>
+        </w:rPr>
+        <w:t xml:space="preserve">enyrgy-knowledge-base</w:t>
+      </w:r>
+      <w:r>
+        <w:rPr>
+          <w:b/>
+          <w:bCs/>
+        </w:rPr>
+        <w:t xml:space="preserve"> </w:t>
+      </w:r>
+      <w:r>
+        <w:rPr>
+          <w:b/>
+          <w:bCs/>
+        </w:rPr>
+        <w:t xml:space="preserve">Company Skill to the repo KB:</w:t>
+      </w:r>
+      <w:r>
+        <w:t xml:space="preserve"> </w:t>
+      </w:r>
+      <w:r>
+        <w:t xml:space="preserve">DONE (Aug 4, 2026), skill now matches commit</w:t>
+      </w:r>
+      <w:r>
+        <w:t xml:space="preserve"> </w:t>
+      </w:r>
+      <w:r>
+        <w:rPr>
+          <w:rStyle w:val="VerbatimChar"/>
+        </w:rPr>
+        <w:t xml:space="preserve">42090226</w:t>
+      </w:r>
+      <w:r>
+        <w:t xml:space="preserve">. That sync carried nine targeted edits: users-not-customers, Brian Cameron CFO as a former securities regulator, the manual referral mechanism, contact@enyrgy.com, the pilot-to-study rule plus</w:t>
+      </w:r>
+      <w:r>
+        <w:t xml:space="preserve"> </w:t>
+      </w:r>
+      <w:r>
+        <w:t xml:space="preserve">“the five participants”</w:t>
+      </w:r>
+      <w:r>
+        <w:t xml:space="preserve">, the three advisor bios with publication figures, and the approved one-in-four wording.</w:t>
+      </w:r>
+      <w:r>
+        <w:t xml:space="preserve"> </w:t>
+      </w:r>
+      <w:r>
+        <w:rPr>
+          <w:b/>
+          <w:bCs/>
+        </w:rPr>
+        <w:t xml:space="preserve">The last one mattered most:</w:t>
+      </w:r>
+      <w:r>
+        <w:t xml:space="preserve"> </w:t>
+      </w:r>
+      <w:r>
+        <w:t xml:space="preserve">“in these trials”</w:t>
+      </w:r>
+      <w:r>
+        <w:t xml:space="preserve"> </w:t>
+      </w:r>
+      <w:r>
+        <w:t xml:space="preserve">is only unambiguous beside the citation, and an agent lifting the phrase into an email leaves the citation behind, so the reader parses it as Enyrgy’s own trials. Earlier syncs: Aug 2</w:t>
+      </w:r>
+      <w:r>
+        <w:t xml:space="preserve"> </w:t>
+      </w:r>
+      <w:r>
+        <w:rPr>
+          <w:rStyle w:val="VerbatimChar"/>
+        </w:rPr>
+        <w:t xml:space="preserve">17c553b7</w:t>
+      </w:r>
+      <w:r>
+        <w:t xml:space="preserve">, Aug 2</w:t>
+      </w:r>
+      <w:r>
+        <w:t xml:space="preserve"> </w:t>
+      </w:r>
+      <w:r>
+        <w:rPr>
+          <w:rStyle w:val="VerbatimChar"/>
+        </w:rPr>
+        <w:t xml:space="preserve">2f4fb933</w:t>
+      </w:r>
+      <w:r>
+        <w:t xml:space="preserve">, Aug 1</w:t>
+      </w:r>
+      <w:r>
+        <w:t xml:space="preserve"> </w:t>
+      </w:r>
+      <w:r>
+        <w:rPr>
+          <w:rStyle w:val="VerbatimChar"/>
+        </w:rPr>
+        <w:t xml:space="preserve">95f41a40</w:t>
+      </w:r>
+      <w:r>
+        <w:t xml:space="preserve">. Six targeted find/replace edits, verified after save.</w:t>
+      </w:r>
+      <w:r>
+        <w:t xml:space="preserve"> </w:t>
+      </w:r>
+      <w:r>
+        <w:rPr>
+          <w:b/>
+          <w:bCs/>
+        </w:rPr>
+        <w:t xml:space="preserve">Standing method:</w:t>
+      </w:r>
+      <w:r>
+        <w:t xml:space="preserve"> </w:t>
+      </w:r>
+      <w:r>
+        <w:t xml:space="preserve">run</w:t>
+      </w:r>
+      <w:r>
+        <w:t xml:space="preserve"> </w:t>
+      </w:r>
+      <w:r>
+        <w:rPr>
+          <w:rStyle w:val="VerbatimChar"/>
+        </w:rPr>
+        <w:t xml:space="preserve">git log &lt;last-synced-commit&gt;..HEAD -- Enyrgy_Paperclip_Knowledge_Base.md</w:t>
+      </w:r>
+      <w:r>
+        <w:t xml:space="preserve">, apply only those hunks in Skill Studio, never select-all-paste, then reopen and confirm the body saved and the frontmatter appears exactly once.</w:t>
+      </w:r>
+      <w:r>
+        <w:t xml:space="preserve"> </w:t>
+      </w:r>
+      <w:r>
+        <w:rPr>
+          <w:b/>
+          <w:bCs/>
+        </w:rPr>
+        <w:t xml:space="preserve">Record the synced commit hash in the handoff documents table every time</w:t>
+      </w:r>
+      <w:r>
+        <w:t xml:space="preserve">, otherwise the next session cannot tell what the live skill actually contains.</w:t>
+      </w:r>
+    </w:p>
+    <w:p>
+      <w:pPr>
+        <w:numPr>
+          <w:ilvl w:val="0"/>
+          <w:numId w:val="1092"/>
+        </w:numPr>
+      </w:pPr>
+      <w:r>
+        <w:rPr>
+          <w:b/>
+          <w:bCs/>
+        </w:rPr>
+        <w:t xml:space="preserve">Refresh the EA to v1.1 (July 28):</w:t>
+      </w:r>
+      <w:r>
+        <w:t xml:space="preserve"> </w:t>
+      </w:r>
+      <w:r>
+        <w:t xml:space="preserve">bumped to Version 1.1 with an authoritative</w:t>
+      </w:r>
+      <w:r>
+        <w:t xml:space="preserve"> </w:t>
+      </w:r>
+      <w:r>
+        <w:t xml:space="preserve">“v1.1 Current-State Update”</w:t>
+      </w:r>
+      <w:r>
+        <w:t xml:space="preserve"> </w:t>
+      </w:r>
+      <w:r>
+        <w:t xml:space="preserve">section that overrides the stale June-29 body (Shopify integration + WF-27/28/29, GBP live + WF-07 wiring, full Paperclip org + tuned heartbeats, toll-free SMS/CNAM/no-10DLC, content assets, addresses/business-category fixes, the reliability findings incl. the debunked phantom-completion, and the open agency-email item). A future pass can fold these line-by-line into each layer.</w:t>
+      </w:r>
+    </w:p>
+    <w:p>
+      <w:pPr>
+        <w:numPr>
+          <w:ilvl w:val="0"/>
+          <w:numId w:val="1093"/>
+        </w:numPr>
+      </w:pPr>
+      <w:r>
+        <w:rPr>
+          <w:b/>
+          <w:bCs/>
+        </w:rPr>
+        <w:t xml:space="preserve">IG loose ends:</w:t>
+      </w:r>
+      <w:r>
+        <w:t xml:space="preserve"> </w:t>
+      </w:r>
+      <w:r>
+        <w:t xml:space="preserve">WF-23/WF-24 numbering gap (confirm not unbuilt), Winter/Tired-Test URLs missing from the Key URLs table, blank team contact fields (Dennis Lan, Dario Pompeii, Millie Carrillo, Thea Cartier).</w:t>
+      </w:r>
+    </w:p>
+    <w:p>
+      <w:pPr>
+        <w:numPr>
+          <w:ilvl w:val="0"/>
+          <w:numId w:val="1094"/>
+        </w:numPr>
+      </w:pPr>
+      <w:r>
+        <w:rPr>
+          <w:b/>
+          <w:bCs/>
+        </w:rPr>
+        <w:t xml:space="preserve">WIP:</w:t>
+      </w:r>
+      <w:r>
+        <w:t xml:space="preserve"> </w:t>
+      </w:r>
+      <w:r>
+        <w:rPr>
+          <w:strike/>
+        </w:rPr>
+        <w:t xml:space="preserve">correct the</w:t>
+      </w:r>
+      <w:r>
+        <w:rPr>
+          <w:strike/>
+        </w:rPr>
+        <w:t xml:space="preserve"> </w:t>
+      </w:r>
+      <w:r>
+        <w:rPr>
+          <w:strike/>
+        </w:rPr>
+        <w:t xml:space="preserve">“24-agent”</w:t>
+      </w:r>
+      <w:r>
+        <w:rPr>
+          <w:strike/>
+        </w:rPr>
+        <w:t xml:space="preserve"> </w:t>
+      </w:r>
+      <w:r>
+        <w:rPr>
+          <w:strike/>
+        </w:rPr>
+        <w:t xml:space="preserve">count</w:t>
+      </w:r>
+      <w:r>
+        <w:t xml:space="preserve"> </w:t>
+      </w:r>
+      <w:r>
+        <w:rPr>
+          <w:b/>
+          <w:bCs/>
+        </w:rPr>
+        <w:t xml:space="preserve">Already done and this item was stale.</w:t>
+      </w:r>
+      <w:r>
+        <w:t xml:space="preserve"> </w:t>
+      </w:r>
+      <w:r>
+        <w:t xml:space="preserve">The WIP records the correction explicitly: 16 built (3 C-Suite + 7 COO + 6 CRO), upper bound 22 with all six Phase 2 additions. The only surviving</w:t>
+      </w:r>
+      <w:r>
+        <w:t xml:space="preserve"> </w:t>
+      </w:r>
+      <w:r>
+        <w:t xml:space="preserve">“24-agent”</w:t>
+      </w:r>
+      <w:r>
+        <w:t xml:space="preserve"> </w:t>
+      </w:r>
+      <w:r>
+        <w:t xml:space="preserve">string is inside the sentence explaining that it was wrong.</w:t>
+      </w:r>
+    </w:p>
+    <w:p>
+      <w:pPr>
+        <w:numPr>
+          <w:ilvl w:val="0"/>
+          <w:numId w:val="1095"/>
+        </w:numPr>
+      </w:pPr>
+      <w:r>
+        <w:rPr>
+          <w:b/>
+          <w:bCs/>
+        </w:rPr>
+        <w:t xml:space="preserve">Doc date stamps corrected (Aug 4).</w:t>
+      </w:r>
+      <w:r>
+        <w:t xml:space="preserve"> </w:t>
+      </w:r>
+      <w:r>
+        <w:t xml:space="preserve">The Handoff header said</w:t>
+      </w:r>
+      <w:r>
+        <w:t xml:space="preserve"> </w:t>
+      </w:r>
+      <w:r>
+        <w:t xml:space="preserve">“end of Session 15”</w:t>
+      </w:r>
+      <w:r>
+        <w:t xml:space="preserve"> </w:t>
+      </w:r>
+      <w:r>
+        <w:t xml:space="preserve">and its own DOCUMENTS row said</w:t>
+      </w:r>
+      <w:r>
+        <w:t xml:space="preserve"> </w:t>
+      </w:r>
+      <w:r>
+        <w:t xml:space="preserve">“Session 14”</w:t>
+      </w:r>
+      <w:r>
+        <w:t xml:space="preserve">; the WIP header said July 28. Both carried Session 16 content.</w:t>
+      </w:r>
+      <w:r>
+        <w:t xml:space="preserve"> </w:t>
+      </w:r>
+      <w:r>
+        <w:rPr>
+          <w:b/>
+          <w:bCs/>
+        </w:rPr>
+        <w:t xml:space="preserve">A stale header on a current document is worse than an old document, because it invites the reader to discount content that is actually current.</w:t>
+      </w:r>
+    </w:p>
+    <w:p>
+      <w:pPr>
+        <w:numPr>
+          <w:ilvl w:val="0"/>
+          <w:numId w:val="1096"/>
+        </w:numPr>
+      </w:pPr>
+      <w:r>
+        <w:rPr>
+          <w:b/>
+          <w:bCs/>
+        </w:rPr>
+        <w:t xml:space="preserve">IG version conflict resolved (Aug 4).</w:t>
+      </w:r>
+      <w:r>
+        <w:t xml:space="preserve"> </w:t>
+      </w:r>
+      <w:r>
+        <w:t xml:space="preserve">The cover said 3.9.4 while the change log said 3.9.5, and a second</w:t>
+      </w:r>
+      <w:r>
+        <w:t xml:space="preserve"> </w:t>
+      </w:r>
+      <w:r>
+        <w:t xml:space="preserve">“v3.9.4 Changes”</w:t>
+      </w:r>
+      <w:r>
+        <w:t xml:space="preserve"> </w:t>
+      </w:r>
+      <w:r>
+        <w:t xml:space="preserve">block had been introduced. Now 3.9.6 throughout, with the Session 16 block filed alongside the others rather than on the cover.</w:t>
+      </w:r>
+    </w:p>
+    <w:p>
+      <w:pPr>
+        <w:numPr>
+          <w:ilvl w:val="0"/>
+          <w:numId w:val="1097"/>
+        </w:numPr>
+      </w:pPr>
+      <w:r>
+        <w:rPr>
+          <w:b/>
+          <w:bCs/>
+        </w:rPr>
+        <w:t xml:space="preserve">IG phantom-completion claim retracted (Aug 4).</w:t>
+      </w:r>
+      <w:r>
+        <w:t xml:space="preserve"> </w:t>
+      </w:r>
+      <w:r>
+        <w:t xml:space="preserve">The v3.9.5 block described an open platform bug auto-flipping runs to</w:t>
+      </w:r>
+      <w:r>
+        <w:t xml:space="preserve"> </w:t>
+      </w:r>
+      <w:r>
+        <w:rPr>
+          <w:rStyle w:val="VerbatimChar"/>
+        </w:rPr>
+        <w:t xml:space="preserve">done</w:t>
+      </w:r>
+      <w:r>
+        <w:t xml:space="preserve">. That was investigated in code and debunked; the WIP and TODO already recorded it as NOT A BUG, so the IG was contradicting both. Now struck with the reason.</w:t>
+      </w:r>
+    </w:p>
+    <w:p>
+      <w:pPr>
+        <w:numPr>
+          <w:ilvl w:val="0"/>
           <w:numId w:val="1098"/>
         </w:numPr>
       </w:pPr>
@@ -6873,162 +7055,40 @@
           <w:b/>
           <w:bCs/>
         </w:rPr>
-        <w:t xml:space="preserve">Sync the live</w:t>
-      </w:r>
-      <w:r>
-        <w:rPr>
-          <w:b/>
-          <w:bCs/>
-        </w:rPr>
-        <w:t xml:space="preserve"> </w:t>
-      </w:r>
-      <w:r>
-        <w:rPr>
-          <w:rStyle w:val="VerbatimChar"/>
-          <w:b/>
-          <w:bCs/>
-        </w:rPr>
-        <w:t xml:space="preserve">enyrgy-knowledge-base</w:t>
-      </w:r>
-      <w:r>
-        <w:rPr>
-          <w:b/>
-          <w:bCs/>
-        </w:rPr>
-        <w:t xml:space="preserve"> </w:t>
-      </w:r>
-      <w:r>
-        <w:rPr>
-          <w:b/>
-          <w:bCs/>
-        </w:rPr>
-        <w:t xml:space="preserve">Company Skill to the repo KB:</w:t>
-      </w:r>
-      <w:r>
-        <w:t xml:space="preserve"> </w:t>
-      </w:r>
-      <w:r>
-        <w:t xml:space="preserve">DONE (Aug 4, 2026), skill now matches commit</w:t>
-      </w:r>
-      <w:r>
-        <w:t xml:space="preserve"> </w:t>
-      </w:r>
-      <w:r>
-        <w:rPr>
-          <w:rStyle w:val="VerbatimChar"/>
-        </w:rPr>
-        <w:t xml:space="preserve">42090226</w:t>
-      </w:r>
-      <w:r>
-        <w:t xml:space="preserve">. That sync carried nine targeted edits: users-not-customers, Brian Cameron CFO as a former securities regulator, the manual referral mechanism, contact@enyrgy.com, the pilot-to-study rule plus</w:t>
-      </w:r>
-      <w:r>
-        <w:t xml:space="preserve"> </w:t>
-      </w:r>
-      <w:r>
-        <w:t xml:space="preserve">“the five participants”</w:t>
-      </w:r>
-      <w:r>
-        <w:t xml:space="preserve">, the three advisor bios with publication figures, and the approved one-in-four wording.</w:t>
-      </w:r>
-      <w:r>
-        <w:t xml:space="preserve"> </w:t>
-      </w:r>
-      <w:r>
-        <w:rPr>
-          <w:b/>
-          <w:bCs/>
-        </w:rPr>
-        <w:t xml:space="preserve">The last one mattered most:</w:t>
-      </w:r>
-      <w:r>
-        <w:t xml:space="preserve"> </w:t>
-      </w:r>
-      <w:r>
-        <w:t xml:space="preserve">“in these trials”</w:t>
-      </w:r>
-      <w:r>
-        <w:t xml:space="preserve"> </w:t>
-      </w:r>
-      <w:r>
-        <w:t xml:space="preserve">is only unambiguous beside the citation, and an agent lifting the phrase into an email leaves the citation behind, so the reader parses it as Enyrgy’s own trials. Earlier syncs: Aug 2</w:t>
-      </w:r>
-      <w:r>
-        <w:t xml:space="preserve"> </w:t>
-      </w:r>
-      <w:r>
-        <w:rPr>
-          <w:rStyle w:val="VerbatimChar"/>
-        </w:rPr>
-        <w:t xml:space="preserve">17c553b7</w:t>
-      </w:r>
-      <w:r>
-        <w:t xml:space="preserve">, Aug 2</w:t>
-      </w:r>
-      <w:r>
-        <w:t xml:space="preserve"> </w:t>
-      </w:r>
-      <w:r>
-        <w:rPr>
-          <w:rStyle w:val="VerbatimChar"/>
-        </w:rPr>
-        <w:t xml:space="preserve">2f4fb933</w:t>
-      </w:r>
-      <w:r>
-        <w:t xml:space="preserve">, Aug 1</w:t>
-      </w:r>
-      <w:r>
-        <w:t xml:space="preserve"> </w:t>
-      </w:r>
-      <w:r>
-        <w:rPr>
-          <w:rStyle w:val="VerbatimChar"/>
-        </w:rPr>
-        <w:t xml:space="preserve">95f41a40</w:t>
-      </w:r>
-      <w:r>
-        <w:t xml:space="preserve">. Six targeted find/replace edits, verified after save.</w:t>
-      </w:r>
-      <w:r>
-        <w:t xml:space="preserve"> </w:t>
-      </w:r>
-      <w:r>
-        <w:rPr>
-          <w:b/>
-          <w:bCs/>
-        </w:rPr>
-        <w:t xml:space="preserve">Standing method:</w:t>
-      </w:r>
-      <w:r>
-        <w:t xml:space="preserve"> </w:t>
-      </w:r>
-      <w:r>
-        <w:t xml:space="preserve">run</w:t>
-      </w:r>
-      <w:r>
-        <w:t xml:space="preserve"> </w:t>
-      </w:r>
-      <w:r>
-        <w:rPr>
-          <w:rStyle w:val="VerbatimChar"/>
-        </w:rPr>
-        <w:t xml:space="preserve">git log &lt;last-synced-commit&gt;..HEAD -- Enyrgy_Paperclip_Knowledge_Base.md</w:t>
-      </w:r>
-      <w:r>
-        <w:t xml:space="preserve">, apply only those hunks in Skill Studio, never select-all-paste, then reopen and confirm the body saved and the frontmatter appears exactly once.</w:t>
-      </w:r>
-      <w:r>
-        <w:t xml:space="preserve"> </w:t>
-      </w:r>
-      <w:r>
-        <w:rPr>
-          <w:b/>
-          <w:bCs/>
-        </w:rPr>
-        <w:t xml:space="preserve">Record the synced commit hash in the handoff documents table every time</w:t>
-      </w:r>
-      <w:r>
-        <w:t xml:space="preserve">, otherwise the next session cannot tell what the live skill actually contains.</w:t>
+        <w:t xml:space="preserve">WIP investor import step 6 corrected (Aug 4).</w:t>
+      </w:r>
+      <w:r>
+        <w:t xml:space="preserve"> </w:t>
+      </w:r>
+      <w:r>
+        <w:t xml:space="preserve">It read</w:t>
+      </w:r>
+      <w:r>
+        <w:t xml:space="preserve"> </w:t>
+      </w:r>
+      <w:r>
+        <w:t xml:space="preserve">“Apply type_investor tag to trigger drip enrollment”</w:t>
+      </w:r>
+      <w:r>
+        <w:t xml:space="preserve"> </w:t>
+      </w:r>
+      <w:r>
+        <w:t xml:space="preserve">in an investor-import runbook, directly contradicting the twice-stated rule never to apply</w:t>
+      </w:r>
+      <w:r>
+        <w:t xml:space="preserve"> </w:t>
+      </w:r>
+      <w:r>
+        <w:rPr>
+          <w:rStyle w:val="VerbatimChar"/>
+        </w:rPr>
+        <w:t xml:space="preserve">type_investor</w:t>
+      </w:r>
+      <w:r>
+        <w:t xml:space="preserve"> </w:t>
+      </w:r>
+      <w:r>
+        <w:t xml:space="preserve">to current investors. Following it would have pitched an investment to people who had already funded. Rewritten to split current from prospective investors, and the rest of the Session 16 import lessons folded in.</w:t>
       </w:r>
     </w:p>
     <w:p>
@@ -7036,302 +7096,6 @@
         <w:numPr>
           <w:ilvl w:val="0"/>
           <w:numId w:val="1099"/>
-        </w:numPr>
-      </w:pPr>
-      <w:r>
-        <w:rPr>
-          <w:b/>
-          <w:bCs/>
-        </w:rPr>
-        <w:t xml:space="preserve">Refresh the EA to v1.1 (July 28):</w:t>
-      </w:r>
-      <w:r>
-        <w:t xml:space="preserve"> </w:t>
-      </w:r>
-      <w:r>
-        <w:t xml:space="preserve">bumped to Version 1.1 with an authoritative</w:t>
-      </w:r>
-      <w:r>
-        <w:t xml:space="preserve"> </w:t>
-      </w:r>
-      <w:r>
-        <w:t xml:space="preserve">“v1.1 Current-State Update”</w:t>
-      </w:r>
-      <w:r>
-        <w:t xml:space="preserve"> </w:t>
-      </w:r>
-      <w:r>
-        <w:t xml:space="preserve">section that overrides the stale June-29 body (Shopify integration + WF-27/28/29, GBP live + WF-07 wiring, full Paperclip org + tuned heartbeats, toll-free SMS/CNAM/no-10DLC, content assets, addresses/business-category fixes, the reliability findings incl. the debunked phantom-completion, and the open agency-email item). A future pass can fold these line-by-line into each layer.</w:t>
-      </w:r>
-    </w:p>
-    <w:p>
-      <w:pPr>
-        <w:numPr>
-          <w:ilvl w:val="0"/>
-          <w:numId w:val="1100"/>
-        </w:numPr>
-      </w:pPr>
-      <w:r>
-        <w:rPr>
-          <w:b/>
-          <w:bCs/>
-        </w:rPr>
-        <w:t xml:space="preserve">IG loose ends:</w:t>
-      </w:r>
-      <w:r>
-        <w:t xml:space="preserve"> </w:t>
-      </w:r>
-      <w:r>
-        <w:t xml:space="preserve">WF-23/WF-24 numbering gap (confirm not unbuilt), Winter/Tired-Test URLs missing from the Key URLs table, blank team contact fields (Dennis Lan, Dario Pompeii, Millie Carrillo, Thea Cartier).</w:t>
-      </w:r>
-    </w:p>
-    <w:p>
-      <w:pPr>
-        <w:numPr>
-          <w:ilvl w:val="0"/>
-          <w:numId w:val="1101"/>
-        </w:numPr>
-      </w:pPr>
-      <w:r>
-        <w:rPr>
-          <w:b/>
-          <w:bCs/>
-        </w:rPr>
-        <w:t xml:space="preserve">WIP:</w:t>
-      </w:r>
-      <w:r>
-        <w:t xml:space="preserve"> </w:t>
-      </w:r>
-      <w:r>
-        <w:rPr>
-          <w:strike/>
-        </w:rPr>
-        <w:t xml:space="preserve">correct the</w:t>
-      </w:r>
-      <w:r>
-        <w:rPr>
-          <w:strike/>
-        </w:rPr>
-        <w:t xml:space="preserve"> </w:t>
-      </w:r>
-      <w:r>
-        <w:rPr>
-          <w:strike/>
-        </w:rPr>
-        <w:t xml:space="preserve">“24-agent”</w:t>
-      </w:r>
-      <w:r>
-        <w:rPr>
-          <w:strike/>
-        </w:rPr>
-        <w:t xml:space="preserve"> </w:t>
-      </w:r>
-      <w:r>
-        <w:rPr>
-          <w:strike/>
-        </w:rPr>
-        <w:t xml:space="preserve">count</w:t>
-      </w:r>
-      <w:r>
-        <w:t xml:space="preserve"> </w:t>
-      </w:r>
-      <w:r>
-        <w:rPr>
-          <w:b/>
-          <w:bCs/>
-        </w:rPr>
-        <w:t xml:space="preserve">Already done and this item was stale.</w:t>
-      </w:r>
-      <w:r>
-        <w:t xml:space="preserve"> </w:t>
-      </w:r>
-      <w:r>
-        <w:t xml:space="preserve">The WIP records the correction explicitly: 16 built (3 C-Suite + 7 COO + 6 CRO), upper bound 22 with all six Phase 2 additions. The only surviving</w:t>
-      </w:r>
-      <w:r>
-        <w:t xml:space="preserve"> </w:t>
-      </w:r>
-      <w:r>
-        <w:t xml:space="preserve">“24-agent”</w:t>
-      </w:r>
-      <w:r>
-        <w:t xml:space="preserve"> </w:t>
-      </w:r>
-      <w:r>
-        <w:t xml:space="preserve">string is inside the sentence explaining that it was wrong.</w:t>
-      </w:r>
-    </w:p>
-    <w:p>
-      <w:pPr>
-        <w:numPr>
-          <w:ilvl w:val="0"/>
-          <w:numId w:val="1102"/>
-        </w:numPr>
-      </w:pPr>
-      <w:r>
-        <w:rPr>
-          <w:b/>
-          <w:bCs/>
-        </w:rPr>
-        <w:t xml:space="preserve">Doc date stamps corrected (Aug 4).</w:t>
-      </w:r>
-      <w:r>
-        <w:t xml:space="preserve"> </w:t>
-      </w:r>
-      <w:r>
-        <w:t xml:space="preserve">The Handoff header said</w:t>
-      </w:r>
-      <w:r>
-        <w:t xml:space="preserve"> </w:t>
-      </w:r>
-      <w:r>
-        <w:t xml:space="preserve">“end of Session 15”</w:t>
-      </w:r>
-      <w:r>
-        <w:t xml:space="preserve"> </w:t>
-      </w:r>
-      <w:r>
-        <w:t xml:space="preserve">and its own DOCUMENTS row said</w:t>
-      </w:r>
-      <w:r>
-        <w:t xml:space="preserve"> </w:t>
-      </w:r>
-      <w:r>
-        <w:t xml:space="preserve">“Session 14”</w:t>
-      </w:r>
-      <w:r>
-        <w:t xml:space="preserve">; the WIP header said July 28. Both carried Session 16 content.</w:t>
-      </w:r>
-      <w:r>
-        <w:t xml:space="preserve"> </w:t>
-      </w:r>
-      <w:r>
-        <w:rPr>
-          <w:b/>
-          <w:bCs/>
-        </w:rPr>
-        <w:t xml:space="preserve">A stale header on a current document is worse than an old document, because it invites the reader to discount content that is actually current.</w:t>
-      </w:r>
-    </w:p>
-    <w:p>
-      <w:pPr>
-        <w:numPr>
-          <w:ilvl w:val="0"/>
-          <w:numId w:val="1103"/>
-        </w:numPr>
-      </w:pPr>
-      <w:r>
-        <w:rPr>
-          <w:b/>
-          <w:bCs/>
-        </w:rPr>
-        <w:t xml:space="preserve">IG version conflict resolved (Aug 4).</w:t>
-      </w:r>
-      <w:r>
-        <w:t xml:space="preserve"> </w:t>
-      </w:r>
-      <w:r>
-        <w:t xml:space="preserve">The cover said 3.9.4 while the change log said 3.9.5, and a second</w:t>
-      </w:r>
-      <w:r>
-        <w:t xml:space="preserve"> </w:t>
-      </w:r>
-      <w:r>
-        <w:t xml:space="preserve">“v3.9.4 Changes”</w:t>
-      </w:r>
-      <w:r>
-        <w:t xml:space="preserve"> </w:t>
-      </w:r>
-      <w:r>
-        <w:t xml:space="preserve">block had been introduced. Now 3.9.6 throughout, with the Session 16 block filed alongside the others rather than on the cover.</w:t>
-      </w:r>
-    </w:p>
-    <w:p>
-      <w:pPr>
-        <w:numPr>
-          <w:ilvl w:val="0"/>
-          <w:numId w:val="1104"/>
-        </w:numPr>
-      </w:pPr>
-      <w:r>
-        <w:rPr>
-          <w:b/>
-          <w:bCs/>
-        </w:rPr>
-        <w:t xml:space="preserve">IG phantom-completion claim retracted (Aug 4).</w:t>
-      </w:r>
-      <w:r>
-        <w:t xml:space="preserve"> </w:t>
-      </w:r>
-      <w:r>
-        <w:t xml:space="preserve">The v3.9.5 block described an open platform bug auto-flipping runs to</w:t>
-      </w:r>
-      <w:r>
-        <w:t xml:space="preserve"> </w:t>
-      </w:r>
-      <w:r>
-        <w:rPr>
-          <w:rStyle w:val="VerbatimChar"/>
-        </w:rPr>
-        <w:t xml:space="preserve">done</w:t>
-      </w:r>
-      <w:r>
-        <w:t xml:space="preserve">. That was investigated in code and debunked; the WIP and TODO already recorded it as NOT A BUG, so the IG was contradicting both. Now struck with the reason.</w:t>
-      </w:r>
-    </w:p>
-    <w:p>
-      <w:pPr>
-        <w:numPr>
-          <w:ilvl w:val="0"/>
-          <w:numId w:val="1105"/>
-        </w:numPr>
-      </w:pPr>
-      <w:r>
-        <w:rPr>
-          <w:b/>
-          <w:bCs/>
-        </w:rPr>
-        <w:t xml:space="preserve">WIP investor import step 6 corrected (Aug 4).</w:t>
-      </w:r>
-      <w:r>
-        <w:t xml:space="preserve"> </w:t>
-      </w:r>
-      <w:r>
-        <w:t xml:space="preserve">It read</w:t>
-      </w:r>
-      <w:r>
-        <w:t xml:space="preserve"> </w:t>
-      </w:r>
-      <w:r>
-        <w:t xml:space="preserve">“Apply type_investor tag to trigger drip enrollment”</w:t>
-      </w:r>
-      <w:r>
-        <w:t xml:space="preserve"> </w:t>
-      </w:r>
-      <w:r>
-        <w:t xml:space="preserve">in an investor-import runbook, directly contradicting the twice-stated rule never to apply</w:t>
-      </w:r>
-      <w:r>
-        <w:t xml:space="preserve"> </w:t>
-      </w:r>
-      <w:r>
-        <w:rPr>
-          <w:rStyle w:val="VerbatimChar"/>
-        </w:rPr>
-        <w:t xml:space="preserve">type_investor</w:t>
-      </w:r>
-      <w:r>
-        <w:t xml:space="preserve"> </w:t>
-      </w:r>
-      <w:r>
-        <w:t xml:space="preserve">to current investors. Following it would have pitched an investment to people who had already funded. Rewritten to split current from prospective investors, and the rest of the Session 16 import lessons folded in.</w:t>
-      </w:r>
-    </w:p>
-    <w:p>
-      <w:pPr>
-        <w:numPr>
-          <w:ilvl w:val="0"/>
-          <w:numId w:val="1106"/>
         </w:numPr>
       </w:pPr>
       <w:r>
@@ -7363,7 +7127,7 @@
         <w:pStyle w:val="Compact"/>
         <w:numPr>
           <w:ilvl w:val="0"/>
-          <w:numId w:val="1107"/>
+          <w:numId w:val="1100"/>
         </w:numPr>
       </w:pPr>
       <w:r>
@@ -7397,7 +7161,7 @@
         <w:pStyle w:val="Compact"/>
         <w:numPr>
           <w:ilvl w:val="0"/>
-          <w:numId w:val="1108"/>
+          <w:numId w:val="1101"/>
         </w:numPr>
       </w:pPr>
       <w:r>
@@ -8167,16 +7931,16 @@
     <w:abstractNumId w:val="991"/>
   </w:num>
   <w:num w:numId="1073">
-    <w:abstractNumId w:val="992"/>
+    <w:abstractNumId w:val="991"/>
   </w:num>
   <w:num w:numId="1074">
     <w:abstractNumId w:val="992"/>
   </w:num>
   <w:num w:numId="1075">
-    <w:abstractNumId w:val="993"/>
+    <w:abstractNumId w:val="992"/>
   </w:num>
   <w:num w:numId="1076">
-    <w:abstractNumId w:val="993"/>
+    <w:abstractNumId w:val="992"/>
   </w:num>
   <w:num w:numId="1077">
     <w:abstractNumId w:val="992"/>
@@ -8185,7 +7949,7 @@
     <w:abstractNumId w:val="992"/>
   </w:num>
   <w:num w:numId="1079">
-    <w:abstractNumId w:val="992"/>
+    <w:abstractNumId w:val="993"/>
   </w:num>
   <w:num w:numId="1080">
     <w:abstractNumId w:val="992"/>
@@ -8206,31 +7970,31 @@
     <w:abstractNumId w:val="992"/>
   </w:num>
   <w:num w:numId="1086">
-    <w:abstractNumId w:val="993"/>
+    <w:abstractNumId w:val="992"/>
   </w:num>
   <w:num w:numId="1087">
     <w:abstractNumId w:val="992"/>
   </w:num>
   <w:num w:numId="1088">
-    <w:abstractNumId w:val="992"/>
+    <w:abstractNumId w:val="993"/>
   </w:num>
   <w:num w:numId="1089">
-    <w:abstractNumId w:val="992"/>
+    <w:abstractNumId w:val="993"/>
   </w:num>
   <w:num w:numId="1090">
-    <w:abstractNumId w:val="992"/>
+    <w:abstractNumId w:val="991"/>
   </w:num>
   <w:num w:numId="1091">
-    <w:abstractNumId w:val="992"/>
+    <w:abstractNumId w:val="993"/>
   </w:num>
   <w:num w:numId="1092">
-    <w:abstractNumId w:val="992"/>
+    <w:abstractNumId w:val="993"/>
   </w:num>
   <w:num w:numId="1093">
     <w:abstractNumId w:val="992"/>
   </w:num>
   <w:num w:numId="1094">
-    <w:abstractNumId w:val="992"/>
+    <w:abstractNumId w:val="993"/>
   </w:num>
   <w:num w:numId="1095">
     <w:abstractNumId w:val="993"/>
@@ -8239,7 +8003,7 @@
     <w:abstractNumId w:val="993"/>
   </w:num>
   <w:num w:numId="1097">
-    <w:abstractNumId w:val="991"/>
+    <w:abstractNumId w:val="993"/>
   </w:num>
   <w:num w:numId="1098">
     <w:abstractNumId w:val="993"/>
@@ -8251,27 +8015,6 @@
     <w:abstractNumId w:val="992"/>
   </w:num>
   <w:num w:numId="1101">
-    <w:abstractNumId w:val="993"/>
-  </w:num>
-  <w:num w:numId="1102">
-    <w:abstractNumId w:val="993"/>
-  </w:num>
-  <w:num w:numId="1103">
-    <w:abstractNumId w:val="993"/>
-  </w:num>
-  <w:num w:numId="1104">
-    <w:abstractNumId w:val="993"/>
-  </w:num>
-  <w:num w:numId="1105">
-    <w:abstractNumId w:val="993"/>
-  </w:num>
-  <w:num w:numId="1106">
-    <w:abstractNumId w:val="993"/>
-  </w:num>
-  <w:num w:numId="1107">
-    <w:abstractNumId w:val="992"/>
-  </w:num>
-  <w:num w:numId="1108">
     <w:abstractNumId w:val="992"/>
   </w:num>
 </w:numbering>

</xml_diff>

<commit_message>
Correct the record: Enyrgy is not a sunlamp product
Scott's correction. Sunlamps are UVA-dominant because tanning is a UVA effect,
and the regulatory category turns on being intended to tan the skin. Enyrgy is
over 90 percent UVB and under 10 percent UVA, the inverse, and is intended for
vitamin D synthesis. The KB has said so in Section 4 the whole time. Citing the
guidance's sunlamp example as though it described Enyrgy was wrong.

The counsel question survives on different ground and is recorded that way. A3 is
not written around tanning; sunlamps are only its illustration, and the test
itself is about radiation exposure absent specific regulatory controls. Whether a
UVB-dominant device clears it is arguably the sharper question, since UVB is the
band responsible for direct DNA damage, which is why the platform has a
per-skin-type MED and an automatic cutoff at all.

Co-Authored-By: Claude Opus 5 <noreply@anthropic.com>
</commit_message>
<xml_diff>
--- a/Enyrgy_Master_TODO.docx
+++ b/Enyrgy_Master_TODO.docx
@@ -5791,7 +5791,7 @@
         <w:t xml:space="preserve"> </w:t>
       </w:r>
       <w:r>
-        <w:t xml:space="preserve">The guidance is a scope policy, not a claims list, and its decision tree question A3 excludes any product involving</w:t>
+        <w:t xml:space="preserve">The guidance is a scope policy, not a claims list. Its decision-tree question A3 excludes any product involving</w:t>
       </w:r>
       <w:r>
         <w:t xml:space="preserve"> </w:t>
@@ -5813,20 +5813,7 @@
         <w:t xml:space="preserve">”</w:t>
       </w:r>
       <w:r>
-        <w:t xml:space="preserve">. Its own worked example of a product that is not low risk is</w:t>
-      </w:r>
-      <w:r>
-        <w:t xml:space="preserve"> </w:t>
-      </w:r>
-      <w:r>
-        <w:rPr>
-          <w:b/>
-          <w:bCs/>
-        </w:rPr>
-        <w:t xml:space="preserve">sunlamp products</w:t>
-      </w:r>
-      <w:r>
-        <w:t xml:space="preserve">, on the basis of ultraviolet radiation. Enyrgy emits over 90 percent UVB, and the A3 test is about the technology rather than the marketing claim.</w:t>
+        <w:t xml:space="preserve">. The test is about the technology rather than the marketing claim, and Enyrgy emits UV.</w:t>
       </w:r>
     </w:p>
     <w:p>
@@ -5842,38 +5829,100 @@
           <w:b/>
           <w:bCs/>
         </w:rPr>
+        <w:t xml:space="preserve">Enyrgy is NOT a sunlamp product, and the guidance’s sunlamp example does not describe it</w:t>
+      </w:r>
+      <w:r>
+        <w:t xml:space="preserve"> </w:t>
+      </w:r>
+      <w:r>
+        <w:t xml:space="preserve">(Scott’s correction, Aug 4). Sunlamps are UVA-dominant because tanning is a UVA effect, and the regulatory category turns on being intended to tan the skin. Enyrgy is</w:t>
+      </w:r>
+      <w:r>
+        <w:t xml:space="preserve"> </w:t>
+      </w:r>
+      <w:r>
+        <w:rPr>
+          <w:b/>
+          <w:bCs/>
+        </w:rPr>
+        <w:t xml:space="preserve">over 90 percent UVB and under 10 percent UVA</w:t>
+      </w:r>
+      <w:r>
+        <w:t xml:space="preserve"> </w:t>
+      </w:r>
+      <w:r>
+        <w:t xml:space="preserve">(KB Section 4), the inverse, and is intended for vitamin D synthesis. An earlier version of this entry leaned on that example and was wrong to.</w:t>
+      </w:r>
+    </w:p>
+    <w:p>
+      <w:pPr>
+        <w:pStyle w:val="Compact"/>
+        <w:numPr>
+          <w:ilvl w:val="0"/>
+          <w:numId w:val="1073"/>
+        </w:numPr>
+      </w:pPr>
+      <w:r>
+        <w:rPr>
+          <w:b/>
+          <w:bCs/>
+        </w:rPr>
+        <w:t xml:space="preserve">The question survives the correction, on different ground.</w:t>
+      </w:r>
+      <w:r>
+        <w:t xml:space="preserve"> </w:t>
+      </w:r>
+      <w:r>
+        <w:t xml:space="preserve">A3 is not written around tanning; sunlamps are only its illustration. Whether a UVB-dominant device clears a radiation-exposure test is arguably the sharper question, since UVB is the band responsible for direct DNA damage. That is precisely why the platform has a per-skin-type MED and an automatic cutoff. Counsel can answer in one conversation whether those controls place Enyrgy inside this policy, inside a different device category, or outside both.</w:t>
+      </w:r>
+    </w:p>
+    <w:p>
+      <w:pPr>
+        <w:pStyle w:val="Compact"/>
+        <w:numPr>
+          <w:ilvl w:val="0"/>
+          <w:numId w:val="1073"/>
+        </w:numPr>
+      </w:pPr>
+      <w:r>
+        <w:rPr>
+          <w:b/>
+          <w:bCs/>
+        </w:rPr>
         <w:t xml:space="preserve">This is very probably not a problem, and that is the point.</w:t>
       </w:r>
       <w:r>
         <w:t xml:space="preserve"> </w:t>
       </w:r>
       <w:r>
-        <w:t xml:space="preserve">Being outside an enforcement-discretion policy is not a violation; it means the policy is the wrong reference. Sunlamp products are regulated as class II with special controls (timers, exposure schedules, warning labels, eyewear), and Enyrgy’s per-skin-type MED calculation and automatic cutoff read like compliance with exactly those. The likely reality is that Enyrgy sits in a different and correct regulatory category, and that</w:t>
-      </w:r>
-      <w:r>
-        <w:t xml:space="preserve"> </w:t>
-      </w:r>
-      <w:r>
+        <w:t xml:space="preserve">Being outside an enforcement-discretion policy is not a violation; it means the policy is the wrong reference. The likely reality is that Enyrgy sits in a different and correct regulatory category. What is worth untangling is that</w:t>
+      </w:r>
+      <w:r>
+        <w:t xml:space="preserve"> </w:t>
+      </w:r>
+      <w:r>
+        <w:rPr>
+          <w:b/>
+          <w:bCs/>
+        </w:rPr>
         <w:t xml:space="preserve">“wellness device, not medical device”</w:t>
       </w:r>
       <w:r>
-        <w:t xml:space="preserve"> </w:t>
-      </w:r>
-      <w:r>
-        <w:t xml:space="preserve">is marketing positioning rather than a regulatory classification.</w:t>
-      </w:r>
-      <w:r>
-        <w:t xml:space="preserve"> </w:t>
-      </w:r>
-      <w:r>
-        <w:rPr>
-          <w:b/>
-          <w:bCs/>
-        </w:rPr>
-        <w:t xml:space="preserve">Those two things being conflated is the thing worth untangling</w:t>
-      </w:r>
-      <w:r>
-        <w:t xml:space="preserve">, and counsel can settle it in one conversation.</w:t>
+        <w:rPr>
+          <w:b/>
+          <w:bCs/>
+        </w:rPr>
+        <w:t xml:space="preserve"> </w:t>
+      </w:r>
+      <w:r>
+        <w:rPr>
+          <w:b/>
+          <w:bCs/>
+        </w:rPr>
+        <w:t xml:space="preserve">may be marketing positioning rather than a regulatory classification</w:t>
+      </w:r>
+      <w:r>
+        <w:t xml:space="preserve">, and the KB currently reads as though it were the latter.</w:t>
       </w:r>
     </w:p>
     <w:p>

</xml_diff>

<commit_message>
KB: facility members can use HSA/FSA on a home unit, never on membership
Closes the last open item in TODO 4b. A facility member may NOT apply HSA/FSA
to a membership or session fees that include Enyrgy access -- that is a
membership, not a medical purchase. If that member buys their own home
Consumer Unit through the facility, that purchase IS eligible, being the same
personal device purchase as any direct consumer order.

Recorded in KB section 3 so Sales Outreach and the commercial side answer it
consistently. Relevant to the Beyond Wellness thread with Gino.

Co-Authored-By: Claude Opus 5 <noreply@anthropic.com>
</commit_message>
<xml_diff>
--- a/Enyrgy_Master_TODO.docx
+++ b/Enyrgy_Master_TODO.docx
@@ -4735,13 +4735,42 @@
           <w:b/>
           <w:bCs/>
         </w:rPr>
-        <w:t xml:space="preserve">Commercial-side question:</w:t>
-      </w:r>
-      <w:r>
-        <w:t xml:space="preserve"> </w:t>
-      </w:r>
-      <w:r>
-        <w:t xml:space="preserve">can a facility member use HSA/FSA against a membership that includes Enyrgy? That is the facility’s transaction, not Enyrgy’s, but it is directly relevant to the Beyond Wellness conversation. Worth answering before Gino comes back.</w:t>
+        <w:t xml:space="preserve">Commercial-side question: ANSWERED Aug 9.</w:t>
+      </w:r>
+      <w:r>
+        <w:t xml:space="preserve"> </w:t>
+      </w:r>
+      <w:r>
+        <w:t xml:space="preserve">Can a facility member use HSA/FSA against a membership that includes Enyrgy?</w:t>
+      </w:r>
+      <w:r>
+        <w:t xml:space="preserve"> </w:t>
+      </w:r>
+      <w:r>
+        <w:rPr>
+          <w:b/>
+          <w:bCs/>
+        </w:rPr>
+        <w:t xml:space="preserve">No — not toward membership or session fees.</w:t>
+      </w:r>
+      <w:r>
+        <w:t xml:space="preserve"> </w:t>
+      </w:r>
+      <w:r>
+        <w:t xml:space="preserve">But if that member purchases their own home Consumer Unit through the facility,</w:t>
+      </w:r>
+      <w:r>
+        <w:t xml:space="preserve"> </w:t>
+      </w:r>
+      <w:r>
+        <w:rPr>
+          <w:b/>
+          <w:bCs/>
+        </w:rPr>
+        <w:t xml:space="preserve">that purchase is eligible</w:t>
+      </w:r>
+      <w:r>
+        <w:t xml:space="preserve">, being the same personal device purchase as any direct consumer order. The recurring membership is never eligible; the home unit is. Recorded in the KB §3 payment options note. Relevant to the Beyond Wellness conversation with Gino, and a genuine channel angle: a facility can offer its members a home unit they can buy with HSA/FSA funds.</w:t>
       </w:r>
     </w:p>
     <w:p>
@@ -8804,7 +8833,7 @@
     <w:abstractNumId w:val="993"/>
   </w:num>
   <w:num w:numId="1057">
-    <w:abstractNumId w:val="992"/>
+    <w:abstractNumId w:val="993"/>
   </w:num>
   <w:num w:numId="1058">
     <w:abstractNumId w:val="993"/>

</xml_diff>

<commit_message>
Hold the facility-member HSA/FSA rule pending written Truemed confirmation
The consumer determination is final and unchanged: Consumer Unit eligible,
wall mount excluded, "HSA/FSA eligible through Truemed" the only authorized
phrasing. The three consumer touches and the KB payment options are untouched.

Only the facility-member half is provisional. Membership and session fees are
settled as never eligible -- that is a membership, not a personal medical
purchase, and needs no determination. Whether a member may use HSA/FSA on a
home Consumer Unit bought through a facility is now marked PENDING written
confirmation from Truemed, and KB section 3 instructs agents to escalate to
Scott rather than answer in either direction.

Reopens the commercial-side item in TODO 4b, which had been marked ANSWERED
prematurely in 972dad6c. Draft commercial-drip Touch 7 copy stays unapplied.

Co-Authored-By: Claude Opus 5 <noreply@anthropic.com>
</commit_message>
<xml_diff>
--- a/Enyrgy_Master_TODO.docx
+++ b/Enyrgy_Master_TODO.docx
@@ -4735,7 +4735,7 @@
           <w:b/>
           <w:bCs/>
         </w:rPr>
-        <w:t xml:space="preserve">Commercial-side question: ANSWERED Aug 9.</w:t>
+        <w:t xml:space="preserve">WAITING ON TRUEMED: commercial-side determination, in writing.</w:t>
       </w:r>
       <w:r>
         <w:t xml:space="preserve"> </w:t>
@@ -4751,26 +4751,49 @@
           <w:b/>
           <w:bCs/>
         </w:rPr>
-        <w:t xml:space="preserve">No — not toward membership or session fees.</w:t>
-      </w:r>
-      <w:r>
-        <w:t xml:space="preserve"> </w:t>
-      </w:r>
-      <w:r>
-        <w:t xml:space="preserve">But if that member purchases their own home Consumer Unit through the facility,</w:t>
-      </w:r>
-      <w:r>
-        <w:t xml:space="preserve"> </w:t>
-      </w:r>
-      <w:r>
-        <w:rPr>
-          <w:b/>
-          <w:bCs/>
-        </w:rPr>
-        <w:t xml:space="preserve">that purchase is eligible</w:t>
-      </w:r>
-      <w:r>
-        <w:t xml:space="preserve">, being the same personal device purchase as any direct consumer order. The recurring membership is never eligible; the home unit is. Recorded in the KB §3 payment options note. Relevant to the Beyond Wellness conversation with Gino, and a genuine channel angle: a facility can offer its members a home unit they can buy with HSA/FSA funds.</w:t>
+        <w:t xml:space="preserve">Membership and session fees: no</w:t>
+      </w:r>
+      <w:r>
+        <w:t xml:space="preserve">, settled — that is a membership, not a personal medical purchase, and it needs no determination from anyone.</w:t>
+      </w:r>
+      <w:r>
+        <w:t xml:space="preserve"> </w:t>
+      </w:r>
+      <w:r>
+        <w:rPr>
+          <w:b/>
+          <w:bCs/>
+        </w:rPr>
+        <w:t xml:space="preserve">A member buying their own home Consumer Unit through the facility: Scott’s read is yes</w:t>
+      </w:r>
+      <w:r>
+        <w:t xml:space="preserve">, being the same personal device purchase as any direct consumer order,</w:t>
+      </w:r>
+      <w:r>
+        <w:t xml:space="preserve"> </w:t>
+      </w:r>
+      <w:r>
+        <w:rPr>
+          <w:b/>
+          <w:bCs/>
+        </w:rPr>
+        <w:t xml:space="preserve">but this is pending written confirmation from Truemed and must not appear in copy or in an agent’s answer until it lands.</w:t>
+      </w:r>
+      <w:r>
+        <w:t xml:space="preserve"> </w:t>
+      </w:r>
+      <w:r>
+        <w:t xml:space="preserve">KB §3 currently instructs agents to escalate rather than answer. Relevant to the Beyond Wellness conversation with Gino, and a genuine channel angle if confirmed: a facility could offer its members a home unit they buy with HSA/FSA funds. Draft commercial-drip copy exists for Touch 7 and is deliberately unapplied pending the answer; the open question of what margin an operator makes reselling a Consumer Unit should be settled at the same time.</w:t>
+      </w:r>
+      <w:r>
+        <w:t xml:space="preserve"> </w:t>
+      </w:r>
+      <w:r>
+        <w:rPr>
+          <w:b/>
+          <w:bCs/>
+        </w:rPr>
+        <w:t xml:space="preserve">The consumer determination is final and unaffected by any of this.</w:t>
       </w:r>
     </w:p>
     <w:p>
@@ -8833,7 +8856,7 @@
     <w:abstractNumId w:val="993"/>
   </w:num>
   <w:num w:numId="1057">
-    <w:abstractNumId w:val="993"/>
+    <w:abstractNumId w:val="992"/>
   </w:num>
   <w:num w:numId="1058">
     <w:abstractNumId w:val="993"/>

</xml_diff>

<commit_message>
HSA/FSA: Truemed confirms the facility and commercial path is not eligible
Resolves the last open item in TODO 4b. A member may not apply HSA/FSA to a
membership or session fees, and a unit bought through a facility does not
qualify either. Eligibility is the direct consumer purchase of the Consumer
Unit only.

KB section 3 now answers plainly instead of instructing agents to escalate.
The provisional hold from 7fe22887 is lifted, resolved as a no rather than
the yes that was expected.

Kills the commercial channel angle: the draft WF-07 copy exploring "your
members can buy a home unit through you with HSA/FSA" was never applied and
must not be revived. Noted in 4b so it is not rediscovered as a good idea.

Direct consumer rules are unchanged throughout: Consumer Unit eligible, wall
mount excluded, "HSA/FSA eligible through Truemed" the only phrasing.

TODO 4b now has zero open items.

Co-Authored-By: Claude Opus 5 <noreply@anthropic.com>
</commit_message>
<xml_diff>
--- a/Enyrgy_Master_TODO.docx
+++ b/Enyrgy_Master_TODO.docx
@@ -4735,65 +4735,75 @@
           <w:b/>
           <w:bCs/>
         </w:rPr>
-        <w:t xml:space="preserve">WAITING ON TRUEMED: commercial-side determination, in writing.</w:t>
-      </w:r>
-      <w:r>
-        <w:t xml:space="preserve"> </w:t>
-      </w:r>
-      <w:r>
-        <w:t xml:space="preserve">Can a facility member use HSA/FSA against a membership that includes Enyrgy?</w:t>
-      </w:r>
-      <w:r>
-        <w:t xml:space="preserve"> </w:t>
-      </w:r>
-      <w:r>
-        <w:rPr>
-          <w:b/>
-          <w:bCs/>
-        </w:rPr>
-        <w:t xml:space="preserve">Membership and session fees: no</w:t>
-      </w:r>
-      <w:r>
-        <w:t xml:space="preserve">, settled — that is a membership, not a personal medical purchase, and it needs no determination from anyone.</w:t>
-      </w:r>
-      <w:r>
-        <w:t xml:space="preserve"> </w:t>
-      </w:r>
-      <w:r>
-        <w:rPr>
-          <w:b/>
-          <w:bCs/>
-        </w:rPr>
-        <w:t xml:space="preserve">A member buying their own home Consumer Unit through the facility: Scott’s read is yes</w:t>
-      </w:r>
-      <w:r>
-        <w:t xml:space="preserve">, being the same personal device purchase as any direct consumer order,</w:t>
-      </w:r>
-      <w:r>
-        <w:t xml:space="preserve"> </w:t>
-      </w:r>
-      <w:r>
-        <w:rPr>
-          <w:b/>
-          <w:bCs/>
-        </w:rPr>
-        <w:t xml:space="preserve">but this is pending written confirmation from Truemed and must not appear in copy or in an agent’s answer until it lands.</w:t>
-      </w:r>
-      <w:r>
-        <w:t xml:space="preserve"> </w:t>
-      </w:r>
-      <w:r>
-        <w:t xml:space="preserve">KB §3 currently instructs agents to escalate rather than answer. Relevant to the Beyond Wellness conversation with Gino, and a genuine channel angle if confirmed: a facility could offer its members a home unit they buy with HSA/FSA funds. Draft commercial-drip copy exists for Touch 7 and is deliberately unapplied pending the answer; the open question of what margin an operator makes reselling a Consumer Unit should be settled at the same time.</w:t>
-      </w:r>
-      <w:r>
-        <w:t xml:space="preserve"> </w:t>
-      </w:r>
-      <w:r>
-        <w:rPr>
-          <w:b/>
-          <w:bCs/>
-        </w:rPr>
-        <w:t xml:space="preserve">The consumer determination is final and unaffected by any of this.</w:t>
+        <w:t xml:space="preserve">Commercial-side determination: ANSWERED by Truemed, August 2026. NOT eligible.</w:t>
+      </w:r>
+      <w:r>
+        <w:t xml:space="preserve"> </w:t>
+      </w:r>
+      <w:r>
+        <w:t xml:space="preserve">The facility and commercial path does not qualify at all. A member may not apply HSA/FSA to a membership or session fees,</w:t>
+      </w:r>
+      <w:r>
+        <w:t xml:space="preserve"> </w:t>
+      </w:r>
+      <w:r>
+        <w:rPr>
+          <w:b/>
+          <w:bCs/>
+        </w:rPr>
+        <w:t xml:space="preserve">and a unit bought through a facility does not qualify either.</w:t>
+      </w:r>
+      <w:r>
+        <w:t xml:space="preserve"> </w:t>
+      </w:r>
+      <w:r>
+        <w:t xml:space="preserve">Eligibility is the direct consumer purchase of the Consumer Unit only. Recorded in KB §3, which now instructs agents to answer plainly rather than escalate.</w:t>
+      </w:r>
+    </w:p>
+    <w:p>
+      <w:pPr>
+        <w:pStyle w:val="Compact"/>
+        <w:numPr>
+          <w:ilvl w:val="1"/>
+          <w:numId w:val="1058"/>
+        </w:numPr>
+      </w:pPr>
+      <w:r>
+        <w:rPr>
+          <w:b/>
+          <w:bCs/>
+        </w:rPr>
+        <w:t xml:space="preserve">Consequence: the commercial channel angle is dead.</w:t>
+      </w:r>
+      <w:r>
+        <w:t xml:space="preserve"> </w:t>
+      </w:r>
+      <w:r>
+        <w:t xml:space="preserve">The draft WF-07 copy exploring</w:t>
+      </w:r>
+      <w:r>
+        <w:t xml:space="preserve"> </w:t>
+      </w:r>
+      <w:r>
+        <w:t xml:space="preserve">“your members can buy a home unit through you with HSA/FSA”</w:t>
+      </w:r>
+      <w:r>
+        <w:t xml:space="preserve"> </w:t>
+      </w:r>
+      <w:r>
+        <w:t xml:space="preserve">was never applied, and must not be. Do not revive it, and do not offer operators a routing workaround. The open question about operator margin on a resold Consumer Unit is now moot for HSA/FSA purposes, though it may still matter commercially.</w:t>
+      </w:r>
+    </w:p>
+    <w:p>
+      <w:pPr>
+        <w:pStyle w:val="Compact"/>
+        <w:numPr>
+          <w:ilvl w:val="1"/>
+          <w:numId w:val="1058"/>
+        </w:numPr>
+      </w:pPr>
+      <w:r>
+        <w:t xml:space="preserve">Relevant to the Beyond Wellness conversation with Gino: the honest answer to the HSA question there is no.</w:t>
       </w:r>
     </w:p>
     <w:p>
@@ -4867,7 +4877,7 @@
         <w:pStyle w:val="Compact"/>
         <w:numPr>
           <w:ilvl w:val="0"/>
-          <w:numId w:val="1058"/>
+          <w:numId w:val="1059"/>
         </w:numPr>
       </w:pPr>
       <w:r>
@@ -4889,7 +4899,7 @@
         <w:pStyle w:val="Compact"/>
         <w:numPr>
           <w:ilvl w:val="0"/>
-          <w:numId w:val="1059"/>
+          <w:numId w:val="1060"/>
         </w:numPr>
       </w:pPr>
       <w:r>
@@ -4908,7 +4918,7 @@
         <w:pStyle w:val="Compact"/>
         <w:numPr>
           <w:ilvl w:val="0"/>
-          <w:numId w:val="1060"/>
+          <w:numId w:val="1061"/>
         </w:numPr>
       </w:pPr>
       <w:r>
@@ -5007,7 +5017,7 @@
         <w:pStyle w:val="Compact"/>
         <w:numPr>
           <w:ilvl w:val="1"/>
-          <w:numId w:val="1061"/>
+          <w:numId w:val="1062"/>
         </w:numPr>
       </w:pPr>
       <w:r>
@@ -5044,7 +5054,7 @@
         <w:pStyle w:val="Compact"/>
         <w:numPr>
           <w:ilvl w:val="1"/>
-          <w:numId w:val="1061"/>
+          <w:numId w:val="1062"/>
         </w:numPr>
       </w:pPr>
       <w:r>
@@ -5066,7 +5076,7 @@
         <w:pStyle w:val="Compact"/>
         <w:numPr>
           <w:ilvl w:val="1"/>
-          <w:numId w:val="1061"/>
+          <w:numId w:val="1062"/>
         </w:numPr>
       </w:pPr>
       <w:r>
@@ -5137,7 +5147,7 @@
         <w:pStyle w:val="Compact"/>
         <w:numPr>
           <w:ilvl w:val="1"/>
-          <w:numId w:val="1061"/>
+          <w:numId w:val="1062"/>
         </w:numPr>
       </w:pPr>
       <w:r>
@@ -5159,7 +5169,7 @@
         <w:pStyle w:val="Compact"/>
         <w:numPr>
           <w:ilvl w:val="0"/>
-          <w:numId w:val="1062"/>
+          <w:numId w:val="1063"/>
         </w:numPr>
       </w:pPr>
       <w:r>
@@ -5196,7 +5206,7 @@
         <w:pStyle w:val="Compact"/>
         <w:numPr>
           <w:ilvl w:val="0"/>
-          <w:numId w:val="1063"/>
+          <w:numId w:val="1064"/>
         </w:numPr>
       </w:pPr>
       <w:r>
@@ -5234,7 +5244,7 @@
         <w:pStyle w:val="Compact"/>
         <w:numPr>
           <w:ilvl w:val="0"/>
-          <w:numId w:val="1064"/>
+          <w:numId w:val="1065"/>
         </w:numPr>
       </w:pPr>
       <w:r>
@@ -5256,7 +5266,7 @@
         <w:pStyle w:val="Compact"/>
         <w:numPr>
           <w:ilvl w:val="0"/>
-          <w:numId w:val="1065"/>
+          <w:numId w:val="1066"/>
         </w:numPr>
       </w:pPr>
       <w:r>
@@ -5278,7 +5288,7 @@
         <w:pStyle w:val="Compact"/>
         <w:numPr>
           <w:ilvl w:val="0"/>
-          <w:numId w:val="1066"/>
+          <w:numId w:val="1067"/>
         </w:numPr>
       </w:pPr>
       <w:r>
@@ -5343,7 +5353,7 @@
         <w:pStyle w:val="Compact"/>
         <w:numPr>
           <w:ilvl w:val="0"/>
-          <w:numId w:val="1067"/>
+          <w:numId w:val="1068"/>
         </w:numPr>
       </w:pPr>
       <w:r>
@@ -5365,7 +5375,7 @@
         <w:pStyle w:val="Compact"/>
         <w:numPr>
           <w:ilvl w:val="0"/>
-          <w:numId w:val="1068"/>
+          <w:numId w:val="1069"/>
         </w:numPr>
       </w:pPr>
       <w:r>
@@ -5442,7 +5452,7 @@
         <w:pStyle w:val="Compact"/>
         <w:numPr>
           <w:ilvl w:val="0"/>
-          <w:numId w:val="1069"/>
+          <w:numId w:val="1070"/>
         </w:numPr>
       </w:pPr>
       <w:r>
@@ -5476,7 +5486,7 @@
         <w:pStyle w:val="Compact"/>
         <w:numPr>
           <w:ilvl w:val="0"/>
-          <w:numId w:val="1070"/>
+          <w:numId w:val="1071"/>
         </w:numPr>
       </w:pPr>
       <w:r>
@@ -5498,7 +5508,7 @@
         <w:pStyle w:val="Compact"/>
         <w:numPr>
           <w:ilvl w:val="0"/>
-          <w:numId w:val="1071"/>
+          <w:numId w:val="1072"/>
         </w:numPr>
       </w:pPr>
       <w:r>
@@ -5520,7 +5530,7 @@
         <w:pStyle w:val="Compact"/>
         <w:numPr>
           <w:ilvl w:val="0"/>
-          <w:numId w:val="1072"/>
+          <w:numId w:val="1073"/>
         </w:numPr>
       </w:pPr>
       <w:r>
@@ -5542,7 +5552,7 @@
         <w:pStyle w:val="Compact"/>
         <w:numPr>
           <w:ilvl w:val="0"/>
-          <w:numId w:val="1073"/>
+          <w:numId w:val="1074"/>
         </w:numPr>
       </w:pPr>
       <w:r>
@@ -5592,7 +5602,7 @@
         <w:pStyle w:val="Compact"/>
         <w:numPr>
           <w:ilvl w:val="0"/>
-          <w:numId w:val="1074"/>
+          <w:numId w:val="1075"/>
         </w:numPr>
       </w:pPr>
       <w:r>
@@ -5681,7 +5691,7 @@
         <w:pStyle w:val="Compact"/>
         <w:numPr>
           <w:ilvl w:val="0"/>
-          <w:numId w:val="1074"/>
+          <w:numId w:val="1075"/>
         </w:numPr>
       </w:pPr>
       <w:r>
@@ -5721,7 +5731,7 @@
         <w:pStyle w:val="Compact"/>
         <w:numPr>
           <w:ilvl w:val="0"/>
-          <w:numId w:val="1074"/>
+          <w:numId w:val="1075"/>
         </w:numPr>
       </w:pPr>
       <w:r>
@@ -5776,7 +5786,7 @@
         <w:pStyle w:val="Compact"/>
         <w:numPr>
           <w:ilvl w:val="0"/>
-          <w:numId w:val="1074"/>
+          <w:numId w:val="1075"/>
         </w:numPr>
       </w:pPr>
       <w:r>
@@ -5873,7 +5883,7 @@
         <w:pStyle w:val="Compact"/>
         <w:numPr>
           <w:ilvl w:val="0"/>
-          <w:numId w:val="1074"/>
+          <w:numId w:val="1075"/>
         </w:numPr>
       </w:pPr>
       <w:r>
@@ -5910,7 +5920,7 @@
         <w:pStyle w:val="Compact"/>
         <w:numPr>
           <w:ilvl w:val="0"/>
-          <w:numId w:val="1074"/>
+          <w:numId w:val="1075"/>
         </w:numPr>
       </w:pPr>
       <w:r>
@@ -5996,7 +6006,7 @@
         <w:pStyle w:val="Compact"/>
         <w:numPr>
           <w:ilvl w:val="0"/>
-          <w:numId w:val="1075"/>
+          <w:numId w:val="1076"/>
         </w:numPr>
       </w:pPr>
       <w:r>
@@ -6024,7 +6034,7 @@
         <w:pStyle w:val="Compact"/>
         <w:numPr>
           <w:ilvl w:val="0"/>
-          <w:numId w:val="1075"/>
+          <w:numId w:val="1076"/>
         </w:numPr>
       </w:pPr>
       <w:r>
@@ -6093,7 +6103,7 @@
         <w:pStyle w:val="Compact"/>
         <w:numPr>
           <w:ilvl w:val="0"/>
-          <w:numId w:val="1075"/>
+          <w:numId w:val="1076"/>
         </w:numPr>
       </w:pPr>
       <w:r>
@@ -6164,7 +6174,7 @@
         <w:pStyle w:val="Compact"/>
         <w:numPr>
           <w:ilvl w:val="0"/>
-          <w:numId w:val="1075"/>
+          <w:numId w:val="1076"/>
         </w:numPr>
       </w:pPr>
       <w:r>
@@ -6205,7 +6215,7 @@
         <w:pStyle w:val="Compact"/>
         <w:numPr>
           <w:ilvl w:val="0"/>
-          <w:numId w:val="1075"/>
+          <w:numId w:val="1076"/>
         </w:numPr>
       </w:pPr>
       <w:r>
@@ -6239,7 +6249,7 @@
         <w:pStyle w:val="Compact"/>
         <w:numPr>
           <w:ilvl w:val="0"/>
-          <w:numId w:val="1075"/>
+          <w:numId w:val="1076"/>
         </w:numPr>
       </w:pPr>
       <w:r>
@@ -6332,7 +6342,7 @@
         <w:pStyle w:val="Compact"/>
         <w:numPr>
           <w:ilvl w:val="0"/>
-          <w:numId w:val="1075"/>
+          <w:numId w:val="1076"/>
         </w:numPr>
       </w:pPr>
       <w:r>
@@ -6354,7 +6364,7 @@
         <w:pStyle w:val="Compact"/>
         <w:numPr>
           <w:ilvl w:val="0"/>
-          <w:numId w:val="1075"/>
+          <w:numId w:val="1076"/>
         </w:numPr>
       </w:pPr>
       <w:r>
@@ -6437,88 +6447,88 @@
         <w:pStyle w:val="Compact"/>
         <w:numPr>
           <w:ilvl w:val="1"/>
+          <w:numId w:val="1077"/>
+        </w:numPr>
+      </w:pPr>
+      <w:r>
+        <w:rPr>
+          <w:b/>
+          <w:bCs/>
+        </w:rPr>
+        <w:t xml:space="preserve">Verified end to end</w:t>
+      </w:r>
+      <w:r>
+        <w:t xml:space="preserve"> </w:t>
+      </w:r>
+      <w:r>
+        <w:t xml:space="preserve">by calling 888-316-1695 from Scott’s mobile and letting it reach voicemail. The phone rang showing 888-316-1695, and the notification arrived as</w:t>
+      </w:r>
+      <w:r>
+        <w:t xml:space="preserve"> </w:t>
+      </w:r>
+      <w:r>
+        <w:rPr>
+          <w:rStyle w:val="VerbatimChar"/>
+        </w:rPr>
+        <w:t xml:space="preserve">Inbound call:</w:t>
+      </w:r>
+      <w:r>
+        <w:t xml:space="preserve"> </w:t>
+      </w:r>
+      <w:r>
+        <w:t xml:space="preserve">with the number populated,</w:t>
+      </w:r>
+      <w:r>
+        <w:t xml:space="preserve"> </w:t>
+      </w:r>
+      <w:r>
+        <w:rPr>
+          <w:b/>
+          <w:bCs/>
+        </w:rPr>
+        <w:t xml:space="preserve">confirming both the branch order and the caller-ID fix in a single test.</w:t>
+      </w:r>
+    </w:p>
+    <w:p>
+      <w:pPr>
+        <w:pStyle w:val="Compact"/>
+        <w:numPr>
+          <w:ilvl w:val="1"/>
+          <w:numId w:val="1077"/>
+        </w:numPr>
+      </w:pPr>
+      <w:r>
+        <w:rPr>
+          <w:b/>
+          <w:bCs/>
+        </w:rPr>
+        <w:t xml:space="preserve">The call channel was deliberately not filtered out</w:t>
+      </w:r>
+      <w:r>
+        <w:t xml:space="preserve">, which was the obvious fix and the wrong one. Those useless</w:t>
+      </w:r>
+      <w:r>
+        <w:t xml:space="preserve"> </w:t>
+      </w:r>
+      <w:r>
+        <w:rPr>
+          <w:rStyle w:val="VerbatimChar"/>
+        </w:rPr>
+        <w:t xml:space="preserve">undefined</w:t>
+      </w:r>
+      <w:r>
+        <w:t xml:space="preserve"> </w:t>
+      </w:r>
+      <w:r>
+        <w:t xml:space="preserve">notifications were the only thing that surfaced the silenced business line. Filtering would have restored the silence that had to be found by accident.</w:t>
+      </w:r>
+    </w:p>
+    <w:p>
+      <w:pPr>
+        <w:pStyle w:val="Compact"/>
+        <w:numPr>
+          <w:ilvl w:val="0"/>
           <w:numId w:val="1076"/>
-        </w:numPr>
-      </w:pPr>
-      <w:r>
-        <w:rPr>
-          <w:b/>
-          <w:bCs/>
-        </w:rPr>
-        <w:t xml:space="preserve">Verified end to end</w:t>
-      </w:r>
-      <w:r>
-        <w:t xml:space="preserve"> </w:t>
-      </w:r>
-      <w:r>
-        <w:t xml:space="preserve">by calling 888-316-1695 from Scott’s mobile and letting it reach voicemail. The phone rang showing 888-316-1695, and the notification arrived as</w:t>
-      </w:r>
-      <w:r>
-        <w:t xml:space="preserve"> </w:t>
-      </w:r>
-      <w:r>
-        <w:rPr>
-          <w:rStyle w:val="VerbatimChar"/>
-        </w:rPr>
-        <w:t xml:space="preserve">Inbound call:</w:t>
-      </w:r>
-      <w:r>
-        <w:t xml:space="preserve"> </w:t>
-      </w:r>
-      <w:r>
-        <w:t xml:space="preserve">with the number populated,</w:t>
-      </w:r>
-      <w:r>
-        <w:t xml:space="preserve"> </w:t>
-      </w:r>
-      <w:r>
-        <w:rPr>
-          <w:b/>
-          <w:bCs/>
-        </w:rPr>
-        <w:t xml:space="preserve">confirming both the branch order and the caller-ID fix in a single test.</w:t>
-      </w:r>
-    </w:p>
-    <w:p>
-      <w:pPr>
-        <w:pStyle w:val="Compact"/>
-        <w:numPr>
-          <w:ilvl w:val="1"/>
-          <w:numId w:val="1076"/>
-        </w:numPr>
-      </w:pPr>
-      <w:r>
-        <w:rPr>
-          <w:b/>
-          <w:bCs/>
-        </w:rPr>
-        <w:t xml:space="preserve">The call channel was deliberately not filtered out</w:t>
-      </w:r>
-      <w:r>
-        <w:t xml:space="preserve">, which was the obvious fix and the wrong one. Those useless</w:t>
-      </w:r>
-      <w:r>
-        <w:t xml:space="preserve"> </w:t>
-      </w:r>
-      <w:r>
-        <w:rPr>
-          <w:rStyle w:val="VerbatimChar"/>
-        </w:rPr>
-        <w:t xml:space="preserve">undefined</w:t>
-      </w:r>
-      <w:r>
-        <w:t xml:space="preserve"> </w:t>
-      </w:r>
-      <w:r>
-        <w:t xml:space="preserve">notifications were the only thing that surfaced the silenced business line. Filtering would have restored the silence that had to be found by accident.</w:t>
-      </w:r>
-    </w:p>
-    <w:p>
-      <w:pPr>
-        <w:pStyle w:val="Compact"/>
-        <w:numPr>
-          <w:ilvl w:val="0"/>
-          <w:numId w:val="1075"/>
         </w:numPr>
       </w:pPr>
       <w:r>
@@ -6605,7 +6615,7 @@
         <w:pStyle w:val="Compact"/>
         <w:numPr>
           <w:ilvl w:val="0"/>
-          <w:numId w:val="1077"/>
+          <w:numId w:val="1078"/>
         </w:numPr>
       </w:pPr>
       <w:r>
@@ -6633,7 +6643,7 @@
         <w:pStyle w:val="Compact"/>
         <w:numPr>
           <w:ilvl w:val="0"/>
-          <w:numId w:val="1077"/>
+          <w:numId w:val="1078"/>
         </w:numPr>
       </w:pPr>
       <w:r>
@@ -6677,7 +6687,7 @@
         <w:pStyle w:val="Compact"/>
         <w:numPr>
           <w:ilvl w:val="0"/>
-          <w:numId w:val="1077"/>
+          <w:numId w:val="1078"/>
         </w:numPr>
       </w:pPr>
       <w:r>
@@ -6715,7 +6725,7 @@
         <w:pStyle w:val="Compact"/>
         <w:numPr>
           <w:ilvl w:val="0"/>
-          <w:numId w:val="1077"/>
+          <w:numId w:val="1078"/>
         </w:numPr>
       </w:pPr>
       <w:r>
@@ -6737,7 +6747,7 @@
         <w:pStyle w:val="Compact"/>
         <w:numPr>
           <w:ilvl w:val="0"/>
-          <w:numId w:val="1077"/>
+          <w:numId w:val="1078"/>
         </w:numPr>
       </w:pPr>
       <w:r>
@@ -6786,7 +6796,7 @@
         <w:pStyle w:val="Compact"/>
         <w:numPr>
           <w:ilvl w:val="0"/>
-          <w:numId w:val="1077"/>
+          <w:numId w:val="1078"/>
         </w:numPr>
       </w:pPr>
       <w:r>
@@ -6808,7 +6818,7 @@
         <w:pStyle w:val="Compact"/>
         <w:numPr>
           <w:ilvl w:val="0"/>
-          <w:numId w:val="1077"/>
+          <w:numId w:val="1078"/>
         </w:numPr>
       </w:pPr>
       <w:r>
@@ -6849,7 +6859,7 @@
         <w:pStyle w:val="Compact"/>
         <w:numPr>
           <w:ilvl w:val="0"/>
-          <w:numId w:val="1078"/>
+          <w:numId w:val="1079"/>
         </w:numPr>
       </w:pPr>
       <w:r>
@@ -6871,7 +6881,7 @@
         <w:pStyle w:val="Compact"/>
         <w:numPr>
           <w:ilvl w:val="0"/>
-          <w:numId w:val="1079"/>
+          <w:numId w:val="1080"/>
         </w:numPr>
       </w:pPr>
       <w:r>
@@ -6893,7 +6903,7 @@
         <w:pStyle w:val="Compact"/>
         <w:numPr>
           <w:ilvl w:val="0"/>
-          <w:numId w:val="1080"/>
+          <w:numId w:val="1081"/>
         </w:numPr>
       </w:pPr>
       <w:r>
@@ -6924,7 +6934,7 @@
         <w:pStyle w:val="Compact"/>
         <w:numPr>
           <w:ilvl w:val="0"/>
-          <w:numId w:val="1081"/>
+          <w:numId w:val="1082"/>
         </w:numPr>
       </w:pPr>
       <w:r>
@@ -6946,7 +6956,7 @@
         <w:pStyle w:val="Compact"/>
         <w:numPr>
           <w:ilvl w:val="0"/>
-          <w:numId w:val="1082"/>
+          <w:numId w:val="1083"/>
         </w:numPr>
       </w:pPr>
       <w:r>
@@ -6968,7 +6978,7 @@
         <w:pStyle w:val="Compact"/>
         <w:numPr>
           <w:ilvl w:val="0"/>
-          <w:numId w:val="1083"/>
+          <w:numId w:val="1084"/>
         </w:numPr>
       </w:pPr>
       <w:r>
@@ -6990,7 +7000,7 @@
         <w:pStyle w:val="Compact"/>
         <w:numPr>
           <w:ilvl w:val="0"/>
-          <w:numId w:val="1084"/>
+          <w:numId w:val="1085"/>
         </w:numPr>
       </w:pPr>
       <w:r>
@@ -7073,7 +7083,7 @@
         <w:pStyle w:val="Compact"/>
         <w:numPr>
           <w:ilvl w:val="0"/>
-          <w:numId w:val="1085"/>
+          <w:numId w:val="1086"/>
         </w:numPr>
       </w:pPr>
       <w:r>
@@ -7095,7 +7105,7 @@
         <w:pStyle w:val="Compact"/>
         <w:numPr>
           <w:ilvl w:val="0"/>
-          <w:numId w:val="1086"/>
+          <w:numId w:val="1087"/>
         </w:numPr>
       </w:pPr>
       <w:r>
@@ -7133,7 +7143,7 @@
         <w:pStyle w:val="Compact"/>
         <w:numPr>
           <w:ilvl w:val="0"/>
-          <w:numId w:val="1087"/>
+          <w:numId w:val="1088"/>
         </w:numPr>
       </w:pPr>
       <w:r>
@@ -7155,7 +7165,7 @@
         <w:pStyle w:val="Compact"/>
         <w:numPr>
           <w:ilvl w:val="0"/>
-          <w:numId w:val="1088"/>
+          <w:numId w:val="1089"/>
         </w:numPr>
       </w:pPr>
       <w:r>
@@ -7177,7 +7187,7 @@
         <w:pStyle w:val="Compact"/>
         <w:numPr>
           <w:ilvl w:val="0"/>
-          <w:numId w:val="1089"/>
+          <w:numId w:val="1090"/>
         </w:numPr>
       </w:pPr>
       <w:r>
@@ -7278,7 +7288,7 @@
         <w:pStyle w:val="Compact"/>
         <w:numPr>
           <w:ilvl w:val="0"/>
-          <w:numId w:val="1090"/>
+          <w:numId w:val="1091"/>
         </w:numPr>
       </w:pPr>
       <w:r>
@@ -7300,7 +7310,7 @@
         <w:pStyle w:val="Compact"/>
         <w:numPr>
           <w:ilvl w:val="0"/>
-          <w:numId w:val="1091"/>
+          <w:numId w:val="1092"/>
         </w:numPr>
       </w:pPr>
       <w:r>
@@ -7332,7 +7342,7 @@
         <w:pStyle w:val="Compact"/>
         <w:numPr>
           <w:ilvl w:val="0"/>
-          <w:numId w:val="1092"/>
+          <w:numId w:val="1093"/>
         </w:numPr>
       </w:pPr>
       <w:r>
@@ -7406,7 +7416,7 @@
         <w:pStyle w:val="Compact"/>
         <w:numPr>
           <w:ilvl w:val="0"/>
-          <w:numId w:val="1093"/>
+          <w:numId w:val="1094"/>
         </w:numPr>
       </w:pPr>
       <w:r>
@@ -7469,7 +7479,7 @@
         <w:pStyle w:val="Compact"/>
         <w:numPr>
           <w:ilvl w:val="1"/>
-          <w:numId w:val="1094"/>
+          <w:numId w:val="1095"/>
         </w:numPr>
       </w:pPr>
       <w:r>
@@ -7491,7 +7501,7 @@
         <w:pStyle w:val="Compact"/>
         <w:numPr>
           <w:ilvl w:val="1"/>
-          <w:numId w:val="1094"/>
+          <w:numId w:val="1095"/>
         </w:numPr>
       </w:pPr>
       <w:r>
@@ -7534,7 +7544,7 @@
         <w:pStyle w:val="Compact"/>
         <w:numPr>
           <w:ilvl w:val="1"/>
-          <w:numId w:val="1094"/>
+          <w:numId w:val="1095"/>
         </w:numPr>
       </w:pPr>
       <w:r>
@@ -7571,7 +7581,7 @@
         <w:pStyle w:val="Compact"/>
         <w:numPr>
           <w:ilvl w:val="1"/>
-          <w:numId w:val="1094"/>
+          <w:numId w:val="1095"/>
         </w:numPr>
       </w:pPr>
       <w:r>
@@ -7602,7 +7612,7 @@
       <w:pPr>
         <w:numPr>
           <w:ilvl w:val="0"/>
-          <w:numId w:val="1095"/>
+          <w:numId w:val="1096"/>
         </w:numPr>
       </w:pPr>
       <w:r>
@@ -7772,7 +7782,7 @@
       <w:pPr>
         <w:numPr>
           <w:ilvl w:val="0"/>
-          <w:numId w:val="1096"/>
+          <w:numId w:val="1097"/>
         </w:numPr>
       </w:pPr>
       <w:r>
@@ -7805,7 +7815,7 @@
       <w:pPr>
         <w:numPr>
           <w:ilvl w:val="0"/>
-          <w:numId w:val="1097"/>
+          <w:numId w:val="1098"/>
         </w:numPr>
       </w:pPr>
       <w:r>
@@ -7826,7 +7836,7 @@
       <w:pPr>
         <w:numPr>
           <w:ilvl w:val="0"/>
-          <w:numId w:val="1098"/>
+          <w:numId w:val="1099"/>
         </w:numPr>
       </w:pPr>
       <w:r>
@@ -7902,7 +7912,7 @@
       <w:pPr>
         <w:numPr>
           <w:ilvl w:val="0"/>
-          <w:numId w:val="1099"/>
+          <w:numId w:val="1100"/>
         </w:numPr>
       </w:pPr>
       <w:r>
@@ -7954,7 +7964,7 @@
       <w:pPr>
         <w:numPr>
           <w:ilvl w:val="0"/>
-          <w:numId w:val="1100"/>
+          <w:numId w:val="1101"/>
         </w:numPr>
       </w:pPr>
       <w:r>
@@ -7987,7 +7997,7 @@
       <w:pPr>
         <w:numPr>
           <w:ilvl w:val="0"/>
-          <w:numId w:val="1101"/>
+          <w:numId w:val="1102"/>
         </w:numPr>
       </w:pPr>
       <w:r>
@@ -8020,7 +8030,7 @@
       <w:pPr>
         <w:numPr>
           <w:ilvl w:val="0"/>
-          <w:numId w:val="1102"/>
+          <w:numId w:val="1103"/>
         </w:numPr>
       </w:pPr>
       <w:r>
@@ -8068,7 +8078,7 @@
       <w:pPr>
         <w:numPr>
           <w:ilvl w:val="0"/>
-          <w:numId w:val="1103"/>
+          <w:numId w:val="1104"/>
         </w:numPr>
       </w:pPr>
       <w:r>
@@ -8100,7 +8110,7 @@
         <w:pStyle w:val="Compact"/>
         <w:numPr>
           <w:ilvl w:val="0"/>
-          <w:numId w:val="1104"/>
+          <w:numId w:val="1105"/>
         </w:numPr>
       </w:pPr>
       <w:r>
@@ -8134,7 +8144,7 @@
         <w:pStyle w:val="Compact"/>
         <w:numPr>
           <w:ilvl w:val="0"/>
-          <w:numId w:val="1105"/>
+          <w:numId w:val="1106"/>
         </w:numPr>
       </w:pPr>
       <w:r>
@@ -8856,10 +8866,10 @@
     <w:abstractNumId w:val="993"/>
   </w:num>
   <w:num w:numId="1057">
-    <w:abstractNumId w:val="992"/>
+    <w:abstractNumId w:val="993"/>
   </w:num>
   <w:num w:numId="1058">
-    <w:abstractNumId w:val="993"/>
+    <w:abstractNumId w:val="991"/>
   </w:num>
   <w:num w:numId="1059">
     <w:abstractNumId w:val="993"/>
@@ -8868,10 +8878,10 @@
     <w:abstractNumId w:val="993"/>
   </w:num>
   <w:num w:numId="1061">
+    <w:abstractNumId w:val="993"/>
+  </w:num>
+  <w:num w:numId="1062">
     <w:abstractNumId w:val="991"/>
-  </w:num>
-  <w:num w:numId="1062">
-    <w:abstractNumId w:val="992"/>
   </w:num>
   <w:num w:numId="1063">
     <w:abstractNumId w:val="992"/>
@@ -8886,7 +8896,7 @@
     <w:abstractNumId w:val="992"/>
   </w:num>
   <w:num w:numId="1067">
-    <w:abstractNumId w:val="993"/>
+    <w:abstractNumId w:val="992"/>
   </w:num>
   <w:num w:numId="1068">
     <w:abstractNumId w:val="993"/>
@@ -8901,13 +8911,13 @@
     <w:abstractNumId w:val="993"/>
   </w:num>
   <w:num w:numId="1072">
+    <w:abstractNumId w:val="993"/>
+  </w:num>
+  <w:num w:numId="1073">
     <w:abstractNumId w:val="992"/>
   </w:num>
-  <w:num w:numId="1073">
+  <w:num w:numId="1074">
     <w:abstractNumId w:val="993"/>
-  </w:num>
-  <w:num w:numId="1074">
-    <w:abstractNumId w:val="991"/>
   </w:num>
   <w:num w:numId="1075">
     <w:abstractNumId w:val="991"/>
@@ -8919,7 +8929,7 @@
     <w:abstractNumId w:val="991"/>
   </w:num>
   <w:num w:numId="1078">
-    <w:abstractNumId w:val="992"/>
+    <w:abstractNumId w:val="991"/>
   </w:num>
   <w:num w:numId="1079">
     <w:abstractNumId w:val="992"/>
@@ -8934,10 +8944,10 @@
     <w:abstractNumId w:val="992"/>
   </w:num>
   <w:num w:numId="1083">
+    <w:abstractNumId w:val="992"/>
+  </w:num>
+  <w:num w:numId="1084">
     <w:abstractNumId w:val="993"/>
-  </w:num>
-  <w:num w:numId="1084">
-    <w:abstractNumId w:val="992"/>
   </w:num>
   <w:num w:numId="1085">
     <w:abstractNumId w:val="992"/>
@@ -8961,25 +8971,25 @@
     <w:abstractNumId w:val="992"/>
   </w:num>
   <w:num w:numId="1092">
-    <w:abstractNumId w:val="993"/>
+    <w:abstractNumId w:val="992"/>
   </w:num>
   <w:num w:numId="1093">
     <w:abstractNumId w:val="993"/>
   </w:num>
   <w:num w:numId="1094">
+    <w:abstractNumId w:val="993"/>
+  </w:num>
+  <w:num w:numId="1095">
     <w:abstractNumId w:val="991"/>
-  </w:num>
-  <w:num w:numId="1095">
-    <w:abstractNumId w:val="993"/>
   </w:num>
   <w:num w:numId="1096">
     <w:abstractNumId w:val="993"/>
   </w:num>
   <w:num w:numId="1097">
+    <w:abstractNumId w:val="993"/>
+  </w:num>
+  <w:num w:numId="1098">
     <w:abstractNumId w:val="992"/>
-  </w:num>
-  <w:num w:numId="1098">
-    <w:abstractNumId w:val="993"/>
   </w:num>
   <w:num w:numId="1099">
     <w:abstractNumId w:val="993"/>
@@ -8997,9 +9007,12 @@
     <w:abstractNumId w:val="993"/>
   </w:num>
   <w:num w:numId="1104">
+    <w:abstractNumId w:val="993"/>
+  </w:num>
+  <w:num w:numId="1105">
     <w:abstractNumId w:val="992"/>
   </w:num>
-  <w:num w:numId="1105">
+  <w:num w:numId="1106">
     <w:abstractNumId w:val="992"/>
   </w:num>
 </w:numbering>

</xml_diff>